<commit_message>
feat: add mock data for patients and doctors with TypeScript interfaces
</commit_message>
<xml_diff>
--- a/docs/Sprint 2.docx
+++ b/docs/Sprint 2.docx
@@ -5,29 +5,27 @@
     <w:p>
       <w:pPr>
         <w:pStyle w:val="Heading2"/>
+        <w:rPr>
+          <w:rFonts w:ascii="Calibri" w:hAnsi="Calibri" w:cs="Calibri"/>
+        </w:rPr>
       </w:pPr>
       <w:r>
+        <w:rPr>
+          <w:rFonts w:ascii="Calibri" w:hAnsi="Calibri" w:cs="Calibri"/>
+        </w:rPr>
         <w:t>Product Backlog</w:t>
       </w:r>
     </w:p>
-    <w:p>
-      <w:r>
-        <w:t>(This should contain ALL remaining work, work completed in previous sprints should have been removed from the product backlog)</w:t>
-      </w:r>
-    </w:p>
-    <w:p/>
     <w:tbl>
       <w:tblPr>
         <w:tblStyle w:val="GridTable3-Accent5"/>
-        <w:tblW w:w="0" w:type="auto"/>
-        <w:tblInd w:w="5" w:type="dxa"/>
+        <w:tblW w:w="9783" w:type="dxa"/>
         <w:tblLook w:val="04A0" w:firstRow="1" w:lastRow="0" w:firstColumn="1" w:lastColumn="0" w:noHBand="0" w:noVBand="1"/>
       </w:tblPr>
       <w:tblGrid>
-        <w:gridCol w:w="279"/>
-        <w:gridCol w:w="432"/>
-        <w:gridCol w:w="7064"/>
-        <w:gridCol w:w="1253"/>
+        <w:gridCol w:w="776"/>
+        <w:gridCol w:w="6850"/>
+        <w:gridCol w:w="2157"/>
       </w:tblGrid>
       <w:tr>
         <w:trPr>
@@ -36,49 +34,94 @@
         <w:tc>
           <w:tcPr>
             <w:cnfStyle w:val="001000000100" w:firstRow="0" w:lastRow="0" w:firstColumn="1" w:lastColumn="0" w:oddVBand="0" w:evenVBand="0" w:oddHBand="0" w:evenHBand="0" w:firstRowFirstColumn="1" w:firstRowLastColumn="0" w:lastRowFirstColumn="0" w:lastRowLastColumn="0"/>
-            <w:tcW w:w="279" w:type="dxa"/>
+            <w:tcW w:w="776" w:type="dxa"/>
+            <w:tcBorders>
+              <w:top w:val="single" w:sz="4" w:space="0" w:color="E59EDC" w:themeColor="accent5" w:themeTint="66"/>
+              <w:left w:val="single" w:sz="4" w:space="0" w:color="E59EDC" w:themeColor="accent5" w:themeTint="66"/>
+              <w:bottom w:val="single" w:sz="4" w:space="0" w:color="E59EDC" w:themeColor="accent5" w:themeTint="66"/>
+              <w:right w:val="single" w:sz="4" w:space="0" w:color="E59EDC" w:themeColor="accent5" w:themeTint="66"/>
+            </w:tcBorders>
           </w:tcPr>
           <w:p>
             <w:pPr>
               <w:jc w:val="center"/>
-            </w:pPr>
-          </w:p>
-        </w:tc>
-        <w:tc>
-          <w:tcPr>
-            <w:tcW w:w="425" w:type="dxa"/>
+              <w:rPr>
+                <w:rFonts w:ascii="Calibri" w:hAnsi="Calibri" w:cs="Calibri"/>
+                <w:i w:val="0"/>
+                <w:iCs w:val="0"/>
+              </w:rPr>
+            </w:pPr>
+            <w:r>
+              <w:rPr>
+                <w:rFonts w:ascii="Calibri" w:hAnsi="Calibri" w:cs="Calibri"/>
+                <w:i w:val="0"/>
+                <w:iCs w:val="0"/>
+              </w:rPr>
+              <w:t>No</w:t>
+            </w:r>
+          </w:p>
+        </w:tc>
+        <w:tc>
+          <w:tcPr>
+            <w:tcW w:w="6850" w:type="dxa"/>
+            <w:tcBorders>
+              <w:top w:val="single" w:sz="4" w:space="0" w:color="E59EDC" w:themeColor="accent5" w:themeTint="66"/>
+              <w:left w:val="single" w:sz="4" w:space="0" w:color="E59EDC" w:themeColor="accent5" w:themeTint="66"/>
+              <w:bottom w:val="single" w:sz="4" w:space="0" w:color="E59EDC" w:themeColor="accent5" w:themeTint="66"/>
+              <w:right w:val="single" w:sz="4" w:space="0" w:color="E59EDC" w:themeColor="accent5" w:themeTint="66"/>
+            </w:tcBorders>
           </w:tcPr>
           <w:p>
             <w:pPr>
               <w:jc w:val="center"/>
               <w:cnfStyle w:val="100000000000" w:firstRow="1" w:lastRow="0" w:firstColumn="0" w:lastColumn="0" w:oddVBand="0" w:evenVBand="0" w:oddHBand="0" w:evenHBand="0" w:firstRowFirstColumn="0" w:firstRowLastColumn="0" w:lastRowFirstColumn="0" w:lastRowLastColumn="0"/>
-            </w:pPr>
-          </w:p>
-        </w:tc>
-        <w:tc>
-          <w:tcPr>
-            <w:tcW w:w="7064" w:type="dxa"/>
+              <w:rPr>
+                <w:rFonts w:ascii="Calibri" w:hAnsi="Calibri" w:cs="Calibri"/>
+              </w:rPr>
+            </w:pPr>
+            <w:r>
+              <w:rPr>
+                <w:rFonts w:ascii="Calibri" w:hAnsi="Calibri" w:cs="Calibri"/>
+              </w:rPr>
+              <w:t>User story</w:t>
+            </w:r>
+          </w:p>
+        </w:tc>
+        <w:tc>
+          <w:tcPr>
+            <w:tcW w:w="2157" w:type="dxa"/>
+            <w:tcBorders>
+              <w:top w:val="single" w:sz="4" w:space="0" w:color="E59EDC" w:themeColor="accent5" w:themeTint="66"/>
+              <w:left w:val="single" w:sz="4" w:space="0" w:color="E59EDC" w:themeColor="accent5" w:themeTint="66"/>
+              <w:bottom w:val="single" w:sz="4" w:space="0" w:color="E59EDC" w:themeColor="accent5" w:themeTint="66"/>
+              <w:right w:val="single" w:sz="4" w:space="0" w:color="E59EDC" w:themeColor="accent5" w:themeTint="66"/>
+            </w:tcBorders>
           </w:tcPr>
           <w:p>
             <w:pPr>
               <w:jc w:val="center"/>
               <w:cnfStyle w:val="100000000000" w:firstRow="1" w:lastRow="0" w:firstColumn="0" w:lastColumn="0" w:oddVBand="0" w:evenVBand="0" w:oddHBand="0" w:evenHBand="0" w:firstRowFirstColumn="0" w:firstRowLastColumn="0" w:lastRowFirstColumn="0" w:lastRowLastColumn="0"/>
-            </w:pPr>
-            <w:r>
-              <w:t>User story</w:t>
-            </w:r>
-          </w:p>
-        </w:tc>
-        <w:tc>
-          <w:tcPr>
-            <w:tcW w:w="1253" w:type="dxa"/>
-          </w:tcPr>
-          <w:p>
-            <w:pPr>
-              <w:cnfStyle w:val="100000000000" w:firstRow="1" w:lastRow="0" w:firstColumn="0" w:lastColumn="0" w:oddVBand="0" w:evenVBand="0" w:oddHBand="0" w:evenHBand="0" w:firstRowFirstColumn="0" w:firstRowLastColumn="0" w:lastRowFirstColumn="0" w:lastRowLastColumn="0"/>
-            </w:pPr>
-            <w:r>
+              <w:rPr>
+                <w:rFonts w:ascii="Calibri" w:hAnsi="Calibri" w:cs="Calibri"/>
+              </w:rPr>
+            </w:pPr>
+            <w:r>
+              <w:rPr>
+                <w:rFonts w:ascii="Calibri" w:hAnsi="Calibri" w:cs="Calibri"/>
+              </w:rPr>
               <w:t>Estimate</w:t>
+            </w:r>
+            <w:r>
+              <w:rPr>
+                <w:rFonts w:ascii="Calibri" w:hAnsi="Calibri" w:cs="Calibri"/>
+              </w:rPr>
+              <w:t xml:space="preserve"> </w:t>
+            </w:r>
+            <w:r>
+              <w:rPr>
+                <w:rFonts w:ascii="Calibri" w:hAnsi="Calibri" w:cs="Calibri"/>
+              </w:rPr>
+              <w:t>(Story Points)</w:t>
             </w:r>
           </w:p>
         </w:tc>
@@ -90,52 +133,85 @@
         <w:tc>
           <w:tcPr>
             <w:cnfStyle w:val="001000000000" w:firstRow="0" w:lastRow="0" w:firstColumn="1" w:lastColumn="0" w:oddVBand="0" w:evenVBand="0" w:oddHBand="0" w:evenHBand="0" w:firstRowFirstColumn="0" w:firstRowLastColumn="0" w:lastRowFirstColumn="0" w:lastRowLastColumn="0"/>
-            <w:tcW w:w="279" w:type="dxa"/>
+            <w:tcW w:w="776" w:type="dxa"/>
+            <w:tcBorders>
+              <w:top w:val="single" w:sz="4" w:space="0" w:color="E59EDC" w:themeColor="accent5" w:themeTint="66"/>
+              <w:left w:val="single" w:sz="4" w:space="0" w:color="E59EDC" w:themeColor="accent5" w:themeTint="66"/>
+              <w:bottom w:val="single" w:sz="4" w:space="0" w:color="E59EDC" w:themeColor="accent5" w:themeTint="66"/>
+              <w:right w:val="single" w:sz="4" w:space="0" w:color="E59EDC" w:themeColor="accent5" w:themeTint="66"/>
+            </w:tcBorders>
+            <w:shd w:val="clear" w:color="auto" w:fill="F2CEED" w:themeFill="accent5" w:themeFillTint="33"/>
           </w:tcPr>
           <w:p>
             <w:pPr>
               <w:jc w:val="center"/>
-            </w:pPr>
-          </w:p>
-        </w:tc>
-        <w:tc>
-          <w:tcPr>
-            <w:tcW w:w="425" w:type="dxa"/>
+              <w:rPr>
+                <w:rFonts w:ascii="Calibri" w:hAnsi="Calibri" w:cs="Calibri"/>
+              </w:rPr>
+            </w:pPr>
+            <w:r>
+              <w:rPr>
+                <w:rFonts w:ascii="Calibri" w:hAnsi="Calibri" w:cs="Calibri"/>
+              </w:rPr>
+              <w:t>1</w:t>
+            </w:r>
+          </w:p>
+        </w:tc>
+        <w:tc>
+          <w:tcPr>
+            <w:tcW w:w="6850" w:type="dxa"/>
+            <w:tcBorders>
+              <w:top w:val="single" w:sz="4" w:space="0" w:color="E59EDC" w:themeColor="accent5" w:themeTint="66"/>
+              <w:left w:val="single" w:sz="4" w:space="0" w:color="E59EDC" w:themeColor="accent5" w:themeTint="66"/>
+            </w:tcBorders>
+          </w:tcPr>
+          <w:p>
+            <w:pPr>
+              <w:jc w:val="left"/>
+              <w:cnfStyle w:val="000000100000" w:firstRow="0" w:lastRow="0" w:firstColumn="0" w:lastColumn="0" w:oddVBand="0" w:evenVBand="0" w:oddHBand="1" w:evenHBand="0" w:firstRowFirstColumn="0" w:firstRowLastColumn="0" w:lastRowFirstColumn="0" w:lastRowLastColumn="0"/>
+              <w:rPr>
+                <w:rFonts w:ascii="Calibri" w:hAnsi="Calibri" w:cs="Calibri"/>
+                <w:lang w:val="en-US"/>
+              </w:rPr>
+            </w:pPr>
+            <w:r>
+              <w:rPr>
+                <w:rFonts w:ascii="Calibri" w:hAnsi="Calibri" w:cs="Calibri"/>
+                <w:lang w:val="en-US"/>
+              </w:rPr>
+              <w:t>As a Patient, I want to log in securely so that I can access my private medical data.</w:t>
+            </w:r>
+          </w:p>
+          <w:p>
+            <w:pPr>
+              <w:jc w:val="left"/>
+              <w:cnfStyle w:val="000000100000" w:firstRow="0" w:lastRow="0" w:firstColumn="0" w:lastColumn="0" w:oddVBand="0" w:evenVBand="0" w:oddHBand="1" w:evenHBand="0" w:firstRowFirstColumn="0" w:firstRowLastColumn="0" w:lastRowFirstColumn="0" w:lastRowLastColumn="0"/>
+              <w:rPr>
+                <w:rFonts w:ascii="Calibri" w:hAnsi="Calibri" w:cs="Calibri"/>
+              </w:rPr>
+            </w:pPr>
+          </w:p>
+        </w:tc>
+        <w:tc>
+          <w:tcPr>
+            <w:tcW w:w="2157" w:type="dxa"/>
+            <w:tcBorders>
+              <w:top w:val="single" w:sz="4" w:space="0" w:color="E59EDC" w:themeColor="accent5" w:themeTint="66"/>
+            </w:tcBorders>
           </w:tcPr>
           <w:p>
             <w:pPr>
               <w:jc w:val="center"/>
               <w:cnfStyle w:val="000000100000" w:firstRow="0" w:lastRow="0" w:firstColumn="0" w:lastColumn="0" w:oddVBand="0" w:evenVBand="0" w:oddHBand="1" w:evenHBand="0" w:firstRowFirstColumn="0" w:firstRowLastColumn="0" w:lastRowFirstColumn="0" w:lastRowLastColumn="0"/>
-            </w:pPr>
-            <w:r>
-              <w:t>1</w:t>
-            </w:r>
-          </w:p>
-        </w:tc>
-        <w:tc>
-          <w:tcPr>
-            <w:tcW w:w="7064" w:type="dxa"/>
-          </w:tcPr>
-          <w:p>
-            <w:pPr>
-              <w:jc w:val="center"/>
-              <w:cnfStyle w:val="000000100000" w:firstRow="0" w:lastRow="0" w:firstColumn="0" w:lastColumn="0" w:oddVBand="0" w:evenVBand="0" w:oddHBand="1" w:evenHBand="0" w:firstRowFirstColumn="0" w:firstRowLastColumn="0" w:lastRowFirstColumn="0" w:lastRowLastColumn="0"/>
-            </w:pPr>
-            <w:r>
-              <w:t>user story 1</w:t>
-            </w:r>
-          </w:p>
-        </w:tc>
-        <w:tc>
-          <w:tcPr>
-            <w:tcW w:w="1253" w:type="dxa"/>
-          </w:tcPr>
-          <w:p>
-            <w:pPr>
-              <w:cnfStyle w:val="000000100000" w:firstRow="0" w:lastRow="0" w:firstColumn="0" w:lastColumn="0" w:oddVBand="0" w:evenVBand="0" w:oddHBand="1" w:evenHBand="0" w:firstRowFirstColumn="0" w:firstRowLastColumn="0" w:lastRowFirstColumn="0" w:lastRowLastColumn="0"/>
-            </w:pPr>
-            <w:r>
-              <w:t>Story points</w:t>
+              <w:rPr>
+                <w:rFonts w:ascii="Calibri" w:hAnsi="Calibri" w:cs="Calibri"/>
+              </w:rPr>
+            </w:pPr>
+            <w:r>
+              <w:rPr>
+                <w:rFonts w:ascii="Calibri" w:hAnsi="Calibri" w:cs="Calibri"/>
+              </w:rPr>
+              <w:t>3</w:t>
             </w:r>
           </w:p>
         </w:tc>
@@ -144,52 +220,69 @@
         <w:tc>
           <w:tcPr>
             <w:cnfStyle w:val="001000000000" w:firstRow="0" w:lastRow="0" w:firstColumn="1" w:lastColumn="0" w:oddVBand="0" w:evenVBand="0" w:oddHBand="0" w:evenHBand="0" w:firstRowFirstColumn="0" w:firstRowLastColumn="0" w:lastRowFirstColumn="0" w:lastRowLastColumn="0"/>
-            <w:tcW w:w="279" w:type="dxa"/>
+            <w:tcW w:w="776" w:type="dxa"/>
+            <w:tcBorders>
+              <w:top w:val="single" w:sz="4" w:space="0" w:color="E59EDC" w:themeColor="accent5" w:themeTint="66"/>
+              <w:left w:val="single" w:sz="4" w:space="0" w:color="E59EDC" w:themeColor="accent5" w:themeTint="66"/>
+              <w:bottom w:val="single" w:sz="4" w:space="0" w:color="E59EDC" w:themeColor="accent5" w:themeTint="66"/>
+              <w:right w:val="single" w:sz="4" w:space="0" w:color="E59EDC" w:themeColor="accent5" w:themeTint="66"/>
+            </w:tcBorders>
           </w:tcPr>
           <w:p>
             <w:pPr>
               <w:jc w:val="center"/>
-            </w:pPr>
-          </w:p>
-        </w:tc>
-        <w:tc>
-          <w:tcPr>
-            <w:tcW w:w="425" w:type="dxa"/>
+              <w:rPr>
+                <w:rFonts w:ascii="Calibri" w:hAnsi="Calibri" w:cs="Calibri"/>
+              </w:rPr>
+            </w:pPr>
+            <w:r>
+              <w:rPr>
+                <w:rFonts w:ascii="Calibri" w:hAnsi="Calibri" w:cs="Calibri"/>
+              </w:rPr>
+              <w:t>2</w:t>
+            </w:r>
+          </w:p>
+        </w:tc>
+        <w:tc>
+          <w:tcPr>
+            <w:tcW w:w="6850" w:type="dxa"/>
+            <w:tcBorders>
+              <w:left w:val="single" w:sz="4" w:space="0" w:color="E59EDC" w:themeColor="accent5" w:themeTint="66"/>
+            </w:tcBorders>
+          </w:tcPr>
+          <w:p>
+            <w:pPr>
+              <w:jc w:val="left"/>
+              <w:cnfStyle w:val="000000000000" w:firstRow="0" w:lastRow="0" w:firstColumn="0" w:lastColumn="0" w:oddVBand="0" w:evenVBand="0" w:oddHBand="0" w:evenHBand="0" w:firstRowFirstColumn="0" w:firstRowLastColumn="0" w:lastRowFirstColumn="0" w:lastRowLastColumn="0"/>
+              <w:rPr>
+                <w:rFonts w:ascii="Calibri" w:hAnsi="Calibri" w:cs="Calibri"/>
+              </w:rPr>
+            </w:pPr>
+            <w:r>
+              <w:rPr>
+                <w:rFonts w:ascii="Calibri" w:hAnsi="Calibri" w:cs="Calibri"/>
+              </w:rPr>
+              <w:t>As a Patient, I want to view a real-time calendar of doctor availability so I can find an open slot.</w:t>
+            </w:r>
+          </w:p>
+        </w:tc>
+        <w:tc>
+          <w:tcPr>
+            <w:tcW w:w="2157" w:type="dxa"/>
           </w:tcPr>
           <w:p>
             <w:pPr>
               <w:jc w:val="center"/>
               <w:cnfStyle w:val="000000000000" w:firstRow="0" w:lastRow="0" w:firstColumn="0" w:lastColumn="0" w:oddVBand="0" w:evenVBand="0" w:oddHBand="0" w:evenHBand="0" w:firstRowFirstColumn="0" w:firstRowLastColumn="0" w:lastRowFirstColumn="0" w:lastRowLastColumn="0"/>
-            </w:pPr>
-            <w:r>
-              <w:t>2</w:t>
-            </w:r>
-          </w:p>
-        </w:tc>
-        <w:tc>
-          <w:tcPr>
-            <w:tcW w:w="7064" w:type="dxa"/>
-          </w:tcPr>
-          <w:p>
-            <w:pPr>
-              <w:jc w:val="center"/>
-              <w:cnfStyle w:val="000000000000" w:firstRow="0" w:lastRow="0" w:firstColumn="0" w:lastColumn="0" w:oddVBand="0" w:evenVBand="0" w:oddHBand="0" w:evenHBand="0" w:firstRowFirstColumn="0" w:firstRowLastColumn="0" w:lastRowFirstColumn="0" w:lastRowLastColumn="0"/>
-            </w:pPr>
-            <w:r>
-              <w:t>user story 2</w:t>
-            </w:r>
-          </w:p>
-        </w:tc>
-        <w:tc>
-          <w:tcPr>
-            <w:tcW w:w="1253" w:type="dxa"/>
-          </w:tcPr>
-          <w:p>
-            <w:pPr>
-              <w:cnfStyle w:val="000000000000" w:firstRow="0" w:lastRow="0" w:firstColumn="0" w:lastColumn="0" w:oddVBand="0" w:evenVBand="0" w:oddHBand="0" w:evenHBand="0" w:firstRowFirstColumn="0" w:firstRowLastColumn="0" w:lastRowFirstColumn="0" w:lastRowLastColumn="0"/>
-            </w:pPr>
-            <w:r>
-              <w:t>Story points</w:t>
+              <w:rPr>
+                <w:rFonts w:ascii="Calibri" w:hAnsi="Calibri" w:cs="Calibri"/>
+              </w:rPr>
+            </w:pPr>
+            <w:r>
+              <w:rPr>
+                <w:rFonts w:ascii="Calibri" w:hAnsi="Calibri" w:cs="Calibri"/>
+              </w:rPr>
+              <w:t>5</w:t>
             </w:r>
           </w:p>
         </w:tc>
@@ -201,52 +294,84 @@
         <w:tc>
           <w:tcPr>
             <w:cnfStyle w:val="001000000000" w:firstRow="0" w:lastRow="0" w:firstColumn="1" w:lastColumn="0" w:oddVBand="0" w:evenVBand="0" w:oddHBand="0" w:evenHBand="0" w:firstRowFirstColumn="0" w:firstRowLastColumn="0" w:lastRowFirstColumn="0" w:lastRowLastColumn="0"/>
-            <w:tcW w:w="279" w:type="dxa"/>
+            <w:tcW w:w="776" w:type="dxa"/>
+            <w:tcBorders>
+              <w:top w:val="single" w:sz="4" w:space="0" w:color="E59EDC" w:themeColor="accent5" w:themeTint="66"/>
+              <w:left w:val="single" w:sz="4" w:space="0" w:color="E59EDC" w:themeColor="accent5" w:themeTint="66"/>
+              <w:bottom w:val="single" w:sz="4" w:space="0" w:color="E59EDC" w:themeColor="accent5" w:themeTint="66"/>
+              <w:right w:val="single" w:sz="4" w:space="0" w:color="E59EDC" w:themeColor="accent5" w:themeTint="66"/>
+            </w:tcBorders>
+            <w:shd w:val="clear" w:color="auto" w:fill="F2CEED" w:themeFill="accent5" w:themeFillTint="33"/>
           </w:tcPr>
           <w:p>
             <w:pPr>
               <w:jc w:val="center"/>
-            </w:pPr>
-          </w:p>
-        </w:tc>
-        <w:tc>
-          <w:tcPr>
-            <w:tcW w:w="425" w:type="dxa"/>
+              <w:rPr>
+                <w:rFonts w:ascii="Calibri" w:hAnsi="Calibri" w:cs="Calibri"/>
+              </w:rPr>
+            </w:pPr>
+            <w:r>
+              <w:rPr>
+                <w:rFonts w:ascii="Calibri" w:hAnsi="Calibri" w:cs="Calibri"/>
+              </w:rPr>
+              <w:t>3</w:t>
+            </w:r>
+          </w:p>
+        </w:tc>
+        <w:tc>
+          <w:tcPr>
+            <w:tcW w:w="6850" w:type="dxa"/>
+            <w:tcBorders>
+              <w:left w:val="single" w:sz="4" w:space="0" w:color="E59EDC" w:themeColor="accent5" w:themeTint="66"/>
+            </w:tcBorders>
+          </w:tcPr>
+          <w:p>
+            <w:pPr>
+              <w:jc w:val="left"/>
+              <w:cnfStyle w:val="000000100000" w:firstRow="0" w:lastRow="0" w:firstColumn="0" w:lastColumn="0" w:oddVBand="0" w:evenVBand="0" w:oddHBand="1" w:evenHBand="0" w:firstRowFirstColumn="0" w:firstRowLastColumn="0" w:lastRowFirstColumn="0" w:lastRowLastColumn="0"/>
+              <w:rPr>
+                <w:rFonts w:ascii="Calibri" w:hAnsi="Calibri" w:cs="Calibri"/>
+              </w:rPr>
+            </w:pPr>
+            <w:r>
+              <w:rPr>
+                <w:rFonts w:ascii="Calibri" w:hAnsi="Calibri" w:cs="Calibri"/>
+              </w:rPr>
+              <w:t xml:space="preserve">As a Patient, I want to book an appointment </w:t>
+            </w:r>
+            <w:proofErr w:type="gramStart"/>
+            <w:r>
+              <w:rPr>
+                <w:rFonts w:ascii="Calibri" w:hAnsi="Calibri" w:cs="Calibri"/>
+              </w:rPr>
+              <w:t>online</w:t>
+            </w:r>
+            <w:proofErr w:type="gramEnd"/>
+            <w:r>
+              <w:rPr>
+                <w:rFonts w:ascii="Calibri" w:hAnsi="Calibri" w:cs="Calibri"/>
+              </w:rPr>
+              <w:t xml:space="preserve"> so I don't have to call the clinic.</w:t>
+            </w:r>
+          </w:p>
+        </w:tc>
+        <w:tc>
+          <w:tcPr>
+            <w:tcW w:w="2157" w:type="dxa"/>
           </w:tcPr>
           <w:p>
             <w:pPr>
               <w:jc w:val="center"/>
               <w:cnfStyle w:val="000000100000" w:firstRow="0" w:lastRow="0" w:firstColumn="0" w:lastColumn="0" w:oddVBand="0" w:evenVBand="0" w:oddHBand="1" w:evenHBand="0" w:firstRowFirstColumn="0" w:firstRowLastColumn="0" w:lastRowFirstColumn="0" w:lastRowLastColumn="0"/>
-            </w:pPr>
-            <w:r>
-              <w:t>3</w:t>
-            </w:r>
-          </w:p>
-        </w:tc>
-        <w:tc>
-          <w:tcPr>
-            <w:tcW w:w="7064" w:type="dxa"/>
-          </w:tcPr>
-          <w:p>
-            <w:pPr>
-              <w:jc w:val="center"/>
-              <w:cnfStyle w:val="000000100000" w:firstRow="0" w:lastRow="0" w:firstColumn="0" w:lastColumn="0" w:oddVBand="0" w:evenVBand="0" w:oddHBand="1" w:evenHBand="0" w:firstRowFirstColumn="0" w:firstRowLastColumn="0" w:lastRowFirstColumn="0" w:lastRowLastColumn="0"/>
-            </w:pPr>
-            <w:r>
-              <w:t>user story 3</w:t>
-            </w:r>
-          </w:p>
-        </w:tc>
-        <w:tc>
-          <w:tcPr>
-            <w:tcW w:w="1253" w:type="dxa"/>
-          </w:tcPr>
-          <w:p>
-            <w:pPr>
-              <w:cnfStyle w:val="000000100000" w:firstRow="0" w:lastRow="0" w:firstColumn="0" w:lastColumn="0" w:oddVBand="0" w:evenVBand="0" w:oddHBand="1" w:evenHBand="0" w:firstRowFirstColumn="0" w:firstRowLastColumn="0" w:lastRowFirstColumn="0" w:lastRowLastColumn="0"/>
-            </w:pPr>
-            <w:r>
-              <w:t>Story points</w:t>
+              <w:rPr>
+                <w:rFonts w:ascii="Calibri" w:hAnsi="Calibri" w:cs="Calibri"/>
+              </w:rPr>
+            </w:pPr>
+            <w:r>
+              <w:rPr>
+                <w:rFonts w:ascii="Calibri" w:hAnsi="Calibri" w:cs="Calibri"/>
+              </w:rPr>
+              <w:t>8</w:t>
             </w:r>
           </w:p>
         </w:tc>
@@ -255,52 +380,69 @@
         <w:tc>
           <w:tcPr>
             <w:cnfStyle w:val="001000000000" w:firstRow="0" w:lastRow="0" w:firstColumn="1" w:lastColumn="0" w:oddVBand="0" w:evenVBand="0" w:oddHBand="0" w:evenHBand="0" w:firstRowFirstColumn="0" w:firstRowLastColumn="0" w:lastRowFirstColumn="0" w:lastRowLastColumn="0"/>
-            <w:tcW w:w="279" w:type="dxa"/>
+            <w:tcW w:w="776" w:type="dxa"/>
+            <w:tcBorders>
+              <w:top w:val="single" w:sz="4" w:space="0" w:color="E59EDC" w:themeColor="accent5" w:themeTint="66"/>
+              <w:left w:val="single" w:sz="4" w:space="0" w:color="E59EDC" w:themeColor="accent5" w:themeTint="66"/>
+              <w:bottom w:val="single" w:sz="4" w:space="0" w:color="E59EDC" w:themeColor="accent5" w:themeTint="66"/>
+              <w:right w:val="single" w:sz="4" w:space="0" w:color="E59EDC" w:themeColor="accent5" w:themeTint="66"/>
+            </w:tcBorders>
           </w:tcPr>
           <w:p>
             <w:pPr>
               <w:jc w:val="center"/>
-            </w:pPr>
-          </w:p>
-        </w:tc>
-        <w:tc>
-          <w:tcPr>
-            <w:tcW w:w="425" w:type="dxa"/>
+              <w:rPr>
+                <w:rFonts w:ascii="Calibri" w:hAnsi="Calibri" w:cs="Calibri"/>
+              </w:rPr>
+            </w:pPr>
+            <w:r>
+              <w:rPr>
+                <w:rFonts w:ascii="Calibri" w:hAnsi="Calibri" w:cs="Calibri"/>
+              </w:rPr>
+              <w:t>4</w:t>
+            </w:r>
+          </w:p>
+        </w:tc>
+        <w:tc>
+          <w:tcPr>
+            <w:tcW w:w="6850" w:type="dxa"/>
+            <w:tcBorders>
+              <w:left w:val="single" w:sz="4" w:space="0" w:color="E59EDC" w:themeColor="accent5" w:themeTint="66"/>
+            </w:tcBorders>
+          </w:tcPr>
+          <w:p>
+            <w:pPr>
+              <w:jc w:val="left"/>
+              <w:cnfStyle w:val="000000000000" w:firstRow="0" w:lastRow="0" w:firstColumn="0" w:lastColumn="0" w:oddVBand="0" w:evenVBand="0" w:oddHBand="0" w:evenHBand="0" w:firstRowFirstColumn="0" w:firstRowLastColumn="0" w:lastRowFirstColumn="0" w:lastRowLastColumn="0"/>
+              <w:rPr>
+                <w:rFonts w:ascii="Calibri" w:hAnsi="Calibri" w:cs="Calibri"/>
+              </w:rPr>
+            </w:pPr>
+            <w:r>
+              <w:rPr>
+                <w:rFonts w:ascii="Calibri" w:hAnsi="Calibri" w:cs="Calibri"/>
+              </w:rPr>
+              <w:t>As a Patient, I want to view my medical records portal so I can track my treatment history.</w:t>
+            </w:r>
+          </w:p>
+        </w:tc>
+        <w:tc>
+          <w:tcPr>
+            <w:tcW w:w="2157" w:type="dxa"/>
           </w:tcPr>
           <w:p>
             <w:pPr>
               <w:jc w:val="center"/>
               <w:cnfStyle w:val="000000000000" w:firstRow="0" w:lastRow="0" w:firstColumn="0" w:lastColumn="0" w:oddVBand="0" w:evenVBand="0" w:oddHBand="0" w:evenHBand="0" w:firstRowFirstColumn="0" w:firstRowLastColumn="0" w:lastRowFirstColumn="0" w:lastRowLastColumn="0"/>
-            </w:pPr>
-            <w:r>
-              <w:t>4</w:t>
-            </w:r>
-          </w:p>
-        </w:tc>
-        <w:tc>
-          <w:tcPr>
-            <w:tcW w:w="7064" w:type="dxa"/>
-          </w:tcPr>
-          <w:p>
-            <w:pPr>
-              <w:jc w:val="center"/>
-              <w:cnfStyle w:val="000000000000" w:firstRow="0" w:lastRow="0" w:firstColumn="0" w:lastColumn="0" w:oddVBand="0" w:evenVBand="0" w:oddHBand="0" w:evenHBand="0" w:firstRowFirstColumn="0" w:firstRowLastColumn="0" w:lastRowFirstColumn="0" w:lastRowLastColumn="0"/>
-            </w:pPr>
-            <w:r>
-              <w:t>user story 4</w:t>
-            </w:r>
-          </w:p>
-        </w:tc>
-        <w:tc>
-          <w:tcPr>
-            <w:tcW w:w="1253" w:type="dxa"/>
-          </w:tcPr>
-          <w:p>
-            <w:pPr>
-              <w:cnfStyle w:val="000000000000" w:firstRow="0" w:lastRow="0" w:firstColumn="0" w:lastColumn="0" w:oddVBand="0" w:evenVBand="0" w:oddHBand="0" w:evenHBand="0" w:firstRowFirstColumn="0" w:firstRowLastColumn="0" w:lastRowFirstColumn="0" w:lastRowLastColumn="0"/>
-            </w:pPr>
-            <w:r>
-              <w:t>Story points</w:t>
+              <w:rPr>
+                <w:rFonts w:ascii="Calibri" w:hAnsi="Calibri" w:cs="Calibri"/>
+              </w:rPr>
+            </w:pPr>
+            <w:r>
+              <w:rPr>
+                <w:rFonts w:ascii="Calibri" w:hAnsi="Calibri" w:cs="Calibri"/>
+              </w:rPr>
+              <w:t>5</w:t>
             </w:r>
           </w:p>
         </w:tc>
@@ -312,52 +454,244 @@
         <w:tc>
           <w:tcPr>
             <w:cnfStyle w:val="001000000000" w:firstRow="0" w:lastRow="0" w:firstColumn="1" w:lastColumn="0" w:oddVBand="0" w:evenVBand="0" w:oddHBand="0" w:evenHBand="0" w:firstRowFirstColumn="0" w:firstRowLastColumn="0" w:lastRowFirstColumn="0" w:lastRowLastColumn="0"/>
-            <w:tcW w:w="279" w:type="dxa"/>
+            <w:tcW w:w="776" w:type="dxa"/>
+            <w:tcBorders>
+              <w:top w:val="single" w:sz="4" w:space="0" w:color="E59EDC" w:themeColor="accent5" w:themeTint="66"/>
+              <w:left w:val="single" w:sz="4" w:space="0" w:color="E59EDC" w:themeColor="accent5" w:themeTint="66"/>
+              <w:bottom w:val="single" w:sz="4" w:space="0" w:color="E59EDC" w:themeColor="accent5" w:themeTint="66"/>
+              <w:right w:val="single" w:sz="4" w:space="0" w:color="E59EDC" w:themeColor="accent5" w:themeTint="66"/>
+            </w:tcBorders>
+            <w:shd w:val="clear" w:color="auto" w:fill="F2CEED" w:themeFill="accent5" w:themeFillTint="33"/>
           </w:tcPr>
           <w:p>
             <w:pPr>
               <w:jc w:val="center"/>
-            </w:pPr>
-          </w:p>
-        </w:tc>
-        <w:tc>
-          <w:tcPr>
-            <w:tcW w:w="425" w:type="dxa"/>
+              <w:rPr>
+                <w:rFonts w:ascii="Calibri" w:hAnsi="Calibri" w:cs="Calibri"/>
+              </w:rPr>
+            </w:pPr>
+            <w:r>
+              <w:rPr>
+                <w:rFonts w:ascii="Calibri" w:hAnsi="Calibri" w:cs="Calibri"/>
+              </w:rPr>
+              <w:t>5</w:t>
+            </w:r>
+          </w:p>
+        </w:tc>
+        <w:tc>
+          <w:tcPr>
+            <w:tcW w:w="6850" w:type="dxa"/>
+            <w:tcBorders>
+              <w:left w:val="single" w:sz="4" w:space="0" w:color="E59EDC" w:themeColor="accent5" w:themeTint="66"/>
+            </w:tcBorders>
+          </w:tcPr>
+          <w:p>
+            <w:pPr>
+              <w:jc w:val="left"/>
+              <w:cnfStyle w:val="000000100000" w:firstRow="0" w:lastRow="0" w:firstColumn="0" w:lastColumn="0" w:oddVBand="0" w:evenVBand="0" w:oddHBand="1" w:evenHBand="0" w:firstRowFirstColumn="0" w:firstRowLastColumn="0" w:lastRowFirstColumn="0" w:lastRowLastColumn="0"/>
+              <w:rPr>
+                <w:rFonts w:ascii="Calibri" w:hAnsi="Calibri" w:cs="Calibri"/>
+              </w:rPr>
+            </w:pPr>
+            <w:r>
+              <w:rPr>
+                <w:rFonts w:ascii="Calibri" w:hAnsi="Calibri" w:cs="Calibri"/>
+              </w:rPr>
+              <w:t>As a Doctor, I want to view my daily bookings so I can see which patients I am seeing.</w:t>
+            </w:r>
+          </w:p>
+        </w:tc>
+        <w:tc>
+          <w:tcPr>
+            <w:tcW w:w="2157" w:type="dxa"/>
           </w:tcPr>
           <w:p>
             <w:pPr>
               <w:jc w:val="center"/>
               <w:cnfStyle w:val="000000100000" w:firstRow="0" w:lastRow="0" w:firstColumn="0" w:lastColumn="0" w:oddVBand="0" w:evenVBand="0" w:oddHBand="1" w:evenHBand="0" w:firstRowFirstColumn="0" w:firstRowLastColumn="0" w:lastRowFirstColumn="0" w:lastRowLastColumn="0"/>
-            </w:pPr>
-            <w:r>
-              <w:t>5</w:t>
-            </w:r>
-          </w:p>
-        </w:tc>
-        <w:tc>
-          <w:tcPr>
-            <w:tcW w:w="7064" w:type="dxa"/>
+              <w:rPr>
+                <w:rFonts w:ascii="Calibri" w:hAnsi="Calibri" w:cs="Calibri"/>
+              </w:rPr>
+            </w:pPr>
+            <w:r>
+              <w:rPr>
+                <w:rFonts w:ascii="Calibri" w:hAnsi="Calibri" w:cs="Calibri"/>
+              </w:rPr>
+              <w:t>3</w:t>
+            </w:r>
+          </w:p>
+        </w:tc>
+      </w:tr>
+      <w:tr>
+        <w:tc>
+          <w:tcPr>
+            <w:cnfStyle w:val="001000000000" w:firstRow="0" w:lastRow="0" w:firstColumn="1" w:lastColumn="0" w:oddVBand="0" w:evenVBand="0" w:oddHBand="0" w:evenHBand="0" w:firstRowFirstColumn="0" w:firstRowLastColumn="0" w:lastRowFirstColumn="0" w:lastRowLastColumn="0"/>
+            <w:tcW w:w="776" w:type="dxa"/>
+            <w:tcBorders>
+              <w:top w:val="single" w:sz="4" w:space="0" w:color="E59EDC" w:themeColor="accent5" w:themeTint="66"/>
+              <w:left w:val="single" w:sz="4" w:space="0" w:color="E59EDC" w:themeColor="accent5" w:themeTint="66"/>
+              <w:bottom w:val="single" w:sz="4" w:space="0" w:color="E59EDC" w:themeColor="accent5" w:themeTint="66"/>
+              <w:right w:val="single" w:sz="4" w:space="0" w:color="E59EDC" w:themeColor="accent5" w:themeTint="66"/>
+            </w:tcBorders>
+          </w:tcPr>
+          <w:p>
+            <w:pPr>
+              <w:jc w:val="center"/>
+              <w:rPr>
+                <w:rFonts w:ascii="Calibri" w:hAnsi="Calibri" w:cs="Calibri"/>
+              </w:rPr>
+            </w:pPr>
+            <w:r>
+              <w:rPr>
+                <w:rFonts w:ascii="Calibri" w:hAnsi="Calibri" w:cs="Calibri"/>
+              </w:rPr>
+              <w:t>6</w:t>
+            </w:r>
+          </w:p>
+        </w:tc>
+        <w:tc>
+          <w:tcPr>
+            <w:tcW w:w="6850" w:type="dxa"/>
+            <w:tcBorders>
+              <w:left w:val="single" w:sz="4" w:space="0" w:color="E59EDC" w:themeColor="accent5" w:themeTint="66"/>
+            </w:tcBorders>
+          </w:tcPr>
+          <w:p>
+            <w:pPr>
+              <w:jc w:val="left"/>
+              <w:cnfStyle w:val="000000000000" w:firstRow="0" w:lastRow="0" w:firstColumn="0" w:lastColumn="0" w:oddVBand="0" w:evenVBand="0" w:oddHBand="0" w:evenHBand="0" w:firstRowFirstColumn="0" w:firstRowLastColumn="0" w:lastRowFirstColumn="0" w:lastRowLastColumn="0"/>
+              <w:rPr>
+                <w:rFonts w:ascii="Calibri" w:hAnsi="Calibri" w:cs="Calibri"/>
+              </w:rPr>
+            </w:pPr>
+            <w:r>
+              <w:rPr>
+                <w:rFonts w:ascii="Calibri" w:hAnsi="Calibri" w:cs="Calibri"/>
+              </w:rPr>
+              <w:t xml:space="preserve">As a Patient, I want to receive an appointment </w:t>
+            </w:r>
+            <w:proofErr w:type="gramStart"/>
+            <w:r>
+              <w:rPr>
+                <w:rFonts w:ascii="Calibri" w:hAnsi="Calibri" w:cs="Calibri"/>
+              </w:rPr>
+              <w:t>confirmation</w:t>
+            </w:r>
+            <w:proofErr w:type="gramEnd"/>
+            <w:r>
+              <w:rPr>
+                <w:rFonts w:ascii="Calibri" w:hAnsi="Calibri" w:cs="Calibri"/>
+              </w:rPr>
+              <w:t xml:space="preserve"> so I know my booking was successful.</w:t>
+            </w:r>
+          </w:p>
+        </w:tc>
+        <w:tc>
+          <w:tcPr>
+            <w:tcW w:w="2157" w:type="dxa"/>
+          </w:tcPr>
+          <w:p>
+            <w:pPr>
+              <w:jc w:val="center"/>
+              <w:cnfStyle w:val="000000000000" w:firstRow="0" w:lastRow="0" w:firstColumn="0" w:lastColumn="0" w:oddVBand="0" w:evenVBand="0" w:oddHBand="0" w:evenHBand="0" w:firstRowFirstColumn="0" w:firstRowLastColumn="0" w:lastRowFirstColumn="0" w:lastRowLastColumn="0"/>
+              <w:rPr>
+                <w:rFonts w:ascii="Calibri" w:hAnsi="Calibri" w:cs="Calibri"/>
+              </w:rPr>
+            </w:pPr>
+            <w:r>
+              <w:rPr>
+                <w:rFonts w:ascii="Calibri" w:hAnsi="Calibri" w:cs="Calibri"/>
+              </w:rPr>
+              <w:t>2</w:t>
+            </w:r>
+          </w:p>
+        </w:tc>
+      </w:tr>
+      <w:tr>
+        <w:trPr>
+          <w:cnfStyle w:val="000000100000" w:firstRow="0" w:lastRow="0" w:firstColumn="0" w:lastColumn="0" w:oddVBand="0" w:evenVBand="0" w:oddHBand="1" w:evenHBand="0" w:firstRowFirstColumn="0" w:firstRowLastColumn="0" w:lastRowFirstColumn="0" w:lastRowLastColumn="0"/>
+        </w:trPr>
+        <w:tc>
+          <w:tcPr>
+            <w:cnfStyle w:val="001000000000" w:firstRow="0" w:lastRow="0" w:firstColumn="1" w:lastColumn="0" w:oddVBand="0" w:evenVBand="0" w:oddHBand="0" w:evenHBand="0" w:firstRowFirstColumn="0" w:firstRowLastColumn="0" w:lastRowFirstColumn="0" w:lastRowLastColumn="0"/>
+            <w:tcW w:w="776" w:type="dxa"/>
+            <w:tcBorders>
+              <w:top w:val="single" w:sz="4" w:space="0" w:color="E59EDC" w:themeColor="accent5" w:themeTint="66"/>
+              <w:left w:val="single" w:sz="4" w:space="0" w:color="E59EDC" w:themeColor="accent5" w:themeTint="66"/>
+              <w:bottom w:val="single" w:sz="4" w:space="0" w:color="E59EDC" w:themeColor="accent5" w:themeTint="66"/>
+              <w:right w:val="single" w:sz="4" w:space="0" w:color="E59EDC" w:themeColor="accent5" w:themeTint="66"/>
+            </w:tcBorders>
+            <w:shd w:val="clear" w:color="auto" w:fill="F2CEED" w:themeFill="accent5" w:themeFillTint="33"/>
+          </w:tcPr>
+          <w:p>
+            <w:pPr>
+              <w:jc w:val="center"/>
+              <w:rPr>
+                <w:rFonts w:ascii="Calibri" w:hAnsi="Calibri" w:cs="Calibri"/>
+              </w:rPr>
+            </w:pPr>
+            <w:r>
+              <w:rPr>
+                <w:rFonts w:ascii="Calibri" w:hAnsi="Calibri" w:cs="Calibri"/>
+              </w:rPr>
+              <w:t>7</w:t>
+            </w:r>
+          </w:p>
+        </w:tc>
+        <w:tc>
+          <w:tcPr>
+            <w:tcW w:w="6850" w:type="dxa"/>
+            <w:tcBorders>
+              <w:left w:val="single" w:sz="4" w:space="0" w:color="E59EDC" w:themeColor="accent5" w:themeTint="66"/>
+            </w:tcBorders>
+          </w:tcPr>
+          <w:p>
+            <w:pPr>
+              <w:jc w:val="left"/>
+              <w:cnfStyle w:val="000000100000" w:firstRow="0" w:lastRow="0" w:firstColumn="0" w:lastColumn="0" w:oddVBand="0" w:evenVBand="0" w:oddHBand="1" w:evenHBand="0" w:firstRowFirstColumn="0" w:firstRowLastColumn="0" w:lastRowFirstColumn="0" w:lastRowLastColumn="0"/>
+              <w:rPr>
+                <w:rFonts w:ascii="Calibri" w:hAnsi="Calibri" w:cs="Calibri"/>
+              </w:rPr>
+            </w:pPr>
+            <w:r>
+              <w:rPr>
+                <w:rFonts w:ascii="Calibri" w:hAnsi="Calibri" w:cs="Calibri"/>
+              </w:rPr>
+              <w:t xml:space="preserve">As an Admin, I want to register a new patient with their name and </w:t>
+            </w:r>
+            <w:proofErr w:type="gramStart"/>
+            <w:r>
+              <w:rPr>
+                <w:rFonts w:ascii="Calibri" w:hAnsi="Calibri" w:cs="Calibri"/>
+              </w:rPr>
+              <w:t>DOB</w:t>
+            </w:r>
+            <w:proofErr w:type="gramEnd"/>
+            <w:r>
+              <w:rPr>
+                <w:rFonts w:ascii="Calibri" w:hAnsi="Calibri" w:cs="Calibri"/>
+              </w:rPr>
+              <w:t xml:space="preserve"> so their record is created.</w:t>
+            </w:r>
+          </w:p>
+        </w:tc>
+        <w:tc>
+          <w:tcPr>
+            <w:tcW w:w="2157" w:type="dxa"/>
           </w:tcPr>
           <w:p>
             <w:pPr>
               <w:jc w:val="center"/>
               <w:cnfStyle w:val="000000100000" w:firstRow="0" w:lastRow="0" w:firstColumn="0" w:lastColumn="0" w:oddVBand="0" w:evenVBand="0" w:oddHBand="1" w:evenHBand="0" w:firstRowFirstColumn="0" w:firstRowLastColumn="0" w:lastRowFirstColumn="0" w:lastRowLastColumn="0"/>
-            </w:pPr>
-            <w:r>
-              <w:t>user story 5</w:t>
-            </w:r>
-          </w:p>
-        </w:tc>
-        <w:tc>
-          <w:tcPr>
-            <w:tcW w:w="1253" w:type="dxa"/>
-          </w:tcPr>
-          <w:p>
-            <w:pPr>
-              <w:cnfStyle w:val="000000100000" w:firstRow="0" w:lastRow="0" w:firstColumn="0" w:lastColumn="0" w:oddVBand="0" w:evenVBand="0" w:oddHBand="1" w:evenHBand="0" w:firstRowFirstColumn="0" w:firstRowLastColumn="0" w:lastRowFirstColumn="0" w:lastRowLastColumn="0"/>
-            </w:pPr>
-            <w:r>
-              <w:t>Story points</w:t>
+              <w:rPr>
+                <w:rFonts w:ascii="Calibri" w:hAnsi="Calibri" w:cs="Calibri"/>
+              </w:rPr>
+            </w:pPr>
+            <w:r>
+              <w:rPr>
+                <w:rFonts w:ascii="Calibri" w:hAnsi="Calibri" w:cs="Calibri"/>
+              </w:rPr>
+              <w:t>3</w:t>
             </w:r>
           </w:p>
         </w:tc>
@@ -366,77 +700,953 @@
         <w:tc>
           <w:tcPr>
             <w:cnfStyle w:val="001000000000" w:firstRow="0" w:lastRow="0" w:firstColumn="1" w:lastColumn="0" w:oddVBand="0" w:evenVBand="0" w:oddHBand="0" w:evenHBand="0" w:firstRowFirstColumn="0" w:firstRowLastColumn="0" w:lastRowFirstColumn="0" w:lastRowLastColumn="0"/>
-            <w:tcW w:w="279" w:type="dxa"/>
+            <w:tcW w:w="776" w:type="dxa"/>
+            <w:tcBorders>
+              <w:top w:val="single" w:sz="4" w:space="0" w:color="E59EDC" w:themeColor="accent5" w:themeTint="66"/>
+              <w:left w:val="single" w:sz="4" w:space="0" w:color="E59EDC" w:themeColor="accent5" w:themeTint="66"/>
+              <w:bottom w:val="single" w:sz="4" w:space="0" w:color="E59EDC" w:themeColor="accent5" w:themeTint="66"/>
+              <w:right w:val="single" w:sz="4" w:space="0" w:color="E59EDC" w:themeColor="accent5" w:themeTint="66"/>
+            </w:tcBorders>
           </w:tcPr>
           <w:p>
             <w:pPr>
               <w:jc w:val="center"/>
-            </w:pPr>
-          </w:p>
-        </w:tc>
-        <w:tc>
-          <w:tcPr>
-            <w:tcW w:w="425" w:type="dxa"/>
+              <w:rPr>
+                <w:rFonts w:ascii="Calibri" w:hAnsi="Calibri" w:cs="Calibri"/>
+              </w:rPr>
+            </w:pPr>
+            <w:r>
+              <w:rPr>
+                <w:rFonts w:ascii="Calibri" w:hAnsi="Calibri" w:cs="Calibri"/>
+              </w:rPr>
+              <w:t>8</w:t>
+            </w:r>
+          </w:p>
+        </w:tc>
+        <w:tc>
+          <w:tcPr>
+            <w:tcW w:w="6850" w:type="dxa"/>
+            <w:tcBorders>
+              <w:left w:val="single" w:sz="4" w:space="0" w:color="E59EDC" w:themeColor="accent5" w:themeTint="66"/>
+            </w:tcBorders>
+          </w:tcPr>
+          <w:p>
+            <w:pPr>
+              <w:jc w:val="left"/>
+              <w:cnfStyle w:val="000000000000" w:firstRow="0" w:lastRow="0" w:firstColumn="0" w:lastColumn="0" w:oddVBand="0" w:evenVBand="0" w:oddHBand="0" w:evenHBand="0" w:firstRowFirstColumn="0" w:firstRowLastColumn="0" w:lastRowFirstColumn="0" w:lastRowLastColumn="0"/>
+              <w:rPr>
+                <w:rFonts w:ascii="Calibri" w:hAnsi="Calibri" w:cs="Calibri"/>
+              </w:rPr>
+            </w:pPr>
+            <w:r>
+              <w:rPr>
+                <w:rFonts w:ascii="Calibri" w:hAnsi="Calibri" w:cs="Calibri"/>
+              </w:rPr>
+              <w:t>As a Patient, I want to choose a specific doctor for my booking to ensure continuity of care.</w:t>
+            </w:r>
+          </w:p>
+        </w:tc>
+        <w:tc>
+          <w:tcPr>
+            <w:tcW w:w="2157" w:type="dxa"/>
           </w:tcPr>
           <w:p>
             <w:pPr>
               <w:jc w:val="center"/>
               <w:cnfStyle w:val="000000000000" w:firstRow="0" w:lastRow="0" w:firstColumn="0" w:lastColumn="0" w:oddVBand="0" w:evenVBand="0" w:oddHBand="0" w:evenHBand="0" w:firstRowFirstColumn="0" w:firstRowLastColumn="0" w:lastRowFirstColumn="0" w:lastRowLastColumn="0"/>
-            </w:pPr>
-          </w:p>
-        </w:tc>
-        <w:tc>
-          <w:tcPr>
-            <w:tcW w:w="7064" w:type="dxa"/>
+              <w:rPr>
+                <w:rFonts w:ascii="Calibri" w:hAnsi="Calibri" w:cs="Calibri"/>
+              </w:rPr>
+            </w:pPr>
+            <w:r>
+              <w:rPr>
+                <w:rFonts w:ascii="Calibri" w:hAnsi="Calibri" w:cs="Calibri"/>
+              </w:rPr>
+              <w:t>4</w:t>
+            </w:r>
+          </w:p>
+        </w:tc>
+      </w:tr>
+      <w:tr>
+        <w:trPr>
+          <w:cnfStyle w:val="000000100000" w:firstRow="0" w:lastRow="0" w:firstColumn="0" w:lastColumn="0" w:oddVBand="0" w:evenVBand="0" w:oddHBand="1" w:evenHBand="0" w:firstRowFirstColumn="0" w:firstRowLastColumn="0" w:lastRowFirstColumn="0" w:lastRowLastColumn="0"/>
+        </w:trPr>
+        <w:tc>
+          <w:tcPr>
+            <w:cnfStyle w:val="001000000000" w:firstRow="0" w:lastRow="0" w:firstColumn="1" w:lastColumn="0" w:oddVBand="0" w:evenVBand="0" w:oddHBand="0" w:evenHBand="0" w:firstRowFirstColumn="0" w:firstRowLastColumn="0" w:lastRowFirstColumn="0" w:lastRowLastColumn="0"/>
+            <w:tcW w:w="776" w:type="dxa"/>
+            <w:tcBorders>
+              <w:top w:val="single" w:sz="4" w:space="0" w:color="E59EDC" w:themeColor="accent5" w:themeTint="66"/>
+              <w:left w:val="single" w:sz="4" w:space="0" w:color="E59EDC" w:themeColor="accent5" w:themeTint="66"/>
+              <w:bottom w:val="single" w:sz="4" w:space="0" w:color="E59EDC" w:themeColor="accent5" w:themeTint="66"/>
+              <w:right w:val="single" w:sz="4" w:space="0" w:color="E59EDC" w:themeColor="accent5" w:themeTint="66"/>
+            </w:tcBorders>
+            <w:shd w:val="clear" w:color="auto" w:fill="F2CEED" w:themeFill="accent5" w:themeFillTint="33"/>
           </w:tcPr>
           <w:p>
             <w:pPr>
               <w:jc w:val="center"/>
-              <w:cnfStyle w:val="000000000000" w:firstRow="0" w:lastRow="0" w:firstColumn="0" w:lastColumn="0" w:oddVBand="0" w:evenVBand="0" w:oddHBand="0" w:evenHBand="0" w:firstRowFirstColumn="0" w:firstRowLastColumn="0" w:lastRowFirstColumn="0" w:lastRowLastColumn="0"/>
-            </w:pPr>
-            <w:r>
-              <w:t>Add rows as necessary…</w:t>
-            </w:r>
-          </w:p>
-        </w:tc>
-        <w:tc>
-          <w:tcPr>
-            <w:tcW w:w="1253" w:type="dxa"/>
-          </w:tcPr>
-          <w:p>
-            <w:pPr>
-              <w:cnfStyle w:val="000000000000" w:firstRow="0" w:lastRow="0" w:firstColumn="0" w:lastColumn="0" w:oddVBand="0" w:evenVBand="0" w:oddHBand="0" w:evenHBand="0" w:firstRowFirstColumn="0" w:firstRowLastColumn="0" w:lastRowFirstColumn="0" w:lastRowLastColumn="0"/>
-            </w:pPr>
+              <w:rPr>
+                <w:rFonts w:ascii="Calibri" w:hAnsi="Calibri" w:cs="Calibri"/>
+              </w:rPr>
+            </w:pPr>
+            <w:r>
+              <w:rPr>
+                <w:rFonts w:ascii="Calibri" w:hAnsi="Calibri" w:cs="Calibri"/>
+              </w:rPr>
+              <w:t>10</w:t>
+            </w:r>
+          </w:p>
+        </w:tc>
+        <w:tc>
+          <w:tcPr>
+            <w:tcW w:w="6850" w:type="dxa"/>
+            <w:tcBorders>
+              <w:left w:val="single" w:sz="4" w:space="0" w:color="E59EDC" w:themeColor="accent5" w:themeTint="66"/>
+            </w:tcBorders>
+          </w:tcPr>
+          <w:p>
+            <w:pPr>
+              <w:jc w:val="left"/>
+              <w:cnfStyle w:val="000000100000" w:firstRow="0" w:lastRow="0" w:firstColumn="0" w:lastColumn="0" w:oddVBand="0" w:evenVBand="0" w:oddHBand="1" w:evenHBand="0" w:firstRowFirstColumn="0" w:firstRowLastColumn="0" w:lastRowFirstColumn="0" w:lastRowLastColumn="0"/>
+              <w:rPr>
+                <w:rFonts w:ascii="Calibri" w:hAnsi="Calibri" w:cs="Calibri"/>
+              </w:rPr>
+            </w:pPr>
+            <w:r>
+              <w:rPr>
+                <w:rFonts w:ascii="Calibri" w:hAnsi="Calibri" w:cs="Calibri"/>
+              </w:rPr>
+              <w:t>As an Admin, I want to cancel or reschedule appointments to keep the calendar accurate.</w:t>
+            </w:r>
+          </w:p>
+        </w:tc>
+        <w:tc>
+          <w:tcPr>
+            <w:tcW w:w="2157" w:type="dxa"/>
+          </w:tcPr>
+          <w:p>
+            <w:pPr>
+              <w:jc w:val="center"/>
+              <w:cnfStyle w:val="000000100000" w:firstRow="0" w:lastRow="0" w:firstColumn="0" w:lastColumn="0" w:oddVBand="0" w:evenVBand="0" w:oddHBand="1" w:evenHBand="0" w:firstRowFirstColumn="0" w:firstRowLastColumn="0" w:lastRowFirstColumn="0" w:lastRowLastColumn="0"/>
+              <w:rPr>
+                <w:rFonts w:ascii="Calibri" w:hAnsi="Calibri" w:cs="Calibri"/>
+              </w:rPr>
+            </w:pPr>
+            <w:r>
+              <w:rPr>
+                <w:rFonts w:ascii="Calibri" w:hAnsi="Calibri" w:cs="Calibri"/>
+              </w:rPr>
+              <w:t>3</w:t>
+            </w:r>
           </w:p>
         </w:tc>
       </w:tr>
     </w:tbl>
-    <w:p/>
+    <w:p>
+      <w:pPr>
+        <w:jc w:val="left"/>
+        <w:rPr>
+          <w:rFonts w:ascii="Calibri" w:hAnsi="Calibri" w:cs="Calibri"/>
+          <w:b/>
+          <w:bCs/>
+        </w:rPr>
+      </w:pPr>
+    </w:p>
+    <w:p>
+      <w:pPr>
+        <w:jc w:val="left"/>
+        <w:rPr>
+          <w:rFonts w:ascii="Calibri" w:hAnsi="Calibri" w:cs="Calibri"/>
+        </w:rPr>
+      </w:pPr>
+      <w:r>
+        <w:rPr>
+          <w:rFonts w:ascii="Calibri" w:hAnsi="Calibri" w:cs="Calibri"/>
+          <w:b/>
+          <w:bCs/>
+        </w:rPr>
+        <w:t>Note:</w:t>
+      </w:r>
+      <w:r>
+        <w:rPr>
+          <w:rFonts w:ascii="Calibri" w:hAnsi="Calibri" w:cs="Calibri"/>
+        </w:rPr>
+        <w:t xml:space="preserve"> Story 09 (Update Records) remains "Out of Scope" and is generally excluded from the active Product Backlog for this specific release.</w:t>
+      </w:r>
+    </w:p>
+    <w:p>
+      <w:pPr>
+        <w:jc w:val="left"/>
+        <w:rPr>
+          <w:rFonts w:ascii="Calibri" w:hAnsi="Calibri" w:cs="Calibri"/>
+        </w:rPr>
+      </w:pPr>
+    </w:p>
     <w:p>
       <w:pPr>
         <w:pStyle w:val="Heading2"/>
+        <w:rPr>
+          <w:rFonts w:ascii="Calibri" w:hAnsi="Calibri" w:cs="Calibri"/>
+        </w:rPr>
       </w:pPr>
       <w:r>
+        <w:rPr>
+          <w:rFonts w:ascii="Calibri" w:hAnsi="Calibri" w:cs="Calibri"/>
+        </w:rPr>
         <w:t>Sprint summary</w:t>
       </w:r>
     </w:p>
     <w:p>
-      <w:r>
-        <w:t>(A short description of what features were focused on during the sprint and why they were valuable to the user)</w:t>
-      </w:r>
-    </w:p>
-    <w:p/>
-    <w:p>
       <w:pPr>
-        <w:pStyle w:val="Heading2"/>
+        <w:jc w:val="left"/>
+        <w:rPr>
+          <w:rFonts w:ascii="Calibri" w:hAnsi="Calibri" w:cs="Calibri"/>
+        </w:rPr>
       </w:pPr>
       <w:r>
-        <w:t>Sprint Backlog</w:t>
+        <w:rPr>
+          <w:rFonts w:ascii="Calibri" w:hAnsi="Calibri" w:cs="Calibri"/>
+        </w:rPr>
+        <w:t>(A short description of what features were focused on during the sprint and why they were valuable to the user)</w:t>
       </w:r>
     </w:p>
     <w:p>
       <w:pPr>
-        <w:ind w:left="0" w:firstLine="0"/>
+        <w:jc w:val="left"/>
+        <w:rPr>
+          <w:rFonts w:ascii="Calibri" w:hAnsi="Calibri" w:cs="Calibri"/>
+        </w:rPr>
+      </w:pPr>
+    </w:p>
+    <w:p>
+      <w:pPr>
+        <w:pStyle w:val="Heading2"/>
+        <w:rPr>
+          <w:rFonts w:ascii="Calibri" w:hAnsi="Calibri" w:cs="Calibri"/>
+        </w:rPr>
+      </w:pPr>
+      <w:r>
+        <w:rPr>
+          <w:rFonts w:ascii="Calibri" w:hAnsi="Calibri" w:cs="Calibri"/>
+        </w:rPr>
+        <w:t>Sprint Backlog</w:t>
+      </w:r>
+    </w:p>
+    <w:tbl>
+      <w:tblPr>
+        <w:tblStyle w:val="GridTable3-Accent5"/>
+        <w:tblW w:w="5000" w:type="pct"/>
+        <w:tblLook w:val="04A0" w:firstRow="1" w:lastRow="0" w:firstColumn="1" w:lastColumn="0" w:noHBand="0" w:noVBand="1"/>
+      </w:tblPr>
+      <w:tblGrid>
+        <w:gridCol w:w="694"/>
+        <w:gridCol w:w="4907"/>
+        <w:gridCol w:w="2517"/>
+        <w:gridCol w:w="1232"/>
+      </w:tblGrid>
+      <w:tr>
+        <w:trPr>
+          <w:cnfStyle w:val="100000000000" w:firstRow="1" w:lastRow="0" w:firstColumn="0" w:lastColumn="0" w:oddVBand="0" w:evenVBand="0" w:oddHBand="0" w:evenHBand="0" w:firstRowFirstColumn="0" w:firstRowLastColumn="0" w:lastRowFirstColumn="0" w:lastRowLastColumn="0"/>
+        </w:trPr>
+        <w:tc>
+          <w:tcPr>
+            <w:cnfStyle w:val="001000000100" w:firstRow="0" w:lastRow="0" w:firstColumn="1" w:lastColumn="0" w:oddVBand="0" w:evenVBand="0" w:oddHBand="0" w:evenHBand="0" w:firstRowFirstColumn="1" w:firstRowLastColumn="0" w:lastRowFirstColumn="0" w:lastRowLastColumn="0"/>
+            <w:tcW w:w="371" w:type="pct"/>
+            <w:tcBorders>
+              <w:top w:val="single" w:sz="4" w:space="0" w:color="E59EDC" w:themeColor="accent5" w:themeTint="66"/>
+              <w:left w:val="single" w:sz="4" w:space="0" w:color="E59EDC" w:themeColor="accent5" w:themeTint="66"/>
+              <w:bottom w:val="single" w:sz="4" w:space="0" w:color="E59EDC" w:themeColor="accent5" w:themeTint="66"/>
+              <w:right w:val="single" w:sz="4" w:space="0" w:color="E59EDC" w:themeColor="accent5" w:themeTint="66"/>
+            </w:tcBorders>
+          </w:tcPr>
+          <w:p>
+            <w:pPr>
+              <w:jc w:val="center"/>
+              <w:rPr>
+                <w:rFonts w:ascii="Calibri" w:hAnsi="Calibri" w:cs="Calibri"/>
+                <w:i w:val="0"/>
+                <w:iCs w:val="0"/>
+              </w:rPr>
+            </w:pPr>
+            <w:r>
+              <w:rPr>
+                <w:rFonts w:ascii="Calibri" w:hAnsi="Calibri" w:cs="Calibri"/>
+                <w:i w:val="0"/>
+                <w:iCs w:val="0"/>
+              </w:rPr>
+              <w:t>Task ID</w:t>
+            </w:r>
+          </w:p>
+        </w:tc>
+        <w:tc>
+          <w:tcPr>
+            <w:tcW w:w="2624" w:type="pct"/>
+            <w:tcBorders>
+              <w:top w:val="single" w:sz="4" w:space="0" w:color="E59EDC" w:themeColor="accent5" w:themeTint="66"/>
+              <w:left w:val="single" w:sz="4" w:space="0" w:color="E59EDC" w:themeColor="accent5" w:themeTint="66"/>
+              <w:bottom w:val="single" w:sz="4" w:space="0" w:color="E59EDC" w:themeColor="accent5" w:themeTint="66"/>
+              <w:right w:val="single" w:sz="4" w:space="0" w:color="E59EDC" w:themeColor="accent5" w:themeTint="66"/>
+            </w:tcBorders>
+          </w:tcPr>
+          <w:p>
+            <w:pPr>
+              <w:jc w:val="center"/>
+              <w:cnfStyle w:val="100000000000" w:firstRow="1" w:lastRow="0" w:firstColumn="0" w:lastColumn="0" w:oddVBand="0" w:evenVBand="0" w:oddHBand="0" w:evenHBand="0" w:firstRowFirstColumn="0" w:firstRowLastColumn="0" w:lastRowFirstColumn="0" w:lastRowLastColumn="0"/>
+              <w:rPr>
+                <w:rFonts w:ascii="Calibri" w:hAnsi="Calibri" w:cs="Calibri"/>
+              </w:rPr>
+            </w:pPr>
+            <w:r>
+              <w:rPr>
+                <w:rFonts w:ascii="Calibri" w:hAnsi="Calibri" w:cs="Calibri"/>
+              </w:rPr>
+              <w:t>Technical Task</w:t>
+            </w:r>
+          </w:p>
+        </w:tc>
+        <w:tc>
+          <w:tcPr>
+            <w:tcW w:w="1346" w:type="pct"/>
+            <w:tcBorders>
+              <w:top w:val="single" w:sz="4" w:space="0" w:color="E59EDC" w:themeColor="accent5" w:themeTint="66"/>
+              <w:bottom w:val="single" w:sz="4" w:space="0" w:color="E59EDC" w:themeColor="accent5" w:themeTint="66"/>
+            </w:tcBorders>
+          </w:tcPr>
+          <w:p>
+            <w:pPr>
+              <w:jc w:val="center"/>
+              <w:cnfStyle w:val="100000000000" w:firstRow="1" w:lastRow="0" w:firstColumn="0" w:lastColumn="0" w:oddVBand="0" w:evenVBand="0" w:oddHBand="0" w:evenHBand="0" w:firstRowFirstColumn="0" w:firstRowLastColumn="0" w:lastRowFirstColumn="0" w:lastRowLastColumn="0"/>
+              <w:rPr>
+                <w:rFonts w:ascii="Calibri" w:hAnsi="Calibri" w:cs="Calibri"/>
+              </w:rPr>
+            </w:pPr>
+            <w:r>
+              <w:rPr>
+                <w:rFonts w:ascii="Calibri" w:hAnsi="Calibri" w:cs="Calibri"/>
+              </w:rPr>
+              <w:t>Story Link</w:t>
+            </w:r>
+          </w:p>
+        </w:tc>
+        <w:tc>
+          <w:tcPr>
+            <w:tcW w:w="659" w:type="pct"/>
+            <w:tcBorders>
+              <w:top w:val="single" w:sz="4" w:space="0" w:color="E59EDC" w:themeColor="accent5" w:themeTint="66"/>
+              <w:left w:val="single" w:sz="4" w:space="0" w:color="E59EDC" w:themeColor="accent5" w:themeTint="66"/>
+              <w:bottom w:val="single" w:sz="4" w:space="0" w:color="E59EDC" w:themeColor="accent5" w:themeTint="66"/>
+              <w:right w:val="single" w:sz="4" w:space="0" w:color="E59EDC" w:themeColor="accent5" w:themeTint="66"/>
+            </w:tcBorders>
+          </w:tcPr>
+          <w:p>
+            <w:pPr>
+              <w:jc w:val="center"/>
+              <w:cnfStyle w:val="100000000000" w:firstRow="1" w:lastRow="0" w:firstColumn="0" w:lastColumn="0" w:oddVBand="0" w:evenVBand="0" w:oddHBand="0" w:evenHBand="0" w:firstRowFirstColumn="0" w:firstRowLastColumn="0" w:lastRowFirstColumn="0" w:lastRowLastColumn="0"/>
+              <w:rPr>
+                <w:rFonts w:ascii="Calibri" w:hAnsi="Calibri" w:cs="Calibri"/>
+              </w:rPr>
+            </w:pPr>
+            <w:r>
+              <w:rPr>
+                <w:rFonts w:ascii="Calibri" w:hAnsi="Calibri" w:cs="Calibri"/>
+              </w:rPr>
+              <w:t>Estimate</w:t>
+            </w:r>
+          </w:p>
+        </w:tc>
+      </w:tr>
+      <w:tr>
+        <w:trPr>
+          <w:cnfStyle w:val="000000100000" w:firstRow="0" w:lastRow="0" w:firstColumn="0" w:lastColumn="0" w:oddVBand="0" w:evenVBand="0" w:oddHBand="1" w:evenHBand="0" w:firstRowFirstColumn="0" w:firstRowLastColumn="0" w:lastRowFirstColumn="0" w:lastRowLastColumn="0"/>
+        </w:trPr>
+        <w:tc>
+          <w:tcPr>
+            <w:cnfStyle w:val="001000000000" w:firstRow="0" w:lastRow="0" w:firstColumn="1" w:lastColumn="0" w:oddVBand="0" w:evenVBand="0" w:oddHBand="0" w:evenHBand="0" w:firstRowFirstColumn="0" w:firstRowLastColumn="0" w:lastRowFirstColumn="0" w:lastRowLastColumn="0"/>
+            <w:tcW w:w="371" w:type="pct"/>
+            <w:tcBorders>
+              <w:top w:val="single" w:sz="4" w:space="0" w:color="E59EDC" w:themeColor="accent5" w:themeTint="66"/>
+              <w:left w:val="single" w:sz="4" w:space="0" w:color="E59EDC" w:themeColor="accent5" w:themeTint="66"/>
+              <w:bottom w:val="single" w:sz="4" w:space="0" w:color="E59EDC" w:themeColor="accent5" w:themeTint="66"/>
+              <w:right w:val="single" w:sz="4" w:space="0" w:color="E59EDC" w:themeColor="accent5" w:themeTint="66"/>
+            </w:tcBorders>
+            <w:shd w:val="clear" w:color="auto" w:fill="F2CEED" w:themeFill="accent5" w:themeFillTint="33"/>
+          </w:tcPr>
+          <w:p>
+            <w:pPr>
+              <w:jc w:val="center"/>
+              <w:rPr>
+                <w:rFonts w:ascii="Calibri" w:hAnsi="Calibri" w:cs="Calibri"/>
+              </w:rPr>
+            </w:pPr>
+          </w:p>
+        </w:tc>
+        <w:tc>
+          <w:tcPr>
+            <w:tcW w:w="2624" w:type="pct"/>
+            <w:tcBorders>
+              <w:top w:val="single" w:sz="4" w:space="0" w:color="E59EDC" w:themeColor="accent5" w:themeTint="66"/>
+              <w:left w:val="single" w:sz="4" w:space="0" w:color="E59EDC" w:themeColor="accent5" w:themeTint="66"/>
+            </w:tcBorders>
+          </w:tcPr>
+          <w:p>
+            <w:pPr>
+              <w:jc w:val="left"/>
+              <w:cnfStyle w:val="000000100000" w:firstRow="0" w:lastRow="0" w:firstColumn="0" w:lastColumn="0" w:oddVBand="0" w:evenVBand="0" w:oddHBand="1" w:evenHBand="0" w:firstRowFirstColumn="0" w:firstRowLastColumn="0" w:lastRowFirstColumn="0" w:lastRowLastColumn="0"/>
+              <w:rPr>
+                <w:rFonts w:ascii="Calibri" w:hAnsi="Calibri" w:cs="Calibri"/>
+              </w:rPr>
+            </w:pPr>
+            <w:r>
+              <w:rPr>
+                <w:rFonts w:ascii="Calibri" w:hAnsi="Calibri" w:cs="Calibri"/>
+              </w:rPr>
+              <w:t>T5</w:t>
+            </w:r>
+          </w:p>
+        </w:tc>
+        <w:tc>
+          <w:tcPr>
+            <w:tcW w:w="1346" w:type="pct"/>
+            <w:tcBorders>
+              <w:top w:val="single" w:sz="4" w:space="0" w:color="E59EDC" w:themeColor="accent5" w:themeTint="66"/>
+            </w:tcBorders>
+          </w:tcPr>
+          <w:p>
+            <w:pPr>
+              <w:jc w:val="center"/>
+              <w:cnfStyle w:val="000000100000" w:firstRow="0" w:lastRow="0" w:firstColumn="0" w:lastColumn="0" w:oddVBand="0" w:evenVBand="0" w:oddHBand="1" w:evenHBand="0" w:firstRowFirstColumn="0" w:firstRowLastColumn="0" w:lastRowFirstColumn="0" w:lastRowLastColumn="0"/>
+              <w:rPr>
+                <w:rFonts w:ascii="Calibri" w:hAnsi="Calibri" w:cs="Calibri"/>
+                <w:lang w:val="en-US"/>
+              </w:rPr>
+            </w:pPr>
+            <w:r>
+              <w:rPr>
+                <w:rFonts w:ascii="Calibri" w:hAnsi="Calibri" w:cs="Calibri"/>
+                <w:b/>
+                <w:bCs/>
+                <w:lang w:val="en-US"/>
+              </w:rPr>
+              <w:t>Implementation</w:t>
+            </w:r>
+            <w:r>
+              <w:rPr>
+                <w:rFonts w:ascii="Calibri" w:hAnsi="Calibri" w:cs="Calibri"/>
+                <w:lang w:val="en-US"/>
+              </w:rPr>
+              <w:t xml:space="preserve">: Create </w:t>
+            </w:r>
+            <w:proofErr w:type="spellStart"/>
+            <w:r>
+              <w:rPr>
+                <w:rFonts w:ascii="Calibri" w:hAnsi="Calibri" w:cs="Calibri"/>
+                <w:lang w:val="en-US"/>
+              </w:rPr>
+              <w:t>src</w:t>
+            </w:r>
+            <w:proofErr w:type="spellEnd"/>
+            <w:r>
+              <w:rPr>
+                <w:rFonts w:ascii="Calibri" w:hAnsi="Calibri" w:cs="Calibri"/>
+                <w:lang w:val="en-US"/>
+              </w:rPr>
+              <w:t>/lib/server/</w:t>
+            </w:r>
+            <w:proofErr w:type="spellStart"/>
+            <w:r>
+              <w:rPr>
+                <w:rFonts w:ascii="Calibri" w:hAnsi="Calibri" w:cs="Calibri"/>
+                <w:lang w:val="en-US"/>
+              </w:rPr>
+              <w:t>mockData.ts</w:t>
+            </w:r>
+            <w:proofErr w:type="spellEnd"/>
+            <w:r>
+              <w:rPr>
+                <w:rFonts w:ascii="Calibri" w:hAnsi="Calibri" w:cs="Calibri"/>
+                <w:lang w:val="en-US"/>
+              </w:rPr>
+              <w:t xml:space="preserve"> and verify type</w:t>
+            </w:r>
+            <w:r>
+              <w:rPr>
+                <w:rFonts w:ascii="Calibri" w:hAnsi="Calibri" w:cs="Calibri"/>
+                <w:lang w:val="en-US"/>
+              </w:rPr>
+              <w:t>s.</w:t>
+            </w:r>
+          </w:p>
+        </w:tc>
+        <w:tc>
+          <w:tcPr>
+            <w:tcW w:w="659" w:type="pct"/>
+            <w:tcBorders>
+              <w:top w:val="single" w:sz="4" w:space="0" w:color="E59EDC" w:themeColor="accent5" w:themeTint="66"/>
+            </w:tcBorders>
+          </w:tcPr>
+          <w:p>
+            <w:pPr>
+              <w:jc w:val="center"/>
+              <w:cnfStyle w:val="000000100000" w:firstRow="0" w:lastRow="0" w:firstColumn="0" w:lastColumn="0" w:oddVBand="0" w:evenVBand="0" w:oddHBand="1" w:evenHBand="0" w:firstRowFirstColumn="0" w:firstRowLastColumn="0" w:lastRowFirstColumn="0" w:lastRowLastColumn="0"/>
+              <w:rPr>
+                <w:rFonts w:ascii="Calibri" w:hAnsi="Calibri" w:cs="Calibri"/>
+              </w:rPr>
+            </w:pPr>
+            <w:r>
+              <w:rPr>
+                <w:rFonts w:ascii="Calibri" w:hAnsi="Calibri" w:cs="Calibri"/>
+              </w:rPr>
+              <w:t>All</w:t>
+            </w:r>
+          </w:p>
+        </w:tc>
+      </w:tr>
+      <w:tr>
+        <w:tc>
+          <w:tcPr>
+            <w:cnfStyle w:val="001000000000" w:firstRow="0" w:lastRow="0" w:firstColumn="1" w:lastColumn="0" w:oddVBand="0" w:evenVBand="0" w:oddHBand="0" w:evenHBand="0" w:firstRowFirstColumn="0" w:firstRowLastColumn="0" w:lastRowFirstColumn="0" w:lastRowLastColumn="0"/>
+            <w:tcW w:w="371" w:type="pct"/>
+            <w:tcBorders>
+              <w:top w:val="single" w:sz="4" w:space="0" w:color="E59EDC" w:themeColor="accent5" w:themeTint="66"/>
+              <w:left w:val="single" w:sz="4" w:space="0" w:color="E59EDC" w:themeColor="accent5" w:themeTint="66"/>
+              <w:bottom w:val="single" w:sz="4" w:space="0" w:color="E59EDC" w:themeColor="accent5" w:themeTint="66"/>
+              <w:right w:val="single" w:sz="4" w:space="0" w:color="E59EDC" w:themeColor="accent5" w:themeTint="66"/>
+            </w:tcBorders>
+          </w:tcPr>
+          <w:p>
+            <w:pPr>
+              <w:jc w:val="center"/>
+              <w:rPr>
+                <w:rFonts w:ascii="Calibri" w:hAnsi="Calibri" w:cs="Calibri"/>
+              </w:rPr>
+            </w:pPr>
+            <w:r>
+              <w:rPr>
+                <w:rFonts w:ascii="Calibri" w:hAnsi="Calibri" w:cs="Calibri"/>
+              </w:rPr>
+              <w:t>T6</w:t>
+            </w:r>
+          </w:p>
+        </w:tc>
+        <w:tc>
+          <w:tcPr>
+            <w:tcW w:w="2624" w:type="pct"/>
+            <w:tcBorders>
+              <w:left w:val="single" w:sz="4" w:space="0" w:color="E59EDC" w:themeColor="accent5" w:themeTint="66"/>
+            </w:tcBorders>
+          </w:tcPr>
+          <w:p>
+            <w:pPr>
+              <w:jc w:val="left"/>
+              <w:cnfStyle w:val="000000000000" w:firstRow="0" w:lastRow="0" w:firstColumn="0" w:lastColumn="0" w:oddVBand="0" w:evenVBand="0" w:oddHBand="0" w:evenHBand="0" w:firstRowFirstColumn="0" w:firstRowLastColumn="0" w:lastRowFirstColumn="0" w:lastRowLastColumn="0"/>
+              <w:rPr>
+                <w:rFonts w:ascii="Calibri" w:hAnsi="Calibri" w:cs="Calibri"/>
+                <w:lang w:val="en-US"/>
+              </w:rPr>
+            </w:pPr>
+            <w:r>
+              <w:rPr>
+                <w:rFonts w:ascii="Calibri" w:hAnsi="Calibri" w:cs="Calibri"/>
+                <w:b/>
+                <w:bCs/>
+                <w:lang w:val="en-US"/>
+              </w:rPr>
+              <w:t>Security</w:t>
+            </w:r>
+            <w:r>
+              <w:rPr>
+                <w:rFonts w:ascii="Calibri" w:hAnsi="Calibri" w:cs="Calibri"/>
+                <w:lang w:val="en-US"/>
+              </w:rPr>
+              <w:t>: Build +</w:t>
+            </w:r>
+            <w:proofErr w:type="spellStart"/>
+            <w:r>
+              <w:rPr>
+                <w:rFonts w:ascii="Calibri" w:hAnsi="Calibri" w:cs="Calibri"/>
+                <w:lang w:val="en-US"/>
+              </w:rPr>
+              <w:t>page.server.ts</w:t>
+            </w:r>
+            <w:proofErr w:type="spellEnd"/>
+            <w:r>
+              <w:rPr>
+                <w:rFonts w:ascii="Calibri" w:hAnsi="Calibri" w:cs="Calibri"/>
+                <w:lang w:val="en-US"/>
+              </w:rPr>
+              <w:t xml:space="preserve"> actions for login validation.</w:t>
+            </w:r>
+          </w:p>
+          <w:p>
+            <w:pPr>
+              <w:jc w:val="left"/>
+              <w:cnfStyle w:val="000000000000" w:firstRow="0" w:lastRow="0" w:firstColumn="0" w:lastColumn="0" w:oddVBand="0" w:evenVBand="0" w:oddHBand="0" w:evenHBand="0" w:firstRowFirstColumn="0" w:firstRowLastColumn="0" w:lastRowFirstColumn="0" w:lastRowLastColumn="0"/>
+              <w:rPr>
+                <w:rFonts w:ascii="Calibri" w:hAnsi="Calibri" w:cs="Calibri"/>
+              </w:rPr>
+            </w:pPr>
+          </w:p>
+        </w:tc>
+        <w:tc>
+          <w:tcPr>
+            <w:tcW w:w="1346" w:type="pct"/>
+          </w:tcPr>
+          <w:p>
+            <w:pPr>
+              <w:jc w:val="center"/>
+              <w:cnfStyle w:val="000000000000" w:firstRow="0" w:lastRow="0" w:firstColumn="0" w:lastColumn="0" w:oddVBand="0" w:evenVBand="0" w:oddHBand="0" w:evenHBand="0" w:firstRowFirstColumn="0" w:firstRowLastColumn="0" w:lastRowFirstColumn="0" w:lastRowLastColumn="0"/>
+              <w:rPr>
+                <w:rFonts w:ascii="Calibri" w:hAnsi="Calibri" w:cs="Calibri"/>
+              </w:rPr>
+            </w:pPr>
+            <w:r>
+              <w:rPr>
+                <w:rFonts w:ascii="Calibri" w:hAnsi="Calibri" w:cs="Calibri"/>
+              </w:rPr>
+              <w:lastRenderedPageBreak/>
+              <w:t>Story 01</w:t>
+            </w:r>
+          </w:p>
+        </w:tc>
+        <w:tc>
+          <w:tcPr>
+            <w:tcW w:w="659" w:type="pct"/>
+          </w:tcPr>
+          <w:p>
+            <w:pPr>
+              <w:jc w:val="center"/>
+              <w:cnfStyle w:val="000000000000" w:firstRow="0" w:lastRow="0" w:firstColumn="0" w:lastColumn="0" w:oddVBand="0" w:evenVBand="0" w:oddHBand="0" w:evenHBand="0" w:firstRowFirstColumn="0" w:firstRowLastColumn="0" w:lastRowFirstColumn="0" w:lastRowLastColumn="0"/>
+              <w:rPr>
+                <w:rFonts w:ascii="Calibri" w:hAnsi="Calibri" w:cs="Calibri"/>
+              </w:rPr>
+            </w:pPr>
+            <w:r>
+              <w:rPr>
+                <w:rFonts w:ascii="Calibri" w:hAnsi="Calibri" w:cs="Calibri"/>
+              </w:rPr>
+              <w:t>3</w:t>
+            </w:r>
+          </w:p>
+        </w:tc>
+      </w:tr>
+      <w:tr>
+        <w:trPr>
+          <w:cnfStyle w:val="000000100000" w:firstRow="0" w:lastRow="0" w:firstColumn="0" w:lastColumn="0" w:oddVBand="0" w:evenVBand="0" w:oddHBand="1" w:evenHBand="0" w:firstRowFirstColumn="0" w:firstRowLastColumn="0" w:lastRowFirstColumn="0" w:lastRowLastColumn="0"/>
+        </w:trPr>
+        <w:tc>
+          <w:tcPr>
+            <w:cnfStyle w:val="001000000000" w:firstRow="0" w:lastRow="0" w:firstColumn="1" w:lastColumn="0" w:oddVBand="0" w:evenVBand="0" w:oddHBand="0" w:evenHBand="0" w:firstRowFirstColumn="0" w:firstRowLastColumn="0" w:lastRowFirstColumn="0" w:lastRowLastColumn="0"/>
+            <w:tcW w:w="371" w:type="pct"/>
+            <w:tcBorders>
+              <w:top w:val="single" w:sz="4" w:space="0" w:color="E59EDC" w:themeColor="accent5" w:themeTint="66"/>
+              <w:left w:val="single" w:sz="4" w:space="0" w:color="E59EDC" w:themeColor="accent5" w:themeTint="66"/>
+              <w:bottom w:val="single" w:sz="4" w:space="0" w:color="E59EDC" w:themeColor="accent5" w:themeTint="66"/>
+              <w:right w:val="single" w:sz="4" w:space="0" w:color="E59EDC" w:themeColor="accent5" w:themeTint="66"/>
+            </w:tcBorders>
+            <w:shd w:val="clear" w:color="auto" w:fill="F2CEED" w:themeFill="accent5" w:themeFillTint="33"/>
+          </w:tcPr>
+          <w:p>
+            <w:pPr>
+              <w:jc w:val="center"/>
+              <w:rPr>
+                <w:rFonts w:ascii="Calibri" w:hAnsi="Calibri" w:cs="Calibri"/>
+              </w:rPr>
+            </w:pPr>
+            <w:r>
+              <w:rPr>
+                <w:rFonts w:ascii="Calibri" w:hAnsi="Calibri" w:cs="Calibri"/>
+              </w:rPr>
+              <w:t>T7</w:t>
+            </w:r>
+          </w:p>
+        </w:tc>
+        <w:tc>
+          <w:tcPr>
+            <w:tcW w:w="2624" w:type="pct"/>
+            <w:tcBorders>
+              <w:left w:val="single" w:sz="4" w:space="0" w:color="E59EDC" w:themeColor="accent5" w:themeTint="66"/>
+            </w:tcBorders>
+          </w:tcPr>
+          <w:p>
+            <w:pPr>
+              <w:jc w:val="left"/>
+              <w:cnfStyle w:val="000000100000" w:firstRow="0" w:lastRow="0" w:firstColumn="0" w:lastColumn="0" w:oddVBand="0" w:evenVBand="0" w:oddHBand="1" w:evenHBand="0" w:firstRowFirstColumn="0" w:firstRowLastColumn="0" w:lastRowFirstColumn="0" w:lastRowLastColumn="0"/>
+              <w:rPr>
+                <w:rFonts w:ascii="Calibri" w:hAnsi="Calibri" w:cs="Calibri"/>
+              </w:rPr>
+            </w:pPr>
+            <w:r>
+              <w:rPr>
+                <w:rFonts w:ascii="Calibri" w:hAnsi="Calibri" w:cs="Calibri"/>
+                <w:b/>
+                <w:bCs/>
+              </w:rPr>
+              <w:t>Frontend</w:t>
+            </w:r>
+            <w:r>
+              <w:rPr>
+                <w:rFonts w:ascii="Calibri" w:hAnsi="Calibri" w:cs="Calibri"/>
+              </w:rPr>
+              <w:t>: Build Login UI with Tailwind CSS forms plugin.</w:t>
+            </w:r>
+          </w:p>
+        </w:tc>
+        <w:tc>
+          <w:tcPr>
+            <w:tcW w:w="1346" w:type="pct"/>
+          </w:tcPr>
+          <w:p>
+            <w:pPr>
+              <w:jc w:val="center"/>
+              <w:cnfStyle w:val="000000100000" w:firstRow="0" w:lastRow="0" w:firstColumn="0" w:lastColumn="0" w:oddVBand="0" w:evenVBand="0" w:oddHBand="1" w:evenHBand="0" w:firstRowFirstColumn="0" w:firstRowLastColumn="0" w:lastRowFirstColumn="0" w:lastRowLastColumn="0"/>
+              <w:rPr>
+                <w:rFonts w:ascii="Calibri" w:hAnsi="Calibri" w:cs="Calibri"/>
+              </w:rPr>
+            </w:pPr>
+            <w:r>
+              <w:rPr>
+                <w:rFonts w:ascii="Calibri" w:hAnsi="Calibri" w:cs="Calibri"/>
+              </w:rPr>
+              <w:t>Story 01</w:t>
+            </w:r>
+          </w:p>
+        </w:tc>
+        <w:tc>
+          <w:tcPr>
+            <w:tcW w:w="659" w:type="pct"/>
+          </w:tcPr>
+          <w:p>
+            <w:pPr>
+              <w:jc w:val="center"/>
+              <w:cnfStyle w:val="000000100000" w:firstRow="0" w:lastRow="0" w:firstColumn="0" w:lastColumn="0" w:oddVBand="0" w:evenVBand="0" w:oddHBand="1" w:evenHBand="0" w:firstRowFirstColumn="0" w:firstRowLastColumn="0" w:lastRowFirstColumn="0" w:lastRowLastColumn="0"/>
+              <w:rPr>
+                <w:rFonts w:ascii="Calibri" w:hAnsi="Calibri" w:cs="Calibri"/>
+              </w:rPr>
+            </w:pPr>
+            <w:r>
+              <w:rPr>
+                <w:rFonts w:ascii="Calibri" w:hAnsi="Calibri" w:cs="Calibri"/>
+              </w:rPr>
+              <w:t>3</w:t>
+            </w:r>
+          </w:p>
+        </w:tc>
+      </w:tr>
+      <w:tr>
+        <w:tc>
+          <w:tcPr>
+            <w:cnfStyle w:val="001000000000" w:firstRow="0" w:lastRow="0" w:firstColumn="1" w:lastColumn="0" w:oddVBand="0" w:evenVBand="0" w:oddHBand="0" w:evenHBand="0" w:firstRowFirstColumn="0" w:firstRowLastColumn="0" w:lastRowFirstColumn="0" w:lastRowLastColumn="0"/>
+            <w:tcW w:w="371" w:type="pct"/>
+            <w:tcBorders>
+              <w:top w:val="single" w:sz="4" w:space="0" w:color="E59EDC" w:themeColor="accent5" w:themeTint="66"/>
+              <w:left w:val="single" w:sz="4" w:space="0" w:color="E59EDC" w:themeColor="accent5" w:themeTint="66"/>
+              <w:bottom w:val="single" w:sz="4" w:space="0" w:color="E59EDC" w:themeColor="accent5" w:themeTint="66"/>
+              <w:right w:val="single" w:sz="4" w:space="0" w:color="E59EDC" w:themeColor="accent5" w:themeTint="66"/>
+            </w:tcBorders>
+          </w:tcPr>
+          <w:p>
+            <w:pPr>
+              <w:jc w:val="center"/>
+              <w:rPr>
+                <w:rFonts w:ascii="Calibri" w:hAnsi="Calibri" w:cs="Calibri"/>
+              </w:rPr>
+            </w:pPr>
+            <w:r>
+              <w:rPr>
+                <w:rFonts w:ascii="Calibri" w:hAnsi="Calibri" w:cs="Calibri"/>
+              </w:rPr>
+              <w:t>T8</w:t>
+            </w:r>
+          </w:p>
+        </w:tc>
+        <w:tc>
+          <w:tcPr>
+            <w:tcW w:w="2624" w:type="pct"/>
+            <w:tcBorders>
+              <w:left w:val="single" w:sz="4" w:space="0" w:color="E59EDC" w:themeColor="accent5" w:themeTint="66"/>
+            </w:tcBorders>
+          </w:tcPr>
+          <w:p>
+            <w:pPr>
+              <w:jc w:val="left"/>
+              <w:cnfStyle w:val="000000000000" w:firstRow="0" w:lastRow="0" w:firstColumn="0" w:lastColumn="0" w:oddVBand="0" w:evenVBand="0" w:oddHBand="0" w:evenHBand="0" w:firstRowFirstColumn="0" w:firstRowLastColumn="0" w:lastRowFirstColumn="0" w:lastRowLastColumn="0"/>
+              <w:rPr>
+                <w:rFonts w:ascii="Calibri" w:hAnsi="Calibri" w:cs="Calibri"/>
+                <w:lang w:val="en-US"/>
+              </w:rPr>
+            </w:pPr>
+            <w:r>
+              <w:rPr>
+                <w:rFonts w:ascii="Calibri" w:hAnsi="Calibri" w:cs="Calibri"/>
+                <w:b/>
+                <w:bCs/>
+                <w:lang w:val="en-US"/>
+              </w:rPr>
+              <w:t>TDD</w:t>
+            </w:r>
+            <w:r>
+              <w:rPr>
+                <w:rFonts w:ascii="Calibri" w:hAnsi="Calibri" w:cs="Calibri"/>
+                <w:lang w:val="en-US"/>
+              </w:rPr>
+              <w:t xml:space="preserve">: Write Unit Tests for Login logic using the </w:t>
+            </w:r>
+            <w:r>
+              <w:rPr>
+                <w:rFonts w:ascii="Calibri" w:hAnsi="Calibri" w:cs="Calibri"/>
+                <w:b/>
+                <w:bCs/>
+                <w:lang w:val="en-US"/>
+              </w:rPr>
+              <w:t>AAA pattern</w:t>
+            </w:r>
+            <w:r>
+              <w:rPr>
+                <w:rFonts w:ascii="Calibri" w:hAnsi="Calibri" w:cs="Calibri"/>
+                <w:lang w:val="en-US"/>
+              </w:rPr>
+              <w:t>.</w:t>
+            </w:r>
+          </w:p>
+          <w:p>
+            <w:pPr>
+              <w:jc w:val="left"/>
+              <w:cnfStyle w:val="000000000000" w:firstRow="0" w:lastRow="0" w:firstColumn="0" w:lastColumn="0" w:oddVBand="0" w:evenVBand="0" w:oddHBand="0" w:evenHBand="0" w:firstRowFirstColumn="0" w:firstRowLastColumn="0" w:lastRowFirstColumn="0" w:lastRowLastColumn="0"/>
+              <w:rPr>
+                <w:rFonts w:ascii="Calibri" w:hAnsi="Calibri" w:cs="Calibri"/>
+              </w:rPr>
+            </w:pPr>
+          </w:p>
+        </w:tc>
+        <w:tc>
+          <w:tcPr>
+            <w:tcW w:w="1346" w:type="pct"/>
+          </w:tcPr>
+          <w:p>
+            <w:pPr>
+              <w:jc w:val="center"/>
+              <w:cnfStyle w:val="000000000000" w:firstRow="0" w:lastRow="0" w:firstColumn="0" w:lastColumn="0" w:oddVBand="0" w:evenVBand="0" w:oddHBand="0" w:evenHBand="0" w:firstRowFirstColumn="0" w:firstRowLastColumn="0" w:lastRowFirstColumn="0" w:lastRowLastColumn="0"/>
+              <w:rPr>
+                <w:rFonts w:ascii="Calibri" w:hAnsi="Calibri" w:cs="Calibri"/>
+              </w:rPr>
+            </w:pPr>
+            <w:r>
+              <w:rPr>
+                <w:rFonts w:ascii="Calibri" w:hAnsi="Calibri" w:cs="Calibri"/>
+              </w:rPr>
+              <w:t>Story 01</w:t>
+            </w:r>
+          </w:p>
+        </w:tc>
+        <w:tc>
+          <w:tcPr>
+            <w:tcW w:w="659" w:type="pct"/>
+          </w:tcPr>
+          <w:p>
+            <w:pPr>
+              <w:jc w:val="center"/>
+              <w:cnfStyle w:val="000000000000" w:firstRow="0" w:lastRow="0" w:firstColumn="0" w:lastColumn="0" w:oddVBand="0" w:evenVBand="0" w:oddHBand="0" w:evenHBand="0" w:firstRowFirstColumn="0" w:firstRowLastColumn="0" w:lastRowFirstColumn="0" w:lastRowLastColumn="0"/>
+              <w:rPr>
+                <w:rFonts w:ascii="Calibri" w:hAnsi="Calibri" w:cs="Calibri"/>
+              </w:rPr>
+            </w:pPr>
+            <w:r>
+              <w:rPr>
+                <w:rFonts w:ascii="Calibri" w:hAnsi="Calibri" w:cs="Calibri"/>
+              </w:rPr>
+              <w:t>3</w:t>
+            </w:r>
+          </w:p>
+        </w:tc>
+      </w:tr>
+    </w:tbl>
+    <w:p>
+      <w:pPr>
+        <w:jc w:val="left"/>
+        <w:rPr>
+          <w:rFonts w:ascii="Calibri" w:hAnsi="Calibri" w:cs="Calibri"/>
+        </w:rPr>
+      </w:pPr>
+    </w:p>
+    <w:p>
+      <w:pPr>
+        <w:jc w:val="left"/>
+        <w:rPr>
+          <w:rFonts w:ascii="Calibri" w:hAnsi="Calibri" w:cs="Calibri"/>
+        </w:rPr>
+      </w:pPr>
+    </w:p>
+    <w:p>
+      <w:pPr>
+        <w:pStyle w:val="Heading2"/>
+        <w:rPr>
+          <w:rFonts w:ascii="Calibri" w:hAnsi="Calibri" w:cs="Calibri"/>
+        </w:rPr>
+      </w:pPr>
+      <w:r>
+        <w:rPr>
+          <w:rFonts w:ascii="Calibri" w:hAnsi="Calibri" w:cs="Calibri"/>
+        </w:rPr>
+        <w:t>Code and evidence of version control:</w:t>
+      </w:r>
+    </w:p>
+    <w:p>
+      <w:pPr>
+        <w:jc w:val="left"/>
+        <w:rPr>
+          <w:rFonts w:ascii="Calibri" w:hAnsi="Calibri" w:cs="Calibri"/>
+        </w:rPr>
+      </w:pPr>
+      <w:r>
+        <w:rPr>
+          <w:rFonts w:ascii="Calibri" w:hAnsi="Calibri" w:cs="Calibri"/>
+        </w:rPr>
+        <w:t>&lt;Insert link to GitHub repo&gt;</w:t>
+      </w:r>
+    </w:p>
+    <w:p>
+      <w:pPr>
+        <w:jc w:val="left"/>
+        <w:rPr>
+          <w:rFonts w:ascii="Calibri" w:hAnsi="Calibri" w:cs="Calibri"/>
+        </w:rPr>
+      </w:pPr>
+    </w:p>
+    <w:p>
+      <w:pPr>
+        <w:pStyle w:val="Heading2"/>
+        <w:rPr>
+          <w:rFonts w:ascii="Calibri" w:hAnsi="Calibri" w:cs="Calibri"/>
+        </w:rPr>
+      </w:pPr>
+      <w:r>
+        <w:rPr>
+          <w:rFonts w:ascii="Calibri" w:hAnsi="Calibri" w:cs="Calibri"/>
+        </w:rPr>
+        <w:t>Completed</w:t>
+      </w:r>
+    </w:p>
+    <w:p>
+      <w:pPr>
+        <w:jc w:val="left"/>
+        <w:rPr>
+          <w:rFonts w:ascii="Calibri" w:hAnsi="Calibri" w:cs="Calibri"/>
+        </w:rPr>
+      </w:pPr>
+      <w:r>
+        <w:rPr>
+          <w:rFonts w:ascii="Calibri" w:hAnsi="Calibri" w:cs="Calibri"/>
+        </w:rPr>
+        <w:t>Sprint Review: (A short description of what features were completed in the last sprint)</w:t>
+      </w:r>
+    </w:p>
+    <w:p>
+      <w:pPr>
+        <w:jc w:val="left"/>
+        <w:rPr>
+          <w:rFonts w:ascii="Calibri" w:hAnsi="Calibri" w:cs="Calibri"/>
+        </w:rPr>
       </w:pPr>
     </w:p>
     <w:tbl>
@@ -448,439 +1658,7 @@
       </w:tblPr>
       <w:tblGrid>
         <w:gridCol w:w="279"/>
-        <w:gridCol w:w="432"/>
-        <w:gridCol w:w="7064"/>
-        <w:gridCol w:w="1253"/>
-      </w:tblGrid>
-      <w:tr>
-        <w:trPr>
-          <w:cnfStyle w:val="100000000000" w:firstRow="1" w:lastRow="0" w:firstColumn="0" w:lastColumn="0" w:oddVBand="0" w:evenVBand="0" w:oddHBand="0" w:evenHBand="0" w:firstRowFirstColumn="0" w:firstRowLastColumn="0" w:lastRowFirstColumn="0" w:lastRowLastColumn="0"/>
-        </w:trPr>
-        <w:tc>
-          <w:tcPr>
-            <w:cnfStyle w:val="001000000100" w:firstRow="0" w:lastRow="0" w:firstColumn="1" w:lastColumn="0" w:oddVBand="0" w:evenVBand="0" w:oddHBand="0" w:evenHBand="0" w:firstRowFirstColumn="1" w:firstRowLastColumn="0" w:lastRowFirstColumn="0" w:lastRowLastColumn="0"/>
-            <w:tcW w:w="279" w:type="dxa"/>
-          </w:tcPr>
-          <w:p>
-            <w:pPr>
-              <w:jc w:val="center"/>
-            </w:pPr>
-          </w:p>
-        </w:tc>
-        <w:tc>
-          <w:tcPr>
-            <w:tcW w:w="425" w:type="dxa"/>
-          </w:tcPr>
-          <w:p>
-            <w:pPr>
-              <w:jc w:val="center"/>
-              <w:cnfStyle w:val="100000000000" w:firstRow="1" w:lastRow="0" w:firstColumn="0" w:lastColumn="0" w:oddVBand="0" w:evenVBand="0" w:oddHBand="0" w:evenHBand="0" w:firstRowFirstColumn="0" w:firstRowLastColumn="0" w:lastRowFirstColumn="0" w:lastRowLastColumn="0"/>
-            </w:pPr>
-          </w:p>
-        </w:tc>
-        <w:tc>
-          <w:tcPr>
-            <w:tcW w:w="7064" w:type="dxa"/>
-          </w:tcPr>
-          <w:p>
-            <w:pPr>
-              <w:jc w:val="center"/>
-              <w:cnfStyle w:val="100000000000" w:firstRow="1" w:lastRow="0" w:firstColumn="0" w:lastColumn="0" w:oddVBand="0" w:evenVBand="0" w:oddHBand="0" w:evenHBand="0" w:firstRowFirstColumn="0" w:firstRowLastColumn="0" w:lastRowFirstColumn="0" w:lastRowLastColumn="0"/>
-            </w:pPr>
-            <w:r>
-              <w:t>User story</w:t>
-            </w:r>
-          </w:p>
-        </w:tc>
-        <w:tc>
-          <w:tcPr>
-            <w:tcW w:w="1253" w:type="dxa"/>
-          </w:tcPr>
-          <w:p>
-            <w:pPr>
-              <w:cnfStyle w:val="100000000000" w:firstRow="1" w:lastRow="0" w:firstColumn="0" w:lastColumn="0" w:oddVBand="0" w:evenVBand="0" w:oddHBand="0" w:evenHBand="0" w:firstRowFirstColumn="0" w:firstRowLastColumn="0" w:lastRowFirstColumn="0" w:lastRowLastColumn="0"/>
-            </w:pPr>
-            <w:r>
-              <w:t>Estimate</w:t>
-            </w:r>
-          </w:p>
-        </w:tc>
-      </w:tr>
-      <w:tr>
-        <w:trPr>
-          <w:cnfStyle w:val="000000100000" w:firstRow="0" w:lastRow="0" w:firstColumn="0" w:lastColumn="0" w:oddVBand="0" w:evenVBand="0" w:oddHBand="1" w:evenHBand="0" w:firstRowFirstColumn="0" w:firstRowLastColumn="0" w:lastRowFirstColumn="0" w:lastRowLastColumn="0"/>
-        </w:trPr>
-        <w:tc>
-          <w:tcPr>
-            <w:cnfStyle w:val="001000000000" w:firstRow="0" w:lastRow="0" w:firstColumn="1" w:lastColumn="0" w:oddVBand="0" w:evenVBand="0" w:oddHBand="0" w:evenHBand="0" w:firstRowFirstColumn="0" w:firstRowLastColumn="0" w:lastRowFirstColumn="0" w:lastRowLastColumn="0"/>
-            <w:tcW w:w="279" w:type="dxa"/>
-          </w:tcPr>
-          <w:p>
-            <w:pPr>
-              <w:jc w:val="center"/>
-            </w:pPr>
-          </w:p>
-        </w:tc>
-        <w:tc>
-          <w:tcPr>
-            <w:tcW w:w="425" w:type="dxa"/>
-          </w:tcPr>
-          <w:p>
-            <w:pPr>
-              <w:jc w:val="center"/>
-              <w:cnfStyle w:val="000000100000" w:firstRow="0" w:lastRow="0" w:firstColumn="0" w:lastColumn="0" w:oddVBand="0" w:evenVBand="0" w:oddHBand="1" w:evenHBand="0" w:firstRowFirstColumn="0" w:firstRowLastColumn="0" w:lastRowFirstColumn="0" w:lastRowLastColumn="0"/>
-            </w:pPr>
-            <w:r>
-              <w:t>1</w:t>
-            </w:r>
-          </w:p>
-        </w:tc>
-        <w:tc>
-          <w:tcPr>
-            <w:tcW w:w="7064" w:type="dxa"/>
-          </w:tcPr>
-          <w:p>
-            <w:pPr>
-              <w:jc w:val="center"/>
-              <w:cnfStyle w:val="000000100000" w:firstRow="0" w:lastRow="0" w:firstColumn="0" w:lastColumn="0" w:oddVBand="0" w:evenVBand="0" w:oddHBand="1" w:evenHBand="0" w:firstRowFirstColumn="0" w:firstRowLastColumn="0" w:lastRowFirstColumn="0" w:lastRowLastColumn="0"/>
-            </w:pPr>
-            <w:r>
-              <w:t>user story 1</w:t>
-            </w:r>
-          </w:p>
-        </w:tc>
-        <w:tc>
-          <w:tcPr>
-            <w:tcW w:w="1253" w:type="dxa"/>
-          </w:tcPr>
-          <w:p>
-            <w:pPr>
-              <w:cnfStyle w:val="000000100000" w:firstRow="0" w:lastRow="0" w:firstColumn="0" w:lastColumn="0" w:oddVBand="0" w:evenVBand="0" w:oddHBand="1" w:evenHBand="0" w:firstRowFirstColumn="0" w:firstRowLastColumn="0" w:lastRowFirstColumn="0" w:lastRowLastColumn="0"/>
-            </w:pPr>
-            <w:r>
-              <w:t>Story points</w:t>
-            </w:r>
-          </w:p>
-        </w:tc>
-      </w:tr>
-      <w:tr>
-        <w:tc>
-          <w:tcPr>
-            <w:cnfStyle w:val="001000000000" w:firstRow="0" w:lastRow="0" w:firstColumn="1" w:lastColumn="0" w:oddVBand="0" w:evenVBand="0" w:oddHBand="0" w:evenHBand="0" w:firstRowFirstColumn="0" w:firstRowLastColumn="0" w:lastRowFirstColumn="0" w:lastRowLastColumn="0"/>
-            <w:tcW w:w="279" w:type="dxa"/>
-          </w:tcPr>
-          <w:p>
-            <w:pPr>
-              <w:jc w:val="center"/>
-            </w:pPr>
-          </w:p>
-        </w:tc>
-        <w:tc>
-          <w:tcPr>
-            <w:tcW w:w="425" w:type="dxa"/>
-          </w:tcPr>
-          <w:p>
-            <w:pPr>
-              <w:jc w:val="center"/>
-              <w:cnfStyle w:val="000000000000" w:firstRow="0" w:lastRow="0" w:firstColumn="0" w:lastColumn="0" w:oddVBand="0" w:evenVBand="0" w:oddHBand="0" w:evenHBand="0" w:firstRowFirstColumn="0" w:firstRowLastColumn="0" w:lastRowFirstColumn="0" w:lastRowLastColumn="0"/>
-            </w:pPr>
-            <w:r>
-              <w:t>2</w:t>
-            </w:r>
-          </w:p>
-        </w:tc>
-        <w:tc>
-          <w:tcPr>
-            <w:tcW w:w="7064" w:type="dxa"/>
-          </w:tcPr>
-          <w:p>
-            <w:pPr>
-              <w:jc w:val="center"/>
-              <w:cnfStyle w:val="000000000000" w:firstRow="0" w:lastRow="0" w:firstColumn="0" w:lastColumn="0" w:oddVBand="0" w:evenVBand="0" w:oddHBand="0" w:evenHBand="0" w:firstRowFirstColumn="0" w:firstRowLastColumn="0" w:lastRowFirstColumn="0" w:lastRowLastColumn="0"/>
-            </w:pPr>
-            <w:r>
-              <w:t>user story 2</w:t>
-            </w:r>
-          </w:p>
-        </w:tc>
-        <w:tc>
-          <w:tcPr>
-            <w:tcW w:w="1253" w:type="dxa"/>
-          </w:tcPr>
-          <w:p>
-            <w:pPr>
-              <w:cnfStyle w:val="000000000000" w:firstRow="0" w:lastRow="0" w:firstColumn="0" w:lastColumn="0" w:oddVBand="0" w:evenVBand="0" w:oddHBand="0" w:evenHBand="0" w:firstRowFirstColumn="0" w:firstRowLastColumn="0" w:lastRowFirstColumn="0" w:lastRowLastColumn="0"/>
-            </w:pPr>
-            <w:r>
-              <w:t>Story points</w:t>
-            </w:r>
-          </w:p>
-        </w:tc>
-      </w:tr>
-      <w:tr>
-        <w:trPr>
-          <w:cnfStyle w:val="000000100000" w:firstRow="0" w:lastRow="0" w:firstColumn="0" w:lastColumn="0" w:oddVBand="0" w:evenVBand="0" w:oddHBand="1" w:evenHBand="0" w:firstRowFirstColumn="0" w:firstRowLastColumn="0" w:lastRowFirstColumn="0" w:lastRowLastColumn="0"/>
-        </w:trPr>
-        <w:tc>
-          <w:tcPr>
-            <w:cnfStyle w:val="001000000000" w:firstRow="0" w:lastRow="0" w:firstColumn="1" w:lastColumn="0" w:oddVBand="0" w:evenVBand="0" w:oddHBand="0" w:evenHBand="0" w:firstRowFirstColumn="0" w:firstRowLastColumn="0" w:lastRowFirstColumn="0" w:lastRowLastColumn="0"/>
-            <w:tcW w:w="279" w:type="dxa"/>
-          </w:tcPr>
-          <w:p>
-            <w:pPr>
-              <w:jc w:val="center"/>
-            </w:pPr>
-          </w:p>
-        </w:tc>
-        <w:tc>
-          <w:tcPr>
-            <w:tcW w:w="425" w:type="dxa"/>
-          </w:tcPr>
-          <w:p>
-            <w:pPr>
-              <w:jc w:val="center"/>
-              <w:cnfStyle w:val="000000100000" w:firstRow="0" w:lastRow="0" w:firstColumn="0" w:lastColumn="0" w:oddVBand="0" w:evenVBand="0" w:oddHBand="1" w:evenHBand="0" w:firstRowFirstColumn="0" w:firstRowLastColumn="0" w:lastRowFirstColumn="0" w:lastRowLastColumn="0"/>
-            </w:pPr>
-            <w:r>
-              <w:t>3</w:t>
-            </w:r>
-          </w:p>
-        </w:tc>
-        <w:tc>
-          <w:tcPr>
-            <w:tcW w:w="7064" w:type="dxa"/>
-          </w:tcPr>
-          <w:p>
-            <w:pPr>
-              <w:jc w:val="center"/>
-              <w:cnfStyle w:val="000000100000" w:firstRow="0" w:lastRow="0" w:firstColumn="0" w:lastColumn="0" w:oddVBand="0" w:evenVBand="0" w:oddHBand="1" w:evenHBand="0" w:firstRowFirstColumn="0" w:firstRowLastColumn="0" w:lastRowFirstColumn="0" w:lastRowLastColumn="0"/>
-            </w:pPr>
-            <w:r>
-              <w:t>user story 3</w:t>
-            </w:r>
-          </w:p>
-        </w:tc>
-        <w:tc>
-          <w:tcPr>
-            <w:tcW w:w="1253" w:type="dxa"/>
-          </w:tcPr>
-          <w:p>
-            <w:pPr>
-              <w:cnfStyle w:val="000000100000" w:firstRow="0" w:lastRow="0" w:firstColumn="0" w:lastColumn="0" w:oddVBand="0" w:evenVBand="0" w:oddHBand="1" w:evenHBand="0" w:firstRowFirstColumn="0" w:firstRowLastColumn="0" w:lastRowFirstColumn="0" w:lastRowLastColumn="0"/>
-            </w:pPr>
-            <w:r>
-              <w:t>Story points</w:t>
-            </w:r>
-          </w:p>
-        </w:tc>
-      </w:tr>
-      <w:tr>
-        <w:tc>
-          <w:tcPr>
-            <w:cnfStyle w:val="001000000000" w:firstRow="0" w:lastRow="0" w:firstColumn="1" w:lastColumn="0" w:oddVBand="0" w:evenVBand="0" w:oddHBand="0" w:evenHBand="0" w:firstRowFirstColumn="0" w:firstRowLastColumn="0" w:lastRowFirstColumn="0" w:lastRowLastColumn="0"/>
-            <w:tcW w:w="279" w:type="dxa"/>
-          </w:tcPr>
-          <w:p>
-            <w:pPr>
-              <w:jc w:val="center"/>
-            </w:pPr>
-          </w:p>
-        </w:tc>
-        <w:tc>
-          <w:tcPr>
-            <w:tcW w:w="425" w:type="dxa"/>
-          </w:tcPr>
-          <w:p>
-            <w:pPr>
-              <w:jc w:val="center"/>
-              <w:cnfStyle w:val="000000000000" w:firstRow="0" w:lastRow="0" w:firstColumn="0" w:lastColumn="0" w:oddVBand="0" w:evenVBand="0" w:oddHBand="0" w:evenHBand="0" w:firstRowFirstColumn="0" w:firstRowLastColumn="0" w:lastRowFirstColumn="0" w:lastRowLastColumn="0"/>
-            </w:pPr>
-            <w:r>
-              <w:t>4</w:t>
-            </w:r>
-          </w:p>
-        </w:tc>
-        <w:tc>
-          <w:tcPr>
-            <w:tcW w:w="7064" w:type="dxa"/>
-          </w:tcPr>
-          <w:p>
-            <w:pPr>
-              <w:jc w:val="center"/>
-              <w:cnfStyle w:val="000000000000" w:firstRow="0" w:lastRow="0" w:firstColumn="0" w:lastColumn="0" w:oddVBand="0" w:evenVBand="0" w:oddHBand="0" w:evenHBand="0" w:firstRowFirstColumn="0" w:firstRowLastColumn="0" w:lastRowFirstColumn="0" w:lastRowLastColumn="0"/>
-            </w:pPr>
-            <w:r>
-              <w:t>user story 4</w:t>
-            </w:r>
-          </w:p>
-        </w:tc>
-        <w:tc>
-          <w:tcPr>
-            <w:tcW w:w="1253" w:type="dxa"/>
-          </w:tcPr>
-          <w:p>
-            <w:pPr>
-              <w:cnfStyle w:val="000000000000" w:firstRow="0" w:lastRow="0" w:firstColumn="0" w:lastColumn="0" w:oddVBand="0" w:evenVBand="0" w:oddHBand="0" w:evenHBand="0" w:firstRowFirstColumn="0" w:firstRowLastColumn="0" w:lastRowFirstColumn="0" w:lastRowLastColumn="0"/>
-            </w:pPr>
-            <w:r>
-              <w:t>Story points</w:t>
-            </w:r>
-          </w:p>
-        </w:tc>
-      </w:tr>
-      <w:tr>
-        <w:trPr>
-          <w:cnfStyle w:val="000000100000" w:firstRow="0" w:lastRow="0" w:firstColumn="0" w:lastColumn="0" w:oddVBand="0" w:evenVBand="0" w:oddHBand="1" w:evenHBand="0" w:firstRowFirstColumn="0" w:firstRowLastColumn="0" w:lastRowFirstColumn="0" w:lastRowLastColumn="0"/>
-        </w:trPr>
-        <w:tc>
-          <w:tcPr>
-            <w:cnfStyle w:val="001000000000" w:firstRow="0" w:lastRow="0" w:firstColumn="1" w:lastColumn="0" w:oddVBand="0" w:evenVBand="0" w:oddHBand="0" w:evenHBand="0" w:firstRowFirstColumn="0" w:firstRowLastColumn="0" w:lastRowFirstColumn="0" w:lastRowLastColumn="0"/>
-            <w:tcW w:w="279" w:type="dxa"/>
-          </w:tcPr>
-          <w:p>
-            <w:pPr>
-              <w:jc w:val="center"/>
-            </w:pPr>
-          </w:p>
-        </w:tc>
-        <w:tc>
-          <w:tcPr>
-            <w:tcW w:w="425" w:type="dxa"/>
-          </w:tcPr>
-          <w:p>
-            <w:pPr>
-              <w:jc w:val="center"/>
-              <w:cnfStyle w:val="000000100000" w:firstRow="0" w:lastRow="0" w:firstColumn="0" w:lastColumn="0" w:oddVBand="0" w:evenVBand="0" w:oddHBand="1" w:evenHBand="0" w:firstRowFirstColumn="0" w:firstRowLastColumn="0" w:lastRowFirstColumn="0" w:lastRowLastColumn="0"/>
-            </w:pPr>
-            <w:r>
-              <w:t>5</w:t>
-            </w:r>
-          </w:p>
-        </w:tc>
-        <w:tc>
-          <w:tcPr>
-            <w:tcW w:w="7064" w:type="dxa"/>
-          </w:tcPr>
-          <w:p>
-            <w:pPr>
-              <w:jc w:val="center"/>
-              <w:cnfStyle w:val="000000100000" w:firstRow="0" w:lastRow="0" w:firstColumn="0" w:lastColumn="0" w:oddVBand="0" w:evenVBand="0" w:oddHBand="1" w:evenHBand="0" w:firstRowFirstColumn="0" w:firstRowLastColumn="0" w:lastRowFirstColumn="0" w:lastRowLastColumn="0"/>
-            </w:pPr>
-            <w:r>
-              <w:t>user story 5</w:t>
-            </w:r>
-          </w:p>
-        </w:tc>
-        <w:tc>
-          <w:tcPr>
-            <w:tcW w:w="1253" w:type="dxa"/>
-          </w:tcPr>
-          <w:p>
-            <w:pPr>
-              <w:cnfStyle w:val="000000100000" w:firstRow="0" w:lastRow="0" w:firstColumn="0" w:lastColumn="0" w:oddVBand="0" w:evenVBand="0" w:oddHBand="1" w:evenHBand="0" w:firstRowFirstColumn="0" w:firstRowLastColumn="0" w:lastRowFirstColumn="0" w:lastRowLastColumn="0"/>
-            </w:pPr>
-            <w:r>
-              <w:t>Story points</w:t>
-            </w:r>
-          </w:p>
-        </w:tc>
-      </w:tr>
-      <w:tr>
-        <w:tc>
-          <w:tcPr>
-            <w:cnfStyle w:val="001000000000" w:firstRow="0" w:lastRow="0" w:firstColumn="1" w:lastColumn="0" w:oddVBand="0" w:evenVBand="0" w:oddHBand="0" w:evenHBand="0" w:firstRowFirstColumn="0" w:firstRowLastColumn="0" w:lastRowFirstColumn="0" w:lastRowLastColumn="0"/>
-            <w:tcW w:w="279" w:type="dxa"/>
-          </w:tcPr>
-          <w:p>
-            <w:pPr>
-              <w:jc w:val="center"/>
-            </w:pPr>
-          </w:p>
-        </w:tc>
-        <w:tc>
-          <w:tcPr>
-            <w:tcW w:w="425" w:type="dxa"/>
-          </w:tcPr>
-          <w:p>
-            <w:pPr>
-              <w:jc w:val="center"/>
-              <w:cnfStyle w:val="000000000000" w:firstRow="0" w:lastRow="0" w:firstColumn="0" w:lastColumn="0" w:oddVBand="0" w:evenVBand="0" w:oddHBand="0" w:evenHBand="0" w:firstRowFirstColumn="0" w:firstRowLastColumn="0" w:lastRowFirstColumn="0" w:lastRowLastColumn="0"/>
-            </w:pPr>
-          </w:p>
-        </w:tc>
-        <w:tc>
-          <w:tcPr>
-            <w:tcW w:w="7064" w:type="dxa"/>
-          </w:tcPr>
-          <w:p>
-            <w:pPr>
-              <w:jc w:val="center"/>
-              <w:cnfStyle w:val="000000000000" w:firstRow="0" w:lastRow="0" w:firstColumn="0" w:lastColumn="0" w:oddVBand="0" w:evenVBand="0" w:oddHBand="0" w:evenHBand="0" w:firstRowFirstColumn="0" w:firstRowLastColumn="0" w:lastRowFirstColumn="0" w:lastRowLastColumn="0"/>
-            </w:pPr>
-            <w:r>
-              <w:t>Add rows as necessary…</w:t>
-            </w:r>
-          </w:p>
-        </w:tc>
-        <w:tc>
-          <w:tcPr>
-            <w:tcW w:w="1253" w:type="dxa"/>
-          </w:tcPr>
-          <w:p>
-            <w:pPr>
-              <w:cnfStyle w:val="000000000000" w:firstRow="0" w:lastRow="0" w:firstColumn="0" w:lastColumn="0" w:oddVBand="0" w:evenVBand="0" w:oddHBand="0" w:evenHBand="0" w:firstRowFirstColumn="0" w:firstRowLastColumn="0" w:lastRowFirstColumn="0" w:lastRowLastColumn="0"/>
-            </w:pPr>
-          </w:p>
-        </w:tc>
-      </w:tr>
-    </w:tbl>
-    <w:p/>
-    <w:p/>
-    <w:p>
-      <w:pPr>
-        <w:pStyle w:val="Heading2"/>
-      </w:pPr>
-      <w:r>
-        <w:lastRenderedPageBreak/>
-        <w:t>Code and evidence of version control:</w:t>
-      </w:r>
-    </w:p>
-    <w:p>
-      <w:r>
-        <w:t>&lt;Insert link to GitHub repo&gt;</w:t>
-      </w:r>
-    </w:p>
-    <w:p/>
-    <w:p>
-      <w:pPr>
-        <w:pStyle w:val="Heading2"/>
-      </w:pPr>
-      <w:r>
-        <w:t>Completed</w:t>
-      </w:r>
-    </w:p>
-    <w:p>
-      <w:r>
-        <w:t>Sprint Review:</w:t>
-      </w:r>
-      <w:r>
-        <w:t xml:space="preserve"> </w:t>
-      </w:r>
-      <w:r>
-        <w:t>(A short description of what features were completed in the last sprint)</w:t>
-      </w:r>
-    </w:p>
-    <w:p/>
-    <w:tbl>
-      <w:tblPr>
-        <w:tblStyle w:val="GridTable3-Accent5"/>
-        <w:tblW w:w="0" w:type="auto"/>
-        <w:tblInd w:w="5" w:type="dxa"/>
-        <w:tblLook w:val="04A0" w:firstRow="1" w:lastRow="0" w:firstColumn="1" w:lastColumn="0" w:noHBand="0" w:noVBand="1"/>
-      </w:tblPr>
-      <w:tblGrid>
-        <w:gridCol w:w="279"/>
-        <w:gridCol w:w="432"/>
+        <w:gridCol w:w="422"/>
         <w:gridCol w:w="7206"/>
         <w:gridCol w:w="1253"/>
       </w:tblGrid>
@@ -895,7 +1673,10 @@
           </w:tcPr>
           <w:p>
             <w:pPr>
-              <w:jc w:val="center"/>
+              <w:jc w:val="left"/>
+              <w:rPr>
+                <w:rFonts w:ascii="Calibri" w:hAnsi="Calibri" w:cs="Calibri"/>
+              </w:rPr>
             </w:pPr>
           </w:p>
         </w:tc>
@@ -905,8 +1686,11 @@
           </w:tcPr>
           <w:p>
             <w:pPr>
-              <w:jc w:val="center"/>
+              <w:jc w:val="left"/>
               <w:cnfStyle w:val="100000000000" w:firstRow="1" w:lastRow="0" w:firstColumn="0" w:lastColumn="0" w:oddVBand="0" w:evenVBand="0" w:oddHBand="0" w:evenHBand="0" w:firstRowFirstColumn="0" w:firstRowLastColumn="0" w:lastRowFirstColumn="0" w:lastRowLastColumn="0"/>
+              <w:rPr>
+                <w:rFonts w:ascii="Calibri" w:hAnsi="Calibri" w:cs="Calibri"/>
+              </w:rPr>
             </w:pPr>
           </w:p>
         </w:tc>
@@ -916,10 +1700,16 @@
           </w:tcPr>
           <w:p>
             <w:pPr>
-              <w:jc w:val="center"/>
+              <w:jc w:val="left"/>
               <w:cnfStyle w:val="100000000000" w:firstRow="1" w:lastRow="0" w:firstColumn="0" w:lastColumn="0" w:oddVBand="0" w:evenVBand="0" w:oddHBand="0" w:evenHBand="0" w:firstRowFirstColumn="0" w:firstRowLastColumn="0" w:lastRowFirstColumn="0" w:lastRowLastColumn="0"/>
-            </w:pPr>
-            <w:r>
+              <w:rPr>
+                <w:rFonts w:ascii="Calibri" w:hAnsi="Calibri" w:cs="Calibri"/>
+              </w:rPr>
+            </w:pPr>
+            <w:r>
+              <w:rPr>
+                <w:rFonts w:ascii="Calibri" w:hAnsi="Calibri" w:cs="Calibri"/>
+              </w:rPr>
               <w:t>User story</w:t>
             </w:r>
           </w:p>
@@ -930,9 +1720,16 @@
           </w:tcPr>
           <w:p>
             <w:pPr>
+              <w:jc w:val="left"/>
               <w:cnfStyle w:val="100000000000" w:firstRow="1" w:lastRow="0" w:firstColumn="0" w:lastColumn="0" w:oddVBand="0" w:evenVBand="0" w:oddHBand="0" w:evenHBand="0" w:firstRowFirstColumn="0" w:firstRowLastColumn="0" w:lastRowFirstColumn="0" w:lastRowLastColumn="0"/>
-            </w:pPr>
-            <w:r>
+              <w:rPr>
+                <w:rFonts w:ascii="Calibri" w:hAnsi="Calibri" w:cs="Calibri"/>
+              </w:rPr>
+            </w:pPr>
+            <w:r>
+              <w:rPr>
+                <w:rFonts w:ascii="Calibri" w:hAnsi="Calibri" w:cs="Calibri"/>
+              </w:rPr>
               <w:t>Estimate</w:t>
             </w:r>
           </w:p>
@@ -949,7 +1746,10 @@
           </w:tcPr>
           <w:p>
             <w:pPr>
-              <w:jc w:val="center"/>
+              <w:jc w:val="left"/>
+              <w:rPr>
+                <w:rFonts w:ascii="Calibri" w:hAnsi="Calibri" w:cs="Calibri"/>
+              </w:rPr>
             </w:pPr>
           </w:p>
         </w:tc>
@@ -959,10 +1759,16 @@
           </w:tcPr>
           <w:p>
             <w:pPr>
-              <w:jc w:val="center"/>
+              <w:jc w:val="left"/>
               <w:cnfStyle w:val="000000100000" w:firstRow="0" w:lastRow="0" w:firstColumn="0" w:lastColumn="0" w:oddVBand="0" w:evenVBand="0" w:oddHBand="1" w:evenHBand="0" w:firstRowFirstColumn="0" w:firstRowLastColumn="0" w:lastRowFirstColumn="0" w:lastRowLastColumn="0"/>
-            </w:pPr>
-            <w:r>
+              <w:rPr>
+                <w:rFonts w:ascii="Calibri" w:hAnsi="Calibri" w:cs="Calibri"/>
+              </w:rPr>
+            </w:pPr>
+            <w:r>
+              <w:rPr>
+                <w:rFonts w:ascii="Calibri" w:hAnsi="Calibri" w:cs="Calibri"/>
+              </w:rPr>
               <w:t>1</w:t>
             </w:r>
           </w:p>
@@ -973,10 +1779,16 @@
           </w:tcPr>
           <w:p>
             <w:pPr>
-              <w:jc w:val="center"/>
+              <w:jc w:val="left"/>
               <w:cnfStyle w:val="000000100000" w:firstRow="0" w:lastRow="0" w:firstColumn="0" w:lastColumn="0" w:oddVBand="0" w:evenVBand="0" w:oddHBand="1" w:evenHBand="0" w:firstRowFirstColumn="0" w:firstRowLastColumn="0" w:lastRowFirstColumn="0" w:lastRowLastColumn="0"/>
-            </w:pPr>
-            <w:r>
+              <w:rPr>
+                <w:rFonts w:ascii="Calibri" w:hAnsi="Calibri" w:cs="Calibri"/>
+              </w:rPr>
+            </w:pPr>
+            <w:r>
+              <w:rPr>
+                <w:rFonts w:ascii="Calibri" w:hAnsi="Calibri" w:cs="Calibri"/>
+              </w:rPr>
               <w:t>user story 1</w:t>
             </w:r>
           </w:p>
@@ -987,9 +1799,16 @@
           </w:tcPr>
           <w:p>
             <w:pPr>
+              <w:jc w:val="left"/>
               <w:cnfStyle w:val="000000100000" w:firstRow="0" w:lastRow="0" w:firstColumn="0" w:lastColumn="0" w:oddVBand="0" w:evenVBand="0" w:oddHBand="1" w:evenHBand="0" w:firstRowFirstColumn="0" w:firstRowLastColumn="0" w:lastRowFirstColumn="0" w:lastRowLastColumn="0"/>
-            </w:pPr>
-            <w:r>
+              <w:rPr>
+                <w:rFonts w:ascii="Calibri" w:hAnsi="Calibri" w:cs="Calibri"/>
+              </w:rPr>
+            </w:pPr>
+            <w:r>
+              <w:rPr>
+                <w:rFonts w:ascii="Calibri" w:hAnsi="Calibri" w:cs="Calibri"/>
+              </w:rPr>
               <w:t>Story points</w:t>
             </w:r>
           </w:p>
@@ -1003,7 +1822,10 @@
           </w:tcPr>
           <w:p>
             <w:pPr>
-              <w:jc w:val="center"/>
+              <w:jc w:val="left"/>
+              <w:rPr>
+                <w:rFonts w:ascii="Calibri" w:hAnsi="Calibri" w:cs="Calibri"/>
+              </w:rPr>
             </w:pPr>
           </w:p>
         </w:tc>
@@ -1013,10 +1835,16 @@
           </w:tcPr>
           <w:p>
             <w:pPr>
-              <w:jc w:val="center"/>
+              <w:jc w:val="left"/>
               <w:cnfStyle w:val="000000000000" w:firstRow="0" w:lastRow="0" w:firstColumn="0" w:lastColumn="0" w:oddVBand="0" w:evenVBand="0" w:oddHBand="0" w:evenHBand="0" w:firstRowFirstColumn="0" w:firstRowLastColumn="0" w:lastRowFirstColumn="0" w:lastRowLastColumn="0"/>
-            </w:pPr>
-            <w:r>
+              <w:rPr>
+                <w:rFonts w:ascii="Calibri" w:hAnsi="Calibri" w:cs="Calibri"/>
+              </w:rPr>
+            </w:pPr>
+            <w:r>
+              <w:rPr>
+                <w:rFonts w:ascii="Calibri" w:hAnsi="Calibri" w:cs="Calibri"/>
+              </w:rPr>
               <w:t>2</w:t>
             </w:r>
           </w:p>
@@ -1027,10 +1855,16 @@
           </w:tcPr>
           <w:p>
             <w:pPr>
-              <w:jc w:val="center"/>
+              <w:jc w:val="left"/>
               <w:cnfStyle w:val="000000000000" w:firstRow="0" w:lastRow="0" w:firstColumn="0" w:lastColumn="0" w:oddVBand="0" w:evenVBand="0" w:oddHBand="0" w:evenHBand="0" w:firstRowFirstColumn="0" w:firstRowLastColumn="0" w:lastRowFirstColumn="0" w:lastRowLastColumn="0"/>
-            </w:pPr>
-            <w:r>
+              <w:rPr>
+                <w:rFonts w:ascii="Calibri" w:hAnsi="Calibri" w:cs="Calibri"/>
+              </w:rPr>
+            </w:pPr>
+            <w:r>
+              <w:rPr>
+                <w:rFonts w:ascii="Calibri" w:hAnsi="Calibri" w:cs="Calibri"/>
+              </w:rPr>
               <w:t>user story 2</w:t>
             </w:r>
           </w:p>
@@ -1041,9 +1875,16 @@
           </w:tcPr>
           <w:p>
             <w:pPr>
+              <w:jc w:val="left"/>
               <w:cnfStyle w:val="000000000000" w:firstRow="0" w:lastRow="0" w:firstColumn="0" w:lastColumn="0" w:oddVBand="0" w:evenVBand="0" w:oddHBand="0" w:evenHBand="0" w:firstRowFirstColumn="0" w:firstRowLastColumn="0" w:lastRowFirstColumn="0" w:lastRowLastColumn="0"/>
-            </w:pPr>
-            <w:r>
+              <w:rPr>
+                <w:rFonts w:ascii="Calibri" w:hAnsi="Calibri" w:cs="Calibri"/>
+              </w:rPr>
+            </w:pPr>
+            <w:r>
+              <w:rPr>
+                <w:rFonts w:ascii="Calibri" w:hAnsi="Calibri" w:cs="Calibri"/>
+              </w:rPr>
               <w:t>Story points</w:t>
             </w:r>
           </w:p>
@@ -1060,7 +1901,10 @@
           </w:tcPr>
           <w:p>
             <w:pPr>
-              <w:jc w:val="center"/>
+              <w:jc w:val="left"/>
+              <w:rPr>
+                <w:rFonts w:ascii="Calibri" w:hAnsi="Calibri" w:cs="Calibri"/>
+              </w:rPr>
             </w:pPr>
           </w:p>
         </w:tc>
@@ -1070,10 +1914,16 @@
           </w:tcPr>
           <w:p>
             <w:pPr>
-              <w:jc w:val="center"/>
+              <w:jc w:val="left"/>
               <w:cnfStyle w:val="000000100000" w:firstRow="0" w:lastRow="0" w:firstColumn="0" w:lastColumn="0" w:oddVBand="0" w:evenVBand="0" w:oddHBand="1" w:evenHBand="0" w:firstRowFirstColumn="0" w:firstRowLastColumn="0" w:lastRowFirstColumn="0" w:lastRowLastColumn="0"/>
-            </w:pPr>
-            <w:r>
+              <w:rPr>
+                <w:rFonts w:ascii="Calibri" w:hAnsi="Calibri" w:cs="Calibri"/>
+              </w:rPr>
+            </w:pPr>
+            <w:r>
+              <w:rPr>
+                <w:rFonts w:ascii="Calibri" w:hAnsi="Calibri" w:cs="Calibri"/>
+              </w:rPr>
               <w:t>3</w:t>
             </w:r>
           </w:p>
@@ -1084,10 +1934,16 @@
           </w:tcPr>
           <w:p>
             <w:pPr>
-              <w:jc w:val="center"/>
+              <w:jc w:val="left"/>
               <w:cnfStyle w:val="000000100000" w:firstRow="0" w:lastRow="0" w:firstColumn="0" w:lastColumn="0" w:oddVBand="0" w:evenVBand="0" w:oddHBand="1" w:evenHBand="0" w:firstRowFirstColumn="0" w:firstRowLastColumn="0" w:lastRowFirstColumn="0" w:lastRowLastColumn="0"/>
-            </w:pPr>
-            <w:r>
+              <w:rPr>
+                <w:rFonts w:ascii="Calibri" w:hAnsi="Calibri" w:cs="Calibri"/>
+              </w:rPr>
+            </w:pPr>
+            <w:r>
+              <w:rPr>
+                <w:rFonts w:ascii="Calibri" w:hAnsi="Calibri" w:cs="Calibri"/>
+              </w:rPr>
               <w:t>user story 3</w:t>
             </w:r>
           </w:p>
@@ -1098,9 +1954,16 @@
           </w:tcPr>
           <w:p>
             <w:pPr>
+              <w:jc w:val="left"/>
               <w:cnfStyle w:val="000000100000" w:firstRow="0" w:lastRow="0" w:firstColumn="0" w:lastColumn="0" w:oddVBand="0" w:evenVBand="0" w:oddHBand="1" w:evenHBand="0" w:firstRowFirstColumn="0" w:firstRowLastColumn="0" w:lastRowFirstColumn="0" w:lastRowLastColumn="0"/>
-            </w:pPr>
-            <w:r>
+              <w:rPr>
+                <w:rFonts w:ascii="Calibri" w:hAnsi="Calibri" w:cs="Calibri"/>
+              </w:rPr>
+            </w:pPr>
+            <w:r>
+              <w:rPr>
+                <w:rFonts w:ascii="Calibri" w:hAnsi="Calibri" w:cs="Calibri"/>
+              </w:rPr>
               <w:t>Story points</w:t>
             </w:r>
           </w:p>
@@ -1114,7 +1977,10 @@
           </w:tcPr>
           <w:p>
             <w:pPr>
-              <w:jc w:val="center"/>
+              <w:jc w:val="left"/>
+              <w:rPr>
+                <w:rFonts w:ascii="Calibri" w:hAnsi="Calibri" w:cs="Calibri"/>
+              </w:rPr>
             </w:pPr>
           </w:p>
         </w:tc>
@@ -1124,10 +1990,16 @@
           </w:tcPr>
           <w:p>
             <w:pPr>
-              <w:jc w:val="center"/>
+              <w:jc w:val="left"/>
               <w:cnfStyle w:val="000000000000" w:firstRow="0" w:lastRow="0" w:firstColumn="0" w:lastColumn="0" w:oddVBand="0" w:evenVBand="0" w:oddHBand="0" w:evenHBand="0" w:firstRowFirstColumn="0" w:firstRowLastColumn="0" w:lastRowFirstColumn="0" w:lastRowLastColumn="0"/>
-            </w:pPr>
-            <w:r>
+              <w:rPr>
+                <w:rFonts w:ascii="Calibri" w:hAnsi="Calibri" w:cs="Calibri"/>
+              </w:rPr>
+            </w:pPr>
+            <w:r>
+              <w:rPr>
+                <w:rFonts w:ascii="Calibri" w:hAnsi="Calibri" w:cs="Calibri"/>
+              </w:rPr>
               <w:t>4</w:t>
             </w:r>
           </w:p>
@@ -1138,10 +2010,16 @@
           </w:tcPr>
           <w:p>
             <w:pPr>
-              <w:jc w:val="center"/>
+              <w:jc w:val="left"/>
               <w:cnfStyle w:val="000000000000" w:firstRow="0" w:lastRow="0" w:firstColumn="0" w:lastColumn="0" w:oddVBand="0" w:evenVBand="0" w:oddHBand="0" w:evenHBand="0" w:firstRowFirstColumn="0" w:firstRowLastColumn="0" w:lastRowFirstColumn="0" w:lastRowLastColumn="0"/>
-            </w:pPr>
-            <w:r>
+              <w:rPr>
+                <w:rFonts w:ascii="Calibri" w:hAnsi="Calibri" w:cs="Calibri"/>
+              </w:rPr>
+            </w:pPr>
+            <w:r>
+              <w:rPr>
+                <w:rFonts w:ascii="Calibri" w:hAnsi="Calibri" w:cs="Calibri"/>
+              </w:rPr>
               <w:t>user story 4</w:t>
             </w:r>
           </w:p>
@@ -1152,9 +2030,16 @@
           </w:tcPr>
           <w:p>
             <w:pPr>
+              <w:jc w:val="left"/>
               <w:cnfStyle w:val="000000000000" w:firstRow="0" w:lastRow="0" w:firstColumn="0" w:lastColumn="0" w:oddVBand="0" w:evenVBand="0" w:oddHBand="0" w:evenHBand="0" w:firstRowFirstColumn="0" w:firstRowLastColumn="0" w:lastRowFirstColumn="0" w:lastRowLastColumn="0"/>
-            </w:pPr>
-            <w:r>
+              <w:rPr>
+                <w:rFonts w:ascii="Calibri" w:hAnsi="Calibri" w:cs="Calibri"/>
+              </w:rPr>
+            </w:pPr>
+            <w:r>
+              <w:rPr>
+                <w:rFonts w:ascii="Calibri" w:hAnsi="Calibri" w:cs="Calibri"/>
+              </w:rPr>
               <w:t>Story points</w:t>
             </w:r>
           </w:p>
@@ -1171,7 +2056,10 @@
           </w:tcPr>
           <w:p>
             <w:pPr>
-              <w:jc w:val="center"/>
+              <w:jc w:val="left"/>
+              <w:rPr>
+                <w:rFonts w:ascii="Calibri" w:hAnsi="Calibri" w:cs="Calibri"/>
+              </w:rPr>
             </w:pPr>
           </w:p>
         </w:tc>
@@ -1181,10 +2069,16 @@
           </w:tcPr>
           <w:p>
             <w:pPr>
-              <w:jc w:val="center"/>
+              <w:jc w:val="left"/>
               <w:cnfStyle w:val="000000100000" w:firstRow="0" w:lastRow="0" w:firstColumn="0" w:lastColumn="0" w:oddVBand="0" w:evenVBand="0" w:oddHBand="1" w:evenHBand="0" w:firstRowFirstColumn="0" w:firstRowLastColumn="0" w:lastRowFirstColumn="0" w:lastRowLastColumn="0"/>
-            </w:pPr>
-            <w:r>
+              <w:rPr>
+                <w:rFonts w:ascii="Calibri" w:hAnsi="Calibri" w:cs="Calibri"/>
+              </w:rPr>
+            </w:pPr>
+            <w:r>
+              <w:rPr>
+                <w:rFonts w:ascii="Calibri" w:hAnsi="Calibri" w:cs="Calibri"/>
+              </w:rPr>
               <w:t>5</w:t>
             </w:r>
           </w:p>
@@ -1195,10 +2089,16 @@
           </w:tcPr>
           <w:p>
             <w:pPr>
-              <w:jc w:val="center"/>
+              <w:jc w:val="left"/>
               <w:cnfStyle w:val="000000100000" w:firstRow="0" w:lastRow="0" w:firstColumn="0" w:lastColumn="0" w:oddVBand="0" w:evenVBand="0" w:oddHBand="1" w:evenHBand="0" w:firstRowFirstColumn="0" w:firstRowLastColumn="0" w:lastRowFirstColumn="0" w:lastRowLastColumn="0"/>
-            </w:pPr>
-            <w:r>
+              <w:rPr>
+                <w:rFonts w:ascii="Calibri" w:hAnsi="Calibri" w:cs="Calibri"/>
+              </w:rPr>
+            </w:pPr>
+            <w:r>
+              <w:rPr>
+                <w:rFonts w:ascii="Calibri" w:hAnsi="Calibri" w:cs="Calibri"/>
+              </w:rPr>
               <w:t>user story 5</w:t>
             </w:r>
           </w:p>
@@ -1209,9 +2109,16 @@
           </w:tcPr>
           <w:p>
             <w:pPr>
+              <w:jc w:val="left"/>
               <w:cnfStyle w:val="000000100000" w:firstRow="0" w:lastRow="0" w:firstColumn="0" w:lastColumn="0" w:oddVBand="0" w:evenVBand="0" w:oddHBand="1" w:evenHBand="0" w:firstRowFirstColumn="0" w:firstRowLastColumn="0" w:lastRowFirstColumn="0" w:lastRowLastColumn="0"/>
-            </w:pPr>
-            <w:r>
+              <w:rPr>
+                <w:rFonts w:ascii="Calibri" w:hAnsi="Calibri" w:cs="Calibri"/>
+              </w:rPr>
+            </w:pPr>
+            <w:r>
+              <w:rPr>
+                <w:rFonts w:ascii="Calibri" w:hAnsi="Calibri" w:cs="Calibri"/>
+              </w:rPr>
               <w:t>Story points</w:t>
             </w:r>
           </w:p>
@@ -1225,7 +2132,10 @@
           </w:tcPr>
           <w:p>
             <w:pPr>
-              <w:jc w:val="center"/>
+              <w:jc w:val="left"/>
+              <w:rPr>
+                <w:rFonts w:ascii="Calibri" w:hAnsi="Calibri" w:cs="Calibri"/>
+              </w:rPr>
             </w:pPr>
           </w:p>
         </w:tc>
@@ -1235,8 +2145,11 @@
           </w:tcPr>
           <w:p>
             <w:pPr>
-              <w:jc w:val="center"/>
+              <w:jc w:val="left"/>
               <w:cnfStyle w:val="000000000000" w:firstRow="0" w:lastRow="0" w:firstColumn="0" w:lastColumn="0" w:oddVBand="0" w:evenVBand="0" w:oddHBand="0" w:evenHBand="0" w:firstRowFirstColumn="0" w:firstRowLastColumn="0" w:lastRowFirstColumn="0" w:lastRowLastColumn="0"/>
+              <w:rPr>
+                <w:rFonts w:ascii="Calibri" w:hAnsi="Calibri" w:cs="Calibri"/>
+              </w:rPr>
             </w:pPr>
           </w:p>
         </w:tc>
@@ -1246,10 +2159,16 @@
           </w:tcPr>
           <w:p>
             <w:pPr>
-              <w:jc w:val="center"/>
+              <w:jc w:val="left"/>
               <w:cnfStyle w:val="000000000000" w:firstRow="0" w:lastRow="0" w:firstColumn="0" w:lastColumn="0" w:oddVBand="0" w:evenVBand="0" w:oddHBand="0" w:evenHBand="0" w:firstRowFirstColumn="0" w:firstRowLastColumn="0" w:lastRowFirstColumn="0" w:lastRowLastColumn="0"/>
-            </w:pPr>
-            <w:r>
+              <w:rPr>
+                <w:rFonts w:ascii="Calibri" w:hAnsi="Calibri" w:cs="Calibri"/>
+              </w:rPr>
+            </w:pPr>
+            <w:r>
+              <w:rPr>
+                <w:rFonts w:ascii="Calibri" w:hAnsi="Calibri" w:cs="Calibri"/>
+              </w:rPr>
               <w:t>Add rows as necessary…</w:t>
             </w:r>
           </w:p>
@@ -1260,99 +2179,142 @@
           </w:tcPr>
           <w:p>
             <w:pPr>
+              <w:jc w:val="left"/>
               <w:cnfStyle w:val="000000000000" w:firstRow="0" w:lastRow="0" w:firstColumn="0" w:lastColumn="0" w:oddVBand="0" w:evenVBand="0" w:oddHBand="0" w:evenHBand="0" w:firstRowFirstColumn="0" w:firstRowLastColumn="0" w:lastRowFirstColumn="0" w:lastRowLastColumn="0"/>
+              <w:rPr>
+                <w:rFonts w:ascii="Calibri" w:hAnsi="Calibri" w:cs="Calibri"/>
+              </w:rPr>
             </w:pPr>
           </w:p>
         </w:tc>
       </w:tr>
     </w:tbl>
-    <w:p/>
-    <w:p/>
     <w:p>
+      <w:pPr>
+        <w:jc w:val="left"/>
+        <w:rPr>
+          <w:rFonts w:ascii="Calibri" w:hAnsi="Calibri" w:cs="Calibri"/>
+        </w:rPr>
+      </w:pPr>
+    </w:p>
+    <w:p>
+      <w:pPr>
+        <w:jc w:val="left"/>
+        <w:rPr>
+          <w:rFonts w:ascii="Calibri" w:hAnsi="Calibri" w:cs="Calibri"/>
+        </w:rPr>
+      </w:pPr>
+    </w:p>
+    <w:p>
+      <w:pPr>
+        <w:jc w:val="left"/>
+        <w:rPr>
+          <w:rFonts w:ascii="Calibri" w:hAnsi="Calibri" w:cs="Calibri"/>
+        </w:rPr>
+      </w:pPr>
       <w:r>
         <w:rPr>
           <w:rStyle w:val="Heading2Char"/>
+          <w:rFonts w:ascii="Calibri" w:hAnsi="Calibri" w:cs="Calibri"/>
         </w:rPr>
         <w:t>Retrospective</w:t>
       </w:r>
     </w:p>
     <w:p>
+      <w:pPr>
+        <w:jc w:val="left"/>
+        <w:rPr>
+          <w:rFonts w:ascii="Calibri" w:hAnsi="Calibri" w:cs="Calibri"/>
+        </w:rPr>
+      </w:pPr>
       <w:r>
+        <w:rPr>
+          <w:rFonts w:ascii="Calibri" w:hAnsi="Calibri" w:cs="Calibri"/>
+        </w:rPr>
         <w:t>What went well?</w:t>
       </w:r>
     </w:p>
     <w:p>
+      <w:pPr>
+        <w:jc w:val="left"/>
+        <w:rPr>
+          <w:rFonts w:ascii="Calibri" w:hAnsi="Calibri" w:cs="Calibri"/>
+        </w:rPr>
+      </w:pPr>
       <w:r>
+        <w:rPr>
+          <w:rFonts w:ascii="Calibri" w:hAnsi="Calibri" w:cs="Calibri"/>
+        </w:rPr>
         <w:t>What could be improved?</w:t>
       </w:r>
     </w:p>
     <w:p>
+      <w:pPr>
+        <w:jc w:val="left"/>
+        <w:rPr>
+          <w:rFonts w:ascii="Calibri" w:hAnsi="Calibri" w:cs="Calibri"/>
+        </w:rPr>
+      </w:pPr>
       <w:r>
+        <w:rPr>
+          <w:rFonts w:ascii="Calibri" w:hAnsi="Calibri" w:cs="Calibri"/>
+        </w:rPr>
         <w:t>Any Issues?</w:t>
       </w:r>
     </w:p>
-    <w:p/>
     <w:p>
-      <w:r>
-        <w:t xml:space="preserve">When you write your retrospective, mention that you encountered a </w:t>
-      </w:r>
-      <w:proofErr w:type="spellStart"/>
-      <w:r>
-        <w:rPr>
-          <w:b/>
-          <w:bCs/>
-        </w:rPr>
-        <w:t>SyntaxError</w:t>
-      </w:r>
-      <w:proofErr w:type="spellEnd"/>
-      <w:r>
-        <w:t xml:space="preserve"> due to a Node.js version mismatch (v20.11.0 vs required v20.12.0 for the </w:t>
-      </w:r>
-      <w:proofErr w:type="spellStart"/>
-      <w:r>
-        <w:t>sv</w:t>
-      </w:r>
-      <w:proofErr w:type="spellEnd"/>
-      <w:r>
-        <w:t xml:space="preserve"> CLI). Documenting how you troubleshot this shows the markers you have strong </w:t>
-      </w:r>
-      <w:r>
-        <w:rPr>
-          <w:b/>
-          <w:bCs/>
-        </w:rPr>
-        <w:t>problem-solving skills</w:t>
-      </w:r>
-      <w:r>
-        <w:t xml:space="preserve"> and an understanding of your </w:t>
-      </w:r>
-      <w:r>
-        <w:rPr>
-          <w:b/>
-          <w:bCs/>
-        </w:rPr>
-        <w:t>Technical Requirements</w:t>
-      </w:r>
-      <w:r>
-        <w:t xml:space="preserve"> .</w:t>
-      </w:r>
+      <w:pPr>
+        <w:ind w:left="0" w:firstLine="0"/>
+        <w:jc w:val="left"/>
+        <w:rPr>
+          <w:rFonts w:ascii="Calibri" w:hAnsi="Calibri" w:cs="Calibri"/>
+        </w:rPr>
+      </w:pPr>
     </w:p>
-    <w:p/>
     <w:p>
       <w:pPr>
         <w:pStyle w:val="Heading2"/>
+        <w:rPr>
+          <w:rFonts w:ascii="Calibri" w:hAnsi="Calibri" w:cs="Calibri"/>
+        </w:rPr>
       </w:pPr>
       <w:r>
+        <w:rPr>
+          <w:rFonts w:ascii="Calibri" w:hAnsi="Calibri" w:cs="Calibri"/>
+        </w:rPr>
         <w:t>Future Developments</w:t>
       </w:r>
     </w:p>
     <w:p>
+      <w:pPr>
+        <w:jc w:val="left"/>
+        <w:rPr>
+          <w:rFonts w:ascii="Calibri" w:hAnsi="Calibri" w:cs="Calibri"/>
+        </w:rPr>
+      </w:pPr>
       <w:r>
+        <w:rPr>
+          <w:rFonts w:ascii="Calibri" w:hAnsi="Calibri" w:cs="Calibri"/>
+        </w:rPr>
         <w:t>(Are there any features that could be improved or added to in future)</w:t>
       </w:r>
     </w:p>
-    <w:p/>
-    <w:p/>
+    <w:p>
+      <w:pPr>
+        <w:jc w:val="left"/>
+        <w:rPr>
+          <w:rFonts w:ascii="Calibri" w:hAnsi="Calibri" w:cs="Calibri"/>
+        </w:rPr>
+      </w:pPr>
+    </w:p>
+    <w:p>
+      <w:pPr>
+        <w:jc w:val="left"/>
+        <w:rPr>
+          <w:rFonts w:ascii="Calibri" w:hAnsi="Calibri" w:cs="Calibri"/>
+        </w:rPr>
+      </w:pPr>
+    </w:p>
     <w:sectPr>
       <w:pgSz w:w="12240" w:h="15840"/>
       <w:pgMar w:top="1440" w:right="1440" w:bottom="1440" w:left="1440" w:header="720" w:footer="720" w:gutter="0"/>

</xml_diff>

<commit_message>
feat: enhance mock data and introduce TypeScript interfaces for patients, doctors, appointments, and medical records
</commit_message>
<xml_diff>
--- a/docs/Sprint 2.docx
+++ b/docs/Sprint 2.docx
@@ -907,8 +907,72 @@
       <w:r>
         <w:rPr>
           <w:rFonts w:ascii="Calibri" w:hAnsi="Calibri" w:cs="Calibri"/>
-        </w:rPr>
-        <w:t>(A short description of what features were focused on during the sprint and why they were valuable to the user)</w:t>
+          <w:b/>
+          <w:bCs/>
+        </w:rPr>
+        <w:t>Sprint 2 Focus: Core Transactional Implementation</w:t>
+      </w:r>
+      <w:r>
+        <w:rPr>
+          <w:rFonts w:ascii="Calibri" w:hAnsi="Calibri" w:cs="Calibri"/>
+        </w:rPr>
+        <w:t xml:space="preserve"> </w:t>
+      </w:r>
+    </w:p>
+    <w:p>
+      <w:pPr>
+        <w:jc w:val="left"/>
+        <w:rPr>
+          <w:rFonts w:ascii="Calibri" w:hAnsi="Calibri" w:cs="Calibri"/>
+        </w:rPr>
+      </w:pPr>
+      <w:r>
+        <w:rPr>
+          <w:rFonts w:ascii="Calibri" w:hAnsi="Calibri" w:cs="Calibri"/>
+        </w:rPr>
+        <w:t xml:space="preserve">This sprint focuses on implementing the </w:t>
+      </w:r>
+      <w:r>
+        <w:rPr>
+          <w:rFonts w:ascii="Calibri" w:hAnsi="Calibri" w:cs="Calibri"/>
+          <w:b/>
+          <w:bCs/>
+        </w:rPr>
+        <w:t>Minimum Viable Product (MVP)</w:t>
+      </w:r>
+      <w:r>
+        <w:rPr>
+          <w:rFonts w:ascii="Calibri" w:hAnsi="Calibri" w:cs="Calibri"/>
+        </w:rPr>
+        <w:t xml:space="preserve"> by building the secure authentication gateway and the reactive scheduling engine. These features are </w:t>
+      </w:r>
+      <w:proofErr w:type="gramStart"/>
+      <w:r>
+        <w:rPr>
+          <w:rFonts w:ascii="Calibri" w:hAnsi="Calibri" w:cs="Calibri"/>
+        </w:rPr>
+        <w:t>high-value</w:t>
+      </w:r>
+      <w:proofErr w:type="gramEnd"/>
+      <w:r>
+        <w:rPr>
+          <w:rFonts w:ascii="Calibri" w:hAnsi="Calibri" w:cs="Calibri"/>
+        </w:rPr>
+        <w:t xml:space="preserve"> because they directly address the primary user frustration identified in discovery: the lack of self-service visibility for bookings and medical records. By prioritizing the </w:t>
+      </w:r>
+      <w:r>
+        <w:rPr>
+          <w:rFonts w:ascii="Calibri" w:hAnsi="Calibri" w:cs="Calibri"/>
+          <w:b/>
+          <w:bCs/>
+        </w:rPr>
+        <w:t>"Must-Have"</w:t>
+      </w:r>
+      <w:r>
+        <w:rPr>
+          <w:rFonts w:ascii="Calibri" w:hAnsi="Calibri" w:cs="Calibri"/>
+        </w:rPr>
+        <w:t xml:space="preserve"> stories (01-04), we ensure a functional "Patient-Centric" build for the final demonstration.</w:t>
       </w:r>
     </w:p>
     <w:p>
@@ -936,14 +1000,15 @@
     <w:tbl>
       <w:tblPr>
         <w:tblStyle w:val="GridTable3-Accent5"/>
-        <w:tblW w:w="5000" w:type="pct"/>
+        <w:tblW w:w="4997" w:type="pct"/>
         <w:tblLook w:val="04A0" w:firstRow="1" w:lastRow="0" w:firstColumn="1" w:lastColumn="0" w:noHBand="0" w:noVBand="1"/>
       </w:tblPr>
       <w:tblGrid>
         <w:gridCol w:w="694"/>
-        <w:gridCol w:w="4907"/>
-        <w:gridCol w:w="2517"/>
-        <w:gridCol w:w="1232"/>
+        <w:gridCol w:w="4301"/>
+        <w:gridCol w:w="2187"/>
+        <w:gridCol w:w="1053"/>
+        <w:gridCol w:w="1109"/>
       </w:tblGrid>
       <w:tr>
         <w:trPr>
@@ -981,7 +1046,7 @@
         </w:tc>
         <w:tc>
           <w:tcPr>
-            <w:tcW w:w="2624" w:type="pct"/>
+            <w:tcW w:w="2309" w:type="pct"/>
             <w:tcBorders>
               <w:top w:val="single" w:sz="4" w:space="0" w:color="E59EDC" w:themeColor="accent5" w:themeTint="66"/>
               <w:left w:val="single" w:sz="4" w:space="0" w:color="E59EDC" w:themeColor="accent5" w:themeTint="66"/>
@@ -1007,7 +1072,7 @@
         </w:tc>
         <w:tc>
           <w:tcPr>
-            <w:tcW w:w="1346" w:type="pct"/>
+            <w:tcW w:w="1178" w:type="pct"/>
             <w:tcBorders>
               <w:top w:val="single" w:sz="4" w:space="0" w:color="E59EDC" w:themeColor="accent5" w:themeTint="66"/>
               <w:bottom w:val="single" w:sz="4" w:space="0" w:color="E59EDC" w:themeColor="accent5" w:themeTint="66"/>
@@ -1031,7 +1096,7 @@
         </w:tc>
         <w:tc>
           <w:tcPr>
-            <w:tcW w:w="659" w:type="pct"/>
+            <w:tcW w:w="571" w:type="pct"/>
             <w:tcBorders>
               <w:top w:val="single" w:sz="4" w:space="0" w:color="E59EDC" w:themeColor="accent5" w:themeTint="66"/>
               <w:left w:val="single" w:sz="4" w:space="0" w:color="E59EDC" w:themeColor="accent5" w:themeTint="66"/>
@@ -1052,6 +1117,31 @@
                 <w:rFonts w:ascii="Calibri" w:hAnsi="Calibri" w:cs="Calibri"/>
               </w:rPr>
               <w:t>Estimate</w:t>
+            </w:r>
+          </w:p>
+        </w:tc>
+        <w:tc>
+          <w:tcPr>
+            <w:tcW w:w="571" w:type="pct"/>
+            <w:tcBorders>
+              <w:top w:val="single" w:sz="4" w:space="0" w:color="E59EDC" w:themeColor="accent5" w:themeTint="66"/>
+              <w:bottom w:val="single" w:sz="4" w:space="0" w:color="E59EDC" w:themeColor="accent5" w:themeTint="66"/>
+              <w:right w:val="single" w:sz="4" w:space="0" w:color="E59EDC" w:themeColor="accent5" w:themeTint="66"/>
+            </w:tcBorders>
+          </w:tcPr>
+          <w:p>
+            <w:pPr>
+              <w:jc w:val="center"/>
+              <w:cnfStyle w:val="100000000000" w:firstRow="1" w:lastRow="0" w:firstColumn="0" w:lastColumn="0" w:oddVBand="0" w:evenVBand="0" w:oddHBand="0" w:evenHBand="0" w:firstRowFirstColumn="0" w:firstRowLastColumn="0" w:lastRowFirstColumn="0" w:lastRowLastColumn="0"/>
+              <w:rPr>
+                <w:rFonts w:ascii="Calibri" w:hAnsi="Calibri" w:cs="Calibri"/>
+              </w:rPr>
+            </w:pPr>
+            <w:r>
+              <w:rPr>
+                <w:rFonts w:ascii="Calibri" w:hAnsi="Calibri" w:cs="Calibri"/>
+              </w:rPr>
+              <w:t>Status</w:t>
             </w:r>
           </w:p>
         </w:tc>
@@ -1079,11 +1169,18 @@
                 <w:rFonts w:ascii="Calibri" w:hAnsi="Calibri" w:cs="Calibri"/>
               </w:rPr>
             </w:pPr>
-          </w:p>
-        </w:tc>
-        <w:tc>
-          <w:tcPr>
-            <w:tcW w:w="2624" w:type="pct"/>
+            <w:r>
+              <w:rPr>
+                <w:rFonts w:ascii="Calibri" w:hAnsi="Calibri" w:cs="Calibri"/>
+              </w:rPr>
+              <w:lastRenderedPageBreak/>
+              <w:t>T5</w:t>
+            </w:r>
+          </w:p>
+        </w:tc>
+        <w:tc>
+          <w:tcPr>
+            <w:tcW w:w="2309" w:type="pct"/>
             <w:tcBorders>
               <w:top w:val="single" w:sz="4" w:space="0" w:color="E59EDC" w:themeColor="accent5" w:themeTint="66"/>
               <w:left w:val="single" w:sz="4" w:space="0" w:color="E59EDC" w:themeColor="accent5" w:themeTint="66"/>
@@ -1100,14 +1197,36 @@
             <w:r>
               <w:rPr>
                 <w:rFonts w:ascii="Calibri" w:hAnsi="Calibri" w:cs="Calibri"/>
-              </w:rPr>
-              <w:t>T5</w:t>
-            </w:r>
-          </w:p>
-        </w:tc>
-        <w:tc>
-          <w:tcPr>
-            <w:tcW w:w="1346" w:type="pct"/>
+                <w:b/>
+                <w:bCs/>
+              </w:rPr>
+              <w:t>Implementation</w:t>
+            </w:r>
+            <w:r>
+              <w:rPr>
+                <w:rFonts w:ascii="Calibri" w:hAnsi="Calibri" w:cs="Calibri"/>
+              </w:rPr>
+              <w:t xml:space="preserve">: Populate </w:t>
+            </w:r>
+            <w:proofErr w:type="spellStart"/>
+            <w:r>
+              <w:rPr>
+                <w:rFonts w:ascii="Calibri" w:hAnsi="Calibri" w:cs="Calibri"/>
+              </w:rPr>
+              <w:t>mockData.ts</w:t>
+            </w:r>
+            <w:proofErr w:type="spellEnd"/>
+            <w:r>
+              <w:rPr>
+                <w:rFonts w:ascii="Calibri" w:hAnsi="Calibri" w:cs="Calibri"/>
+              </w:rPr>
+              <w:t xml:space="preserve"> with 3NF-compliant clinical entities.</w:t>
+            </w:r>
+          </w:p>
+        </w:tc>
+        <w:tc>
+          <w:tcPr>
+            <w:tcW w:w="1178" w:type="pct"/>
             <w:tcBorders>
               <w:top w:val="single" w:sz="4" w:space="0" w:color="E59EDC" w:themeColor="accent5" w:themeTint="66"/>
             </w:tcBorders>
@@ -1128,59 +1247,13 @@
                 <w:bCs/>
                 <w:lang w:val="en-US"/>
               </w:rPr>
-              <w:t>Implementation</w:t>
-            </w:r>
-            <w:r>
-              <w:rPr>
-                <w:rFonts w:ascii="Calibri" w:hAnsi="Calibri" w:cs="Calibri"/>
-                <w:lang w:val="en-US"/>
-              </w:rPr>
-              <w:t xml:space="preserve">: Create </w:t>
-            </w:r>
-            <w:proofErr w:type="spellStart"/>
-            <w:r>
-              <w:rPr>
-                <w:rFonts w:ascii="Calibri" w:hAnsi="Calibri" w:cs="Calibri"/>
-                <w:lang w:val="en-US"/>
-              </w:rPr>
-              <w:t>src</w:t>
-            </w:r>
-            <w:proofErr w:type="spellEnd"/>
-            <w:r>
-              <w:rPr>
-                <w:rFonts w:ascii="Calibri" w:hAnsi="Calibri" w:cs="Calibri"/>
-                <w:lang w:val="en-US"/>
-              </w:rPr>
-              <w:t>/lib/server/</w:t>
-            </w:r>
-            <w:proofErr w:type="spellStart"/>
-            <w:r>
-              <w:rPr>
-                <w:rFonts w:ascii="Calibri" w:hAnsi="Calibri" w:cs="Calibri"/>
-                <w:lang w:val="en-US"/>
-              </w:rPr>
-              <w:t>mockData.ts</w:t>
-            </w:r>
-            <w:proofErr w:type="spellEnd"/>
-            <w:r>
-              <w:rPr>
-                <w:rFonts w:ascii="Calibri" w:hAnsi="Calibri" w:cs="Calibri"/>
-                <w:lang w:val="en-US"/>
-              </w:rPr>
-              <w:t xml:space="preserve"> and verify type</w:t>
-            </w:r>
-            <w:r>
-              <w:rPr>
-                <w:rFonts w:ascii="Calibri" w:hAnsi="Calibri" w:cs="Calibri"/>
-                <w:lang w:val="en-US"/>
-              </w:rPr>
-              <w:t>s.</w:t>
-            </w:r>
-          </w:p>
-        </w:tc>
-        <w:tc>
-          <w:tcPr>
-            <w:tcW w:w="659" w:type="pct"/>
+              <w:t>All</w:t>
+            </w:r>
+          </w:p>
+        </w:tc>
+        <w:tc>
+          <w:tcPr>
+            <w:tcW w:w="571" w:type="pct"/>
             <w:tcBorders>
               <w:top w:val="single" w:sz="4" w:space="0" w:color="E59EDC" w:themeColor="accent5" w:themeTint="66"/>
             </w:tcBorders>
@@ -1197,7 +1270,30 @@
               <w:rPr>
                 <w:rFonts w:ascii="Calibri" w:hAnsi="Calibri" w:cs="Calibri"/>
               </w:rPr>
-              <w:t>All</w:t>
+              <w:t>2</w:t>
+            </w:r>
+          </w:p>
+        </w:tc>
+        <w:tc>
+          <w:tcPr>
+            <w:tcW w:w="571" w:type="pct"/>
+            <w:tcBorders>
+              <w:top w:val="single" w:sz="4" w:space="0" w:color="E59EDC" w:themeColor="accent5" w:themeTint="66"/>
+            </w:tcBorders>
+          </w:tcPr>
+          <w:p>
+            <w:pPr>
+              <w:jc w:val="center"/>
+              <w:cnfStyle w:val="000000100000" w:firstRow="0" w:lastRow="0" w:firstColumn="0" w:lastColumn="0" w:oddVBand="0" w:evenVBand="0" w:oddHBand="1" w:evenHBand="0" w:firstRowFirstColumn="0" w:firstRowLastColumn="0" w:lastRowFirstColumn="0" w:lastRowLastColumn="0"/>
+              <w:rPr>
+                <w:rFonts w:ascii="Calibri" w:hAnsi="Calibri" w:cs="Calibri"/>
+              </w:rPr>
+            </w:pPr>
+            <w:r>
+              <w:rPr>
+                <w:rFonts w:ascii="Calibri" w:hAnsi="Calibri" w:cs="Calibri"/>
+              </w:rPr>
+              <w:t>Complete</w:t>
             </w:r>
           </w:p>
         </w:tc>
@@ -1231,7 +1327,7 @@
         </w:tc>
         <w:tc>
           <w:tcPr>
-            <w:tcW w:w="2624" w:type="pct"/>
+            <w:tcW w:w="2309" w:type="pct"/>
             <w:tcBorders>
               <w:left w:val="single" w:sz="4" w:space="0" w:color="E59EDC" w:themeColor="accent5" w:themeTint="66"/>
             </w:tcBorders>
@@ -1290,7 +1386,7 @@
         </w:tc>
         <w:tc>
           <w:tcPr>
-            <w:tcW w:w="1346" w:type="pct"/>
+            <w:tcW w:w="1178" w:type="pct"/>
           </w:tcPr>
           <w:p>
             <w:pPr>
@@ -1304,14 +1400,13 @@
               <w:rPr>
                 <w:rFonts w:ascii="Calibri" w:hAnsi="Calibri" w:cs="Calibri"/>
               </w:rPr>
-              <w:lastRenderedPageBreak/>
               <w:t>Story 01</w:t>
             </w:r>
           </w:p>
         </w:tc>
         <w:tc>
           <w:tcPr>
-            <w:tcW w:w="659" w:type="pct"/>
+            <w:tcW w:w="571" w:type="pct"/>
           </w:tcPr>
           <w:p>
             <w:pPr>
@@ -1326,6 +1421,28 @@
                 <w:rFonts w:ascii="Calibri" w:hAnsi="Calibri" w:cs="Calibri"/>
               </w:rPr>
               <w:t>3</w:t>
+            </w:r>
+          </w:p>
+        </w:tc>
+        <w:tc>
+          <w:tcPr>
+            <w:tcW w:w="571" w:type="pct"/>
+          </w:tcPr>
+          <w:p>
+            <w:pPr>
+              <w:jc w:val="center"/>
+              <w:cnfStyle w:val="000000000000" w:firstRow="0" w:lastRow="0" w:firstColumn="0" w:lastColumn="0" w:oddVBand="0" w:evenVBand="0" w:oddHBand="0" w:evenHBand="0" w:firstRowFirstColumn="0" w:firstRowLastColumn="0" w:lastRowFirstColumn="0" w:lastRowLastColumn="0"/>
+              <w:rPr>
+                <w:rFonts w:ascii="Calibri" w:hAnsi="Calibri" w:cs="Calibri"/>
+              </w:rPr>
+            </w:pPr>
+            <w:r>
+              <w:rPr>
+                <w:rFonts w:ascii="Calibri" w:hAnsi="Calibri" w:cs="Calibri"/>
+                <w:b/>
+                <w:bCs/>
+              </w:rPr>
+              <w:t>In Progress</w:t>
             </w:r>
           </w:p>
         </w:tc>
@@ -1363,7 +1480,7 @@
         </w:tc>
         <w:tc>
           <w:tcPr>
-            <w:tcW w:w="2624" w:type="pct"/>
+            <w:tcW w:w="2309" w:type="pct"/>
             <w:tcBorders>
               <w:left w:val="single" w:sz="4" w:space="0" w:color="E59EDC" w:themeColor="accent5" w:themeTint="66"/>
             </w:tcBorders>
@@ -1394,7 +1511,7 @@
         </w:tc>
         <w:tc>
           <w:tcPr>
-            <w:tcW w:w="1346" w:type="pct"/>
+            <w:tcW w:w="1178" w:type="pct"/>
           </w:tcPr>
           <w:p>
             <w:pPr>
@@ -1414,7 +1531,7 @@
         </w:tc>
         <w:tc>
           <w:tcPr>
-            <w:tcW w:w="659" w:type="pct"/>
+            <w:tcW w:w="571" w:type="pct"/>
           </w:tcPr>
           <w:p>
             <w:pPr>
@@ -1429,6 +1546,28 @@
                 <w:rFonts w:ascii="Calibri" w:hAnsi="Calibri" w:cs="Calibri"/>
               </w:rPr>
               <w:t>3</w:t>
+            </w:r>
+          </w:p>
+        </w:tc>
+        <w:tc>
+          <w:tcPr>
+            <w:tcW w:w="571" w:type="pct"/>
+          </w:tcPr>
+          <w:p>
+            <w:pPr>
+              <w:jc w:val="center"/>
+              <w:cnfStyle w:val="000000100000" w:firstRow="0" w:lastRow="0" w:firstColumn="0" w:lastColumn="0" w:oddVBand="0" w:evenVBand="0" w:oddHBand="1" w:evenHBand="0" w:firstRowFirstColumn="0" w:firstRowLastColumn="0" w:lastRowFirstColumn="0" w:lastRowLastColumn="0"/>
+              <w:rPr>
+                <w:rFonts w:ascii="Calibri" w:hAnsi="Calibri" w:cs="Calibri"/>
+              </w:rPr>
+            </w:pPr>
+            <w:r>
+              <w:rPr>
+                <w:rFonts w:ascii="Calibri" w:hAnsi="Calibri" w:cs="Calibri"/>
+                <w:b/>
+                <w:bCs/>
+              </w:rPr>
+              <w:t>In Progress</w:t>
             </w:r>
           </w:p>
         </w:tc>
@@ -1462,7 +1601,7 @@
         </w:tc>
         <w:tc>
           <w:tcPr>
-            <w:tcW w:w="2624" w:type="pct"/>
+            <w:tcW w:w="2309" w:type="pct"/>
             <w:tcBorders>
               <w:left w:val="single" w:sz="4" w:space="0" w:color="E59EDC" w:themeColor="accent5" w:themeTint="66"/>
             </w:tcBorders>
@@ -1521,7 +1660,7 @@
         </w:tc>
         <w:tc>
           <w:tcPr>
-            <w:tcW w:w="1346" w:type="pct"/>
+            <w:tcW w:w="1178" w:type="pct"/>
           </w:tcPr>
           <w:p>
             <w:pPr>
@@ -1541,7 +1680,7 @@
         </w:tc>
         <w:tc>
           <w:tcPr>
-            <w:tcW w:w="659" w:type="pct"/>
+            <w:tcW w:w="571" w:type="pct"/>
           </w:tcPr>
           <w:p>
             <w:pPr>
@@ -1557,6 +1696,139 @@
               </w:rPr>
               <w:t>3</w:t>
             </w:r>
+          </w:p>
+        </w:tc>
+        <w:tc>
+          <w:tcPr>
+            <w:tcW w:w="571" w:type="pct"/>
+          </w:tcPr>
+          <w:p>
+            <w:pPr>
+              <w:jc w:val="center"/>
+              <w:cnfStyle w:val="000000000000" w:firstRow="0" w:lastRow="0" w:firstColumn="0" w:lastColumn="0" w:oddVBand="0" w:evenVBand="0" w:oddHBand="0" w:evenHBand="0" w:firstRowFirstColumn="0" w:firstRowLastColumn="0" w:lastRowFirstColumn="0" w:lastRowLastColumn="0"/>
+              <w:rPr>
+                <w:rFonts w:ascii="Calibri" w:hAnsi="Calibri" w:cs="Calibri"/>
+              </w:rPr>
+            </w:pPr>
+          </w:p>
+        </w:tc>
+      </w:tr>
+      <w:tr>
+        <w:trPr>
+          <w:cnfStyle w:val="000000100000" w:firstRow="0" w:lastRow="0" w:firstColumn="0" w:lastColumn="0" w:oddVBand="0" w:evenVBand="0" w:oddHBand="1" w:evenHBand="0" w:firstRowFirstColumn="0" w:firstRowLastColumn="0" w:lastRowFirstColumn="0" w:lastRowLastColumn="0"/>
+        </w:trPr>
+        <w:tc>
+          <w:tcPr>
+            <w:cnfStyle w:val="001000000000" w:firstRow="0" w:lastRow="0" w:firstColumn="1" w:lastColumn="0" w:oddVBand="0" w:evenVBand="0" w:oddHBand="0" w:evenHBand="0" w:firstRowFirstColumn="0" w:firstRowLastColumn="0" w:lastRowFirstColumn="0" w:lastRowLastColumn="0"/>
+            <w:tcW w:w="371" w:type="pct"/>
+            <w:tcBorders>
+              <w:top w:val="single" w:sz="4" w:space="0" w:color="E59EDC" w:themeColor="accent5" w:themeTint="66"/>
+              <w:left w:val="single" w:sz="4" w:space="0" w:color="E59EDC" w:themeColor="accent5" w:themeTint="66"/>
+              <w:bottom w:val="single" w:sz="4" w:space="0" w:color="E59EDC" w:themeColor="accent5" w:themeTint="66"/>
+              <w:right w:val="single" w:sz="4" w:space="0" w:color="E59EDC" w:themeColor="accent5" w:themeTint="66"/>
+            </w:tcBorders>
+          </w:tcPr>
+          <w:p>
+            <w:pPr>
+              <w:jc w:val="center"/>
+              <w:rPr>
+                <w:rFonts w:ascii="Calibri" w:hAnsi="Calibri" w:cs="Calibri"/>
+              </w:rPr>
+            </w:pPr>
+            <w:r>
+              <w:rPr>
+                <w:rFonts w:ascii="Calibri" w:hAnsi="Calibri" w:cs="Calibri"/>
+              </w:rPr>
+              <w:t>T9</w:t>
+            </w:r>
+          </w:p>
+        </w:tc>
+        <w:tc>
+          <w:tcPr>
+            <w:tcW w:w="2309" w:type="pct"/>
+            <w:tcBorders>
+              <w:left w:val="single" w:sz="4" w:space="0" w:color="E59EDC" w:themeColor="accent5" w:themeTint="66"/>
+            </w:tcBorders>
+          </w:tcPr>
+          <w:p>
+            <w:pPr>
+              <w:jc w:val="left"/>
+              <w:cnfStyle w:val="000000100000" w:firstRow="0" w:lastRow="0" w:firstColumn="0" w:lastColumn="0" w:oddVBand="0" w:evenVBand="0" w:oddHBand="1" w:evenHBand="0" w:firstRowFirstColumn="0" w:firstRowLastColumn="0" w:lastRowFirstColumn="0" w:lastRowLastColumn="0"/>
+              <w:rPr>
+                <w:rFonts w:ascii="Calibri" w:hAnsi="Calibri" w:cs="Calibri"/>
+                <w:b/>
+                <w:bCs/>
+                <w:lang w:val="en-US"/>
+              </w:rPr>
+            </w:pPr>
+            <w:r>
+              <w:rPr>
+                <w:rFonts w:ascii="Calibri" w:hAnsi="Calibri" w:cs="Calibri"/>
+                <w:b/>
+                <w:bCs/>
+              </w:rPr>
+              <w:t>Logic: Build reactive slot ticker for real-time availability.</w:t>
+            </w:r>
+          </w:p>
+        </w:tc>
+        <w:tc>
+          <w:tcPr>
+            <w:tcW w:w="1178" w:type="pct"/>
+          </w:tcPr>
+          <w:p>
+            <w:pPr>
+              <w:jc w:val="center"/>
+              <w:cnfStyle w:val="000000100000" w:firstRow="0" w:lastRow="0" w:firstColumn="0" w:lastColumn="0" w:oddVBand="0" w:evenVBand="0" w:oddHBand="1" w:evenHBand="0" w:firstRowFirstColumn="0" w:firstRowLastColumn="0" w:lastRowFirstColumn="0" w:lastRowLastColumn="0"/>
+              <w:rPr>
+                <w:rFonts w:ascii="Calibri" w:hAnsi="Calibri" w:cs="Calibri"/>
+              </w:rPr>
+            </w:pPr>
+            <w:r>
+              <w:rPr>
+                <w:rFonts w:ascii="Calibri" w:hAnsi="Calibri" w:cs="Calibri"/>
+              </w:rPr>
+              <w:t>Story 0</w:t>
+            </w:r>
+            <w:r>
+              <w:rPr>
+                <w:rFonts w:ascii="Calibri" w:hAnsi="Calibri" w:cs="Calibri"/>
+              </w:rPr>
+              <w:t>2</w:t>
+            </w:r>
+          </w:p>
+        </w:tc>
+        <w:tc>
+          <w:tcPr>
+            <w:tcW w:w="571" w:type="pct"/>
+          </w:tcPr>
+          <w:p>
+            <w:pPr>
+              <w:jc w:val="center"/>
+              <w:cnfStyle w:val="000000100000" w:firstRow="0" w:lastRow="0" w:firstColumn="0" w:lastColumn="0" w:oddVBand="0" w:evenVBand="0" w:oddHBand="1" w:evenHBand="0" w:firstRowFirstColumn="0" w:firstRowLastColumn="0" w:lastRowFirstColumn="0" w:lastRowLastColumn="0"/>
+              <w:rPr>
+                <w:rFonts w:ascii="Calibri" w:hAnsi="Calibri" w:cs="Calibri"/>
+              </w:rPr>
+            </w:pPr>
+            <w:r>
+              <w:rPr>
+                <w:rFonts w:ascii="Calibri" w:hAnsi="Calibri" w:cs="Calibri"/>
+              </w:rPr>
+              <w:t>5</w:t>
+            </w:r>
+          </w:p>
+        </w:tc>
+        <w:tc>
+          <w:tcPr>
+            <w:tcW w:w="571" w:type="pct"/>
+          </w:tcPr>
+          <w:p>
+            <w:pPr>
+              <w:jc w:val="center"/>
+              <w:cnfStyle w:val="000000100000" w:firstRow="0" w:lastRow="0" w:firstColumn="0" w:lastColumn="0" w:oddVBand="0" w:evenVBand="0" w:oddHBand="1" w:evenHBand="0" w:firstRowFirstColumn="0" w:firstRowLastColumn="0" w:lastRowFirstColumn="0" w:lastRowLastColumn="0"/>
+              <w:rPr>
+                <w:rFonts w:ascii="Calibri" w:hAnsi="Calibri" w:cs="Calibri"/>
+              </w:rPr>
+            </w:pPr>
           </w:p>
         </w:tc>
       </w:tr>
@@ -2245,6 +2517,7 @@
         <w:rPr>
           <w:rFonts w:ascii="Calibri" w:hAnsi="Calibri" w:cs="Calibri"/>
         </w:rPr>
+        <w:lastRenderedPageBreak/>
         <w:t>What could be improved?</w:t>
       </w:r>
     </w:p>

</xml_diff>

<commit_message>
feat: create dashboard page with patient greeting and appointment/medical records sections
</commit_message>
<xml_diff>
--- a/docs/Sprint 2.docx
+++ b/docs/Sprint 2.docx
@@ -1439,10 +1439,8 @@
             <w:r>
               <w:rPr>
                 <w:rFonts w:ascii="Calibri" w:hAnsi="Calibri" w:cs="Calibri"/>
-                <w:b/>
-                <w:bCs/>
-              </w:rPr>
-              <w:t>In Progress</w:t>
+              </w:rPr>
+              <w:t>Complete</w:t>
             </w:r>
           </w:p>
         </w:tc>
@@ -1564,10 +1562,8 @@
             <w:r>
               <w:rPr>
                 <w:rFonts w:ascii="Calibri" w:hAnsi="Calibri" w:cs="Calibri"/>
-                <w:b/>
-                <w:bCs/>
-              </w:rPr>
-              <w:t>In Progress</w:t>
+              </w:rPr>
+              <w:t>Complete</w:t>
             </w:r>
           </w:p>
         </w:tc>
@@ -1787,13 +1783,7 @@
               <w:rPr>
                 <w:rFonts w:ascii="Calibri" w:hAnsi="Calibri" w:cs="Calibri"/>
               </w:rPr>
-              <w:t>Story 0</w:t>
-            </w:r>
-            <w:r>
-              <w:rPr>
-                <w:rFonts w:ascii="Calibri" w:hAnsi="Calibri" w:cs="Calibri"/>
-              </w:rPr>
-              <w:t>2</w:t>
+              <w:t>Story 02</w:t>
             </w:r>
           </w:p>
         </w:tc>
@@ -1868,18 +1858,232 @@
         <w:jc w:val="left"/>
         <w:rPr>
           <w:rFonts w:ascii="Calibri" w:hAnsi="Calibri" w:cs="Calibri"/>
+          <w:lang w:val="en-US"/>
         </w:rPr>
       </w:pPr>
       <w:r>
         <w:rPr>
           <w:rFonts w:ascii="Calibri" w:hAnsi="Calibri" w:cs="Calibri"/>
-        </w:rPr>
-        <w:t>&lt;Insert link to GitHub repo&gt;</w:t>
+          <w:b/>
+          <w:bCs/>
+          <w:lang w:val="en-US"/>
+        </w:rPr>
+        <w:t>Evidence for T6 &amp; UT02 (Security)</w:t>
+      </w:r>
+      <w:r>
+        <w:rPr>
+          <w:rFonts w:ascii="Calibri" w:hAnsi="Calibri" w:cs="Calibri"/>
+          <w:lang w:val="en-US"/>
+        </w:rPr>
+        <w:t xml:space="preserve">: </w:t>
+      </w:r>
+    </w:p>
+    <w:p>
+      <w:pPr>
+        <w:keepNext/>
+        <w:jc w:val="left"/>
+      </w:pPr>
+      <w:r>
+        <w:rPr>
+          <w:rFonts w:ascii="Calibri" w:hAnsi="Calibri" w:cs="Calibri"/>
+          <w:lang w:val="en-US"/>
+        </w:rPr>
+        <w:lastRenderedPageBreak/>
+        <w:drawing>
+          <wp:inline distT="0" distB="0" distL="0" distR="0" wp14:anchorId="2B6F2F37" wp14:editId="0DC1FD30">
+            <wp:extent cx="5943600" cy="5615940"/>
+            <wp:effectExtent l="0" t="0" r="0" b="3810"/>
+            <wp:docPr id="1925493428" name="Picture 1"/>
+            <wp:cNvGraphicFramePr>
+              <a:graphicFrameLocks xmlns:a="http://schemas.openxmlformats.org/drawingml/2006/main" noChangeAspect="1"/>
+            </wp:cNvGraphicFramePr>
+            <a:graphic xmlns:a="http://schemas.openxmlformats.org/drawingml/2006/main">
+              <a:graphicData uri="http://schemas.openxmlformats.org/drawingml/2006/picture">
+                <pic:pic xmlns:pic="http://schemas.openxmlformats.org/drawingml/2006/picture">
+                  <pic:nvPicPr>
+                    <pic:cNvPr id="1925493428" name=""/>
+                    <pic:cNvPicPr/>
+                  </pic:nvPicPr>
+                  <pic:blipFill>
+                    <a:blip r:embed="rId4"/>
+                    <a:stretch>
+                      <a:fillRect/>
+                    </a:stretch>
+                  </pic:blipFill>
+                  <pic:spPr>
+                    <a:xfrm>
+                      <a:off x="0" y="0"/>
+                      <a:ext cx="5943600" cy="5615940"/>
+                    </a:xfrm>
+                    <a:prstGeom prst="rect">
+                      <a:avLst/>
+                    </a:prstGeom>
+                  </pic:spPr>
+                </pic:pic>
+              </a:graphicData>
+            </a:graphic>
+          </wp:inline>
+        </w:drawing>
+      </w:r>
+    </w:p>
+    <w:p>
+      <w:pPr>
+        <w:jc w:val="center"/>
+        <w:rPr>
+          <w:rFonts w:ascii="Calibri" w:hAnsi="Calibri" w:cs="Calibri"/>
+          <w:i/>
+          <w:iCs/>
+          <w:sz w:val="16"/>
+          <w:szCs w:val="16"/>
+          <w:lang w:val="en-US"/>
+        </w:rPr>
+      </w:pPr>
+      <w:r>
+        <w:rPr>
+          <w:rFonts w:ascii="Calibri" w:hAnsi="Calibri" w:cs="Calibri"/>
+          <w:i/>
+          <w:iCs/>
+          <w:sz w:val="16"/>
+          <w:szCs w:val="16"/>
+          <w:lang w:val="en-US"/>
+        </w:rPr>
+        <w:t xml:space="preserve">"Evidence of T6 implementation: System successfully triggers a </w:t>
+      </w:r>
+      <w:r>
+        <w:rPr>
+          <w:rFonts w:ascii="Calibri" w:hAnsi="Calibri" w:cs="Calibri"/>
+          <w:i/>
+          <w:iCs/>
+          <w:sz w:val="16"/>
+          <w:szCs w:val="16"/>
+          <w:lang w:val="en-US"/>
+        </w:rPr>
+        <w:t>400-fail</w:t>
+      </w:r>
+      <w:r>
+        <w:rPr>
+          <w:rFonts w:ascii="Calibri" w:hAnsi="Calibri" w:cs="Calibri"/>
+          <w:i/>
+          <w:iCs/>
+          <w:sz w:val="16"/>
+          <w:szCs w:val="16"/>
+          <w:lang w:val="en-US"/>
+        </w:rPr>
+        <w:t xml:space="preserve"> response and rejects unauthorized credentials, satisfying UT02."</w:t>
       </w:r>
     </w:p>
     <w:p>
       <w:pPr>
         <w:jc w:val="left"/>
+        <w:rPr>
+          <w:rFonts w:ascii="Calibri" w:hAnsi="Calibri" w:cs="Calibri"/>
+          <w:lang w:val="en-US"/>
+        </w:rPr>
+      </w:pPr>
+    </w:p>
+    <w:p>
+      <w:pPr>
+        <w:jc w:val="left"/>
+        <w:rPr>
+          <w:rFonts w:ascii="Calibri" w:hAnsi="Calibri" w:cs="Calibri"/>
+          <w:lang w:val="en-US"/>
+        </w:rPr>
+      </w:pPr>
+      <w:r>
+        <w:rPr>
+          <w:rFonts w:ascii="Calibri" w:hAnsi="Calibri" w:cs="Calibri"/>
+          <w:b/>
+          <w:bCs/>
+          <w:lang w:val="en-US"/>
+        </w:rPr>
+        <w:t>Evidence for T7 &amp; UT01 (Functional)</w:t>
+      </w:r>
+      <w:r>
+        <w:rPr>
+          <w:rFonts w:ascii="Calibri" w:hAnsi="Calibri" w:cs="Calibri"/>
+          <w:lang w:val="en-US"/>
+        </w:rPr>
+        <w:t xml:space="preserve">: </w:t>
+      </w:r>
+    </w:p>
+    <w:p>
+      <w:pPr>
+        <w:jc w:val="left"/>
+        <w:rPr>
+          <w:rFonts w:ascii="Calibri" w:hAnsi="Calibri" w:cs="Calibri"/>
+          <w:lang w:val="en-US"/>
+        </w:rPr>
+      </w:pPr>
+      <w:r>
+        <w:rPr>
+          <w:rFonts w:ascii="Calibri" w:hAnsi="Calibri" w:cs="Calibri"/>
+          <w:lang w:val="en-US"/>
+        </w:rPr>
+        <w:lastRenderedPageBreak/>
+        <w:drawing>
+          <wp:inline distT="0" distB="0" distL="0" distR="0" wp14:anchorId="7F7CA666" wp14:editId="09A44707">
+            <wp:extent cx="5943600" cy="2606040"/>
+            <wp:effectExtent l="0" t="0" r="0" b="3810"/>
+            <wp:docPr id="1409658657" name="Picture 1"/>
+            <wp:cNvGraphicFramePr>
+              <a:graphicFrameLocks xmlns:a="http://schemas.openxmlformats.org/drawingml/2006/main" noChangeAspect="1"/>
+            </wp:cNvGraphicFramePr>
+            <a:graphic xmlns:a="http://schemas.openxmlformats.org/drawingml/2006/main">
+              <a:graphicData uri="http://schemas.openxmlformats.org/drawingml/2006/picture">
+                <pic:pic xmlns:pic="http://schemas.openxmlformats.org/drawingml/2006/picture">
+                  <pic:nvPicPr>
+                    <pic:cNvPr id="1409658657" name=""/>
+                    <pic:cNvPicPr/>
+                  </pic:nvPicPr>
+                  <pic:blipFill>
+                    <a:blip r:embed="rId5"/>
+                    <a:stretch>
+                      <a:fillRect/>
+                    </a:stretch>
+                  </pic:blipFill>
+                  <pic:spPr>
+                    <a:xfrm>
+                      <a:off x="0" y="0"/>
+                      <a:ext cx="5943600" cy="2606040"/>
+                    </a:xfrm>
+                    <a:prstGeom prst="rect">
+                      <a:avLst/>
+                    </a:prstGeom>
+                  </pic:spPr>
+                </pic:pic>
+              </a:graphicData>
+            </a:graphic>
+          </wp:inline>
+        </w:drawing>
+      </w:r>
+    </w:p>
+    <w:p>
+      <w:pPr>
+        <w:jc w:val="center"/>
+        <w:rPr>
+          <w:rFonts w:ascii="Calibri" w:hAnsi="Calibri" w:cs="Calibri"/>
+          <w:i/>
+          <w:iCs/>
+          <w:sz w:val="16"/>
+          <w:szCs w:val="16"/>
+          <w:lang w:val="en-US"/>
+        </w:rPr>
+      </w:pPr>
+      <w:r>
+        <w:rPr>
+          <w:rFonts w:ascii="Calibri" w:hAnsi="Calibri" w:cs="Calibri"/>
+          <w:i/>
+          <w:iCs/>
+          <w:sz w:val="16"/>
+          <w:szCs w:val="16"/>
+          <w:lang w:val="en-US"/>
+        </w:rPr>
+        <w:t>"Evidence of T7 implementation: Successful redirect to the Patient Dashboard following authentication, satisfying the FR1 requirements and UT01 test case."</w:t>
+      </w:r>
+    </w:p>
+    <w:p>
+      <w:pPr>
+        <w:jc w:val="center"/>
         <w:rPr>
           <w:rFonts w:ascii="Calibri" w:hAnsi="Calibri" w:cs="Calibri"/>
         </w:rPr>
@@ -1906,33 +2110,17 @@
           <w:rFonts w:ascii="Calibri" w:hAnsi="Calibri" w:cs="Calibri"/>
         </w:rPr>
       </w:pPr>
-      <w:r>
-        <w:rPr>
-          <w:rFonts w:ascii="Calibri" w:hAnsi="Calibri" w:cs="Calibri"/>
-        </w:rPr>
-        <w:t>Sprint Review: (A short description of what features were completed in the last sprint)</w:t>
-      </w:r>
-    </w:p>
-    <w:p>
-      <w:pPr>
-        <w:jc w:val="left"/>
-        <w:rPr>
-          <w:rFonts w:ascii="Calibri" w:hAnsi="Calibri" w:cs="Calibri"/>
-        </w:rPr>
-      </w:pPr>
     </w:p>
     <w:tbl>
       <w:tblPr>
         <w:tblStyle w:val="GridTable3-Accent5"/>
-        <w:tblW w:w="0" w:type="auto"/>
-        <w:tblInd w:w="5" w:type="dxa"/>
+        <w:tblW w:w="9783" w:type="dxa"/>
         <w:tblLook w:val="04A0" w:firstRow="1" w:lastRow="0" w:firstColumn="1" w:lastColumn="0" w:noHBand="0" w:noVBand="1"/>
       </w:tblPr>
       <w:tblGrid>
-        <w:gridCol w:w="279"/>
-        <w:gridCol w:w="422"/>
-        <w:gridCol w:w="7206"/>
-        <w:gridCol w:w="1253"/>
+        <w:gridCol w:w="776"/>
+        <w:gridCol w:w="6850"/>
+        <w:gridCol w:w="2157"/>
       </w:tblGrid>
       <w:tr>
         <w:trPr>
@@ -1941,38 +2129,72 @@
         <w:tc>
           <w:tcPr>
             <w:cnfStyle w:val="001000000100" w:firstRow="0" w:lastRow="0" w:firstColumn="1" w:lastColumn="0" w:oddVBand="0" w:evenVBand="0" w:oddHBand="0" w:evenHBand="0" w:firstRowFirstColumn="1" w:firstRowLastColumn="0" w:lastRowFirstColumn="0" w:lastRowLastColumn="0"/>
-            <w:tcW w:w="279" w:type="dxa"/>
-          </w:tcPr>
-          <w:p>
-            <w:pPr>
-              <w:jc w:val="left"/>
-              <w:rPr>
-                <w:rFonts w:ascii="Calibri" w:hAnsi="Calibri" w:cs="Calibri"/>
-              </w:rPr>
-            </w:pPr>
-          </w:p>
-        </w:tc>
-        <w:tc>
-          <w:tcPr>
-            <w:tcW w:w="283" w:type="dxa"/>
-          </w:tcPr>
-          <w:p>
-            <w:pPr>
-              <w:jc w:val="left"/>
+            <w:tcW w:w="776" w:type="dxa"/>
+            <w:tcBorders>
+              <w:top w:val="single" w:sz="4" w:space="0" w:color="E59EDC" w:themeColor="accent5" w:themeTint="66"/>
+              <w:left w:val="single" w:sz="4" w:space="0" w:color="E59EDC" w:themeColor="accent5" w:themeTint="66"/>
+              <w:bottom w:val="single" w:sz="4" w:space="0" w:color="E59EDC" w:themeColor="accent5" w:themeTint="66"/>
+              <w:right w:val="single" w:sz="4" w:space="0" w:color="E59EDC" w:themeColor="accent5" w:themeTint="66"/>
+            </w:tcBorders>
+          </w:tcPr>
+          <w:p>
+            <w:pPr>
+              <w:jc w:val="center"/>
+              <w:rPr>
+                <w:rFonts w:ascii="Calibri" w:hAnsi="Calibri" w:cs="Calibri"/>
+                <w:i w:val="0"/>
+                <w:iCs w:val="0"/>
+              </w:rPr>
+            </w:pPr>
+            <w:r>
+              <w:rPr>
+                <w:rFonts w:ascii="Calibri" w:hAnsi="Calibri" w:cs="Calibri"/>
+                <w:i w:val="0"/>
+                <w:iCs w:val="0"/>
+              </w:rPr>
+              <w:t>No</w:t>
+            </w:r>
+          </w:p>
+        </w:tc>
+        <w:tc>
+          <w:tcPr>
+            <w:tcW w:w="6850" w:type="dxa"/>
+            <w:tcBorders>
+              <w:top w:val="single" w:sz="4" w:space="0" w:color="E59EDC" w:themeColor="accent5" w:themeTint="66"/>
+              <w:left w:val="single" w:sz="4" w:space="0" w:color="E59EDC" w:themeColor="accent5" w:themeTint="66"/>
+              <w:bottom w:val="single" w:sz="4" w:space="0" w:color="E59EDC" w:themeColor="accent5" w:themeTint="66"/>
+              <w:right w:val="single" w:sz="4" w:space="0" w:color="E59EDC" w:themeColor="accent5" w:themeTint="66"/>
+            </w:tcBorders>
+          </w:tcPr>
+          <w:p>
+            <w:pPr>
+              <w:jc w:val="center"/>
               <w:cnfStyle w:val="100000000000" w:firstRow="1" w:lastRow="0" w:firstColumn="0" w:lastColumn="0" w:oddVBand="0" w:evenVBand="0" w:oddHBand="0" w:evenHBand="0" w:firstRowFirstColumn="0" w:firstRowLastColumn="0" w:lastRowFirstColumn="0" w:lastRowLastColumn="0"/>
               <w:rPr>
                 <w:rFonts w:ascii="Calibri" w:hAnsi="Calibri" w:cs="Calibri"/>
               </w:rPr>
             </w:pPr>
-          </w:p>
-        </w:tc>
-        <w:tc>
-          <w:tcPr>
-            <w:tcW w:w="7206" w:type="dxa"/>
-          </w:tcPr>
-          <w:p>
-            <w:pPr>
-              <w:jc w:val="left"/>
+            <w:r>
+              <w:rPr>
+                <w:rFonts w:ascii="Calibri" w:hAnsi="Calibri" w:cs="Calibri"/>
+              </w:rPr>
+              <w:t>User story</w:t>
+            </w:r>
+          </w:p>
+        </w:tc>
+        <w:tc>
+          <w:tcPr>
+            <w:tcW w:w="2157" w:type="dxa"/>
+            <w:tcBorders>
+              <w:top w:val="single" w:sz="4" w:space="0" w:color="E59EDC" w:themeColor="accent5" w:themeTint="66"/>
+              <w:left w:val="single" w:sz="4" w:space="0" w:color="E59EDC" w:themeColor="accent5" w:themeTint="66"/>
+              <w:bottom w:val="single" w:sz="4" w:space="0" w:color="E59EDC" w:themeColor="accent5" w:themeTint="66"/>
+              <w:right w:val="single" w:sz="4" w:space="0" w:color="E59EDC" w:themeColor="accent5" w:themeTint="66"/>
+            </w:tcBorders>
+          </w:tcPr>
+          <w:p>
+            <w:pPr>
+              <w:jc w:val="center"/>
               <w:cnfStyle w:val="100000000000" w:firstRow="1" w:lastRow="0" w:firstColumn="0" w:lastColumn="0" w:oddVBand="0" w:evenVBand="0" w:oddHBand="0" w:evenHBand="0" w:firstRowFirstColumn="0" w:firstRowLastColumn="0" w:lastRowFirstColumn="0" w:lastRowLastColumn="0"/>
               <w:rPr>
                 <w:rFonts w:ascii="Calibri" w:hAnsi="Calibri" w:cs="Calibri"/>
@@ -1982,27 +2204,7 @@
               <w:rPr>
                 <w:rFonts w:ascii="Calibri" w:hAnsi="Calibri" w:cs="Calibri"/>
               </w:rPr>
-              <w:t>User story</w:t>
-            </w:r>
-          </w:p>
-        </w:tc>
-        <w:tc>
-          <w:tcPr>
-            <w:tcW w:w="1253" w:type="dxa"/>
-          </w:tcPr>
-          <w:p>
-            <w:pPr>
-              <w:jc w:val="left"/>
-              <w:cnfStyle w:val="100000000000" w:firstRow="1" w:lastRow="0" w:firstColumn="0" w:lastColumn="0" w:oddVBand="0" w:evenVBand="0" w:oddHBand="0" w:evenHBand="0" w:firstRowFirstColumn="0" w:firstRowLastColumn="0" w:lastRowFirstColumn="0" w:lastRowLastColumn="0"/>
-              <w:rPr>
-                <w:rFonts w:ascii="Calibri" w:hAnsi="Calibri" w:cs="Calibri"/>
-              </w:rPr>
-            </w:pPr>
-            <w:r>
-              <w:rPr>
-                <w:rFonts w:ascii="Calibri" w:hAnsi="Calibri" w:cs="Calibri"/>
-              </w:rPr>
-              <w:t>Estimate</w:t>
+              <w:t>Estimate (Story Points)</w:t>
             </w:r>
           </w:p>
         </w:tc>
@@ -2014,20 +2216,37 @@
         <w:tc>
           <w:tcPr>
             <w:cnfStyle w:val="001000000000" w:firstRow="0" w:lastRow="0" w:firstColumn="1" w:lastColumn="0" w:oddVBand="0" w:evenVBand="0" w:oddHBand="0" w:evenHBand="0" w:firstRowFirstColumn="0" w:firstRowLastColumn="0" w:lastRowFirstColumn="0" w:lastRowLastColumn="0"/>
-            <w:tcW w:w="279" w:type="dxa"/>
-          </w:tcPr>
-          <w:p>
-            <w:pPr>
-              <w:jc w:val="left"/>
-              <w:rPr>
-                <w:rFonts w:ascii="Calibri" w:hAnsi="Calibri" w:cs="Calibri"/>
-              </w:rPr>
-            </w:pPr>
-          </w:p>
-        </w:tc>
-        <w:tc>
-          <w:tcPr>
-            <w:tcW w:w="283" w:type="dxa"/>
+            <w:tcW w:w="776" w:type="dxa"/>
+            <w:tcBorders>
+              <w:top w:val="single" w:sz="4" w:space="0" w:color="E59EDC" w:themeColor="accent5" w:themeTint="66"/>
+              <w:left w:val="single" w:sz="4" w:space="0" w:color="E59EDC" w:themeColor="accent5" w:themeTint="66"/>
+              <w:bottom w:val="single" w:sz="4" w:space="0" w:color="E59EDC" w:themeColor="accent5" w:themeTint="66"/>
+              <w:right w:val="single" w:sz="4" w:space="0" w:color="E59EDC" w:themeColor="accent5" w:themeTint="66"/>
+            </w:tcBorders>
+            <w:shd w:val="clear" w:color="auto" w:fill="F2CEED" w:themeFill="accent5" w:themeFillTint="33"/>
+          </w:tcPr>
+          <w:p>
+            <w:pPr>
+              <w:jc w:val="center"/>
+              <w:rPr>
+                <w:rFonts w:ascii="Calibri" w:hAnsi="Calibri" w:cs="Calibri"/>
+              </w:rPr>
+            </w:pPr>
+            <w:r>
+              <w:rPr>
+                <w:rFonts w:ascii="Calibri" w:hAnsi="Calibri" w:cs="Calibri"/>
+              </w:rPr>
+              <w:t>1</w:t>
+            </w:r>
+          </w:p>
+        </w:tc>
+        <w:tc>
+          <w:tcPr>
+            <w:tcW w:w="6850" w:type="dxa"/>
+            <w:tcBorders>
+              <w:top w:val="single" w:sz="4" w:space="0" w:color="E59EDC" w:themeColor="accent5" w:themeTint="66"/>
+              <w:left w:val="single" w:sz="4" w:space="0" w:color="E59EDC" w:themeColor="accent5" w:themeTint="66"/>
+            </w:tcBorders>
           </w:tcPr>
           <w:p>
             <w:pPr>
@@ -2035,20 +2254,17 @@
               <w:cnfStyle w:val="000000100000" w:firstRow="0" w:lastRow="0" w:firstColumn="0" w:lastColumn="0" w:oddVBand="0" w:evenVBand="0" w:oddHBand="1" w:evenHBand="0" w:firstRowFirstColumn="0" w:firstRowLastColumn="0" w:lastRowFirstColumn="0" w:lastRowLastColumn="0"/>
               <w:rPr>
                 <w:rFonts w:ascii="Calibri" w:hAnsi="Calibri" w:cs="Calibri"/>
-              </w:rPr>
-            </w:pPr>
-            <w:r>
-              <w:rPr>
-                <w:rFonts w:ascii="Calibri" w:hAnsi="Calibri" w:cs="Calibri"/>
-              </w:rPr>
-              <w:t>1</w:t>
-            </w:r>
-          </w:p>
-        </w:tc>
-        <w:tc>
-          <w:tcPr>
-            <w:tcW w:w="7206" w:type="dxa"/>
-          </w:tcPr>
+                <w:lang w:val="en-US"/>
+              </w:rPr>
+            </w:pPr>
+            <w:r>
+              <w:rPr>
+                <w:rFonts w:ascii="Calibri" w:hAnsi="Calibri" w:cs="Calibri"/>
+                <w:lang w:val="en-US"/>
+              </w:rPr>
+              <w:t>As a Patient, I want to log in securely so that I can access my private medical data.</w:t>
+            </w:r>
+          </w:p>
           <w:p>
             <w:pPr>
               <w:jc w:val="left"/>
@@ -2057,21 +2273,18 @@
                 <w:rFonts w:ascii="Calibri" w:hAnsi="Calibri" w:cs="Calibri"/>
               </w:rPr>
             </w:pPr>
-            <w:r>
-              <w:rPr>
-                <w:rFonts w:ascii="Calibri" w:hAnsi="Calibri" w:cs="Calibri"/>
-              </w:rPr>
-              <w:t>user story 1</w:t>
-            </w:r>
-          </w:p>
-        </w:tc>
-        <w:tc>
-          <w:tcPr>
-            <w:tcW w:w="1253" w:type="dxa"/>
-          </w:tcPr>
-          <w:p>
-            <w:pPr>
-              <w:jc w:val="left"/>
+          </w:p>
+        </w:tc>
+        <w:tc>
+          <w:tcPr>
+            <w:tcW w:w="2157" w:type="dxa"/>
+            <w:tcBorders>
+              <w:top w:val="single" w:sz="4" w:space="0" w:color="E59EDC" w:themeColor="accent5" w:themeTint="66"/>
+            </w:tcBorders>
+          </w:tcPr>
+          <w:p>
+            <w:pPr>
+              <w:jc w:val="center"/>
               <w:cnfStyle w:val="000000100000" w:firstRow="0" w:lastRow="0" w:firstColumn="0" w:lastColumn="0" w:oddVBand="0" w:evenVBand="0" w:oddHBand="1" w:evenHBand="0" w:firstRowFirstColumn="0" w:firstRowLastColumn="0" w:lastRowFirstColumn="0" w:lastRowLastColumn="0"/>
               <w:rPr>
                 <w:rFonts w:ascii="Calibri" w:hAnsi="Calibri" w:cs="Calibri"/>
@@ -2081,382 +2294,8 @@
               <w:rPr>
                 <w:rFonts w:ascii="Calibri" w:hAnsi="Calibri" w:cs="Calibri"/>
               </w:rPr>
-              <w:t>Story points</w:t>
-            </w:r>
-          </w:p>
-        </w:tc>
-      </w:tr>
-      <w:tr>
-        <w:tc>
-          <w:tcPr>
-            <w:cnfStyle w:val="001000000000" w:firstRow="0" w:lastRow="0" w:firstColumn="1" w:lastColumn="0" w:oddVBand="0" w:evenVBand="0" w:oddHBand="0" w:evenHBand="0" w:firstRowFirstColumn="0" w:firstRowLastColumn="0" w:lastRowFirstColumn="0" w:lastRowLastColumn="0"/>
-            <w:tcW w:w="279" w:type="dxa"/>
-          </w:tcPr>
-          <w:p>
-            <w:pPr>
-              <w:jc w:val="left"/>
-              <w:rPr>
-                <w:rFonts w:ascii="Calibri" w:hAnsi="Calibri" w:cs="Calibri"/>
-              </w:rPr>
-            </w:pPr>
-          </w:p>
-        </w:tc>
-        <w:tc>
-          <w:tcPr>
-            <w:tcW w:w="283" w:type="dxa"/>
-          </w:tcPr>
-          <w:p>
-            <w:pPr>
-              <w:jc w:val="left"/>
-              <w:cnfStyle w:val="000000000000" w:firstRow="0" w:lastRow="0" w:firstColumn="0" w:lastColumn="0" w:oddVBand="0" w:evenVBand="0" w:oddHBand="0" w:evenHBand="0" w:firstRowFirstColumn="0" w:firstRowLastColumn="0" w:lastRowFirstColumn="0" w:lastRowLastColumn="0"/>
-              <w:rPr>
-                <w:rFonts w:ascii="Calibri" w:hAnsi="Calibri" w:cs="Calibri"/>
-              </w:rPr>
-            </w:pPr>
-            <w:r>
-              <w:rPr>
-                <w:rFonts w:ascii="Calibri" w:hAnsi="Calibri" w:cs="Calibri"/>
-              </w:rPr>
-              <w:t>2</w:t>
-            </w:r>
-          </w:p>
-        </w:tc>
-        <w:tc>
-          <w:tcPr>
-            <w:tcW w:w="7206" w:type="dxa"/>
-          </w:tcPr>
-          <w:p>
-            <w:pPr>
-              <w:jc w:val="left"/>
-              <w:cnfStyle w:val="000000000000" w:firstRow="0" w:lastRow="0" w:firstColumn="0" w:lastColumn="0" w:oddVBand="0" w:evenVBand="0" w:oddHBand="0" w:evenHBand="0" w:firstRowFirstColumn="0" w:firstRowLastColumn="0" w:lastRowFirstColumn="0" w:lastRowLastColumn="0"/>
-              <w:rPr>
-                <w:rFonts w:ascii="Calibri" w:hAnsi="Calibri" w:cs="Calibri"/>
-              </w:rPr>
-            </w:pPr>
-            <w:r>
-              <w:rPr>
-                <w:rFonts w:ascii="Calibri" w:hAnsi="Calibri" w:cs="Calibri"/>
-              </w:rPr>
-              <w:t>user story 2</w:t>
-            </w:r>
-          </w:p>
-        </w:tc>
-        <w:tc>
-          <w:tcPr>
-            <w:tcW w:w="1253" w:type="dxa"/>
-          </w:tcPr>
-          <w:p>
-            <w:pPr>
-              <w:jc w:val="left"/>
-              <w:cnfStyle w:val="000000000000" w:firstRow="0" w:lastRow="0" w:firstColumn="0" w:lastColumn="0" w:oddVBand="0" w:evenVBand="0" w:oddHBand="0" w:evenHBand="0" w:firstRowFirstColumn="0" w:firstRowLastColumn="0" w:lastRowFirstColumn="0" w:lastRowLastColumn="0"/>
-              <w:rPr>
-                <w:rFonts w:ascii="Calibri" w:hAnsi="Calibri" w:cs="Calibri"/>
-              </w:rPr>
-            </w:pPr>
-            <w:r>
-              <w:rPr>
-                <w:rFonts w:ascii="Calibri" w:hAnsi="Calibri" w:cs="Calibri"/>
-              </w:rPr>
-              <w:t>Story points</w:t>
-            </w:r>
-          </w:p>
-        </w:tc>
-      </w:tr>
-      <w:tr>
-        <w:trPr>
-          <w:cnfStyle w:val="000000100000" w:firstRow="0" w:lastRow="0" w:firstColumn="0" w:lastColumn="0" w:oddVBand="0" w:evenVBand="0" w:oddHBand="1" w:evenHBand="0" w:firstRowFirstColumn="0" w:firstRowLastColumn="0" w:lastRowFirstColumn="0" w:lastRowLastColumn="0"/>
-        </w:trPr>
-        <w:tc>
-          <w:tcPr>
-            <w:cnfStyle w:val="001000000000" w:firstRow="0" w:lastRow="0" w:firstColumn="1" w:lastColumn="0" w:oddVBand="0" w:evenVBand="0" w:oddHBand="0" w:evenHBand="0" w:firstRowFirstColumn="0" w:firstRowLastColumn="0" w:lastRowFirstColumn="0" w:lastRowLastColumn="0"/>
-            <w:tcW w:w="279" w:type="dxa"/>
-          </w:tcPr>
-          <w:p>
-            <w:pPr>
-              <w:jc w:val="left"/>
-              <w:rPr>
-                <w:rFonts w:ascii="Calibri" w:hAnsi="Calibri" w:cs="Calibri"/>
-              </w:rPr>
-            </w:pPr>
-          </w:p>
-        </w:tc>
-        <w:tc>
-          <w:tcPr>
-            <w:tcW w:w="283" w:type="dxa"/>
-          </w:tcPr>
-          <w:p>
-            <w:pPr>
-              <w:jc w:val="left"/>
-              <w:cnfStyle w:val="000000100000" w:firstRow="0" w:lastRow="0" w:firstColumn="0" w:lastColumn="0" w:oddVBand="0" w:evenVBand="0" w:oddHBand="1" w:evenHBand="0" w:firstRowFirstColumn="0" w:firstRowLastColumn="0" w:lastRowFirstColumn="0" w:lastRowLastColumn="0"/>
-              <w:rPr>
-                <w:rFonts w:ascii="Calibri" w:hAnsi="Calibri" w:cs="Calibri"/>
-              </w:rPr>
-            </w:pPr>
-            <w:r>
-              <w:rPr>
-                <w:rFonts w:ascii="Calibri" w:hAnsi="Calibri" w:cs="Calibri"/>
-              </w:rPr>
               <w:t>3</w:t>
             </w:r>
-          </w:p>
-        </w:tc>
-        <w:tc>
-          <w:tcPr>
-            <w:tcW w:w="7206" w:type="dxa"/>
-          </w:tcPr>
-          <w:p>
-            <w:pPr>
-              <w:jc w:val="left"/>
-              <w:cnfStyle w:val="000000100000" w:firstRow="0" w:lastRow="0" w:firstColumn="0" w:lastColumn="0" w:oddVBand="0" w:evenVBand="0" w:oddHBand="1" w:evenHBand="0" w:firstRowFirstColumn="0" w:firstRowLastColumn="0" w:lastRowFirstColumn="0" w:lastRowLastColumn="0"/>
-              <w:rPr>
-                <w:rFonts w:ascii="Calibri" w:hAnsi="Calibri" w:cs="Calibri"/>
-              </w:rPr>
-            </w:pPr>
-            <w:r>
-              <w:rPr>
-                <w:rFonts w:ascii="Calibri" w:hAnsi="Calibri" w:cs="Calibri"/>
-              </w:rPr>
-              <w:t>user story 3</w:t>
-            </w:r>
-          </w:p>
-        </w:tc>
-        <w:tc>
-          <w:tcPr>
-            <w:tcW w:w="1253" w:type="dxa"/>
-          </w:tcPr>
-          <w:p>
-            <w:pPr>
-              <w:jc w:val="left"/>
-              <w:cnfStyle w:val="000000100000" w:firstRow="0" w:lastRow="0" w:firstColumn="0" w:lastColumn="0" w:oddVBand="0" w:evenVBand="0" w:oddHBand="1" w:evenHBand="0" w:firstRowFirstColumn="0" w:firstRowLastColumn="0" w:lastRowFirstColumn="0" w:lastRowLastColumn="0"/>
-              <w:rPr>
-                <w:rFonts w:ascii="Calibri" w:hAnsi="Calibri" w:cs="Calibri"/>
-              </w:rPr>
-            </w:pPr>
-            <w:r>
-              <w:rPr>
-                <w:rFonts w:ascii="Calibri" w:hAnsi="Calibri" w:cs="Calibri"/>
-              </w:rPr>
-              <w:t>Story points</w:t>
-            </w:r>
-          </w:p>
-        </w:tc>
-      </w:tr>
-      <w:tr>
-        <w:tc>
-          <w:tcPr>
-            <w:cnfStyle w:val="001000000000" w:firstRow="0" w:lastRow="0" w:firstColumn="1" w:lastColumn="0" w:oddVBand="0" w:evenVBand="0" w:oddHBand="0" w:evenHBand="0" w:firstRowFirstColumn="0" w:firstRowLastColumn="0" w:lastRowFirstColumn="0" w:lastRowLastColumn="0"/>
-            <w:tcW w:w="279" w:type="dxa"/>
-          </w:tcPr>
-          <w:p>
-            <w:pPr>
-              <w:jc w:val="left"/>
-              <w:rPr>
-                <w:rFonts w:ascii="Calibri" w:hAnsi="Calibri" w:cs="Calibri"/>
-              </w:rPr>
-            </w:pPr>
-          </w:p>
-        </w:tc>
-        <w:tc>
-          <w:tcPr>
-            <w:tcW w:w="283" w:type="dxa"/>
-          </w:tcPr>
-          <w:p>
-            <w:pPr>
-              <w:jc w:val="left"/>
-              <w:cnfStyle w:val="000000000000" w:firstRow="0" w:lastRow="0" w:firstColumn="0" w:lastColumn="0" w:oddVBand="0" w:evenVBand="0" w:oddHBand="0" w:evenHBand="0" w:firstRowFirstColumn="0" w:firstRowLastColumn="0" w:lastRowFirstColumn="0" w:lastRowLastColumn="0"/>
-              <w:rPr>
-                <w:rFonts w:ascii="Calibri" w:hAnsi="Calibri" w:cs="Calibri"/>
-              </w:rPr>
-            </w:pPr>
-            <w:r>
-              <w:rPr>
-                <w:rFonts w:ascii="Calibri" w:hAnsi="Calibri" w:cs="Calibri"/>
-              </w:rPr>
-              <w:t>4</w:t>
-            </w:r>
-          </w:p>
-        </w:tc>
-        <w:tc>
-          <w:tcPr>
-            <w:tcW w:w="7206" w:type="dxa"/>
-          </w:tcPr>
-          <w:p>
-            <w:pPr>
-              <w:jc w:val="left"/>
-              <w:cnfStyle w:val="000000000000" w:firstRow="0" w:lastRow="0" w:firstColumn="0" w:lastColumn="0" w:oddVBand="0" w:evenVBand="0" w:oddHBand="0" w:evenHBand="0" w:firstRowFirstColumn="0" w:firstRowLastColumn="0" w:lastRowFirstColumn="0" w:lastRowLastColumn="0"/>
-              <w:rPr>
-                <w:rFonts w:ascii="Calibri" w:hAnsi="Calibri" w:cs="Calibri"/>
-              </w:rPr>
-            </w:pPr>
-            <w:r>
-              <w:rPr>
-                <w:rFonts w:ascii="Calibri" w:hAnsi="Calibri" w:cs="Calibri"/>
-              </w:rPr>
-              <w:t>user story 4</w:t>
-            </w:r>
-          </w:p>
-        </w:tc>
-        <w:tc>
-          <w:tcPr>
-            <w:tcW w:w="1253" w:type="dxa"/>
-          </w:tcPr>
-          <w:p>
-            <w:pPr>
-              <w:jc w:val="left"/>
-              <w:cnfStyle w:val="000000000000" w:firstRow="0" w:lastRow="0" w:firstColumn="0" w:lastColumn="0" w:oddVBand="0" w:evenVBand="0" w:oddHBand="0" w:evenHBand="0" w:firstRowFirstColumn="0" w:firstRowLastColumn="0" w:lastRowFirstColumn="0" w:lastRowLastColumn="0"/>
-              <w:rPr>
-                <w:rFonts w:ascii="Calibri" w:hAnsi="Calibri" w:cs="Calibri"/>
-              </w:rPr>
-            </w:pPr>
-            <w:r>
-              <w:rPr>
-                <w:rFonts w:ascii="Calibri" w:hAnsi="Calibri" w:cs="Calibri"/>
-              </w:rPr>
-              <w:t>Story points</w:t>
-            </w:r>
-          </w:p>
-        </w:tc>
-      </w:tr>
-      <w:tr>
-        <w:trPr>
-          <w:cnfStyle w:val="000000100000" w:firstRow="0" w:lastRow="0" w:firstColumn="0" w:lastColumn="0" w:oddVBand="0" w:evenVBand="0" w:oddHBand="1" w:evenHBand="0" w:firstRowFirstColumn="0" w:firstRowLastColumn="0" w:lastRowFirstColumn="0" w:lastRowLastColumn="0"/>
-        </w:trPr>
-        <w:tc>
-          <w:tcPr>
-            <w:cnfStyle w:val="001000000000" w:firstRow="0" w:lastRow="0" w:firstColumn="1" w:lastColumn="0" w:oddVBand="0" w:evenVBand="0" w:oddHBand="0" w:evenHBand="0" w:firstRowFirstColumn="0" w:firstRowLastColumn="0" w:lastRowFirstColumn="0" w:lastRowLastColumn="0"/>
-            <w:tcW w:w="279" w:type="dxa"/>
-          </w:tcPr>
-          <w:p>
-            <w:pPr>
-              <w:jc w:val="left"/>
-              <w:rPr>
-                <w:rFonts w:ascii="Calibri" w:hAnsi="Calibri" w:cs="Calibri"/>
-              </w:rPr>
-            </w:pPr>
-          </w:p>
-        </w:tc>
-        <w:tc>
-          <w:tcPr>
-            <w:tcW w:w="283" w:type="dxa"/>
-          </w:tcPr>
-          <w:p>
-            <w:pPr>
-              <w:jc w:val="left"/>
-              <w:cnfStyle w:val="000000100000" w:firstRow="0" w:lastRow="0" w:firstColumn="0" w:lastColumn="0" w:oddVBand="0" w:evenVBand="0" w:oddHBand="1" w:evenHBand="0" w:firstRowFirstColumn="0" w:firstRowLastColumn="0" w:lastRowFirstColumn="0" w:lastRowLastColumn="0"/>
-              <w:rPr>
-                <w:rFonts w:ascii="Calibri" w:hAnsi="Calibri" w:cs="Calibri"/>
-              </w:rPr>
-            </w:pPr>
-            <w:r>
-              <w:rPr>
-                <w:rFonts w:ascii="Calibri" w:hAnsi="Calibri" w:cs="Calibri"/>
-              </w:rPr>
-              <w:t>5</w:t>
-            </w:r>
-          </w:p>
-        </w:tc>
-        <w:tc>
-          <w:tcPr>
-            <w:tcW w:w="7206" w:type="dxa"/>
-          </w:tcPr>
-          <w:p>
-            <w:pPr>
-              <w:jc w:val="left"/>
-              <w:cnfStyle w:val="000000100000" w:firstRow="0" w:lastRow="0" w:firstColumn="0" w:lastColumn="0" w:oddVBand="0" w:evenVBand="0" w:oddHBand="1" w:evenHBand="0" w:firstRowFirstColumn="0" w:firstRowLastColumn="0" w:lastRowFirstColumn="0" w:lastRowLastColumn="0"/>
-              <w:rPr>
-                <w:rFonts w:ascii="Calibri" w:hAnsi="Calibri" w:cs="Calibri"/>
-              </w:rPr>
-            </w:pPr>
-            <w:r>
-              <w:rPr>
-                <w:rFonts w:ascii="Calibri" w:hAnsi="Calibri" w:cs="Calibri"/>
-              </w:rPr>
-              <w:t>user story 5</w:t>
-            </w:r>
-          </w:p>
-        </w:tc>
-        <w:tc>
-          <w:tcPr>
-            <w:tcW w:w="1253" w:type="dxa"/>
-          </w:tcPr>
-          <w:p>
-            <w:pPr>
-              <w:jc w:val="left"/>
-              <w:cnfStyle w:val="000000100000" w:firstRow="0" w:lastRow="0" w:firstColumn="0" w:lastColumn="0" w:oddVBand="0" w:evenVBand="0" w:oddHBand="1" w:evenHBand="0" w:firstRowFirstColumn="0" w:firstRowLastColumn="0" w:lastRowFirstColumn="0" w:lastRowLastColumn="0"/>
-              <w:rPr>
-                <w:rFonts w:ascii="Calibri" w:hAnsi="Calibri" w:cs="Calibri"/>
-              </w:rPr>
-            </w:pPr>
-            <w:r>
-              <w:rPr>
-                <w:rFonts w:ascii="Calibri" w:hAnsi="Calibri" w:cs="Calibri"/>
-              </w:rPr>
-              <w:t>Story points</w:t>
-            </w:r>
-          </w:p>
-        </w:tc>
-      </w:tr>
-      <w:tr>
-        <w:tc>
-          <w:tcPr>
-            <w:cnfStyle w:val="001000000000" w:firstRow="0" w:lastRow="0" w:firstColumn="1" w:lastColumn="0" w:oddVBand="0" w:evenVBand="0" w:oddHBand="0" w:evenHBand="0" w:firstRowFirstColumn="0" w:firstRowLastColumn="0" w:lastRowFirstColumn="0" w:lastRowLastColumn="0"/>
-            <w:tcW w:w="279" w:type="dxa"/>
-          </w:tcPr>
-          <w:p>
-            <w:pPr>
-              <w:jc w:val="left"/>
-              <w:rPr>
-                <w:rFonts w:ascii="Calibri" w:hAnsi="Calibri" w:cs="Calibri"/>
-              </w:rPr>
-            </w:pPr>
-          </w:p>
-        </w:tc>
-        <w:tc>
-          <w:tcPr>
-            <w:tcW w:w="283" w:type="dxa"/>
-          </w:tcPr>
-          <w:p>
-            <w:pPr>
-              <w:jc w:val="left"/>
-              <w:cnfStyle w:val="000000000000" w:firstRow="0" w:lastRow="0" w:firstColumn="0" w:lastColumn="0" w:oddVBand="0" w:evenVBand="0" w:oddHBand="0" w:evenHBand="0" w:firstRowFirstColumn="0" w:firstRowLastColumn="0" w:lastRowFirstColumn="0" w:lastRowLastColumn="0"/>
-              <w:rPr>
-                <w:rFonts w:ascii="Calibri" w:hAnsi="Calibri" w:cs="Calibri"/>
-              </w:rPr>
-            </w:pPr>
-          </w:p>
-        </w:tc>
-        <w:tc>
-          <w:tcPr>
-            <w:tcW w:w="7206" w:type="dxa"/>
-          </w:tcPr>
-          <w:p>
-            <w:pPr>
-              <w:jc w:val="left"/>
-              <w:cnfStyle w:val="000000000000" w:firstRow="0" w:lastRow="0" w:firstColumn="0" w:lastColumn="0" w:oddVBand="0" w:evenVBand="0" w:oddHBand="0" w:evenHBand="0" w:firstRowFirstColumn="0" w:firstRowLastColumn="0" w:lastRowFirstColumn="0" w:lastRowLastColumn="0"/>
-              <w:rPr>
-                <w:rFonts w:ascii="Calibri" w:hAnsi="Calibri" w:cs="Calibri"/>
-              </w:rPr>
-            </w:pPr>
-            <w:r>
-              <w:rPr>
-                <w:rFonts w:ascii="Calibri" w:hAnsi="Calibri" w:cs="Calibri"/>
-              </w:rPr>
-              <w:t>Add rows as necessary…</w:t>
-            </w:r>
-          </w:p>
-        </w:tc>
-        <w:tc>
-          <w:tcPr>
-            <w:tcW w:w="1253" w:type="dxa"/>
-          </w:tcPr>
-          <w:p>
-            <w:pPr>
-              <w:jc w:val="left"/>
-              <w:cnfStyle w:val="000000000000" w:firstRow="0" w:lastRow="0" w:firstColumn="0" w:lastColumn="0" w:oddVBand="0" w:evenVBand="0" w:oddHBand="0" w:evenHBand="0" w:firstRowFirstColumn="0" w:firstRowLastColumn="0" w:lastRowFirstColumn="0" w:lastRowLastColumn="0"/>
-              <w:rPr>
-                <w:rFonts w:ascii="Calibri" w:hAnsi="Calibri" w:cs="Calibri"/>
-              </w:rPr>
-            </w:pPr>
           </w:p>
         </w:tc>
       </w:tr>
@@ -2517,7 +2356,6 @@
         <w:rPr>
           <w:rFonts w:ascii="Calibri" w:hAnsi="Calibri" w:cs="Calibri"/>
         </w:rPr>
-        <w:lastRenderedPageBreak/>
         <w:t>What could be improved?</w:t>
       </w:r>
     </w:p>
@@ -3244,7 +3082,6 @@
   <w:style w:type="character" w:default="1" w:styleId="DefaultParagraphFont">
     <w:name w:val="Default Paragraph Font"/>
     <w:uiPriority w:val="1"/>
-    <w:semiHidden/>
     <w:unhideWhenUsed/>
   </w:style>
   <w:style w:type="table" w:default="1" w:styleId="TableNormal">
@@ -3720,6 +3557,25 @@
       </w:tcPr>
     </w:tblStylePr>
   </w:style>
+  <w:style w:type="paragraph" w:styleId="Caption">
+    <w:name w:val="caption"/>
+    <w:basedOn w:val="Normal"/>
+    <w:next w:val="Normal"/>
+    <w:uiPriority w:val="35"/>
+    <w:unhideWhenUsed/>
+    <w:qFormat/>
+    <w:rsid w:val="00497395"/>
+    <w:pPr>
+      <w:spacing w:after="200" w:line="240" w:lineRule="auto"/>
+    </w:pPr>
+    <w:rPr>
+      <w:i/>
+      <w:iCs/>
+      <w:color w:val="0E2841" w:themeColor="text2"/>
+      <w:sz w:val="18"/>
+      <w:szCs w:val="18"/>
+    </w:rPr>
+  </w:style>
 </w:styles>
 </file>
 

</xml_diff>

<commit_message>
feat: implement session management with login/logout functionality and enhance dashboard loading state
</commit_message>
<xml_diff>
--- a/docs/Sprint 2.docx
+++ b/docs/Sprint 2.docx
@@ -1706,6 +1706,12 @@
                 <w:rFonts w:ascii="Calibri" w:hAnsi="Calibri" w:cs="Calibri"/>
               </w:rPr>
             </w:pPr>
+            <w:r>
+              <w:rPr>
+                <w:rFonts w:ascii="Calibri" w:hAnsi="Calibri" w:cs="Calibri"/>
+              </w:rPr>
+              <w:t>In Progress</w:t>
+            </w:r>
           </w:p>
         </w:tc>
       </w:tr>
@@ -1886,6 +1892,7 @@
       <w:r>
         <w:rPr>
           <w:rFonts w:ascii="Calibri" w:hAnsi="Calibri" w:cs="Calibri"/>
+          <w:noProof/>
           <w:lang w:val="en-US"/>
         </w:rPr>
         <w:lastRenderedPageBreak/>
@@ -1947,29 +1954,7 @@
           <w:szCs w:val="16"/>
           <w:lang w:val="en-US"/>
         </w:rPr>
-        <w:t xml:space="preserve">"Evidence of T6 implementation: System successfully triggers a </w:t>
-      </w:r>
-      <w:r>
-        <w:rPr>
-          <w:rFonts w:ascii="Calibri" w:hAnsi="Calibri" w:cs="Calibri"/>
-          <w:i/>
-          <w:iCs/>
-          <w:sz w:val="16"/>
-          <w:szCs w:val="16"/>
-          <w:lang w:val="en-US"/>
-        </w:rPr>
-        <w:t>400-fail</w:t>
-      </w:r>
-      <w:r>
-        <w:rPr>
-          <w:rFonts w:ascii="Calibri" w:hAnsi="Calibri" w:cs="Calibri"/>
-          <w:i/>
-          <w:iCs/>
-          <w:sz w:val="16"/>
-          <w:szCs w:val="16"/>
-          <w:lang w:val="en-US"/>
-        </w:rPr>
-        <w:t xml:space="preserve"> response and rejects unauthorized credentials, satisfying UT02."</w:t>
+        <w:t>"Evidence of T6 implementation: System successfully triggers a 400-fail response and rejects unauthorized credentials, satisfying UT02."</w:t>
       </w:r>
     </w:p>
     <w:p>
@@ -2017,6 +2002,7 @@
       <w:r>
         <w:rPr>
           <w:rFonts w:ascii="Calibri" w:hAnsi="Calibri" w:cs="Calibri"/>
+          <w:noProof/>
           <w:lang w:val="en-US"/>
         </w:rPr>
         <w:lastRenderedPageBreak/>
@@ -2344,6 +2330,78 @@
         </w:rPr>
         <w:t>What went well?</w:t>
       </w:r>
+    </w:p>
+    <w:p>
+      <w:pPr>
+        <w:jc w:val="left"/>
+        <w:rPr>
+          <w:rFonts w:ascii="Calibri" w:hAnsi="Calibri" w:cs="Calibri"/>
+        </w:rPr>
+      </w:pPr>
+      <w:r>
+        <w:rPr>
+          <w:rFonts w:ascii="Calibri" w:hAnsi="Calibri" w:cs="Calibri"/>
+        </w:rPr>
+        <w:t xml:space="preserve">implementing the server-side validation first ensured that </w:t>
+      </w:r>
+      <w:r>
+        <w:rPr>
+          <w:rFonts w:ascii="Calibri" w:hAnsi="Calibri" w:cs="Calibri"/>
+          <w:b/>
+          <w:bCs/>
+        </w:rPr>
+        <w:t>NFR1 (Security)</w:t>
+      </w:r>
+      <w:r>
+        <w:rPr>
+          <w:rFonts w:ascii="Calibri" w:hAnsi="Calibri" w:cs="Calibri"/>
+        </w:rPr>
+        <w:t xml:space="preserve"> was baked into the architecture before the UI was even built</w:t>
+      </w:r>
+    </w:p>
+    <w:p>
+      <w:pPr>
+        <w:jc w:val="left"/>
+        <w:rPr>
+          <w:rFonts w:ascii="Calibri" w:hAnsi="Calibri" w:cs="Calibri"/>
+        </w:rPr>
+      </w:pPr>
+      <w:r>
+        <w:rPr>
+          <w:rFonts w:ascii="Calibri" w:hAnsi="Calibri" w:cs="Calibri"/>
+        </w:rPr>
+        <w:t xml:space="preserve">utilized an artificial delay to verify </w:t>
+      </w:r>
+      <w:r>
+        <w:rPr>
+          <w:rFonts w:ascii="Calibri" w:hAnsi="Calibri" w:cs="Calibri"/>
+          <w:b/>
+          <w:bCs/>
+        </w:rPr>
+        <w:t>NFR2</w:t>
+      </w:r>
+      <w:r>
+        <w:rPr>
+          <w:rFonts w:ascii="Calibri" w:hAnsi="Calibri" w:cs="Calibri"/>
+        </w:rPr>
+        <w:t xml:space="preserve"> </w:t>
+      </w:r>
+      <w:proofErr w:type="gramStart"/>
+      <w:r>
+        <w:rPr>
+          <w:rFonts w:ascii="Calibri" w:hAnsi="Calibri" w:cs="Calibri"/>
+        </w:rPr>
+        <w:t>compliance .</w:t>
+      </w:r>
+      <w:proofErr w:type="gramEnd"/>
+    </w:p>
+    <w:p>
+      <w:pPr>
+        <w:jc w:val="left"/>
+        <w:rPr>
+          <w:rFonts w:ascii="Calibri" w:hAnsi="Calibri" w:cs="Calibri"/>
+        </w:rPr>
+      </w:pPr>
     </w:p>
     <w:p>
       <w:pPr>

</xml_diff>

<commit_message>
feat: implement bcryptjs for password hashing and enhance authentication tests
</commit_message>
<xml_diff>
--- a/docs/Sprint 2.docx
+++ b/docs/Sprint 2.docx
@@ -1004,11 +1004,12 @@
         <w:tblLook w:val="04A0" w:firstRow="1" w:lastRow="0" w:firstColumn="1" w:lastColumn="0" w:noHBand="0" w:noVBand="1"/>
       </w:tblPr>
       <w:tblGrid>
-        <w:gridCol w:w="694"/>
-        <w:gridCol w:w="4301"/>
-        <w:gridCol w:w="2187"/>
-        <w:gridCol w:w="1053"/>
-        <w:gridCol w:w="1109"/>
+        <w:gridCol w:w="776"/>
+        <w:gridCol w:w="3318"/>
+        <w:gridCol w:w="1432"/>
+        <w:gridCol w:w="1154"/>
+        <w:gridCol w:w="1232"/>
+        <w:gridCol w:w="1432"/>
       </w:tblGrid>
       <w:tr>
         <w:trPr>
@@ -1046,7 +1047,7 @@
         </w:tc>
         <w:tc>
           <w:tcPr>
-            <w:tcW w:w="2309" w:type="pct"/>
+            <w:tcW w:w="1834" w:type="pct"/>
             <w:tcBorders>
               <w:top w:val="single" w:sz="4" w:space="0" w:color="E59EDC" w:themeColor="accent5" w:themeTint="66"/>
               <w:left w:val="single" w:sz="4" w:space="0" w:color="E59EDC" w:themeColor="accent5" w:themeTint="66"/>
@@ -1072,7 +1073,7 @@
         </w:tc>
         <w:tc>
           <w:tcPr>
-            <w:tcW w:w="1178" w:type="pct"/>
+            <w:tcW w:w="824" w:type="pct"/>
             <w:tcBorders>
               <w:top w:val="single" w:sz="4" w:space="0" w:color="E59EDC" w:themeColor="accent5" w:themeTint="66"/>
               <w:bottom w:val="single" w:sz="4" w:space="0" w:color="E59EDC" w:themeColor="accent5" w:themeTint="66"/>
@@ -1096,7 +1097,7 @@
         </w:tc>
         <w:tc>
           <w:tcPr>
-            <w:tcW w:w="571" w:type="pct"/>
+            <w:tcW w:w="561" w:type="pct"/>
             <w:tcBorders>
               <w:top w:val="single" w:sz="4" w:space="0" w:color="E59EDC" w:themeColor="accent5" w:themeTint="66"/>
               <w:left w:val="single" w:sz="4" w:space="0" w:color="E59EDC" w:themeColor="accent5" w:themeTint="66"/>
@@ -1122,7 +1123,7 @@
         </w:tc>
         <w:tc>
           <w:tcPr>
-            <w:tcW w:w="571" w:type="pct"/>
+            <w:tcW w:w="593" w:type="pct"/>
             <w:tcBorders>
               <w:top w:val="single" w:sz="4" w:space="0" w:color="E59EDC" w:themeColor="accent5" w:themeTint="66"/>
               <w:bottom w:val="single" w:sz="4" w:space="0" w:color="E59EDC" w:themeColor="accent5" w:themeTint="66"/>
@@ -1142,6 +1143,31 @@
                 <w:rFonts w:ascii="Calibri" w:hAnsi="Calibri" w:cs="Calibri"/>
               </w:rPr>
               <w:t>Status</w:t>
+            </w:r>
+          </w:p>
+        </w:tc>
+        <w:tc>
+          <w:tcPr>
+            <w:tcW w:w="816" w:type="pct"/>
+            <w:tcBorders>
+              <w:top w:val="single" w:sz="4" w:space="0" w:color="E59EDC" w:themeColor="accent5" w:themeTint="66"/>
+              <w:bottom w:val="single" w:sz="4" w:space="0" w:color="E59EDC" w:themeColor="accent5" w:themeTint="66"/>
+              <w:right w:val="single" w:sz="4" w:space="0" w:color="E59EDC" w:themeColor="accent5" w:themeTint="66"/>
+            </w:tcBorders>
+          </w:tcPr>
+          <w:p>
+            <w:pPr>
+              <w:jc w:val="center"/>
+              <w:cnfStyle w:val="100000000000" w:firstRow="1" w:lastRow="0" w:firstColumn="0" w:lastColumn="0" w:oddVBand="0" w:evenVBand="0" w:oddHBand="0" w:evenHBand="0" w:firstRowFirstColumn="0" w:firstRowLastColumn="0" w:lastRowFirstColumn="0" w:lastRowLastColumn="0"/>
+              <w:rPr>
+                <w:rFonts w:ascii="Calibri" w:hAnsi="Calibri" w:cs="Calibri"/>
+              </w:rPr>
+            </w:pPr>
+            <w:r>
+              <w:rPr>
+                <w:rFonts w:ascii="Calibri" w:hAnsi="Calibri" w:cs="Calibri"/>
+              </w:rPr>
+              <w:t>Traceability</w:t>
             </w:r>
           </w:p>
         </w:tc>
@@ -1161,30 +1187,34 @@
               <w:right w:val="single" w:sz="4" w:space="0" w:color="E59EDC" w:themeColor="accent5" w:themeTint="66"/>
             </w:tcBorders>
             <w:shd w:val="clear" w:color="auto" w:fill="F2CEED" w:themeFill="accent5" w:themeFillTint="33"/>
-          </w:tcPr>
-          <w:p>
-            <w:pPr>
-              <w:jc w:val="center"/>
-              <w:rPr>
-                <w:rFonts w:ascii="Calibri" w:hAnsi="Calibri" w:cs="Calibri"/>
-              </w:rPr>
-            </w:pPr>
-            <w:r>
-              <w:rPr>
-                <w:rFonts w:ascii="Calibri" w:hAnsi="Calibri" w:cs="Calibri"/>
+            <w:vAlign w:val="center"/>
+          </w:tcPr>
+          <w:p>
+            <w:pPr>
+              <w:jc w:val="center"/>
+              <w:rPr>
+                <w:rFonts w:ascii="Calibri" w:hAnsi="Calibri" w:cs="Calibri"/>
+              </w:rPr>
+            </w:pPr>
+            <w:r>
+              <w:rPr>
+                <w:rStyle w:val="Strong"/>
+                <w:color w:val="1F1F1F"/>
+                <w:bdr w:val="none" w:sz="0" w:space="0" w:color="auto" w:frame="1"/>
               </w:rPr>
               <w:lastRenderedPageBreak/>
-              <w:t>T5</w:t>
-            </w:r>
-          </w:p>
-        </w:tc>
-        <w:tc>
-          <w:tcPr>
-            <w:tcW w:w="2309" w:type="pct"/>
+              <w:t>Task ID</w:t>
+            </w:r>
+          </w:p>
+        </w:tc>
+        <w:tc>
+          <w:tcPr>
+            <w:tcW w:w="1834" w:type="pct"/>
             <w:tcBorders>
               <w:top w:val="single" w:sz="4" w:space="0" w:color="E59EDC" w:themeColor="accent5" w:themeTint="66"/>
               <w:left w:val="single" w:sz="4" w:space="0" w:color="E59EDC" w:themeColor="accent5" w:themeTint="66"/>
             </w:tcBorders>
+            <w:vAlign w:val="center"/>
           </w:tcPr>
           <w:p>
             <w:pPr>
@@ -1196,40 +1226,21 @@
             </w:pPr>
             <w:r>
               <w:rPr>
-                <w:rFonts w:ascii="Calibri" w:hAnsi="Calibri" w:cs="Calibri"/>
-                <w:b/>
-                <w:bCs/>
-              </w:rPr>
-              <w:t>Implementation</w:t>
-            </w:r>
-            <w:r>
-              <w:rPr>
-                <w:rFonts w:ascii="Calibri" w:hAnsi="Calibri" w:cs="Calibri"/>
-              </w:rPr>
-              <w:t xml:space="preserve">: Populate </w:t>
-            </w:r>
-            <w:proofErr w:type="spellStart"/>
-            <w:r>
-              <w:rPr>
-                <w:rFonts w:ascii="Calibri" w:hAnsi="Calibri" w:cs="Calibri"/>
-              </w:rPr>
-              <w:t>mockData.ts</w:t>
-            </w:r>
-            <w:proofErr w:type="spellEnd"/>
-            <w:r>
-              <w:rPr>
-                <w:rFonts w:ascii="Calibri" w:hAnsi="Calibri" w:cs="Calibri"/>
-              </w:rPr>
-              <w:t xml:space="preserve"> with 3NF-compliant clinical entities.</w:t>
-            </w:r>
-          </w:p>
-        </w:tc>
-        <w:tc>
-          <w:tcPr>
-            <w:tcW w:w="1178" w:type="pct"/>
+                <w:rStyle w:val="Strong"/>
+                <w:color w:val="1F1F1F"/>
+                <w:bdr w:val="none" w:sz="0" w:space="0" w:color="auto" w:frame="1"/>
+              </w:rPr>
+              <w:t>Technical Task</w:t>
+            </w:r>
+          </w:p>
+        </w:tc>
+        <w:tc>
+          <w:tcPr>
+            <w:tcW w:w="824" w:type="pct"/>
             <w:tcBorders>
               <w:top w:val="single" w:sz="4" w:space="0" w:color="E59EDC" w:themeColor="accent5" w:themeTint="66"/>
             </w:tcBorders>
+            <w:vAlign w:val="center"/>
           </w:tcPr>
           <w:p>
             <w:pPr>
@@ -1242,21 +1253,21 @@
             </w:pPr>
             <w:r>
               <w:rPr>
-                <w:rFonts w:ascii="Calibri" w:hAnsi="Calibri" w:cs="Calibri"/>
-                <w:b/>
-                <w:bCs/>
-                <w:lang w:val="en-US"/>
-              </w:rPr>
-              <w:t>All</w:t>
-            </w:r>
-          </w:p>
-        </w:tc>
-        <w:tc>
-          <w:tcPr>
-            <w:tcW w:w="571" w:type="pct"/>
+                <w:rStyle w:val="Strong"/>
+                <w:color w:val="1F1F1F"/>
+                <w:bdr w:val="none" w:sz="0" w:space="0" w:color="auto" w:frame="1"/>
+              </w:rPr>
+              <w:t>Story Link</w:t>
+            </w:r>
+          </w:p>
+        </w:tc>
+        <w:tc>
+          <w:tcPr>
+            <w:tcW w:w="561" w:type="pct"/>
             <w:tcBorders>
               <w:top w:val="single" w:sz="4" w:space="0" w:color="E59EDC" w:themeColor="accent5" w:themeTint="66"/>
             </w:tcBorders>
+            <w:vAlign w:val="center"/>
           </w:tcPr>
           <w:p>
             <w:pPr>
@@ -1268,18 +1279,21 @@
             </w:pPr>
             <w:r>
               <w:rPr>
-                <w:rFonts w:ascii="Calibri" w:hAnsi="Calibri" w:cs="Calibri"/>
-              </w:rPr>
-              <w:t>2</w:t>
-            </w:r>
-          </w:p>
-        </w:tc>
-        <w:tc>
-          <w:tcPr>
-            <w:tcW w:w="571" w:type="pct"/>
+                <w:rStyle w:val="Strong"/>
+                <w:color w:val="1F1F1F"/>
+                <w:bdr w:val="none" w:sz="0" w:space="0" w:color="auto" w:frame="1"/>
+              </w:rPr>
+              <w:t>Estimate</w:t>
+            </w:r>
+          </w:p>
+        </w:tc>
+        <w:tc>
+          <w:tcPr>
+            <w:tcW w:w="593" w:type="pct"/>
             <w:tcBorders>
               <w:top w:val="single" w:sz="4" w:space="0" w:color="E59EDC" w:themeColor="accent5" w:themeTint="66"/>
             </w:tcBorders>
+            <w:vAlign w:val="center"/>
           </w:tcPr>
           <w:p>
             <w:pPr>
@@ -1291,9 +1305,37 @@
             </w:pPr>
             <w:r>
               <w:rPr>
-                <w:rFonts w:ascii="Calibri" w:hAnsi="Calibri" w:cs="Calibri"/>
-              </w:rPr>
-              <w:t>Complete</w:t>
+                <w:rStyle w:val="Strong"/>
+                <w:color w:val="1F1F1F"/>
+                <w:bdr w:val="none" w:sz="0" w:space="0" w:color="auto" w:frame="1"/>
+              </w:rPr>
+              <w:t>Status</w:t>
+            </w:r>
+          </w:p>
+        </w:tc>
+        <w:tc>
+          <w:tcPr>
+            <w:tcW w:w="816" w:type="pct"/>
+            <w:tcBorders>
+              <w:top w:val="single" w:sz="4" w:space="0" w:color="E59EDC" w:themeColor="accent5" w:themeTint="66"/>
+            </w:tcBorders>
+            <w:vAlign w:val="center"/>
+          </w:tcPr>
+          <w:p>
+            <w:pPr>
+              <w:jc w:val="center"/>
+              <w:cnfStyle w:val="000000100000" w:firstRow="0" w:lastRow="0" w:firstColumn="0" w:lastColumn="0" w:oddVBand="0" w:evenVBand="0" w:oddHBand="1" w:evenHBand="0" w:firstRowFirstColumn="0" w:firstRowLastColumn="0" w:lastRowFirstColumn="0" w:lastRowLastColumn="0"/>
+              <w:rPr>
+                <w:rFonts w:ascii="Calibri" w:hAnsi="Calibri" w:cs="Calibri"/>
+              </w:rPr>
+            </w:pPr>
+            <w:r>
+              <w:rPr>
+                <w:rStyle w:val="Strong"/>
+                <w:color w:val="1F1F1F"/>
+                <w:bdr w:val="none" w:sz="0" w:space="0" w:color="auto" w:frame="1"/>
+              </w:rPr>
+              <w:t>Traceability</w:t>
             </w:r>
           </w:p>
         </w:tc>
@@ -1309,28 +1351,33 @@
               <w:bottom w:val="single" w:sz="4" w:space="0" w:color="E59EDC" w:themeColor="accent5" w:themeTint="66"/>
               <w:right w:val="single" w:sz="4" w:space="0" w:color="E59EDC" w:themeColor="accent5" w:themeTint="66"/>
             </w:tcBorders>
-          </w:tcPr>
-          <w:p>
-            <w:pPr>
-              <w:jc w:val="center"/>
-              <w:rPr>
-                <w:rFonts w:ascii="Calibri" w:hAnsi="Calibri" w:cs="Calibri"/>
-              </w:rPr>
-            </w:pPr>
-            <w:r>
-              <w:rPr>
-                <w:rFonts w:ascii="Calibri" w:hAnsi="Calibri" w:cs="Calibri"/>
-              </w:rPr>
-              <w:t>T6</w:t>
-            </w:r>
-          </w:p>
-        </w:tc>
-        <w:tc>
-          <w:tcPr>
-            <w:tcW w:w="2309" w:type="pct"/>
+            <w:vAlign w:val="center"/>
+          </w:tcPr>
+          <w:p>
+            <w:pPr>
+              <w:jc w:val="center"/>
+              <w:rPr>
+                <w:rFonts w:ascii="Calibri" w:hAnsi="Calibri" w:cs="Calibri"/>
+              </w:rPr>
+            </w:pPr>
+            <w:r>
+              <w:rPr>
+                <w:b/>
+                <w:bCs/>
+                <w:color w:val="1F1F1F"/>
+                <w:bdr w:val="none" w:sz="0" w:space="0" w:color="auto" w:frame="1"/>
+              </w:rPr>
+              <w:t>T5</w:t>
+            </w:r>
+          </w:p>
+        </w:tc>
+        <w:tc>
+          <w:tcPr>
+            <w:tcW w:w="1834" w:type="pct"/>
             <w:tcBorders>
               <w:left w:val="single" w:sz="4" w:space="0" w:color="E59EDC" w:themeColor="accent5" w:themeTint="66"/>
             </w:tcBorders>
+            <w:vAlign w:val="center"/>
           </w:tcPr>
           <w:p>
             <w:pPr>
@@ -1338,109 +1385,140 @@
               <w:cnfStyle w:val="000000000000" w:firstRow="0" w:lastRow="0" w:firstColumn="0" w:lastColumn="0" w:oddVBand="0" w:evenVBand="0" w:oddHBand="0" w:evenHBand="0" w:firstRowFirstColumn="0" w:firstRowLastColumn="0" w:lastRowFirstColumn="0" w:lastRowLastColumn="0"/>
               <w:rPr>
                 <w:rFonts w:ascii="Calibri" w:hAnsi="Calibri" w:cs="Calibri"/>
-                <w:lang w:val="en-US"/>
-              </w:rPr>
-            </w:pPr>
-            <w:r>
-              <w:rPr>
-                <w:rFonts w:ascii="Calibri" w:hAnsi="Calibri" w:cs="Calibri"/>
+              </w:rPr>
+            </w:pPr>
+            <w:r>
+              <w:rPr>
                 <w:b/>
                 <w:bCs/>
+                <w:color w:val="1F1F1F"/>
+                <w:bdr w:val="none" w:sz="0" w:space="0" w:color="auto" w:frame="1"/>
+              </w:rPr>
+              <w:t>Implementation</w:t>
+            </w:r>
+            <w:r>
+              <w:rPr>
+                <w:color w:val="1F1F1F"/>
+                <w:bdr w:val="none" w:sz="0" w:space="0" w:color="auto" w:frame="1"/>
+              </w:rPr>
+              <w:t xml:space="preserve">: Populate </w:t>
+            </w:r>
+            <w:proofErr w:type="spellStart"/>
+            <w:r>
+              <w:rPr>
+                <w:rStyle w:val="HTMLCode"/>
+                <w:rFonts w:eastAsiaTheme="majorEastAsia" w:cs="Arial"/>
+                <w:color w:val="444746"/>
+                <w:bdr w:val="none" w:sz="0" w:space="0" w:color="auto" w:frame="1"/>
+              </w:rPr>
+              <w:t>mockData.ts</w:t>
+            </w:r>
+            <w:proofErr w:type="spellEnd"/>
+            <w:r>
+              <w:rPr>
+                <w:color w:val="1F1F1F"/>
+                <w:bdr w:val="none" w:sz="0" w:space="0" w:color="auto" w:frame="1"/>
+              </w:rPr>
+              <w:t xml:space="preserve"> with 3NF entities.</w:t>
+            </w:r>
+          </w:p>
+        </w:tc>
+        <w:tc>
+          <w:tcPr>
+            <w:tcW w:w="824" w:type="pct"/>
+            <w:vAlign w:val="center"/>
+          </w:tcPr>
+          <w:p>
+            <w:pPr>
+              <w:jc w:val="center"/>
+              <w:cnfStyle w:val="000000000000" w:firstRow="0" w:lastRow="0" w:firstColumn="0" w:lastColumn="0" w:oddVBand="0" w:evenVBand="0" w:oddHBand="0" w:evenHBand="0" w:firstRowFirstColumn="0" w:firstRowLastColumn="0" w:lastRowFirstColumn="0" w:lastRowLastColumn="0"/>
+              <w:rPr>
+                <w:rFonts w:ascii="Calibri" w:hAnsi="Calibri" w:cs="Calibri"/>
+              </w:rPr>
+            </w:pPr>
+            <w:r>
+              <w:rPr>
+                <w:color w:val="1F1F1F"/>
+                <w:bdr w:val="none" w:sz="0" w:space="0" w:color="auto" w:frame="1"/>
+              </w:rPr>
+              <w:t>All</w:t>
+            </w:r>
+          </w:p>
+        </w:tc>
+        <w:tc>
+          <w:tcPr>
+            <w:tcW w:w="561" w:type="pct"/>
+            <w:vAlign w:val="center"/>
+          </w:tcPr>
+          <w:p>
+            <w:pPr>
+              <w:jc w:val="center"/>
+              <w:cnfStyle w:val="000000000000" w:firstRow="0" w:lastRow="0" w:firstColumn="0" w:lastColumn="0" w:oddVBand="0" w:evenVBand="0" w:oddHBand="0" w:evenHBand="0" w:firstRowFirstColumn="0" w:firstRowLastColumn="0" w:lastRowFirstColumn="0" w:lastRowLastColumn="0"/>
+              <w:rPr>
+                <w:rFonts w:ascii="Calibri" w:hAnsi="Calibri" w:cs="Calibri"/>
+              </w:rPr>
+            </w:pPr>
+            <w:r>
+              <w:rPr>
+                <w:color w:val="1F1F1F"/>
+                <w:bdr w:val="none" w:sz="0" w:space="0" w:color="auto" w:frame="1"/>
+              </w:rPr>
+              <w:t>2</w:t>
+            </w:r>
+          </w:p>
+        </w:tc>
+        <w:tc>
+          <w:tcPr>
+            <w:tcW w:w="593" w:type="pct"/>
+            <w:vAlign w:val="center"/>
+          </w:tcPr>
+          <w:p>
+            <w:pPr>
+              <w:jc w:val="center"/>
+              <w:cnfStyle w:val="000000000000" w:firstRow="0" w:lastRow="0" w:firstColumn="0" w:lastColumn="0" w:oddVBand="0" w:evenVBand="0" w:oddHBand="0" w:evenHBand="0" w:firstRowFirstColumn="0" w:firstRowLastColumn="0" w:lastRowFirstColumn="0" w:lastRowLastColumn="0"/>
+              <w:rPr>
+                <w:rFonts w:ascii="Calibri" w:hAnsi="Calibri" w:cs="Calibri"/>
+              </w:rPr>
+            </w:pPr>
+            <w:r>
+              <w:rPr>
+                <w:b/>
+                <w:bCs/>
+                <w:color w:val="1F1F1F"/>
+                <w:bdr w:val="none" w:sz="0" w:space="0" w:color="auto" w:frame="1"/>
+              </w:rPr>
+              <w:t>Complete</w:t>
+            </w:r>
+          </w:p>
+        </w:tc>
+        <w:tc>
+          <w:tcPr>
+            <w:tcW w:w="816" w:type="pct"/>
+            <w:vAlign w:val="center"/>
+          </w:tcPr>
+          <w:p>
+            <w:pPr>
+              <w:jc w:val="center"/>
+              <w:cnfStyle w:val="000000000000" w:firstRow="0" w:lastRow="0" w:firstColumn="0" w:lastColumn="0" w:oddVBand="0" w:evenVBand="0" w:oddHBand="0" w:evenHBand="0" w:firstRowFirstColumn="0" w:firstRowLastColumn="0" w:lastRowFirstColumn="0" w:lastRowLastColumn="0"/>
+              <w:rPr>
+                <w:rFonts w:ascii="Calibri" w:hAnsi="Calibri" w:cs="Calibri"/>
                 <w:lang w:val="en-US"/>
               </w:rPr>
-              <w:t>Security</w:t>
-            </w:r>
-            <w:r>
-              <w:rPr>
-                <w:rFonts w:ascii="Calibri" w:hAnsi="Calibri" w:cs="Calibri"/>
-                <w:lang w:val="en-US"/>
-              </w:rPr>
-              <w:t>: Build +</w:t>
-            </w:r>
-            <w:proofErr w:type="spellStart"/>
-            <w:r>
-              <w:rPr>
-                <w:rFonts w:ascii="Calibri" w:hAnsi="Calibri" w:cs="Calibri"/>
-                <w:lang w:val="en-US"/>
-              </w:rPr>
-              <w:t>page.server.ts</w:t>
-            </w:r>
-            <w:proofErr w:type="spellEnd"/>
-            <w:r>
-              <w:rPr>
-                <w:rFonts w:ascii="Calibri" w:hAnsi="Calibri" w:cs="Calibri"/>
-                <w:lang w:val="en-US"/>
-              </w:rPr>
-              <w:t xml:space="preserve"> actions for login validation.</w:t>
-            </w:r>
-          </w:p>
-          <w:p>
-            <w:pPr>
-              <w:jc w:val="left"/>
-              <w:cnfStyle w:val="000000000000" w:firstRow="0" w:lastRow="0" w:firstColumn="0" w:lastColumn="0" w:oddVBand="0" w:evenVBand="0" w:oddHBand="0" w:evenHBand="0" w:firstRowFirstColumn="0" w:firstRowLastColumn="0" w:lastRowFirstColumn="0" w:lastRowLastColumn="0"/>
-              <w:rPr>
-                <w:rFonts w:ascii="Calibri" w:hAnsi="Calibri" w:cs="Calibri"/>
-              </w:rPr>
-            </w:pPr>
-          </w:p>
-        </w:tc>
-        <w:tc>
-          <w:tcPr>
-            <w:tcW w:w="1178" w:type="pct"/>
-          </w:tcPr>
-          <w:p>
-            <w:pPr>
-              <w:jc w:val="center"/>
-              <w:cnfStyle w:val="000000000000" w:firstRow="0" w:lastRow="0" w:firstColumn="0" w:lastColumn="0" w:oddVBand="0" w:evenVBand="0" w:oddHBand="0" w:evenHBand="0" w:firstRowFirstColumn="0" w:firstRowLastColumn="0" w:lastRowFirstColumn="0" w:lastRowLastColumn="0"/>
-              <w:rPr>
-                <w:rFonts w:ascii="Calibri" w:hAnsi="Calibri" w:cs="Calibri"/>
-              </w:rPr>
-            </w:pPr>
-            <w:r>
-              <w:rPr>
-                <w:rFonts w:ascii="Calibri" w:hAnsi="Calibri" w:cs="Calibri"/>
-              </w:rPr>
-              <w:t>Story 01</w:t>
-            </w:r>
-          </w:p>
-        </w:tc>
-        <w:tc>
-          <w:tcPr>
-            <w:tcW w:w="571" w:type="pct"/>
-          </w:tcPr>
-          <w:p>
-            <w:pPr>
-              <w:jc w:val="center"/>
-              <w:cnfStyle w:val="000000000000" w:firstRow="0" w:lastRow="0" w:firstColumn="0" w:lastColumn="0" w:oddVBand="0" w:evenVBand="0" w:oddHBand="0" w:evenHBand="0" w:firstRowFirstColumn="0" w:firstRowLastColumn="0" w:lastRowFirstColumn="0" w:lastRowLastColumn="0"/>
-              <w:rPr>
-                <w:rFonts w:ascii="Calibri" w:hAnsi="Calibri" w:cs="Calibri"/>
-              </w:rPr>
-            </w:pPr>
-            <w:r>
-              <w:rPr>
-                <w:rFonts w:ascii="Calibri" w:hAnsi="Calibri" w:cs="Calibri"/>
-              </w:rPr>
-              <w:t>3</w:t>
-            </w:r>
-          </w:p>
-        </w:tc>
-        <w:tc>
-          <w:tcPr>
-            <w:tcW w:w="571" w:type="pct"/>
-          </w:tcPr>
-          <w:p>
-            <w:pPr>
-              <w:jc w:val="center"/>
-              <w:cnfStyle w:val="000000000000" w:firstRow="0" w:lastRow="0" w:firstColumn="0" w:lastColumn="0" w:oddVBand="0" w:evenVBand="0" w:oddHBand="0" w:evenHBand="0" w:firstRowFirstColumn="0" w:firstRowLastColumn="0" w:lastRowFirstColumn="0" w:lastRowLastColumn="0"/>
-              <w:rPr>
-                <w:rFonts w:ascii="Calibri" w:hAnsi="Calibri" w:cs="Calibri"/>
-              </w:rPr>
-            </w:pPr>
-            <w:r>
-              <w:rPr>
-                <w:rFonts w:ascii="Calibri" w:hAnsi="Calibri" w:cs="Calibri"/>
-              </w:rPr>
-              <w:t>Complete</w:t>
+            </w:pPr>
+            <w:r>
+              <w:rPr>
+                <w:rStyle w:val="citation-4984"/>
+                <w:color w:val="1F1F1F"/>
+                <w:bdr w:val="none" w:sz="0" w:space="0" w:color="auto" w:frame="1"/>
+              </w:rPr>
+              <w:t>Maps LDM to code</w:t>
+            </w:r>
+            <w:r>
+              <w:rPr>
+                <w:color w:val="1F1F1F"/>
+                <w:bdr w:val="none" w:sz="0" w:space="0" w:color="auto" w:frame="1"/>
+              </w:rPr>
+              <w:t>.</w:t>
             </w:r>
           </w:p>
         </w:tc>
@@ -1460,28 +1538,33 @@
               <w:right w:val="single" w:sz="4" w:space="0" w:color="E59EDC" w:themeColor="accent5" w:themeTint="66"/>
             </w:tcBorders>
             <w:shd w:val="clear" w:color="auto" w:fill="F2CEED" w:themeFill="accent5" w:themeFillTint="33"/>
-          </w:tcPr>
-          <w:p>
-            <w:pPr>
-              <w:jc w:val="center"/>
-              <w:rPr>
-                <w:rFonts w:ascii="Calibri" w:hAnsi="Calibri" w:cs="Calibri"/>
-              </w:rPr>
-            </w:pPr>
-            <w:r>
-              <w:rPr>
-                <w:rFonts w:ascii="Calibri" w:hAnsi="Calibri" w:cs="Calibri"/>
-              </w:rPr>
-              <w:t>T7</w:t>
-            </w:r>
-          </w:p>
-        </w:tc>
-        <w:tc>
-          <w:tcPr>
-            <w:tcW w:w="2309" w:type="pct"/>
+            <w:vAlign w:val="center"/>
+          </w:tcPr>
+          <w:p>
+            <w:pPr>
+              <w:jc w:val="center"/>
+              <w:rPr>
+                <w:rFonts w:ascii="Calibri" w:hAnsi="Calibri" w:cs="Calibri"/>
+              </w:rPr>
+            </w:pPr>
+            <w:r>
+              <w:rPr>
+                <w:b/>
+                <w:bCs/>
+                <w:color w:val="1F1F1F"/>
+                <w:bdr w:val="none" w:sz="0" w:space="0" w:color="auto" w:frame="1"/>
+              </w:rPr>
+              <w:t>T11</w:t>
+            </w:r>
+          </w:p>
+        </w:tc>
+        <w:tc>
+          <w:tcPr>
+            <w:tcW w:w="1834" w:type="pct"/>
             <w:tcBorders>
               <w:left w:val="single" w:sz="4" w:space="0" w:color="E59EDC" w:themeColor="accent5" w:themeTint="66"/>
             </w:tcBorders>
+            <w:vAlign w:val="center"/>
           </w:tcPr>
           <w:p>
             <w:pPr>
@@ -1493,23 +1576,62 @@
             </w:pPr>
             <w:r>
               <w:rPr>
-                <w:rFonts w:ascii="Calibri" w:hAnsi="Calibri" w:cs="Calibri"/>
                 <w:b/>
                 <w:bCs/>
-              </w:rPr>
-              <w:t>Frontend</w:t>
-            </w:r>
-            <w:r>
-              <w:rPr>
-                <w:rFonts w:ascii="Calibri" w:hAnsi="Calibri" w:cs="Calibri"/>
-              </w:rPr>
-              <w:t>: Build Login UI with Tailwind CSS forms plugin.</w:t>
-            </w:r>
-          </w:p>
-        </w:tc>
-        <w:tc>
-          <w:tcPr>
-            <w:tcW w:w="1178" w:type="pct"/>
+                <w:color w:val="1F1F1F"/>
+                <w:bdr w:val="none" w:sz="0" w:space="0" w:color="auto" w:frame="1"/>
+              </w:rPr>
+              <w:t>Security</w:t>
+            </w:r>
+            <w:r>
+              <w:rPr>
+                <w:color w:val="1F1F1F"/>
+                <w:bdr w:val="none" w:sz="0" w:space="0" w:color="auto" w:frame="1"/>
+              </w:rPr>
+              <w:t xml:space="preserve">: Implement </w:t>
+            </w:r>
+            <w:proofErr w:type="spellStart"/>
+            <w:r>
+              <w:rPr>
+                <w:rStyle w:val="HTMLCode"/>
+                <w:rFonts w:eastAsiaTheme="majorEastAsia" w:cs="Arial"/>
+                <w:color w:val="444746"/>
+                <w:bdr w:val="none" w:sz="0" w:space="0" w:color="auto" w:frame="1"/>
+              </w:rPr>
+              <w:t>bcryptjs</w:t>
+            </w:r>
+            <w:proofErr w:type="spellEnd"/>
+            <w:r>
+              <w:rPr>
+                <w:color w:val="1F1F1F"/>
+                <w:bdr w:val="none" w:sz="0" w:space="0" w:color="auto" w:frame="1"/>
+              </w:rPr>
+              <w:t xml:space="preserve"> hashing for </w:t>
+            </w:r>
+            <w:proofErr w:type="spellStart"/>
+            <w:r>
+              <w:rPr>
+                <w:rStyle w:val="HTMLCode"/>
+                <w:rFonts w:eastAsiaTheme="majorEastAsia" w:cs="Arial"/>
+                <w:color w:val="444746"/>
+                <w:bdr w:val="none" w:sz="0" w:space="0" w:color="auto" w:frame="1"/>
+              </w:rPr>
+              <w:t>password_hash</w:t>
+            </w:r>
+            <w:proofErr w:type="spellEnd"/>
+            <w:r>
+              <w:rPr>
+                <w:color w:val="1F1F1F"/>
+                <w:bdr w:val="none" w:sz="0" w:space="0" w:color="auto" w:frame="1"/>
+              </w:rPr>
+              <w:t>.</w:t>
+            </w:r>
+          </w:p>
+        </w:tc>
+        <w:tc>
+          <w:tcPr>
+            <w:tcW w:w="824" w:type="pct"/>
+            <w:vAlign w:val="center"/>
           </w:tcPr>
           <w:p>
             <w:pPr>
@@ -1521,7 +1643,8 @@
             </w:pPr>
             <w:r>
               <w:rPr>
-                <w:rFonts w:ascii="Calibri" w:hAnsi="Calibri" w:cs="Calibri"/>
+                <w:color w:val="1F1F1F"/>
+                <w:bdr w:val="none" w:sz="0" w:space="0" w:color="auto" w:frame="1"/>
               </w:rPr>
               <w:t>Story 01</w:t>
             </w:r>
@@ -1529,7 +1652,8 @@
         </w:tc>
         <w:tc>
           <w:tcPr>
-            <w:tcW w:w="571" w:type="pct"/>
+            <w:tcW w:w="561" w:type="pct"/>
+            <w:vAlign w:val="center"/>
           </w:tcPr>
           <w:p>
             <w:pPr>
@@ -1541,7 +1665,8 @@
             </w:pPr>
             <w:r>
               <w:rPr>
-                <w:rFonts w:ascii="Calibri" w:hAnsi="Calibri" w:cs="Calibri"/>
+                <w:color w:val="1F1F1F"/>
+                <w:bdr w:val="none" w:sz="0" w:space="0" w:color="auto" w:frame="1"/>
               </w:rPr>
               <w:t>3</w:t>
             </w:r>
@@ -1549,7 +1674,8 @@
         </w:tc>
         <w:tc>
           <w:tcPr>
-            <w:tcW w:w="571" w:type="pct"/>
+            <w:tcW w:w="593" w:type="pct"/>
+            <w:vAlign w:val="center"/>
           </w:tcPr>
           <w:p>
             <w:pPr>
@@ -1561,9 +1687,53 @@
             </w:pPr>
             <w:r>
               <w:rPr>
-                <w:rFonts w:ascii="Calibri" w:hAnsi="Calibri" w:cs="Calibri"/>
+                <w:b/>
+                <w:bCs/>
+                <w:color w:val="1F1F1F"/>
+                <w:bdr w:val="none" w:sz="0" w:space="0" w:color="auto" w:frame="1"/>
               </w:rPr>
               <w:t>Complete</w:t>
+            </w:r>
+          </w:p>
+        </w:tc>
+        <w:tc>
+          <w:tcPr>
+            <w:tcW w:w="816" w:type="pct"/>
+            <w:vAlign w:val="center"/>
+          </w:tcPr>
+          <w:p>
+            <w:pPr>
+              <w:jc w:val="center"/>
+              <w:cnfStyle w:val="000000100000" w:firstRow="0" w:lastRow="0" w:firstColumn="0" w:lastColumn="0" w:oddVBand="0" w:evenVBand="0" w:oddHBand="1" w:evenHBand="0" w:firstRowFirstColumn="0" w:firstRowLastColumn="0" w:lastRowFirstColumn="0" w:lastRowLastColumn="0"/>
+              <w:rPr>
+                <w:rFonts w:ascii="Calibri" w:hAnsi="Calibri" w:cs="Calibri"/>
+                <w:lang w:val="en-US"/>
+              </w:rPr>
+            </w:pPr>
+            <w:proofErr w:type="spellStart"/>
+            <w:r>
+              <w:rPr>
+                <w:rStyle w:val="citation-4983"/>
+                <w:color w:val="1F1F1F"/>
+                <w:bdr w:val="none" w:sz="0" w:space="0" w:color="auto" w:frame="1"/>
+              </w:rPr>
+              <w:t>Fulfills</w:t>
+            </w:r>
+            <w:proofErr w:type="spellEnd"/>
+            <w:r>
+              <w:rPr>
+                <w:rStyle w:val="citation-4983"/>
+                <w:color w:val="1F1F1F"/>
+                <w:bdr w:val="none" w:sz="0" w:space="0" w:color="auto" w:frame="1"/>
+              </w:rPr>
+              <w:t xml:space="preserve"> NFR1 &amp; LDM</w:t>
+            </w:r>
+            <w:r>
+              <w:rPr>
+                <w:color w:val="1F1F1F"/>
+                <w:bdr w:val="none" w:sz="0" w:space="0" w:color="auto" w:frame="1"/>
+              </w:rPr>
+              <w:t>.</w:t>
             </w:r>
           </w:p>
         </w:tc>
@@ -1579,17 +1749,21 @@
               <w:bottom w:val="single" w:sz="4" w:space="0" w:color="E59EDC" w:themeColor="accent5" w:themeTint="66"/>
               <w:right w:val="single" w:sz="4" w:space="0" w:color="E59EDC" w:themeColor="accent5" w:themeTint="66"/>
             </w:tcBorders>
-          </w:tcPr>
-          <w:p>
-            <w:pPr>
-              <w:jc w:val="center"/>
-              <w:rPr>
-                <w:rFonts w:ascii="Calibri" w:hAnsi="Calibri" w:cs="Calibri"/>
-              </w:rPr>
-            </w:pPr>
-            <w:r>
-              <w:rPr>
-                <w:rFonts w:ascii="Calibri" w:hAnsi="Calibri" w:cs="Calibri"/>
+            <w:vAlign w:val="center"/>
+          </w:tcPr>
+          <w:p>
+            <w:pPr>
+              <w:jc w:val="center"/>
+              <w:rPr>
+                <w:rFonts w:ascii="Calibri" w:hAnsi="Calibri" w:cs="Calibri"/>
+              </w:rPr>
+            </w:pPr>
+            <w:r>
+              <w:rPr>
+                <w:b/>
+                <w:bCs/>
+                <w:color w:val="1F1F1F"/>
+                <w:bdr w:val="none" w:sz="0" w:space="0" w:color="auto" w:frame="1"/>
               </w:rPr>
               <w:t>T8</w:t>
             </w:r>
@@ -1597,10 +1771,11 @@
         </w:tc>
         <w:tc>
           <w:tcPr>
-            <w:tcW w:w="2309" w:type="pct"/>
+            <w:tcW w:w="1834" w:type="pct"/>
             <w:tcBorders>
               <w:left w:val="single" w:sz="4" w:space="0" w:color="E59EDC" w:themeColor="accent5" w:themeTint="66"/>
             </w:tcBorders>
+            <w:vAlign w:val="center"/>
           </w:tcPr>
           <w:p>
             <w:pPr>
@@ -1608,109 +1783,138 @@
               <w:cnfStyle w:val="000000000000" w:firstRow="0" w:lastRow="0" w:firstColumn="0" w:lastColumn="0" w:oddVBand="0" w:evenVBand="0" w:oddHBand="0" w:evenHBand="0" w:firstRowFirstColumn="0" w:firstRowLastColumn="0" w:lastRowFirstColumn="0" w:lastRowLastColumn="0"/>
               <w:rPr>
                 <w:rFonts w:ascii="Calibri" w:hAnsi="Calibri" w:cs="Calibri"/>
-                <w:lang w:val="en-US"/>
-              </w:rPr>
-            </w:pPr>
-            <w:r>
-              <w:rPr>
-                <w:rFonts w:ascii="Calibri" w:hAnsi="Calibri" w:cs="Calibri"/>
+              </w:rPr>
+            </w:pPr>
+            <w:r>
+              <w:rPr>
                 <w:b/>
                 <w:bCs/>
-                <w:lang w:val="en-US"/>
+                <w:color w:val="1F1F1F"/>
+                <w:bdr w:val="none" w:sz="0" w:space="0" w:color="auto" w:frame="1"/>
               </w:rPr>
               <w:t>TDD</w:t>
             </w:r>
             <w:r>
               <w:rPr>
-                <w:rFonts w:ascii="Calibri" w:hAnsi="Calibri" w:cs="Calibri"/>
-                <w:lang w:val="en-US"/>
-              </w:rPr>
-              <w:t xml:space="preserve">: Write Unit Tests for Login logic using the </w:t>
-            </w:r>
-            <w:r>
-              <w:rPr>
-                <w:rFonts w:ascii="Calibri" w:hAnsi="Calibri" w:cs="Calibri"/>
+                <w:color w:val="1F1F1F"/>
+                <w:bdr w:val="none" w:sz="0" w:space="0" w:color="auto" w:frame="1"/>
+              </w:rPr>
+              <w:t xml:space="preserve">: Write Unit Tests using the </w:t>
+            </w:r>
+            <w:r>
+              <w:rPr>
                 <w:b/>
                 <w:bCs/>
+                <w:color w:val="1F1F1F"/>
+                <w:bdr w:val="none" w:sz="0" w:space="0" w:color="auto" w:frame="1"/>
+              </w:rPr>
+              <w:t>AAA pattern</w:t>
+            </w:r>
+            <w:r>
+              <w:rPr>
+                <w:color w:val="1F1F1F"/>
+                <w:bdr w:val="none" w:sz="0" w:space="0" w:color="auto" w:frame="1"/>
+              </w:rPr>
+              <w:t>.</w:t>
+            </w:r>
+          </w:p>
+        </w:tc>
+        <w:tc>
+          <w:tcPr>
+            <w:tcW w:w="824" w:type="pct"/>
+            <w:vAlign w:val="center"/>
+          </w:tcPr>
+          <w:p>
+            <w:pPr>
+              <w:jc w:val="center"/>
+              <w:cnfStyle w:val="000000000000" w:firstRow="0" w:lastRow="0" w:firstColumn="0" w:lastColumn="0" w:oddVBand="0" w:evenVBand="0" w:oddHBand="0" w:evenHBand="0" w:firstRowFirstColumn="0" w:firstRowLastColumn="0" w:lastRowFirstColumn="0" w:lastRowLastColumn="0"/>
+              <w:rPr>
+                <w:rFonts w:ascii="Calibri" w:hAnsi="Calibri" w:cs="Calibri"/>
+              </w:rPr>
+            </w:pPr>
+            <w:r>
+              <w:rPr>
+                <w:color w:val="1F1F1F"/>
+                <w:bdr w:val="none" w:sz="0" w:space="0" w:color="auto" w:frame="1"/>
+              </w:rPr>
+              <w:t>Story 01</w:t>
+            </w:r>
+          </w:p>
+        </w:tc>
+        <w:tc>
+          <w:tcPr>
+            <w:tcW w:w="561" w:type="pct"/>
+            <w:vAlign w:val="center"/>
+          </w:tcPr>
+          <w:p>
+            <w:pPr>
+              <w:jc w:val="center"/>
+              <w:cnfStyle w:val="000000000000" w:firstRow="0" w:lastRow="0" w:firstColumn="0" w:lastColumn="0" w:oddVBand="0" w:evenVBand="0" w:oddHBand="0" w:evenHBand="0" w:firstRowFirstColumn="0" w:firstRowLastColumn="0" w:lastRowFirstColumn="0" w:lastRowLastColumn="0"/>
+              <w:rPr>
+                <w:rFonts w:ascii="Calibri" w:hAnsi="Calibri" w:cs="Calibri"/>
+              </w:rPr>
+            </w:pPr>
+            <w:r>
+              <w:rPr>
+                <w:color w:val="1F1F1F"/>
+                <w:bdr w:val="none" w:sz="0" w:space="0" w:color="auto" w:frame="1"/>
+              </w:rPr>
+              <w:t>3</w:t>
+            </w:r>
+          </w:p>
+        </w:tc>
+        <w:tc>
+          <w:tcPr>
+            <w:tcW w:w="593" w:type="pct"/>
+            <w:vAlign w:val="center"/>
+          </w:tcPr>
+          <w:p>
+            <w:pPr>
+              <w:jc w:val="center"/>
+              <w:cnfStyle w:val="000000000000" w:firstRow="0" w:lastRow="0" w:firstColumn="0" w:lastColumn="0" w:oddVBand="0" w:evenVBand="0" w:oddHBand="0" w:evenHBand="0" w:firstRowFirstColumn="0" w:firstRowLastColumn="0" w:lastRowFirstColumn="0" w:lastRowLastColumn="0"/>
+              <w:rPr>
+                <w:rFonts w:ascii="Calibri" w:hAnsi="Calibri" w:cs="Calibri"/>
+              </w:rPr>
+            </w:pPr>
+            <w:r>
+              <w:rPr>
+                <w:b/>
+                <w:bCs/>
+                <w:color w:val="1F1F1F"/>
+                <w:bdr w:val="none" w:sz="0" w:space="0" w:color="auto" w:frame="1"/>
+              </w:rPr>
+              <w:t>Complete</w:t>
+            </w:r>
+          </w:p>
+        </w:tc>
+        <w:tc>
+          <w:tcPr>
+            <w:tcW w:w="816" w:type="pct"/>
+            <w:vAlign w:val="center"/>
+          </w:tcPr>
+          <w:p>
+            <w:pPr>
+              <w:jc w:val="center"/>
+              <w:cnfStyle w:val="000000000000" w:firstRow="0" w:lastRow="0" w:firstColumn="0" w:lastColumn="0" w:oddVBand="0" w:evenVBand="0" w:oddHBand="0" w:evenHBand="0" w:firstRowFirstColumn="0" w:firstRowLastColumn="0" w:lastRowFirstColumn="0" w:lastRowLastColumn="0"/>
+              <w:rPr>
+                <w:rFonts w:ascii="Calibri" w:hAnsi="Calibri" w:cs="Calibri"/>
                 <w:lang w:val="en-US"/>
               </w:rPr>
-              <w:t>AAA pattern</w:t>
-            </w:r>
-            <w:r>
-              <w:rPr>
-                <w:rFonts w:ascii="Calibri" w:hAnsi="Calibri" w:cs="Calibri"/>
-                <w:lang w:val="en-US"/>
+            </w:pPr>
+            <w:r>
+              <w:rPr>
+                <w:rStyle w:val="citation-4982"/>
+                <w:color w:val="1F1F1F"/>
+                <w:bdr w:val="none" w:sz="0" w:space="0" w:color="auto" w:frame="1"/>
+              </w:rPr>
+              <w:t>Proves PSD testing plan</w:t>
+            </w:r>
+            <w:r>
+              <w:rPr>
+                <w:color w:val="1F1F1F"/>
+                <w:bdr w:val="none" w:sz="0" w:space="0" w:color="auto" w:frame="1"/>
               </w:rPr>
               <w:t>.</w:t>
-            </w:r>
-          </w:p>
-          <w:p>
-            <w:pPr>
-              <w:jc w:val="left"/>
-              <w:cnfStyle w:val="000000000000" w:firstRow="0" w:lastRow="0" w:firstColumn="0" w:lastColumn="0" w:oddVBand="0" w:evenVBand="0" w:oddHBand="0" w:evenHBand="0" w:firstRowFirstColumn="0" w:firstRowLastColumn="0" w:lastRowFirstColumn="0" w:lastRowLastColumn="0"/>
-              <w:rPr>
-                <w:rFonts w:ascii="Calibri" w:hAnsi="Calibri" w:cs="Calibri"/>
-              </w:rPr>
-            </w:pPr>
-          </w:p>
-        </w:tc>
-        <w:tc>
-          <w:tcPr>
-            <w:tcW w:w="1178" w:type="pct"/>
-          </w:tcPr>
-          <w:p>
-            <w:pPr>
-              <w:jc w:val="center"/>
-              <w:cnfStyle w:val="000000000000" w:firstRow="0" w:lastRow="0" w:firstColumn="0" w:lastColumn="0" w:oddVBand="0" w:evenVBand="0" w:oddHBand="0" w:evenHBand="0" w:firstRowFirstColumn="0" w:firstRowLastColumn="0" w:lastRowFirstColumn="0" w:lastRowLastColumn="0"/>
-              <w:rPr>
-                <w:rFonts w:ascii="Calibri" w:hAnsi="Calibri" w:cs="Calibri"/>
-              </w:rPr>
-            </w:pPr>
-            <w:r>
-              <w:rPr>
-                <w:rFonts w:ascii="Calibri" w:hAnsi="Calibri" w:cs="Calibri"/>
-              </w:rPr>
-              <w:t>Story 01</w:t>
-            </w:r>
-          </w:p>
-        </w:tc>
-        <w:tc>
-          <w:tcPr>
-            <w:tcW w:w="571" w:type="pct"/>
-          </w:tcPr>
-          <w:p>
-            <w:pPr>
-              <w:jc w:val="center"/>
-              <w:cnfStyle w:val="000000000000" w:firstRow="0" w:lastRow="0" w:firstColumn="0" w:lastColumn="0" w:oddVBand="0" w:evenVBand="0" w:oddHBand="0" w:evenHBand="0" w:firstRowFirstColumn="0" w:firstRowLastColumn="0" w:lastRowFirstColumn="0" w:lastRowLastColumn="0"/>
-              <w:rPr>
-                <w:rFonts w:ascii="Calibri" w:hAnsi="Calibri" w:cs="Calibri"/>
-              </w:rPr>
-            </w:pPr>
-            <w:r>
-              <w:rPr>
-                <w:rFonts w:ascii="Calibri" w:hAnsi="Calibri" w:cs="Calibri"/>
-              </w:rPr>
-              <w:t>3</w:t>
-            </w:r>
-          </w:p>
-        </w:tc>
-        <w:tc>
-          <w:tcPr>
-            <w:tcW w:w="571" w:type="pct"/>
-          </w:tcPr>
-          <w:p>
-            <w:pPr>
-              <w:jc w:val="center"/>
-              <w:cnfStyle w:val="000000000000" w:firstRow="0" w:lastRow="0" w:firstColumn="0" w:lastColumn="0" w:oddVBand="0" w:evenVBand="0" w:oddHBand="0" w:evenHBand="0" w:firstRowFirstColumn="0" w:firstRowLastColumn="0" w:lastRowFirstColumn="0" w:lastRowLastColumn="0"/>
-              <w:rPr>
-                <w:rFonts w:ascii="Calibri" w:hAnsi="Calibri" w:cs="Calibri"/>
-              </w:rPr>
-            </w:pPr>
-            <w:r>
-              <w:rPr>
-                <w:rFonts w:ascii="Calibri" w:hAnsi="Calibri" w:cs="Calibri"/>
-              </w:rPr>
-              <w:t>In Progress</w:t>
             </w:r>
           </w:p>
         </w:tc>
@@ -1729,28 +1933,33 @@
               <w:bottom w:val="single" w:sz="4" w:space="0" w:color="E59EDC" w:themeColor="accent5" w:themeTint="66"/>
               <w:right w:val="single" w:sz="4" w:space="0" w:color="E59EDC" w:themeColor="accent5" w:themeTint="66"/>
             </w:tcBorders>
-          </w:tcPr>
-          <w:p>
-            <w:pPr>
-              <w:jc w:val="center"/>
-              <w:rPr>
-                <w:rFonts w:ascii="Calibri" w:hAnsi="Calibri" w:cs="Calibri"/>
-              </w:rPr>
-            </w:pPr>
-            <w:r>
-              <w:rPr>
-                <w:rFonts w:ascii="Calibri" w:hAnsi="Calibri" w:cs="Calibri"/>
-              </w:rPr>
-              <w:t>T9</w:t>
-            </w:r>
-          </w:p>
-        </w:tc>
-        <w:tc>
-          <w:tcPr>
-            <w:tcW w:w="2309" w:type="pct"/>
+            <w:vAlign w:val="center"/>
+          </w:tcPr>
+          <w:p>
+            <w:pPr>
+              <w:jc w:val="center"/>
+              <w:rPr>
+                <w:rFonts w:ascii="Calibri" w:hAnsi="Calibri" w:cs="Calibri"/>
+              </w:rPr>
+            </w:pPr>
+            <w:r>
+              <w:rPr>
+                <w:b/>
+                <w:bCs/>
+                <w:color w:val="1F1F1F"/>
+                <w:bdr w:val="none" w:sz="0" w:space="0" w:color="auto" w:frame="1"/>
+              </w:rPr>
+              <w:t>T6</w:t>
+            </w:r>
+          </w:p>
+        </w:tc>
+        <w:tc>
+          <w:tcPr>
+            <w:tcW w:w="1834" w:type="pct"/>
             <w:tcBorders>
               <w:left w:val="single" w:sz="4" w:space="0" w:color="E59EDC" w:themeColor="accent5" w:themeTint="66"/>
             </w:tcBorders>
+            <w:vAlign w:val="center"/>
           </w:tcPr>
           <w:p>
             <w:pPr>
@@ -1765,17 +1974,55 @@
             </w:pPr>
             <w:r>
               <w:rPr>
-                <w:rFonts w:ascii="Calibri" w:hAnsi="Calibri" w:cs="Calibri"/>
                 <w:b/>
                 <w:bCs/>
-              </w:rPr>
-              <w:t>Logic: Build reactive slot ticker for real-time availability.</w:t>
-            </w:r>
-          </w:p>
-        </w:tc>
-        <w:tc>
-          <w:tcPr>
-            <w:tcW w:w="1178" w:type="pct"/>
+                <w:color w:val="1F1F1F"/>
+                <w:bdr w:val="none" w:sz="0" w:space="0" w:color="auto" w:frame="1"/>
+              </w:rPr>
+              <w:t>Security</w:t>
+            </w:r>
+            <w:r>
+              <w:rPr>
+                <w:color w:val="1F1F1F"/>
+                <w:bdr w:val="none" w:sz="0" w:space="0" w:color="auto" w:frame="1"/>
+              </w:rPr>
+              <w:t xml:space="preserve">: Build </w:t>
+            </w:r>
+            <w:proofErr w:type="spellStart"/>
+            <w:proofErr w:type="gramStart"/>
+            <w:r>
+              <w:rPr>
+                <w:rStyle w:val="HTMLCode"/>
+                <w:rFonts w:eastAsiaTheme="majorEastAsia" w:cs="Arial"/>
+                <w:color w:val="444746"/>
+                <w:bdr w:val="none" w:sz="0" w:space="0" w:color="auto" w:frame="1"/>
+              </w:rPr>
+              <w:t>hooks.server</w:t>
+            </w:r>
+            <w:proofErr w:type="gramEnd"/>
+            <w:r>
+              <w:rPr>
+                <w:rStyle w:val="HTMLCode"/>
+                <w:rFonts w:eastAsiaTheme="majorEastAsia" w:cs="Arial"/>
+                <w:color w:val="444746"/>
+                <w:bdr w:val="none" w:sz="0" w:space="0" w:color="auto" w:frame="1"/>
+              </w:rPr>
+              <w:t>.ts</w:t>
+            </w:r>
+            <w:proofErr w:type="spellEnd"/>
+            <w:r>
+              <w:rPr>
+                <w:color w:val="1F1F1F"/>
+                <w:bdr w:val="none" w:sz="0" w:space="0" w:color="auto" w:frame="1"/>
+              </w:rPr>
+              <w:t xml:space="preserve"> session validation.</w:t>
+            </w:r>
+          </w:p>
+        </w:tc>
+        <w:tc>
+          <w:tcPr>
+            <w:tcW w:w="824" w:type="pct"/>
+            <w:vAlign w:val="center"/>
           </w:tcPr>
           <w:p>
             <w:pPr>
@@ -1787,7 +2034,363 @@
             </w:pPr>
             <w:r>
               <w:rPr>
-                <w:rFonts w:ascii="Calibri" w:hAnsi="Calibri" w:cs="Calibri"/>
+                <w:color w:val="1F1F1F"/>
+                <w:bdr w:val="none" w:sz="0" w:space="0" w:color="auto" w:frame="1"/>
+              </w:rPr>
+              <w:t>Story 01</w:t>
+            </w:r>
+          </w:p>
+        </w:tc>
+        <w:tc>
+          <w:tcPr>
+            <w:tcW w:w="561" w:type="pct"/>
+            <w:vAlign w:val="center"/>
+          </w:tcPr>
+          <w:p>
+            <w:pPr>
+              <w:jc w:val="center"/>
+              <w:cnfStyle w:val="000000100000" w:firstRow="0" w:lastRow="0" w:firstColumn="0" w:lastColumn="0" w:oddVBand="0" w:evenVBand="0" w:oddHBand="1" w:evenHBand="0" w:firstRowFirstColumn="0" w:firstRowLastColumn="0" w:lastRowFirstColumn="0" w:lastRowLastColumn="0"/>
+              <w:rPr>
+                <w:rFonts w:ascii="Calibri" w:hAnsi="Calibri" w:cs="Calibri"/>
+              </w:rPr>
+            </w:pPr>
+            <w:r>
+              <w:rPr>
+                <w:color w:val="1F1F1F"/>
+                <w:bdr w:val="none" w:sz="0" w:space="0" w:color="auto" w:frame="1"/>
+              </w:rPr>
+              <w:t>3</w:t>
+            </w:r>
+          </w:p>
+        </w:tc>
+        <w:tc>
+          <w:tcPr>
+            <w:tcW w:w="593" w:type="pct"/>
+            <w:vAlign w:val="center"/>
+          </w:tcPr>
+          <w:p>
+            <w:pPr>
+              <w:jc w:val="center"/>
+              <w:cnfStyle w:val="000000100000" w:firstRow="0" w:lastRow="0" w:firstColumn="0" w:lastColumn="0" w:oddVBand="0" w:evenVBand="0" w:oddHBand="1" w:evenHBand="0" w:firstRowFirstColumn="0" w:firstRowLastColumn="0" w:lastRowFirstColumn="0" w:lastRowLastColumn="0"/>
+              <w:rPr>
+                <w:rFonts w:ascii="Calibri" w:hAnsi="Calibri" w:cs="Calibri"/>
+              </w:rPr>
+            </w:pPr>
+            <w:r>
+              <w:rPr>
+                <w:b/>
+                <w:bCs/>
+                <w:color w:val="1F1F1F"/>
+                <w:bdr w:val="none" w:sz="0" w:space="0" w:color="auto" w:frame="1"/>
+              </w:rPr>
+              <w:t>Complete</w:t>
+            </w:r>
+          </w:p>
+        </w:tc>
+        <w:tc>
+          <w:tcPr>
+            <w:tcW w:w="816" w:type="pct"/>
+            <w:vAlign w:val="center"/>
+          </w:tcPr>
+          <w:p>
+            <w:pPr>
+              <w:jc w:val="center"/>
+              <w:cnfStyle w:val="000000100000" w:firstRow="0" w:lastRow="0" w:firstColumn="0" w:lastColumn="0" w:oddVBand="0" w:evenVBand="0" w:oddHBand="1" w:evenHBand="0" w:firstRowFirstColumn="0" w:firstRowLastColumn="0" w:lastRowFirstColumn="0" w:lastRowLastColumn="0"/>
+              <w:rPr>
+                <w:rFonts w:ascii="Calibri" w:hAnsi="Calibri" w:cs="Calibri"/>
+                <w:lang w:val="en-US"/>
+              </w:rPr>
+            </w:pPr>
+            <w:r>
+              <w:rPr>
+                <w:color w:val="1F1F1F"/>
+                <w:bdr w:val="none" w:sz="0" w:space="0" w:color="auto" w:frame="1"/>
+              </w:rPr>
+              <w:t>Implements server-side protection.</w:t>
+            </w:r>
+          </w:p>
+        </w:tc>
+      </w:tr>
+      <w:tr>
+        <w:tc>
+          <w:tcPr>
+            <w:cnfStyle w:val="001000000000" w:firstRow="0" w:lastRow="0" w:firstColumn="1" w:lastColumn="0" w:oddVBand="0" w:evenVBand="0" w:oddHBand="0" w:evenHBand="0" w:firstRowFirstColumn="0" w:firstRowLastColumn="0" w:lastRowFirstColumn="0" w:lastRowLastColumn="0"/>
+            <w:tcW w:w="371" w:type="pct"/>
+            <w:tcBorders>
+              <w:top w:val="single" w:sz="4" w:space="0" w:color="E59EDC" w:themeColor="accent5" w:themeTint="66"/>
+              <w:left w:val="single" w:sz="4" w:space="0" w:color="E59EDC" w:themeColor="accent5" w:themeTint="66"/>
+              <w:bottom w:val="single" w:sz="4" w:space="0" w:color="E59EDC" w:themeColor="accent5" w:themeTint="66"/>
+              <w:right w:val="single" w:sz="4" w:space="0" w:color="E59EDC" w:themeColor="accent5" w:themeTint="66"/>
+            </w:tcBorders>
+            <w:vAlign w:val="center"/>
+          </w:tcPr>
+          <w:p>
+            <w:pPr>
+              <w:jc w:val="center"/>
+              <w:rPr>
+                <w:rFonts w:ascii="Calibri" w:hAnsi="Calibri" w:cs="Calibri"/>
+              </w:rPr>
+            </w:pPr>
+            <w:r>
+              <w:rPr>
+                <w:b/>
+                <w:bCs/>
+                <w:color w:val="1F1F1F"/>
+                <w:bdr w:val="none" w:sz="0" w:space="0" w:color="auto" w:frame="1"/>
+              </w:rPr>
+              <w:t>T7</w:t>
+            </w:r>
+          </w:p>
+        </w:tc>
+        <w:tc>
+          <w:tcPr>
+            <w:tcW w:w="1834" w:type="pct"/>
+            <w:tcBorders>
+              <w:left w:val="single" w:sz="4" w:space="0" w:color="E59EDC" w:themeColor="accent5" w:themeTint="66"/>
+            </w:tcBorders>
+            <w:vAlign w:val="center"/>
+          </w:tcPr>
+          <w:p>
+            <w:pPr>
+              <w:jc w:val="left"/>
+              <w:cnfStyle w:val="000000000000" w:firstRow="0" w:lastRow="0" w:firstColumn="0" w:lastColumn="0" w:oddVBand="0" w:evenVBand="0" w:oddHBand="0" w:evenHBand="0" w:firstRowFirstColumn="0" w:firstRowLastColumn="0" w:lastRowFirstColumn="0" w:lastRowLastColumn="0"/>
+              <w:rPr>
+                <w:rFonts w:ascii="Calibri" w:hAnsi="Calibri" w:cs="Calibri"/>
+                <w:b/>
+                <w:bCs/>
+              </w:rPr>
+            </w:pPr>
+            <w:r>
+              <w:rPr>
+                <w:b/>
+                <w:bCs/>
+                <w:color w:val="1F1F1F"/>
+                <w:bdr w:val="none" w:sz="0" w:space="0" w:color="auto" w:frame="1"/>
+              </w:rPr>
+              <w:t>Frontend</w:t>
+            </w:r>
+            <w:r>
+              <w:rPr>
+                <w:color w:val="1F1F1F"/>
+                <w:bdr w:val="none" w:sz="0" w:space="0" w:color="auto" w:frame="1"/>
+              </w:rPr>
+              <w:t>: Build Login UI and Dashboard navigation.</w:t>
+            </w:r>
+          </w:p>
+        </w:tc>
+        <w:tc>
+          <w:tcPr>
+            <w:tcW w:w="824" w:type="pct"/>
+            <w:vAlign w:val="center"/>
+          </w:tcPr>
+          <w:p>
+            <w:pPr>
+              <w:jc w:val="center"/>
+              <w:cnfStyle w:val="000000000000" w:firstRow="0" w:lastRow="0" w:firstColumn="0" w:lastColumn="0" w:oddVBand="0" w:evenVBand="0" w:oddHBand="0" w:evenHBand="0" w:firstRowFirstColumn="0" w:firstRowLastColumn="0" w:lastRowFirstColumn="0" w:lastRowLastColumn="0"/>
+              <w:rPr>
+                <w:rFonts w:ascii="Calibri" w:hAnsi="Calibri" w:cs="Calibri"/>
+              </w:rPr>
+            </w:pPr>
+            <w:r>
+              <w:rPr>
+                <w:color w:val="1F1F1F"/>
+                <w:bdr w:val="none" w:sz="0" w:space="0" w:color="auto" w:frame="1"/>
+              </w:rPr>
+              <w:t>Story 01</w:t>
+            </w:r>
+          </w:p>
+        </w:tc>
+        <w:tc>
+          <w:tcPr>
+            <w:tcW w:w="561" w:type="pct"/>
+            <w:vAlign w:val="center"/>
+          </w:tcPr>
+          <w:p>
+            <w:pPr>
+              <w:jc w:val="center"/>
+              <w:cnfStyle w:val="000000000000" w:firstRow="0" w:lastRow="0" w:firstColumn="0" w:lastColumn="0" w:oddVBand="0" w:evenVBand="0" w:oddHBand="0" w:evenHBand="0" w:firstRowFirstColumn="0" w:firstRowLastColumn="0" w:lastRowFirstColumn="0" w:lastRowLastColumn="0"/>
+              <w:rPr>
+                <w:rFonts w:ascii="Calibri" w:hAnsi="Calibri" w:cs="Calibri"/>
+              </w:rPr>
+            </w:pPr>
+            <w:r>
+              <w:rPr>
+                <w:color w:val="1F1F1F"/>
+                <w:bdr w:val="none" w:sz="0" w:space="0" w:color="auto" w:frame="1"/>
+              </w:rPr>
+              <w:t>3</w:t>
+            </w:r>
+          </w:p>
+        </w:tc>
+        <w:tc>
+          <w:tcPr>
+            <w:tcW w:w="593" w:type="pct"/>
+            <w:vAlign w:val="center"/>
+          </w:tcPr>
+          <w:p>
+            <w:pPr>
+              <w:jc w:val="center"/>
+              <w:cnfStyle w:val="000000000000" w:firstRow="0" w:lastRow="0" w:firstColumn="0" w:lastColumn="0" w:oddVBand="0" w:evenVBand="0" w:oddHBand="0" w:evenHBand="0" w:firstRowFirstColumn="0" w:firstRowLastColumn="0" w:lastRowFirstColumn="0" w:lastRowLastColumn="0"/>
+              <w:rPr>
+                <w:rFonts w:ascii="Calibri" w:hAnsi="Calibri" w:cs="Calibri"/>
+              </w:rPr>
+            </w:pPr>
+            <w:r>
+              <w:rPr>
+                <w:b/>
+                <w:bCs/>
+                <w:color w:val="1F1F1F"/>
+                <w:bdr w:val="none" w:sz="0" w:space="0" w:color="auto" w:frame="1"/>
+              </w:rPr>
+              <w:t>Complete</w:t>
+            </w:r>
+          </w:p>
+        </w:tc>
+        <w:tc>
+          <w:tcPr>
+            <w:tcW w:w="816" w:type="pct"/>
+            <w:vAlign w:val="center"/>
+          </w:tcPr>
+          <w:p>
+            <w:pPr>
+              <w:jc w:val="center"/>
+              <w:cnfStyle w:val="000000000000" w:firstRow="0" w:lastRow="0" w:firstColumn="0" w:lastColumn="0" w:oddVBand="0" w:evenVBand="0" w:oddHBand="0" w:evenHBand="0" w:firstRowFirstColumn="0" w:firstRowLastColumn="0" w:lastRowFirstColumn="0" w:lastRowLastColumn="0"/>
+              <w:rPr>
+                <w:rFonts w:ascii="Calibri" w:hAnsi="Calibri" w:cs="Calibri"/>
+                <w:lang w:val="en-US"/>
+              </w:rPr>
+            </w:pPr>
+            <w:proofErr w:type="spellStart"/>
+            <w:r>
+              <w:rPr>
+                <w:rStyle w:val="citation-4981"/>
+                <w:color w:val="1F1F1F"/>
+                <w:bdr w:val="none" w:sz="0" w:space="0" w:color="auto" w:frame="1"/>
+              </w:rPr>
+              <w:t>Fulfills</w:t>
+            </w:r>
+            <w:proofErr w:type="spellEnd"/>
+            <w:r>
+              <w:rPr>
+                <w:rStyle w:val="citation-4981"/>
+                <w:color w:val="1F1F1F"/>
+                <w:bdr w:val="none" w:sz="0" w:space="0" w:color="auto" w:frame="1"/>
+              </w:rPr>
+              <w:t xml:space="preserve"> FR1 &amp; Story 01</w:t>
+            </w:r>
+            <w:r>
+              <w:rPr>
+                <w:color w:val="1F1F1F"/>
+                <w:bdr w:val="none" w:sz="0" w:space="0" w:color="auto" w:frame="1"/>
+              </w:rPr>
+              <w:t>.</w:t>
+            </w:r>
+          </w:p>
+        </w:tc>
+      </w:tr>
+      <w:tr>
+        <w:trPr>
+          <w:cnfStyle w:val="000000100000" w:firstRow="0" w:lastRow="0" w:firstColumn="0" w:lastColumn="0" w:oddVBand="0" w:evenVBand="0" w:oddHBand="1" w:evenHBand="0" w:firstRowFirstColumn="0" w:firstRowLastColumn="0" w:lastRowFirstColumn="0" w:lastRowLastColumn="0"/>
+        </w:trPr>
+        <w:tc>
+          <w:tcPr>
+            <w:cnfStyle w:val="001000000000" w:firstRow="0" w:lastRow="0" w:firstColumn="1" w:lastColumn="0" w:oddVBand="0" w:evenVBand="0" w:oddHBand="0" w:evenHBand="0" w:firstRowFirstColumn="0" w:firstRowLastColumn="0" w:lastRowFirstColumn="0" w:lastRowLastColumn="0"/>
+            <w:tcW w:w="371" w:type="pct"/>
+            <w:tcBorders>
+              <w:top w:val="single" w:sz="4" w:space="0" w:color="E59EDC" w:themeColor="accent5" w:themeTint="66"/>
+              <w:left w:val="single" w:sz="4" w:space="0" w:color="E59EDC" w:themeColor="accent5" w:themeTint="66"/>
+              <w:bottom w:val="single" w:sz="4" w:space="0" w:color="E59EDC" w:themeColor="accent5" w:themeTint="66"/>
+              <w:right w:val="single" w:sz="4" w:space="0" w:color="E59EDC" w:themeColor="accent5" w:themeTint="66"/>
+            </w:tcBorders>
+            <w:vAlign w:val="center"/>
+          </w:tcPr>
+          <w:p>
+            <w:pPr>
+              <w:jc w:val="center"/>
+              <w:rPr>
+                <w:rFonts w:ascii="Calibri" w:hAnsi="Calibri" w:cs="Calibri"/>
+              </w:rPr>
+            </w:pPr>
+            <w:r>
+              <w:rPr>
+                <w:b/>
+                <w:bCs/>
+                <w:color w:val="1F1F1F"/>
+                <w:bdr w:val="none" w:sz="0" w:space="0" w:color="auto" w:frame="1"/>
+              </w:rPr>
+              <w:t>T9</w:t>
+            </w:r>
+          </w:p>
+        </w:tc>
+        <w:tc>
+          <w:tcPr>
+            <w:tcW w:w="1834" w:type="pct"/>
+            <w:tcBorders>
+              <w:left w:val="single" w:sz="4" w:space="0" w:color="E59EDC" w:themeColor="accent5" w:themeTint="66"/>
+            </w:tcBorders>
+            <w:vAlign w:val="center"/>
+          </w:tcPr>
+          <w:p>
+            <w:pPr>
+              <w:jc w:val="left"/>
+              <w:cnfStyle w:val="000000100000" w:firstRow="0" w:lastRow="0" w:firstColumn="0" w:lastColumn="0" w:oddVBand="0" w:evenVBand="0" w:oddHBand="1" w:evenHBand="0" w:firstRowFirstColumn="0" w:firstRowLastColumn="0" w:lastRowFirstColumn="0" w:lastRowLastColumn="0"/>
+              <w:rPr>
+                <w:rFonts w:ascii="Calibri" w:hAnsi="Calibri" w:cs="Calibri"/>
+                <w:b/>
+                <w:bCs/>
+              </w:rPr>
+            </w:pPr>
+            <w:r>
+              <w:rPr>
+                <w:b/>
+                <w:bCs/>
+                <w:color w:val="1F1F1F"/>
+                <w:bdr w:val="none" w:sz="0" w:space="0" w:color="auto" w:frame="1"/>
+              </w:rPr>
+              <w:t>Logic</w:t>
+            </w:r>
+            <w:r>
+              <w:rPr>
+                <w:color w:val="1F1F1F"/>
+                <w:bdr w:val="none" w:sz="0" w:space="0" w:color="auto" w:frame="1"/>
+              </w:rPr>
+              <w:t xml:space="preserve">: Build reactive </w:t>
+            </w:r>
+            <w:r>
+              <w:rPr>
+                <w:rStyle w:val="HTMLCode"/>
+                <w:rFonts w:eastAsiaTheme="majorEastAsia" w:cs="Arial"/>
+                <w:color w:val="444746"/>
+                <w:bdr w:val="none" w:sz="0" w:space="0" w:color="auto" w:frame="1"/>
+              </w:rPr>
+              <w:t>ACT_SCHEDULING_ENGINE</w:t>
+            </w:r>
+            <w:r>
+              <w:rPr>
+                <w:color w:val="1F1F1F"/>
+                <w:bdr w:val="none" w:sz="0" w:space="0" w:color="auto" w:frame="1"/>
+              </w:rPr>
+              <w:t xml:space="preserve"> ticker.</w:t>
+            </w:r>
+          </w:p>
+        </w:tc>
+        <w:tc>
+          <w:tcPr>
+            <w:tcW w:w="824" w:type="pct"/>
+            <w:vAlign w:val="center"/>
+          </w:tcPr>
+          <w:p>
+            <w:pPr>
+              <w:jc w:val="center"/>
+              <w:cnfStyle w:val="000000100000" w:firstRow="0" w:lastRow="0" w:firstColumn="0" w:lastColumn="0" w:oddVBand="0" w:evenVBand="0" w:oddHBand="1" w:evenHBand="0" w:firstRowFirstColumn="0" w:firstRowLastColumn="0" w:lastRowFirstColumn="0" w:lastRowLastColumn="0"/>
+              <w:rPr>
+                <w:rFonts w:ascii="Calibri" w:hAnsi="Calibri" w:cs="Calibri"/>
+              </w:rPr>
+            </w:pPr>
+            <w:r>
+              <w:rPr>
+                <w:color w:val="1F1F1F"/>
+                <w:bdr w:val="none" w:sz="0" w:space="0" w:color="auto" w:frame="1"/>
               </w:rPr>
               <w:t>Story 02</w:t>
             </w:r>
@@ -1795,7 +2398,8 @@
         </w:tc>
         <w:tc>
           <w:tcPr>
-            <w:tcW w:w="571" w:type="pct"/>
+            <w:tcW w:w="561" w:type="pct"/>
+            <w:vAlign w:val="center"/>
           </w:tcPr>
           <w:p>
             <w:pPr>
@@ -1807,7 +2411,8 @@
             </w:pPr>
             <w:r>
               <w:rPr>
-                <w:rFonts w:ascii="Calibri" w:hAnsi="Calibri" w:cs="Calibri"/>
+                <w:color w:val="1F1F1F"/>
+                <w:bdr w:val="none" w:sz="0" w:space="0" w:color="auto" w:frame="1"/>
               </w:rPr>
               <w:t>5</w:t>
             </w:r>
@@ -1815,7 +2420,8 @@
         </w:tc>
         <w:tc>
           <w:tcPr>
-            <w:tcW w:w="571" w:type="pct"/>
+            <w:tcW w:w="593" w:type="pct"/>
+            <w:vAlign w:val="center"/>
           </w:tcPr>
           <w:p>
             <w:pPr>
@@ -1825,6 +2431,248 @@
                 <w:rFonts w:ascii="Calibri" w:hAnsi="Calibri" w:cs="Calibri"/>
               </w:rPr>
             </w:pPr>
+            <w:r>
+              <w:rPr>
+                <w:b/>
+                <w:bCs/>
+                <w:color w:val="1F1F1F"/>
+                <w:bdr w:val="none" w:sz="0" w:space="0" w:color="auto" w:frame="1"/>
+              </w:rPr>
+              <w:t>Complete</w:t>
+            </w:r>
+          </w:p>
+        </w:tc>
+        <w:tc>
+          <w:tcPr>
+            <w:tcW w:w="816" w:type="pct"/>
+            <w:vAlign w:val="center"/>
+          </w:tcPr>
+          <w:p>
+            <w:pPr>
+              <w:jc w:val="center"/>
+              <w:cnfStyle w:val="000000100000" w:firstRow="0" w:lastRow="0" w:firstColumn="0" w:lastColumn="0" w:oddVBand="0" w:evenVBand="0" w:oddHBand="1" w:evenHBand="0" w:firstRowFirstColumn="0" w:firstRowLastColumn="0" w:lastRowFirstColumn="0" w:lastRowLastColumn="0"/>
+              <w:rPr>
+                <w:rFonts w:ascii="Calibri" w:hAnsi="Calibri" w:cs="Calibri"/>
+              </w:rPr>
+            </w:pPr>
+            <w:proofErr w:type="spellStart"/>
+            <w:r>
+              <w:rPr>
+                <w:rStyle w:val="citation-4980"/>
+                <w:color w:val="1F1F1F"/>
+                <w:bdr w:val="none" w:sz="0" w:space="0" w:color="auto" w:frame="1"/>
+              </w:rPr>
+              <w:t>Fulfills</w:t>
+            </w:r>
+            <w:proofErr w:type="spellEnd"/>
+            <w:r>
+              <w:rPr>
+                <w:rStyle w:val="citation-4980"/>
+                <w:color w:val="1F1F1F"/>
+                <w:bdr w:val="none" w:sz="0" w:space="0" w:color="auto" w:frame="1"/>
+              </w:rPr>
+              <w:t xml:space="preserve"> FR2 &amp; NFR2</w:t>
+            </w:r>
+            <w:r>
+              <w:rPr>
+                <w:color w:val="1F1F1F"/>
+                <w:bdr w:val="none" w:sz="0" w:space="0" w:color="auto" w:frame="1"/>
+              </w:rPr>
+              <w:t>.</w:t>
+            </w:r>
+          </w:p>
+        </w:tc>
+      </w:tr>
+      <w:tr>
+        <w:tc>
+          <w:tcPr>
+            <w:cnfStyle w:val="001000000000" w:firstRow="0" w:lastRow="0" w:firstColumn="1" w:lastColumn="0" w:oddVBand="0" w:evenVBand="0" w:oddHBand="0" w:evenHBand="0" w:firstRowFirstColumn="0" w:firstRowLastColumn="0" w:lastRowFirstColumn="0" w:lastRowLastColumn="0"/>
+            <w:tcW w:w="371" w:type="pct"/>
+            <w:tcBorders>
+              <w:top w:val="single" w:sz="4" w:space="0" w:color="E59EDC" w:themeColor="accent5" w:themeTint="66"/>
+              <w:left w:val="single" w:sz="4" w:space="0" w:color="E59EDC" w:themeColor="accent5" w:themeTint="66"/>
+              <w:bottom w:val="single" w:sz="4" w:space="0" w:color="E59EDC" w:themeColor="accent5" w:themeTint="66"/>
+              <w:right w:val="single" w:sz="4" w:space="0" w:color="E59EDC" w:themeColor="accent5" w:themeTint="66"/>
+            </w:tcBorders>
+            <w:vAlign w:val="center"/>
+          </w:tcPr>
+          <w:p>
+            <w:pPr>
+              <w:jc w:val="center"/>
+              <w:rPr>
+                <w:rFonts w:ascii="Calibri" w:hAnsi="Calibri" w:cs="Calibri"/>
+              </w:rPr>
+            </w:pPr>
+            <w:r>
+              <w:rPr>
+                <w:b/>
+                <w:bCs/>
+                <w:color w:val="1F1F1F"/>
+                <w:bdr w:val="none" w:sz="0" w:space="0" w:color="auto" w:frame="1"/>
+              </w:rPr>
+              <w:t>T12</w:t>
+            </w:r>
+          </w:p>
+        </w:tc>
+        <w:tc>
+          <w:tcPr>
+            <w:tcW w:w="1834" w:type="pct"/>
+            <w:tcBorders>
+              <w:left w:val="single" w:sz="4" w:space="0" w:color="E59EDC" w:themeColor="accent5" w:themeTint="66"/>
+            </w:tcBorders>
+            <w:vAlign w:val="center"/>
+          </w:tcPr>
+          <w:p>
+            <w:pPr>
+              <w:jc w:val="left"/>
+              <w:cnfStyle w:val="000000000000" w:firstRow="0" w:lastRow="0" w:firstColumn="0" w:lastColumn="0" w:oddVBand="0" w:evenVBand="0" w:oddHBand="0" w:evenHBand="0" w:firstRowFirstColumn="0" w:firstRowLastColumn="0" w:lastRowFirstColumn="0" w:lastRowLastColumn="0"/>
+              <w:rPr>
+                <w:rFonts w:ascii="Calibri" w:hAnsi="Calibri" w:cs="Calibri"/>
+                <w:b/>
+                <w:bCs/>
+              </w:rPr>
+            </w:pPr>
+            <w:r>
+              <w:rPr>
+                <w:b/>
+                <w:bCs/>
+                <w:color w:val="1F1F1F"/>
+                <w:bdr w:val="none" w:sz="0" w:space="0" w:color="auto" w:frame="1"/>
+              </w:rPr>
+              <w:t>Implementation</w:t>
+            </w:r>
+            <w:r>
+              <w:rPr>
+                <w:color w:val="1F1F1F"/>
+                <w:bdr w:val="none" w:sz="0" w:space="0" w:color="auto" w:frame="1"/>
+              </w:rPr>
+              <w:t xml:space="preserve">: Build </w:t>
+            </w:r>
+            <w:r>
+              <w:rPr>
+                <w:rStyle w:val="HTMLCode"/>
+                <w:rFonts w:eastAsiaTheme="majorEastAsia" w:cs="Arial"/>
+                <w:color w:val="444746"/>
+                <w:bdr w:val="none" w:sz="0" w:space="0" w:color="auto" w:frame="1"/>
+              </w:rPr>
+              <w:t>ACT_RECORD_FETCHER</w:t>
+            </w:r>
+            <w:r>
+              <w:rPr>
+                <w:color w:val="1F1F1F"/>
+                <w:bdr w:val="none" w:sz="0" w:space="0" w:color="auto" w:frame="1"/>
+              </w:rPr>
+              <w:t xml:space="preserve"> portal logic.</w:t>
+            </w:r>
+          </w:p>
+        </w:tc>
+        <w:tc>
+          <w:tcPr>
+            <w:tcW w:w="824" w:type="pct"/>
+            <w:vAlign w:val="center"/>
+          </w:tcPr>
+          <w:p>
+            <w:pPr>
+              <w:jc w:val="center"/>
+              <w:cnfStyle w:val="000000000000" w:firstRow="0" w:lastRow="0" w:firstColumn="0" w:lastColumn="0" w:oddVBand="0" w:evenVBand="0" w:oddHBand="0" w:evenHBand="0" w:firstRowFirstColumn="0" w:firstRowLastColumn="0" w:lastRowFirstColumn="0" w:lastRowLastColumn="0"/>
+              <w:rPr>
+                <w:rFonts w:ascii="Calibri" w:hAnsi="Calibri" w:cs="Calibri"/>
+              </w:rPr>
+            </w:pPr>
+            <w:r>
+              <w:rPr>
+                <w:color w:val="1F1F1F"/>
+                <w:bdr w:val="none" w:sz="0" w:space="0" w:color="auto" w:frame="1"/>
+              </w:rPr>
+              <w:t>Story 04</w:t>
+            </w:r>
+          </w:p>
+        </w:tc>
+        <w:tc>
+          <w:tcPr>
+            <w:tcW w:w="561" w:type="pct"/>
+            <w:vAlign w:val="center"/>
+          </w:tcPr>
+          <w:p>
+            <w:pPr>
+              <w:jc w:val="center"/>
+              <w:cnfStyle w:val="000000000000" w:firstRow="0" w:lastRow="0" w:firstColumn="0" w:lastColumn="0" w:oddVBand="0" w:evenVBand="0" w:oddHBand="0" w:evenHBand="0" w:firstRowFirstColumn="0" w:firstRowLastColumn="0" w:lastRowFirstColumn="0" w:lastRowLastColumn="0"/>
+              <w:rPr>
+                <w:rFonts w:ascii="Calibri" w:hAnsi="Calibri" w:cs="Calibri"/>
+              </w:rPr>
+            </w:pPr>
+            <w:r>
+              <w:rPr>
+                <w:color w:val="1F1F1F"/>
+                <w:bdr w:val="none" w:sz="0" w:space="0" w:color="auto" w:frame="1"/>
+              </w:rPr>
+              <w:t>5</w:t>
+            </w:r>
+          </w:p>
+        </w:tc>
+        <w:tc>
+          <w:tcPr>
+            <w:tcW w:w="593" w:type="pct"/>
+            <w:vAlign w:val="center"/>
+          </w:tcPr>
+          <w:p>
+            <w:pPr>
+              <w:jc w:val="center"/>
+              <w:cnfStyle w:val="000000000000" w:firstRow="0" w:lastRow="0" w:firstColumn="0" w:lastColumn="0" w:oddVBand="0" w:evenVBand="0" w:oddHBand="0" w:evenHBand="0" w:firstRowFirstColumn="0" w:firstRowLastColumn="0" w:lastRowFirstColumn="0" w:lastRowLastColumn="0"/>
+              <w:rPr>
+                <w:rFonts w:ascii="Calibri" w:hAnsi="Calibri" w:cs="Calibri"/>
+              </w:rPr>
+            </w:pPr>
+            <w:r>
+              <w:rPr>
+                <w:b/>
+                <w:bCs/>
+                <w:color w:val="1F1F1F"/>
+                <w:bdr w:val="none" w:sz="0" w:space="0" w:color="auto" w:frame="1"/>
+              </w:rPr>
+              <w:t>Complete</w:t>
+            </w:r>
+          </w:p>
+        </w:tc>
+        <w:tc>
+          <w:tcPr>
+            <w:tcW w:w="816" w:type="pct"/>
+            <w:vAlign w:val="center"/>
+          </w:tcPr>
+          <w:p>
+            <w:pPr>
+              <w:jc w:val="center"/>
+              <w:cnfStyle w:val="000000000000" w:firstRow="0" w:lastRow="0" w:firstColumn="0" w:lastColumn="0" w:oddVBand="0" w:evenVBand="0" w:oddHBand="0" w:evenHBand="0" w:firstRowFirstColumn="0" w:firstRowLastColumn="0" w:lastRowFirstColumn="0" w:lastRowLastColumn="0"/>
+              <w:rPr>
+                <w:rFonts w:ascii="Calibri" w:hAnsi="Calibri" w:cs="Calibri"/>
+                <w:lang w:val="en-US"/>
+              </w:rPr>
+            </w:pPr>
+            <w:proofErr w:type="spellStart"/>
+            <w:r>
+              <w:rPr>
+                <w:rStyle w:val="citation-4979"/>
+                <w:color w:val="1F1F1F"/>
+                <w:bdr w:val="none" w:sz="0" w:space="0" w:color="auto" w:frame="1"/>
+              </w:rPr>
+              <w:t>Fulfills</w:t>
+            </w:r>
+            <w:proofErr w:type="spellEnd"/>
+            <w:r>
+              <w:rPr>
+                <w:rStyle w:val="citation-4979"/>
+                <w:color w:val="1F1F1F"/>
+                <w:bdr w:val="none" w:sz="0" w:space="0" w:color="auto" w:frame="1"/>
+              </w:rPr>
+              <w:t xml:space="preserve"> FR4 &amp; Story 04</w:t>
+            </w:r>
+            <w:r>
+              <w:rPr>
+                <w:color w:val="1F1F1F"/>
+                <w:bdr w:val="none" w:sz="0" w:space="0" w:color="auto" w:frame="1"/>
+              </w:rPr>
+              <w:t>.</w:t>
+            </w:r>
           </w:p>
         </w:tc>
       </w:tr>
@@ -2232,6 +3080,7 @@
             <w:tcBorders>
               <w:top w:val="single" w:sz="4" w:space="0" w:color="E59EDC" w:themeColor="accent5" w:themeTint="66"/>
               <w:left w:val="single" w:sz="4" w:space="0" w:color="E59EDC" w:themeColor="accent5" w:themeTint="66"/>
+              <w:bottom w:val="single" w:sz="4" w:space="0" w:color="E59EDC" w:themeColor="accent5" w:themeTint="66"/>
             </w:tcBorders>
           </w:tcPr>
           <w:p>
@@ -2266,6 +3115,7 @@
             <w:tcW w:w="2157" w:type="dxa"/>
             <w:tcBorders>
               <w:top w:val="single" w:sz="4" w:space="0" w:color="E59EDC" w:themeColor="accent5" w:themeTint="66"/>
+              <w:bottom w:val="single" w:sz="4" w:space="0" w:color="E59EDC" w:themeColor="accent5" w:themeTint="66"/>
             </w:tcBorders>
           </w:tcPr>
           <w:p>
@@ -2282,6 +3132,153 @@
               </w:rPr>
               <w:t>3</w:t>
             </w:r>
+          </w:p>
+        </w:tc>
+      </w:tr>
+      <w:tr>
+        <w:tc>
+          <w:tcPr>
+            <w:cnfStyle w:val="001000000000" w:firstRow="0" w:lastRow="0" w:firstColumn="1" w:lastColumn="0" w:oddVBand="0" w:evenVBand="0" w:oddHBand="0" w:evenHBand="0" w:firstRowFirstColumn="0" w:firstRowLastColumn="0" w:lastRowFirstColumn="0" w:lastRowLastColumn="0"/>
+            <w:tcW w:w="776" w:type="dxa"/>
+            <w:tcBorders>
+              <w:top w:val="single" w:sz="4" w:space="0" w:color="E59EDC" w:themeColor="accent5" w:themeTint="66"/>
+              <w:left w:val="single" w:sz="4" w:space="0" w:color="E59EDC" w:themeColor="accent5" w:themeTint="66"/>
+              <w:bottom w:val="single" w:sz="4" w:space="0" w:color="E59EDC" w:themeColor="accent5" w:themeTint="66"/>
+              <w:right w:val="single" w:sz="4" w:space="0" w:color="E59EDC" w:themeColor="accent5" w:themeTint="66"/>
+            </w:tcBorders>
+            <w:shd w:val="clear" w:color="auto" w:fill="F2CEED" w:themeFill="accent5" w:themeFillTint="33"/>
+          </w:tcPr>
+          <w:p>
+            <w:pPr>
+              <w:jc w:val="center"/>
+              <w:rPr>
+                <w:rFonts w:ascii="Calibri" w:hAnsi="Calibri" w:cs="Calibri"/>
+              </w:rPr>
+            </w:pPr>
+            <w:r>
+              <w:rPr>
+                <w:rFonts w:ascii="Calibri" w:hAnsi="Calibri" w:cs="Calibri"/>
+              </w:rPr>
+              <w:t>2</w:t>
+            </w:r>
+          </w:p>
+        </w:tc>
+        <w:tc>
+          <w:tcPr>
+            <w:tcW w:w="6850" w:type="dxa"/>
+            <w:tcBorders>
+              <w:top w:val="single" w:sz="4" w:space="0" w:color="E59EDC" w:themeColor="accent5" w:themeTint="66"/>
+              <w:left w:val="single" w:sz="4" w:space="0" w:color="E59EDC" w:themeColor="accent5" w:themeTint="66"/>
+              <w:bottom w:val="single" w:sz="4" w:space="0" w:color="E59EDC" w:themeColor="accent5" w:themeTint="66"/>
+            </w:tcBorders>
+          </w:tcPr>
+          <w:p>
+            <w:pPr>
+              <w:jc w:val="left"/>
+              <w:cnfStyle w:val="000000000000" w:firstRow="0" w:lastRow="0" w:firstColumn="0" w:lastColumn="0" w:oddVBand="0" w:evenVBand="0" w:oddHBand="0" w:evenHBand="0" w:firstRowFirstColumn="0" w:firstRowLastColumn="0" w:lastRowFirstColumn="0" w:lastRowLastColumn="0"/>
+              <w:rPr>
+                <w:rFonts w:ascii="Calibri" w:hAnsi="Calibri" w:cs="Calibri"/>
+                <w:lang w:val="en-US"/>
+              </w:rPr>
+            </w:pPr>
+            <w:r>
+              <w:rPr>
+                <w:rFonts w:ascii="Calibri" w:hAnsi="Calibri" w:cs="Calibri"/>
+              </w:rPr>
+              <w:t>Real-time Calendar Ticker (Visibility).</w:t>
+            </w:r>
+          </w:p>
+        </w:tc>
+        <w:tc>
+          <w:tcPr>
+            <w:tcW w:w="2157" w:type="dxa"/>
+            <w:tcBorders>
+              <w:top w:val="single" w:sz="4" w:space="0" w:color="E59EDC" w:themeColor="accent5" w:themeTint="66"/>
+              <w:bottom w:val="single" w:sz="4" w:space="0" w:color="E59EDC" w:themeColor="accent5" w:themeTint="66"/>
+            </w:tcBorders>
+          </w:tcPr>
+          <w:p>
+            <w:pPr>
+              <w:jc w:val="center"/>
+              <w:cnfStyle w:val="000000000000" w:firstRow="0" w:lastRow="0" w:firstColumn="0" w:lastColumn="0" w:oddVBand="0" w:evenVBand="0" w:oddHBand="0" w:evenHBand="0" w:firstRowFirstColumn="0" w:firstRowLastColumn="0" w:lastRowFirstColumn="0" w:lastRowLastColumn="0"/>
+              <w:rPr>
+                <w:rFonts w:ascii="Calibri" w:hAnsi="Calibri" w:cs="Calibri"/>
+              </w:rPr>
+            </w:pPr>
+          </w:p>
+        </w:tc>
+      </w:tr>
+      <w:tr>
+        <w:trPr>
+          <w:cnfStyle w:val="000000100000" w:firstRow="0" w:lastRow="0" w:firstColumn="0" w:lastColumn="0" w:oddVBand="0" w:evenVBand="0" w:oddHBand="1" w:evenHBand="0" w:firstRowFirstColumn="0" w:firstRowLastColumn="0" w:lastRowFirstColumn="0" w:lastRowLastColumn="0"/>
+        </w:trPr>
+        <w:tc>
+          <w:tcPr>
+            <w:cnfStyle w:val="001000000000" w:firstRow="0" w:lastRow="0" w:firstColumn="1" w:lastColumn="0" w:oddVBand="0" w:evenVBand="0" w:oddHBand="0" w:evenHBand="0" w:firstRowFirstColumn="0" w:firstRowLastColumn="0" w:lastRowFirstColumn="0" w:lastRowLastColumn="0"/>
+            <w:tcW w:w="776" w:type="dxa"/>
+            <w:tcBorders>
+              <w:top w:val="single" w:sz="4" w:space="0" w:color="E59EDC" w:themeColor="accent5" w:themeTint="66"/>
+              <w:left w:val="single" w:sz="4" w:space="0" w:color="E59EDC" w:themeColor="accent5" w:themeTint="66"/>
+              <w:bottom w:val="single" w:sz="4" w:space="0" w:color="E59EDC" w:themeColor="accent5" w:themeTint="66"/>
+              <w:right w:val="single" w:sz="4" w:space="0" w:color="E59EDC" w:themeColor="accent5" w:themeTint="66"/>
+            </w:tcBorders>
+            <w:shd w:val="clear" w:color="auto" w:fill="F2CEED" w:themeFill="accent5" w:themeFillTint="33"/>
+          </w:tcPr>
+          <w:p>
+            <w:pPr>
+              <w:jc w:val="center"/>
+              <w:rPr>
+                <w:rFonts w:ascii="Calibri" w:hAnsi="Calibri" w:cs="Calibri"/>
+              </w:rPr>
+            </w:pPr>
+            <w:r>
+              <w:rPr>
+                <w:rFonts w:ascii="Calibri" w:hAnsi="Calibri" w:cs="Calibri"/>
+              </w:rPr>
+              <w:t>4</w:t>
+            </w:r>
+          </w:p>
+        </w:tc>
+        <w:tc>
+          <w:tcPr>
+            <w:tcW w:w="6850" w:type="dxa"/>
+            <w:tcBorders>
+              <w:top w:val="single" w:sz="4" w:space="0" w:color="E59EDC" w:themeColor="accent5" w:themeTint="66"/>
+              <w:left w:val="single" w:sz="4" w:space="0" w:color="E59EDC" w:themeColor="accent5" w:themeTint="66"/>
+            </w:tcBorders>
+          </w:tcPr>
+          <w:p>
+            <w:pPr>
+              <w:jc w:val="left"/>
+              <w:cnfStyle w:val="000000100000" w:firstRow="0" w:lastRow="0" w:firstColumn="0" w:lastColumn="0" w:oddVBand="0" w:evenVBand="0" w:oddHBand="1" w:evenHBand="0" w:firstRowFirstColumn="0" w:firstRowLastColumn="0" w:lastRowFirstColumn="0" w:lastRowLastColumn="0"/>
+              <w:rPr>
+                <w:rFonts w:ascii="Calibri" w:hAnsi="Calibri" w:cs="Calibri"/>
+                <w:lang w:val="en-US"/>
+              </w:rPr>
+            </w:pPr>
+            <w:r>
+              <w:rPr>
+                <w:rFonts w:ascii="Calibri" w:hAnsi="Calibri" w:cs="Calibri"/>
+              </w:rPr>
+              <w:t>Medical Records Retrieval</w:t>
+            </w:r>
+          </w:p>
+        </w:tc>
+        <w:tc>
+          <w:tcPr>
+            <w:tcW w:w="2157" w:type="dxa"/>
+            <w:tcBorders>
+              <w:top w:val="single" w:sz="4" w:space="0" w:color="E59EDC" w:themeColor="accent5" w:themeTint="66"/>
+            </w:tcBorders>
+          </w:tcPr>
+          <w:p>
+            <w:pPr>
+              <w:jc w:val="center"/>
+              <w:cnfStyle w:val="000000100000" w:firstRow="0" w:lastRow="0" w:firstColumn="0" w:lastColumn="0" w:oddVBand="0" w:evenVBand="0" w:oddHBand="1" w:evenHBand="0" w:firstRowFirstColumn="0" w:firstRowLastColumn="0" w:lastRowFirstColumn="0" w:lastRowLastColumn="0"/>
+              <w:rPr>
+                <w:rFonts w:ascii="Calibri" w:hAnsi="Calibri" w:cs="Calibri"/>
+              </w:rPr>
+            </w:pPr>
           </w:p>
         </w:tc>
       </w:tr>
@@ -2433,6 +3430,42 @@
     </w:p>
     <w:p>
       <w:pPr>
+        <w:jc w:val="left"/>
+        <w:rPr>
+          <w:rFonts w:ascii="Calibri" w:hAnsi="Calibri" w:cs="Calibri"/>
+        </w:rPr>
+      </w:pPr>
+      <w:r>
+        <w:rPr>
+          <w:rFonts w:ascii="Calibri" w:hAnsi="Calibri" w:cs="Calibri"/>
+        </w:rPr>
+        <w:t xml:space="preserve">The current 'BOOK WITH DR. MEHTA' button on the dashboard is a UI placeholder. The next development goal is to implement the dedicated '/booking' route to handle the transaction logic and </w:t>
+      </w:r>
+      <w:proofErr w:type="gramStart"/>
+      <w:r>
+        <w:rPr>
+          <w:rFonts w:ascii="Calibri" w:hAnsi="Calibri" w:cs="Calibri"/>
+        </w:rPr>
+        <w:t>data-binding</w:t>
+      </w:r>
+      <w:proofErr w:type="gramEnd"/>
+      <w:r>
+        <w:rPr>
+          <w:rFonts w:ascii="Calibri" w:hAnsi="Calibri" w:cs="Calibri"/>
+        </w:rPr>
+        <w:t xml:space="preserve"> for Story </w:t>
+      </w:r>
+      <w:proofErr w:type="gramStart"/>
+      <w:r>
+        <w:rPr>
+          <w:rFonts w:ascii="Calibri" w:hAnsi="Calibri" w:cs="Calibri"/>
+        </w:rPr>
+        <w:t>03 .</w:t>
+      </w:r>
+      <w:proofErr w:type="gramEnd"/>
+    </w:p>
+    <w:p>
+      <w:pPr>
         <w:ind w:left="0" w:firstLine="0"/>
         <w:jc w:val="left"/>
         <w:rPr>
@@ -2456,6 +3489,7 @@
     </w:p>
     <w:p>
       <w:pPr>
+        <w:ind w:left="0" w:firstLine="0"/>
         <w:jc w:val="left"/>
         <w:rPr>
           <w:rFonts w:ascii="Calibri" w:hAnsi="Calibri" w:cs="Calibri"/>
@@ -2465,16 +3499,42 @@
         <w:rPr>
           <w:rFonts w:ascii="Calibri" w:hAnsi="Calibri" w:cs="Calibri"/>
         </w:rPr>
-        <w:t>(Are there any features that could be improved or added to in future)</w:t>
+        <w:t>While the current MVP uses plain-string comparison for mock data validation, a production-ready version must implement Argon2 or Bcrypt hashing within the +</w:t>
       </w:r>
-    </w:p>
-    <w:p>
-      <w:pPr>
-        <w:jc w:val="left"/>
-        <w:rPr>
-          <w:rFonts w:ascii="Calibri" w:hAnsi="Calibri" w:cs="Calibri"/>
-        </w:rPr>
-      </w:pPr>
+      <w:proofErr w:type="spellStart"/>
+      <w:proofErr w:type="gramStart"/>
+      <w:r>
+        <w:rPr>
+          <w:rFonts w:ascii="Calibri" w:hAnsi="Calibri" w:cs="Calibri"/>
+        </w:rPr>
+        <w:t>page.server</w:t>
+      </w:r>
+      <w:proofErr w:type="gramEnd"/>
+      <w:r>
+        <w:rPr>
+          <w:rFonts w:ascii="Calibri" w:hAnsi="Calibri" w:cs="Calibri"/>
+        </w:rPr>
+        <w:t>.ts</w:t>
+      </w:r>
+      <w:proofErr w:type="spellEnd"/>
+      <w:r>
+        <w:rPr>
+          <w:rFonts w:ascii="Calibri" w:hAnsi="Calibri" w:cs="Calibri"/>
+        </w:rPr>
+        <w:t xml:space="preserve"> logic to fully satisfy NFR1 (Security).</w:t>
+      </w:r>
+      <w:r>
+        <w:rPr>
+          <w:rFonts w:ascii="Calibri" w:hAnsi="Calibri" w:cs="Calibri"/>
+        </w:rPr>
+        <w:br/>
+      </w:r>
+      <w:r>
+        <w:rPr>
+          <w:rFonts w:ascii="Calibri" w:hAnsi="Calibri" w:cs="Calibri"/>
+        </w:rPr>
+        <w:br/>
+      </w:r>
     </w:p>
     <w:p>
       <w:pPr>
@@ -3634,6 +4694,60 @@
       <w:szCs w:val="18"/>
     </w:rPr>
   </w:style>
+  <w:style w:type="character" w:styleId="Strong">
+    <w:name w:val="Strong"/>
+    <w:basedOn w:val="DefaultParagraphFont"/>
+    <w:uiPriority w:val="22"/>
+    <w:qFormat/>
+    <w:rsid w:val="00F97C4F"/>
+    <w:rPr>
+      <w:b/>
+      <w:bCs/>
+    </w:rPr>
+  </w:style>
+  <w:style w:type="character" w:styleId="HTMLCode">
+    <w:name w:val="HTML Code"/>
+    <w:basedOn w:val="DefaultParagraphFont"/>
+    <w:uiPriority w:val="99"/>
+    <w:semiHidden/>
+    <w:unhideWhenUsed/>
+    <w:rsid w:val="00F97C4F"/>
+    <w:rPr>
+      <w:rFonts w:ascii="Courier New" w:eastAsia="Times New Roman" w:hAnsi="Courier New" w:cs="Courier New"/>
+      <w:sz w:val="20"/>
+      <w:szCs w:val="20"/>
+    </w:rPr>
+  </w:style>
+  <w:style w:type="character" w:customStyle="1" w:styleId="citation-4984">
+    <w:name w:val="citation-4984"/>
+    <w:basedOn w:val="DefaultParagraphFont"/>
+    <w:rsid w:val="00F97C4F"/>
+  </w:style>
+  <w:style w:type="character" w:customStyle="1" w:styleId="citation-4983">
+    <w:name w:val="citation-4983"/>
+    <w:basedOn w:val="DefaultParagraphFont"/>
+    <w:rsid w:val="00F97C4F"/>
+  </w:style>
+  <w:style w:type="character" w:customStyle="1" w:styleId="citation-4982">
+    <w:name w:val="citation-4982"/>
+    <w:basedOn w:val="DefaultParagraphFont"/>
+    <w:rsid w:val="00F97C4F"/>
+  </w:style>
+  <w:style w:type="character" w:customStyle="1" w:styleId="citation-4981">
+    <w:name w:val="citation-4981"/>
+    <w:basedOn w:val="DefaultParagraphFont"/>
+    <w:rsid w:val="00F97C4F"/>
+  </w:style>
+  <w:style w:type="character" w:customStyle="1" w:styleId="citation-4980">
+    <w:name w:val="citation-4980"/>
+    <w:basedOn w:val="DefaultParagraphFont"/>
+    <w:rsid w:val="00F97C4F"/>
+  </w:style>
+  <w:style w:type="character" w:customStyle="1" w:styleId="citation-4979">
+    <w:name w:val="citation-4979"/>
+    <w:basedOn w:val="DefaultParagraphFont"/>
+    <w:rsid w:val="00F97C4F"/>
+  </w:style>
 </w:styles>
 </file>
 

</xml_diff>

<commit_message>
feat: add bcrypt password hashing for user authentication and update test scripts
</commit_message>
<xml_diff>
--- a/docs/Sprint 2.docx
+++ b/docs/Sprint 2.docx
@@ -337,21 +337,7 @@
               <w:rPr>
                 <w:rFonts w:ascii="Calibri" w:hAnsi="Calibri" w:cs="Calibri"/>
               </w:rPr>
-              <w:t xml:space="preserve">As a Patient, I want to book an appointment </w:t>
-            </w:r>
-            <w:proofErr w:type="gramStart"/>
-            <w:r>
-              <w:rPr>
-                <w:rFonts w:ascii="Calibri" w:hAnsi="Calibri" w:cs="Calibri"/>
-              </w:rPr>
-              <w:t>online</w:t>
-            </w:r>
-            <w:proofErr w:type="gramEnd"/>
-            <w:r>
-              <w:rPr>
-                <w:rFonts w:ascii="Calibri" w:hAnsi="Calibri" w:cs="Calibri"/>
-              </w:rPr>
-              <w:t xml:space="preserve"> so I don't have to call the clinic.</w:t>
+              <w:t>As a Patient, I want to book an appointment online so I don't have to call the clinic.</w:t>
             </w:r>
           </w:p>
         </w:tc>
@@ -568,21 +554,7 @@
               <w:rPr>
                 <w:rFonts w:ascii="Calibri" w:hAnsi="Calibri" w:cs="Calibri"/>
               </w:rPr>
-              <w:t xml:space="preserve">As a Patient, I want to receive an appointment </w:t>
-            </w:r>
-            <w:proofErr w:type="gramStart"/>
-            <w:r>
-              <w:rPr>
-                <w:rFonts w:ascii="Calibri" w:hAnsi="Calibri" w:cs="Calibri"/>
-              </w:rPr>
-              <w:t>confirmation</w:t>
-            </w:r>
-            <w:proofErr w:type="gramEnd"/>
-            <w:r>
-              <w:rPr>
-                <w:rFonts w:ascii="Calibri" w:hAnsi="Calibri" w:cs="Calibri"/>
-              </w:rPr>
-              <w:t xml:space="preserve"> so I know my booking was successful.</w:t>
+              <w:t>As a Patient, I want to receive an appointment confirmation so I know my booking was successful.</w:t>
             </w:r>
           </w:p>
         </w:tc>
@@ -657,21 +629,7 @@
               <w:rPr>
                 <w:rFonts w:ascii="Calibri" w:hAnsi="Calibri" w:cs="Calibri"/>
               </w:rPr>
-              <w:t xml:space="preserve">As an Admin, I want to register a new patient with their name and </w:t>
-            </w:r>
-            <w:proofErr w:type="gramStart"/>
-            <w:r>
-              <w:rPr>
-                <w:rFonts w:ascii="Calibri" w:hAnsi="Calibri" w:cs="Calibri"/>
-              </w:rPr>
-              <w:t>DOB</w:t>
-            </w:r>
-            <w:proofErr w:type="gramEnd"/>
-            <w:r>
-              <w:rPr>
-                <w:rFonts w:ascii="Calibri" w:hAnsi="Calibri" w:cs="Calibri"/>
-              </w:rPr>
-              <w:t xml:space="preserve"> so their record is created.</w:t>
+              <w:t>As an Admin, I want to register a new patient with their name and DOB so their record is created.</w:t>
             </w:r>
           </w:p>
         </w:tc>
@@ -944,21 +902,7 @@
         <w:rPr>
           <w:rFonts w:ascii="Calibri" w:hAnsi="Calibri" w:cs="Calibri"/>
         </w:rPr>
-        <w:t xml:space="preserve"> by building the secure authentication gateway and the reactive scheduling engine. These features are </w:t>
-      </w:r>
-      <w:proofErr w:type="gramStart"/>
-      <w:r>
-        <w:rPr>
-          <w:rFonts w:ascii="Calibri" w:hAnsi="Calibri" w:cs="Calibri"/>
-        </w:rPr>
-        <w:t>high-value</w:t>
-      </w:r>
-      <w:proofErr w:type="gramEnd"/>
-      <w:r>
-        <w:rPr>
-          <w:rFonts w:ascii="Calibri" w:hAnsi="Calibri" w:cs="Calibri"/>
-        </w:rPr>
-        <w:t xml:space="preserve"> because they directly address the primary user frustration identified in discovery: the lack of self-service visibility for bookings and medical records. By prioritizing the </w:t>
+        <w:t xml:space="preserve"> by building the secure authentication gateway and the reactive scheduling engine. These features are high-value because they directly address the primary user frustration identified in discovery: the lack of self-service visibility for bookings and medical records. By prioritizing the </w:t>
       </w:r>
       <w:r>
         <w:rPr>
@@ -1989,7 +1933,6 @@
               <w:t xml:space="preserve">: Build </w:t>
             </w:r>
             <w:proofErr w:type="spellStart"/>
-            <w:proofErr w:type="gramStart"/>
             <w:r>
               <w:rPr>
                 <w:rStyle w:val="HTMLCode"/>
@@ -1997,17 +1940,7 @@
                 <w:color w:val="444746"/>
                 <w:bdr w:val="none" w:sz="0" w:space="0" w:color="auto" w:frame="1"/>
               </w:rPr>
-              <w:t>hooks.server</w:t>
-            </w:r>
-            <w:proofErr w:type="gramEnd"/>
-            <w:r>
-              <w:rPr>
-                <w:rStyle w:val="HTMLCode"/>
-                <w:rFonts w:eastAsiaTheme="majorEastAsia" w:cs="Arial"/>
-                <w:color w:val="444746"/>
-                <w:bdr w:val="none" w:sz="0" w:space="0" w:color="auto" w:frame="1"/>
-              </w:rPr>
-              <w:t>.ts</w:t>
+              <w:t>hooks.server.ts</w:t>
             </w:r>
             <w:proofErr w:type="spellEnd"/>
             <w:r>
@@ -2925,6 +2858,54 @@
     </w:p>
     <w:p>
       <w:pPr>
+        <w:jc w:val="center"/>
+        <w:rPr>
+          <w:rFonts w:ascii="Calibri" w:hAnsi="Calibri" w:cs="Calibri"/>
+        </w:rPr>
+      </w:pPr>
+      <w:r>
+        <w:rPr>
+          <w:rFonts w:ascii="Calibri" w:hAnsi="Calibri" w:cs="Calibri"/>
+        </w:rPr>
+        <w:t>Task T8 (TDD)</w:t>
+      </w:r>
+      <w:r>
+        <w:rPr>
+          <w:rFonts w:ascii="Calibri" w:hAnsi="Calibri" w:cs="Calibri"/>
+        </w:rPr>
+        <w:t xml:space="preserve"> </w:t>
+      </w:r>
+      <w:r>
+        <w:rPr>
+          <w:rFonts w:ascii="Calibri" w:hAnsi="Calibri" w:cs="Calibri"/>
+        </w:rPr>
+        <w:t xml:space="preserve">Take a screenshot of your terminal showing the </w:t>
+      </w:r>
+      <w:r>
+        <w:rPr>
+          <w:rFonts w:ascii="Calibri" w:hAnsi="Calibri" w:cs="Calibri"/>
+          <w:b/>
+          <w:bCs/>
+        </w:rPr>
+        <w:t>4 passed tests</w:t>
+      </w:r>
+      <w:r>
+        <w:rPr>
+          <w:rFonts w:ascii="Calibri" w:hAnsi="Calibri" w:cs="Calibri"/>
+        </w:rPr>
+        <w:t xml:space="preserve"> and place it in the "Code and evidence" section</w:t>
+      </w:r>
+    </w:p>
+    <w:p>
+      <w:pPr>
+        <w:jc w:val="center"/>
+        <w:rPr>
+          <w:rFonts w:ascii="Calibri" w:hAnsi="Calibri" w:cs="Calibri"/>
+        </w:rPr>
+      </w:pPr>
+    </w:p>
+    <w:p>
+      <w:pPr>
         <w:pStyle w:val="Heading2"/>
         <w:rPr>
           <w:rFonts w:ascii="Calibri" w:hAnsi="Calibri" w:cs="Calibri"/>
@@ -3381,16 +3362,50 @@
         <w:rPr>
           <w:rFonts w:ascii="Calibri" w:hAnsi="Calibri" w:cs="Calibri"/>
         </w:rPr>
-        <w:t xml:space="preserve"> </w:t>
+        <w:t xml:space="preserve"> compliance .</w:t>
       </w:r>
-      <w:proofErr w:type="gramStart"/>
+    </w:p>
+    <w:p>
+      <w:pPr>
+        <w:jc w:val="left"/>
+        <w:rPr>
+          <w:rFonts w:ascii="Calibri" w:hAnsi="Calibri" w:cs="Calibri"/>
+        </w:rPr>
+      </w:pPr>
       <w:r>
         <w:rPr>
           <w:rFonts w:ascii="Calibri" w:hAnsi="Calibri" w:cs="Calibri"/>
         </w:rPr>
-        <w:t>compliance .</w:t>
+        <w:t xml:space="preserve">achieved a </w:t>
       </w:r>
-      <w:proofErr w:type="gramEnd"/>
+      <w:r>
+        <w:rPr>
+          <w:rFonts w:ascii="Calibri" w:hAnsi="Calibri" w:cs="Calibri"/>
+          <w:b/>
+          <w:bCs/>
+        </w:rPr>
+        <w:t>100% pass rate</w:t>
+      </w:r>
+      <w:r>
+        <w:rPr>
+          <w:rFonts w:ascii="Calibri" w:hAnsi="Calibri" w:cs="Calibri"/>
+        </w:rPr>
+        <w:t xml:space="preserve"> on core functional unit tests, satisfying the success metric defined in your </w:t>
+      </w:r>
+      <w:r>
+        <w:rPr>
+          <w:rFonts w:ascii="Calibri" w:hAnsi="Calibri" w:cs="Calibri"/>
+          <w:b/>
+          <w:bCs/>
+        </w:rPr>
+        <w:t>PSD</w:t>
+      </w:r>
+      <w:r>
+        <w:rPr>
+          <w:rFonts w:ascii="Calibri" w:hAnsi="Calibri" w:cs="Calibri"/>
+        </w:rPr>
+        <w:t>.</w:t>
+      </w:r>
     </w:p>
     <w:p>
       <w:pPr>
@@ -3411,6 +3426,7 @@
         <w:rPr>
           <w:rFonts w:ascii="Calibri" w:hAnsi="Calibri" w:cs="Calibri"/>
         </w:rPr>
+        <w:lastRenderedPageBreak/>
         <w:t>What could be improved?</w:t>
       </w:r>
     </w:p>
@@ -3439,30 +3455,8 @@
         <w:rPr>
           <w:rFonts w:ascii="Calibri" w:hAnsi="Calibri" w:cs="Calibri"/>
         </w:rPr>
-        <w:t xml:space="preserve">The current 'BOOK WITH DR. MEHTA' button on the dashboard is a UI placeholder. The next development goal is to implement the dedicated '/booking' route to handle the transaction logic and </w:t>
+        <w:t>The current 'BOOK WITH DR. MEHTA' button on the dashboard is a UI placeholder. The next development goal is to implement the dedicated '/booking' route to handle the transaction logic and data-binding for Story 03 .</w:t>
       </w:r>
-      <w:proofErr w:type="gramStart"/>
-      <w:r>
-        <w:rPr>
-          <w:rFonts w:ascii="Calibri" w:hAnsi="Calibri" w:cs="Calibri"/>
-        </w:rPr>
-        <w:t>data-binding</w:t>
-      </w:r>
-      <w:proofErr w:type="gramEnd"/>
-      <w:r>
-        <w:rPr>
-          <w:rFonts w:ascii="Calibri" w:hAnsi="Calibri" w:cs="Calibri"/>
-        </w:rPr>
-        <w:t xml:space="preserve"> for Story </w:t>
-      </w:r>
-      <w:proofErr w:type="gramStart"/>
-      <w:r>
-        <w:rPr>
-          <w:rFonts w:ascii="Calibri" w:hAnsi="Calibri" w:cs="Calibri"/>
-        </w:rPr>
-        <w:t>03 .</w:t>
-      </w:r>
-      <w:proofErr w:type="gramEnd"/>
     </w:p>
     <w:p>
       <w:pPr>
@@ -3502,19 +3496,11 @@
         <w:t>While the current MVP uses plain-string comparison for mock data validation, a production-ready version must implement Argon2 or Bcrypt hashing within the +</w:t>
       </w:r>
       <w:proofErr w:type="spellStart"/>
-      <w:proofErr w:type="gramStart"/>
       <w:r>
         <w:rPr>
           <w:rFonts w:ascii="Calibri" w:hAnsi="Calibri" w:cs="Calibri"/>
         </w:rPr>
-        <w:t>page.server</w:t>
-      </w:r>
-      <w:proofErr w:type="gramEnd"/>
-      <w:r>
-        <w:rPr>
-          <w:rFonts w:ascii="Calibri" w:hAnsi="Calibri" w:cs="Calibri"/>
-        </w:rPr>
-        <w:t>.ts</w:t>
+        <w:t>page.server.ts</w:t>
       </w:r>
       <w:proofErr w:type="spellEnd"/>
       <w:r>

</xml_diff>

<commit_message>
docs: update Sprint 2 documentation
</commit_message>
<xml_diff>
--- a/docs/Sprint 2.docx
+++ b/docs/Sprint 2.docx
@@ -337,7 +337,21 @@
               <w:rPr>
                 <w:rFonts w:ascii="Calibri" w:hAnsi="Calibri" w:cs="Calibri"/>
               </w:rPr>
-              <w:t>As a Patient, I want to book an appointment online so I don't have to call the clinic.</w:t>
+              <w:t xml:space="preserve">As a Patient, I want to book an appointment </w:t>
+            </w:r>
+            <w:proofErr w:type="gramStart"/>
+            <w:r>
+              <w:rPr>
+                <w:rFonts w:ascii="Calibri" w:hAnsi="Calibri" w:cs="Calibri"/>
+              </w:rPr>
+              <w:t>online</w:t>
+            </w:r>
+            <w:proofErr w:type="gramEnd"/>
+            <w:r>
+              <w:rPr>
+                <w:rFonts w:ascii="Calibri" w:hAnsi="Calibri" w:cs="Calibri"/>
+              </w:rPr>
+              <w:t xml:space="preserve"> so I don't have to call the clinic.</w:t>
             </w:r>
           </w:p>
         </w:tc>
@@ -554,7 +568,21 @@
               <w:rPr>
                 <w:rFonts w:ascii="Calibri" w:hAnsi="Calibri" w:cs="Calibri"/>
               </w:rPr>
-              <w:t>As a Patient, I want to receive an appointment confirmation so I know my booking was successful.</w:t>
+              <w:t xml:space="preserve">As a Patient, I want to receive an appointment </w:t>
+            </w:r>
+            <w:proofErr w:type="gramStart"/>
+            <w:r>
+              <w:rPr>
+                <w:rFonts w:ascii="Calibri" w:hAnsi="Calibri" w:cs="Calibri"/>
+              </w:rPr>
+              <w:t>confirmation</w:t>
+            </w:r>
+            <w:proofErr w:type="gramEnd"/>
+            <w:r>
+              <w:rPr>
+                <w:rFonts w:ascii="Calibri" w:hAnsi="Calibri" w:cs="Calibri"/>
+              </w:rPr>
+              <w:t xml:space="preserve"> so I know my booking was successful.</w:t>
             </w:r>
           </w:p>
         </w:tc>
@@ -629,7 +657,21 @@
               <w:rPr>
                 <w:rFonts w:ascii="Calibri" w:hAnsi="Calibri" w:cs="Calibri"/>
               </w:rPr>
-              <w:t>As an Admin, I want to register a new patient with their name and DOB so their record is created.</w:t>
+              <w:t xml:space="preserve">As an Admin, I want to register a new patient with their name and </w:t>
+            </w:r>
+            <w:proofErr w:type="gramStart"/>
+            <w:r>
+              <w:rPr>
+                <w:rFonts w:ascii="Calibri" w:hAnsi="Calibri" w:cs="Calibri"/>
+              </w:rPr>
+              <w:t>DOB</w:t>
+            </w:r>
+            <w:proofErr w:type="gramEnd"/>
+            <w:r>
+              <w:rPr>
+                <w:rFonts w:ascii="Calibri" w:hAnsi="Calibri" w:cs="Calibri"/>
+              </w:rPr>
+              <w:t xml:space="preserve"> so their record is created.</w:t>
             </w:r>
           </w:p>
         </w:tc>
@@ -902,7 +944,21 @@
         <w:rPr>
           <w:rFonts w:ascii="Calibri" w:hAnsi="Calibri" w:cs="Calibri"/>
         </w:rPr>
-        <w:t xml:space="preserve"> by building the secure authentication gateway and the reactive scheduling engine. These features are high-value because they directly address the primary user frustration identified in discovery: the lack of self-service visibility for bookings and medical records. By prioritizing the </w:t>
+        <w:t xml:space="preserve"> by building the secure authentication gateway and the reactive scheduling engine. These features are </w:t>
+      </w:r>
+      <w:proofErr w:type="gramStart"/>
+      <w:r>
+        <w:rPr>
+          <w:rFonts w:ascii="Calibri" w:hAnsi="Calibri" w:cs="Calibri"/>
+        </w:rPr>
+        <w:t>high-value</w:t>
+      </w:r>
+      <w:proofErr w:type="gramEnd"/>
+      <w:r>
+        <w:rPr>
+          <w:rFonts w:ascii="Calibri" w:hAnsi="Calibri" w:cs="Calibri"/>
+        </w:rPr>
+        <w:t xml:space="preserve"> because they directly address the primary user frustration identified in discovery: the lack of self-service visibility for bookings and medical records. By prioritizing the </w:t>
       </w:r>
       <w:r>
         <w:rPr>
@@ -943,47 +999,38 @@
     </w:p>
     <w:tbl>
       <w:tblPr>
-        <w:tblStyle w:val="GridTable3-Accent5"/>
-        <w:tblW w:w="4997" w:type="pct"/>
+        <w:tblStyle w:val="TableGrid"/>
+        <w:tblW w:w="0" w:type="auto"/>
         <w:tblLook w:val="04A0" w:firstRow="1" w:lastRow="0" w:firstColumn="1" w:lastColumn="0" w:noHBand="0" w:noVBand="1"/>
       </w:tblPr>
       <w:tblGrid>
-        <w:gridCol w:w="776"/>
-        <w:gridCol w:w="3318"/>
-        <w:gridCol w:w="1432"/>
-        <w:gridCol w:w="1154"/>
-        <w:gridCol w:w="1232"/>
-        <w:gridCol w:w="1432"/>
+        <w:gridCol w:w="748"/>
+        <w:gridCol w:w="3484"/>
+        <w:gridCol w:w="875"/>
+        <w:gridCol w:w="618"/>
+        <w:gridCol w:w="1155"/>
+        <w:gridCol w:w="2470"/>
       </w:tblGrid>
       <w:tr>
-        <w:trPr>
-          <w:cnfStyle w:val="100000000000" w:firstRow="1" w:lastRow="0" w:firstColumn="0" w:lastColumn="0" w:oddVBand="0" w:evenVBand="0" w:oddHBand="0" w:evenHBand="0" w:firstRowFirstColumn="0" w:firstRowLastColumn="0" w:lastRowFirstColumn="0" w:lastRowLastColumn="0"/>
-        </w:trPr>
-        <w:tc>
-          <w:tcPr>
-            <w:cnfStyle w:val="001000000100" w:firstRow="0" w:lastRow="0" w:firstColumn="1" w:lastColumn="0" w:oddVBand="0" w:evenVBand="0" w:oddHBand="0" w:evenHBand="0" w:firstRowFirstColumn="1" w:firstRowLastColumn="0" w:lastRowFirstColumn="0" w:lastRowLastColumn="0"/>
-            <w:tcW w:w="371" w:type="pct"/>
-            <w:tcBorders>
-              <w:top w:val="single" w:sz="4" w:space="0" w:color="E59EDC" w:themeColor="accent5" w:themeTint="66"/>
-              <w:left w:val="single" w:sz="4" w:space="0" w:color="E59EDC" w:themeColor="accent5" w:themeTint="66"/>
-              <w:bottom w:val="single" w:sz="4" w:space="0" w:color="E59EDC" w:themeColor="accent5" w:themeTint="66"/>
-              <w:right w:val="single" w:sz="4" w:space="0" w:color="E59EDC" w:themeColor="accent5" w:themeTint="66"/>
-            </w:tcBorders>
-          </w:tcPr>
-          <w:p>
-            <w:pPr>
-              <w:jc w:val="center"/>
-              <w:rPr>
-                <w:rFonts w:ascii="Calibri" w:hAnsi="Calibri" w:cs="Calibri"/>
-                <w:i w:val="0"/>
-                <w:iCs w:val="0"/>
-              </w:rPr>
-            </w:pPr>
-            <w:r>
-              <w:rPr>
-                <w:rFonts w:ascii="Calibri" w:hAnsi="Calibri" w:cs="Calibri"/>
-                <w:i w:val="0"/>
-                <w:iCs w:val="0"/>
+        <w:tc>
+          <w:tcPr>
+            <w:tcW w:w="0" w:type="auto"/>
+            <w:hideMark/>
+          </w:tcPr>
+          <w:p>
+            <w:pPr>
+              <w:jc w:val="left"/>
+              <w:rPr>
+                <w:rFonts w:ascii="Calibri" w:hAnsi="Calibri" w:cs="Calibri"/>
+                <w:lang w:val="en-US"/>
+              </w:rPr>
+            </w:pPr>
+            <w:r>
+              <w:rPr>
+                <w:rFonts w:ascii="Calibri" w:hAnsi="Calibri" w:cs="Calibri"/>
+                <w:b/>
+                <w:bCs/>
+                <w:lang w:val="en-US"/>
               </w:rPr>
               <w:t>Task ID</w:t>
             </w:r>
@@ -991,25 +1038,23 @@
         </w:tc>
         <w:tc>
           <w:tcPr>
-            <w:tcW w:w="1834" w:type="pct"/>
-            <w:tcBorders>
-              <w:top w:val="single" w:sz="4" w:space="0" w:color="E59EDC" w:themeColor="accent5" w:themeTint="66"/>
-              <w:left w:val="single" w:sz="4" w:space="0" w:color="E59EDC" w:themeColor="accent5" w:themeTint="66"/>
-              <w:bottom w:val="single" w:sz="4" w:space="0" w:color="E59EDC" w:themeColor="accent5" w:themeTint="66"/>
-              <w:right w:val="single" w:sz="4" w:space="0" w:color="E59EDC" w:themeColor="accent5" w:themeTint="66"/>
-            </w:tcBorders>
-          </w:tcPr>
-          <w:p>
-            <w:pPr>
-              <w:jc w:val="center"/>
-              <w:cnfStyle w:val="100000000000" w:firstRow="1" w:lastRow="0" w:firstColumn="0" w:lastColumn="0" w:oddVBand="0" w:evenVBand="0" w:oddHBand="0" w:evenHBand="0" w:firstRowFirstColumn="0" w:firstRowLastColumn="0" w:lastRowFirstColumn="0" w:lastRowLastColumn="0"/>
-              <w:rPr>
-                <w:rFonts w:ascii="Calibri" w:hAnsi="Calibri" w:cs="Calibri"/>
-              </w:rPr>
-            </w:pPr>
-            <w:r>
-              <w:rPr>
-                <w:rFonts w:ascii="Calibri" w:hAnsi="Calibri" w:cs="Calibri"/>
+            <w:tcW w:w="0" w:type="auto"/>
+            <w:hideMark/>
+          </w:tcPr>
+          <w:p>
+            <w:pPr>
+              <w:jc w:val="left"/>
+              <w:rPr>
+                <w:rFonts w:ascii="Calibri" w:hAnsi="Calibri" w:cs="Calibri"/>
+                <w:lang w:val="en-US"/>
+              </w:rPr>
+            </w:pPr>
+            <w:r>
+              <w:rPr>
+                <w:rFonts w:ascii="Calibri" w:hAnsi="Calibri" w:cs="Calibri"/>
+                <w:b/>
+                <w:bCs/>
+                <w:lang w:val="en-US"/>
               </w:rPr>
               <w:t>Technical Task</w:t>
             </w:r>
@@ -1017,23 +1062,23 @@
         </w:tc>
         <w:tc>
           <w:tcPr>
-            <w:tcW w:w="824" w:type="pct"/>
-            <w:tcBorders>
-              <w:top w:val="single" w:sz="4" w:space="0" w:color="E59EDC" w:themeColor="accent5" w:themeTint="66"/>
-              <w:bottom w:val="single" w:sz="4" w:space="0" w:color="E59EDC" w:themeColor="accent5" w:themeTint="66"/>
-            </w:tcBorders>
-          </w:tcPr>
-          <w:p>
-            <w:pPr>
-              <w:jc w:val="center"/>
-              <w:cnfStyle w:val="100000000000" w:firstRow="1" w:lastRow="0" w:firstColumn="0" w:lastColumn="0" w:oddVBand="0" w:evenVBand="0" w:oddHBand="0" w:evenHBand="0" w:firstRowFirstColumn="0" w:firstRowLastColumn="0" w:lastRowFirstColumn="0" w:lastRowLastColumn="0"/>
-              <w:rPr>
-                <w:rFonts w:ascii="Calibri" w:hAnsi="Calibri" w:cs="Calibri"/>
-              </w:rPr>
-            </w:pPr>
-            <w:r>
-              <w:rPr>
-                <w:rFonts w:ascii="Calibri" w:hAnsi="Calibri" w:cs="Calibri"/>
+            <w:tcW w:w="0" w:type="auto"/>
+            <w:hideMark/>
+          </w:tcPr>
+          <w:p>
+            <w:pPr>
+              <w:jc w:val="left"/>
+              <w:rPr>
+                <w:rFonts w:ascii="Calibri" w:hAnsi="Calibri" w:cs="Calibri"/>
+                <w:lang w:val="en-US"/>
+              </w:rPr>
+            </w:pPr>
+            <w:r>
+              <w:rPr>
+                <w:rFonts w:ascii="Calibri" w:hAnsi="Calibri" w:cs="Calibri"/>
+                <w:b/>
+                <w:bCs/>
+                <w:lang w:val="en-US"/>
               </w:rPr>
               <w:t>Story Link</w:t>
             </w:r>
@@ -1041,50 +1086,47 @@
         </w:tc>
         <w:tc>
           <w:tcPr>
-            <w:tcW w:w="561" w:type="pct"/>
-            <w:tcBorders>
-              <w:top w:val="single" w:sz="4" w:space="0" w:color="E59EDC" w:themeColor="accent5" w:themeTint="66"/>
-              <w:left w:val="single" w:sz="4" w:space="0" w:color="E59EDC" w:themeColor="accent5" w:themeTint="66"/>
-              <w:bottom w:val="single" w:sz="4" w:space="0" w:color="E59EDC" w:themeColor="accent5" w:themeTint="66"/>
-              <w:right w:val="single" w:sz="4" w:space="0" w:color="E59EDC" w:themeColor="accent5" w:themeTint="66"/>
-            </w:tcBorders>
-          </w:tcPr>
-          <w:p>
-            <w:pPr>
-              <w:jc w:val="center"/>
-              <w:cnfStyle w:val="100000000000" w:firstRow="1" w:lastRow="0" w:firstColumn="0" w:lastColumn="0" w:oddVBand="0" w:evenVBand="0" w:oddHBand="0" w:evenHBand="0" w:firstRowFirstColumn="0" w:firstRowLastColumn="0" w:lastRowFirstColumn="0" w:lastRowLastColumn="0"/>
-              <w:rPr>
-                <w:rFonts w:ascii="Calibri" w:hAnsi="Calibri" w:cs="Calibri"/>
-              </w:rPr>
-            </w:pPr>
-            <w:r>
-              <w:rPr>
-                <w:rFonts w:ascii="Calibri" w:hAnsi="Calibri" w:cs="Calibri"/>
-              </w:rPr>
-              <w:t>Estimate</w:t>
-            </w:r>
-          </w:p>
-        </w:tc>
-        <w:tc>
-          <w:tcPr>
-            <w:tcW w:w="593" w:type="pct"/>
-            <w:tcBorders>
-              <w:top w:val="single" w:sz="4" w:space="0" w:color="E59EDC" w:themeColor="accent5" w:themeTint="66"/>
-              <w:bottom w:val="single" w:sz="4" w:space="0" w:color="E59EDC" w:themeColor="accent5" w:themeTint="66"/>
-              <w:right w:val="single" w:sz="4" w:space="0" w:color="E59EDC" w:themeColor="accent5" w:themeTint="66"/>
-            </w:tcBorders>
-          </w:tcPr>
-          <w:p>
-            <w:pPr>
-              <w:jc w:val="center"/>
-              <w:cnfStyle w:val="100000000000" w:firstRow="1" w:lastRow="0" w:firstColumn="0" w:lastColumn="0" w:oddVBand="0" w:evenVBand="0" w:oddHBand="0" w:evenHBand="0" w:firstRowFirstColumn="0" w:firstRowLastColumn="0" w:lastRowFirstColumn="0" w:lastRowLastColumn="0"/>
-              <w:rPr>
-                <w:rFonts w:ascii="Calibri" w:hAnsi="Calibri" w:cs="Calibri"/>
-              </w:rPr>
-            </w:pPr>
-            <w:r>
-              <w:rPr>
-                <w:rFonts w:ascii="Calibri" w:hAnsi="Calibri" w:cs="Calibri"/>
+            <w:tcW w:w="0" w:type="auto"/>
+            <w:hideMark/>
+          </w:tcPr>
+          <w:p>
+            <w:pPr>
+              <w:jc w:val="left"/>
+              <w:rPr>
+                <w:rFonts w:ascii="Calibri" w:hAnsi="Calibri" w:cs="Calibri"/>
+                <w:lang w:val="en-US"/>
+              </w:rPr>
+            </w:pPr>
+            <w:r>
+              <w:rPr>
+                <w:rFonts w:ascii="Calibri" w:hAnsi="Calibri" w:cs="Calibri"/>
+                <w:b/>
+                <w:bCs/>
+                <w:lang w:val="en-US"/>
+              </w:rPr>
+              <w:t>Est.</w:t>
+            </w:r>
+          </w:p>
+        </w:tc>
+        <w:tc>
+          <w:tcPr>
+            <w:tcW w:w="0" w:type="auto"/>
+            <w:hideMark/>
+          </w:tcPr>
+          <w:p>
+            <w:pPr>
+              <w:jc w:val="left"/>
+              <w:rPr>
+                <w:rFonts w:ascii="Calibri" w:hAnsi="Calibri" w:cs="Calibri"/>
+                <w:lang w:val="en-US"/>
+              </w:rPr>
+            </w:pPr>
+            <w:r>
+              <w:rPr>
+                <w:rFonts w:ascii="Calibri" w:hAnsi="Calibri" w:cs="Calibri"/>
+                <w:b/>
+                <w:bCs/>
+                <w:lang w:val="en-US"/>
               </w:rPr>
               <w:t>Status</w:t>
             </w:r>
@@ -1092,24 +1134,23 @@
         </w:tc>
         <w:tc>
           <w:tcPr>
-            <w:tcW w:w="816" w:type="pct"/>
-            <w:tcBorders>
-              <w:top w:val="single" w:sz="4" w:space="0" w:color="E59EDC" w:themeColor="accent5" w:themeTint="66"/>
-              <w:bottom w:val="single" w:sz="4" w:space="0" w:color="E59EDC" w:themeColor="accent5" w:themeTint="66"/>
-              <w:right w:val="single" w:sz="4" w:space="0" w:color="E59EDC" w:themeColor="accent5" w:themeTint="66"/>
-            </w:tcBorders>
-          </w:tcPr>
-          <w:p>
-            <w:pPr>
-              <w:jc w:val="center"/>
-              <w:cnfStyle w:val="100000000000" w:firstRow="1" w:lastRow="0" w:firstColumn="0" w:lastColumn="0" w:oddVBand="0" w:evenVBand="0" w:oddHBand="0" w:evenHBand="0" w:firstRowFirstColumn="0" w:firstRowLastColumn="0" w:lastRowFirstColumn="0" w:lastRowLastColumn="0"/>
-              <w:rPr>
-                <w:rFonts w:ascii="Calibri" w:hAnsi="Calibri" w:cs="Calibri"/>
-              </w:rPr>
-            </w:pPr>
-            <w:r>
-              <w:rPr>
-                <w:rFonts w:ascii="Calibri" w:hAnsi="Calibri" w:cs="Calibri"/>
+            <w:tcW w:w="0" w:type="auto"/>
+            <w:hideMark/>
+          </w:tcPr>
+          <w:p>
+            <w:pPr>
+              <w:jc w:val="left"/>
+              <w:rPr>
+                <w:rFonts w:ascii="Calibri" w:hAnsi="Calibri" w:cs="Calibri"/>
+                <w:lang w:val="en-US"/>
+              </w:rPr>
+            </w:pPr>
+            <w:r>
+              <w:rPr>
+                <w:rFonts w:ascii="Calibri" w:hAnsi="Calibri" w:cs="Calibri"/>
+                <w:b/>
+                <w:bCs/>
+                <w:lang w:val="en-US"/>
               </w:rPr>
               <w:t>Traceability</w:t>
             </w:r>
@@ -1117,169 +1158,181 @@
         </w:tc>
       </w:tr>
       <w:tr>
-        <w:trPr>
-          <w:cnfStyle w:val="000000100000" w:firstRow="0" w:lastRow="0" w:firstColumn="0" w:lastColumn="0" w:oddVBand="0" w:evenVBand="0" w:oddHBand="1" w:evenHBand="0" w:firstRowFirstColumn="0" w:firstRowLastColumn="0" w:lastRowFirstColumn="0" w:lastRowLastColumn="0"/>
-        </w:trPr>
-        <w:tc>
-          <w:tcPr>
-            <w:cnfStyle w:val="001000000000" w:firstRow="0" w:lastRow="0" w:firstColumn="1" w:lastColumn="0" w:oddVBand="0" w:evenVBand="0" w:oddHBand="0" w:evenHBand="0" w:firstRowFirstColumn="0" w:firstRowLastColumn="0" w:lastRowFirstColumn="0" w:lastRowLastColumn="0"/>
-            <w:tcW w:w="371" w:type="pct"/>
-            <w:tcBorders>
-              <w:top w:val="single" w:sz="4" w:space="0" w:color="E59EDC" w:themeColor="accent5" w:themeTint="66"/>
-              <w:left w:val="single" w:sz="4" w:space="0" w:color="E59EDC" w:themeColor="accent5" w:themeTint="66"/>
-              <w:bottom w:val="single" w:sz="4" w:space="0" w:color="E59EDC" w:themeColor="accent5" w:themeTint="66"/>
-              <w:right w:val="single" w:sz="4" w:space="0" w:color="E59EDC" w:themeColor="accent5" w:themeTint="66"/>
-            </w:tcBorders>
-            <w:shd w:val="clear" w:color="auto" w:fill="F2CEED" w:themeFill="accent5" w:themeFillTint="33"/>
-            <w:vAlign w:val="center"/>
-          </w:tcPr>
-          <w:p>
-            <w:pPr>
-              <w:jc w:val="center"/>
-              <w:rPr>
-                <w:rFonts w:ascii="Calibri" w:hAnsi="Calibri" w:cs="Calibri"/>
-              </w:rPr>
-            </w:pPr>
-            <w:r>
-              <w:rPr>
-                <w:rStyle w:val="Strong"/>
-                <w:color w:val="1F1F1F"/>
-                <w:bdr w:val="none" w:sz="0" w:space="0" w:color="auto" w:frame="1"/>
+        <w:tc>
+          <w:tcPr>
+            <w:tcW w:w="0" w:type="auto"/>
+            <w:hideMark/>
+          </w:tcPr>
+          <w:p>
+            <w:pPr>
+              <w:jc w:val="left"/>
+              <w:rPr>
+                <w:rFonts w:ascii="Calibri" w:hAnsi="Calibri" w:cs="Calibri"/>
+                <w:lang w:val="en-US"/>
+              </w:rPr>
+            </w:pPr>
+            <w:r>
+              <w:rPr>
+                <w:rFonts w:ascii="Calibri" w:hAnsi="Calibri" w:cs="Calibri"/>
+                <w:b/>
+                <w:bCs/>
+                <w:lang w:val="en-US"/>
               </w:rPr>
               <w:lastRenderedPageBreak/>
-              <w:t>Task ID</w:t>
-            </w:r>
-          </w:p>
-        </w:tc>
-        <w:tc>
-          <w:tcPr>
-            <w:tcW w:w="1834" w:type="pct"/>
-            <w:tcBorders>
-              <w:top w:val="single" w:sz="4" w:space="0" w:color="E59EDC" w:themeColor="accent5" w:themeTint="66"/>
-              <w:left w:val="single" w:sz="4" w:space="0" w:color="E59EDC" w:themeColor="accent5" w:themeTint="66"/>
-            </w:tcBorders>
-            <w:vAlign w:val="center"/>
-          </w:tcPr>
-          <w:p>
-            <w:pPr>
-              <w:jc w:val="left"/>
-              <w:cnfStyle w:val="000000100000" w:firstRow="0" w:lastRow="0" w:firstColumn="0" w:lastColumn="0" w:oddVBand="0" w:evenVBand="0" w:oddHBand="1" w:evenHBand="0" w:firstRowFirstColumn="0" w:firstRowLastColumn="0" w:lastRowFirstColumn="0" w:lastRowLastColumn="0"/>
-              <w:rPr>
-                <w:rFonts w:ascii="Calibri" w:hAnsi="Calibri" w:cs="Calibri"/>
-              </w:rPr>
-            </w:pPr>
-            <w:r>
-              <w:rPr>
-                <w:rStyle w:val="Strong"/>
-                <w:color w:val="1F1F1F"/>
-                <w:bdr w:val="none" w:sz="0" w:space="0" w:color="auto" w:frame="1"/>
-              </w:rPr>
-              <w:t>Technical Task</w:t>
-            </w:r>
-          </w:p>
-        </w:tc>
-        <w:tc>
-          <w:tcPr>
-            <w:tcW w:w="824" w:type="pct"/>
-            <w:tcBorders>
-              <w:top w:val="single" w:sz="4" w:space="0" w:color="E59EDC" w:themeColor="accent5" w:themeTint="66"/>
-            </w:tcBorders>
-            <w:vAlign w:val="center"/>
-          </w:tcPr>
-          <w:p>
-            <w:pPr>
-              <w:jc w:val="center"/>
-              <w:cnfStyle w:val="000000100000" w:firstRow="0" w:lastRow="0" w:firstColumn="0" w:lastColumn="0" w:oddVBand="0" w:evenVBand="0" w:oddHBand="1" w:evenHBand="0" w:firstRowFirstColumn="0" w:firstRowLastColumn="0" w:lastRowFirstColumn="0" w:lastRowLastColumn="0"/>
-              <w:rPr>
-                <w:rFonts w:ascii="Calibri" w:hAnsi="Calibri" w:cs="Calibri"/>
-                <w:lang w:val="en-US"/>
-              </w:rPr>
-            </w:pPr>
-            <w:r>
-              <w:rPr>
-                <w:rStyle w:val="Strong"/>
-                <w:color w:val="1F1F1F"/>
-                <w:bdr w:val="none" w:sz="0" w:space="0" w:color="auto" w:frame="1"/>
-              </w:rPr>
-              <w:t>Story Link</w:t>
-            </w:r>
-          </w:p>
-        </w:tc>
-        <w:tc>
-          <w:tcPr>
-            <w:tcW w:w="561" w:type="pct"/>
-            <w:tcBorders>
-              <w:top w:val="single" w:sz="4" w:space="0" w:color="E59EDC" w:themeColor="accent5" w:themeTint="66"/>
-            </w:tcBorders>
-            <w:vAlign w:val="center"/>
-          </w:tcPr>
-          <w:p>
-            <w:pPr>
-              <w:jc w:val="center"/>
-              <w:cnfStyle w:val="000000100000" w:firstRow="0" w:lastRow="0" w:firstColumn="0" w:lastColumn="0" w:oddVBand="0" w:evenVBand="0" w:oddHBand="1" w:evenHBand="0" w:firstRowFirstColumn="0" w:firstRowLastColumn="0" w:lastRowFirstColumn="0" w:lastRowLastColumn="0"/>
-              <w:rPr>
-                <w:rFonts w:ascii="Calibri" w:hAnsi="Calibri" w:cs="Calibri"/>
-              </w:rPr>
-            </w:pPr>
-            <w:r>
-              <w:rPr>
-                <w:rStyle w:val="Strong"/>
-                <w:color w:val="1F1F1F"/>
-                <w:bdr w:val="none" w:sz="0" w:space="0" w:color="auto" w:frame="1"/>
-              </w:rPr>
-              <w:t>Estimate</w:t>
-            </w:r>
-          </w:p>
-        </w:tc>
-        <w:tc>
-          <w:tcPr>
-            <w:tcW w:w="593" w:type="pct"/>
-            <w:tcBorders>
-              <w:top w:val="single" w:sz="4" w:space="0" w:color="E59EDC" w:themeColor="accent5" w:themeTint="66"/>
-            </w:tcBorders>
-            <w:vAlign w:val="center"/>
-          </w:tcPr>
-          <w:p>
-            <w:pPr>
-              <w:jc w:val="center"/>
-              <w:cnfStyle w:val="000000100000" w:firstRow="0" w:lastRow="0" w:firstColumn="0" w:lastColumn="0" w:oddVBand="0" w:evenVBand="0" w:oddHBand="1" w:evenHBand="0" w:firstRowFirstColumn="0" w:firstRowLastColumn="0" w:lastRowFirstColumn="0" w:lastRowLastColumn="0"/>
-              <w:rPr>
-                <w:rFonts w:ascii="Calibri" w:hAnsi="Calibri" w:cs="Calibri"/>
-              </w:rPr>
-            </w:pPr>
-            <w:r>
-              <w:rPr>
-                <w:rStyle w:val="Strong"/>
-                <w:color w:val="1F1F1F"/>
-                <w:bdr w:val="none" w:sz="0" w:space="0" w:color="auto" w:frame="1"/>
-              </w:rPr>
-              <w:t>Status</w:t>
-            </w:r>
-          </w:p>
-        </w:tc>
-        <w:tc>
-          <w:tcPr>
-            <w:tcW w:w="816" w:type="pct"/>
-            <w:tcBorders>
-              <w:top w:val="single" w:sz="4" w:space="0" w:color="E59EDC" w:themeColor="accent5" w:themeTint="66"/>
-            </w:tcBorders>
-            <w:vAlign w:val="center"/>
-          </w:tcPr>
-          <w:p>
-            <w:pPr>
-              <w:jc w:val="center"/>
-              <w:cnfStyle w:val="000000100000" w:firstRow="0" w:lastRow="0" w:firstColumn="0" w:lastColumn="0" w:oddVBand="0" w:evenVBand="0" w:oddHBand="1" w:evenHBand="0" w:firstRowFirstColumn="0" w:firstRowLastColumn="0" w:lastRowFirstColumn="0" w:lastRowLastColumn="0"/>
-              <w:rPr>
-                <w:rFonts w:ascii="Calibri" w:hAnsi="Calibri" w:cs="Calibri"/>
-              </w:rPr>
-            </w:pPr>
-            <w:r>
-              <w:rPr>
-                <w:rStyle w:val="Strong"/>
-                <w:color w:val="1F1F1F"/>
-                <w:bdr w:val="none" w:sz="0" w:space="0" w:color="auto" w:frame="1"/>
-              </w:rPr>
-              <w:t>Traceability</w:t>
+              <w:t>T5</w:t>
+            </w:r>
+          </w:p>
+        </w:tc>
+        <w:tc>
+          <w:tcPr>
+            <w:tcW w:w="0" w:type="auto"/>
+            <w:hideMark/>
+          </w:tcPr>
+          <w:p>
+            <w:pPr>
+              <w:jc w:val="left"/>
+              <w:rPr>
+                <w:rFonts w:ascii="Calibri" w:hAnsi="Calibri" w:cs="Calibri"/>
+                <w:lang w:val="en-US"/>
+              </w:rPr>
+            </w:pPr>
+            <w:r>
+              <w:rPr>
+                <w:rFonts w:ascii="Calibri" w:hAnsi="Calibri" w:cs="Calibri"/>
+                <w:b/>
+                <w:bCs/>
+                <w:lang w:val="en-US"/>
+              </w:rPr>
+              <w:t>Implementation</w:t>
+            </w:r>
+            <w:r>
+              <w:rPr>
+                <w:rFonts w:ascii="Calibri" w:hAnsi="Calibri" w:cs="Calibri"/>
+                <w:lang w:val="en-US"/>
+              </w:rPr>
+              <w:t xml:space="preserve">: Populate </w:t>
+            </w:r>
+            <w:proofErr w:type="spellStart"/>
+            <w:r>
+              <w:rPr>
+                <w:rFonts w:ascii="Calibri" w:hAnsi="Calibri" w:cs="Calibri"/>
+                <w:lang w:val="en-US"/>
+              </w:rPr>
+              <w:t>mockData.ts</w:t>
+            </w:r>
+            <w:proofErr w:type="spellEnd"/>
+            <w:r>
+              <w:rPr>
+                <w:rFonts w:ascii="Calibri" w:hAnsi="Calibri" w:cs="Calibri"/>
+                <w:lang w:val="en-US"/>
+              </w:rPr>
+              <w:t xml:space="preserve"> with 3NF clinical entities.</w:t>
+            </w:r>
+          </w:p>
+        </w:tc>
+        <w:tc>
+          <w:tcPr>
+            <w:tcW w:w="0" w:type="auto"/>
+            <w:hideMark/>
+          </w:tcPr>
+          <w:p>
+            <w:pPr>
+              <w:jc w:val="left"/>
+              <w:rPr>
+                <w:rFonts w:ascii="Calibri" w:hAnsi="Calibri" w:cs="Calibri"/>
+                <w:lang w:val="en-US"/>
+              </w:rPr>
+            </w:pPr>
+            <w:r>
+              <w:rPr>
+                <w:rFonts w:ascii="Calibri" w:hAnsi="Calibri" w:cs="Calibri"/>
+                <w:lang w:val="en-US"/>
+              </w:rPr>
+              <w:t>All</w:t>
+            </w:r>
+          </w:p>
+        </w:tc>
+        <w:tc>
+          <w:tcPr>
+            <w:tcW w:w="0" w:type="auto"/>
+            <w:hideMark/>
+          </w:tcPr>
+          <w:p>
+            <w:pPr>
+              <w:jc w:val="left"/>
+              <w:rPr>
+                <w:rFonts w:ascii="Calibri" w:hAnsi="Calibri" w:cs="Calibri"/>
+                <w:lang w:val="en-US"/>
+              </w:rPr>
+            </w:pPr>
+            <w:r>
+              <w:rPr>
+                <w:rFonts w:ascii="Calibri" w:hAnsi="Calibri" w:cs="Calibri"/>
+                <w:lang w:val="en-US"/>
+              </w:rPr>
+              <w:t>2</w:t>
+            </w:r>
+          </w:p>
+        </w:tc>
+        <w:tc>
+          <w:tcPr>
+            <w:tcW w:w="0" w:type="auto"/>
+            <w:hideMark/>
+          </w:tcPr>
+          <w:p>
+            <w:pPr>
+              <w:jc w:val="left"/>
+              <w:rPr>
+                <w:rFonts w:ascii="Calibri" w:hAnsi="Calibri" w:cs="Calibri"/>
+                <w:lang w:val="en-US"/>
+              </w:rPr>
+            </w:pPr>
+            <w:r>
+              <w:rPr>
+                <w:rFonts w:ascii="Calibri" w:hAnsi="Calibri" w:cs="Calibri"/>
+                <w:b/>
+                <w:bCs/>
+                <w:lang w:val="en-US"/>
+              </w:rPr>
+              <w:t>Complete</w:t>
+            </w:r>
+          </w:p>
+        </w:tc>
+        <w:tc>
+          <w:tcPr>
+            <w:tcW w:w="0" w:type="auto"/>
+            <w:hideMark/>
+          </w:tcPr>
+          <w:p>
+            <w:pPr>
+              <w:jc w:val="left"/>
+              <w:rPr>
+                <w:rFonts w:ascii="Calibri" w:hAnsi="Calibri" w:cs="Calibri"/>
+                <w:lang w:val="en-US"/>
+              </w:rPr>
+            </w:pPr>
+            <w:r>
+              <w:rPr>
+                <w:rFonts w:ascii="Calibri" w:hAnsi="Calibri" w:cs="Calibri"/>
+                <w:lang w:val="en-US"/>
+              </w:rPr>
+              <w:t xml:space="preserve">Maps </w:t>
+            </w:r>
+            <w:r>
+              <w:rPr>
+                <w:rFonts w:ascii="Calibri" w:hAnsi="Calibri" w:cs="Calibri"/>
+                <w:b/>
+                <w:bCs/>
+                <w:lang w:val="en-US"/>
+              </w:rPr>
+              <w:t>LDM</w:t>
+            </w:r>
+            <w:r>
+              <w:rPr>
+                <w:rFonts w:ascii="Calibri" w:hAnsi="Calibri" w:cs="Calibri"/>
+                <w:lang w:val="en-US"/>
+              </w:rPr>
+              <w:t xml:space="preserve"> attributes to code.</w:t>
             </w:r>
           </w:p>
         </w:tc>
@@ -1287,149 +1340,154 @@
       <w:tr>
         <w:tc>
           <w:tcPr>
-            <w:cnfStyle w:val="001000000000" w:firstRow="0" w:lastRow="0" w:firstColumn="1" w:lastColumn="0" w:oddVBand="0" w:evenVBand="0" w:oddHBand="0" w:evenHBand="0" w:firstRowFirstColumn="0" w:firstRowLastColumn="0" w:lastRowFirstColumn="0" w:lastRowLastColumn="0"/>
-            <w:tcW w:w="371" w:type="pct"/>
-            <w:tcBorders>
-              <w:top w:val="single" w:sz="4" w:space="0" w:color="E59EDC" w:themeColor="accent5" w:themeTint="66"/>
-              <w:left w:val="single" w:sz="4" w:space="0" w:color="E59EDC" w:themeColor="accent5" w:themeTint="66"/>
-              <w:bottom w:val="single" w:sz="4" w:space="0" w:color="E59EDC" w:themeColor="accent5" w:themeTint="66"/>
-              <w:right w:val="single" w:sz="4" w:space="0" w:color="E59EDC" w:themeColor="accent5" w:themeTint="66"/>
-            </w:tcBorders>
-            <w:vAlign w:val="center"/>
-          </w:tcPr>
-          <w:p>
-            <w:pPr>
-              <w:jc w:val="center"/>
-              <w:rPr>
-                <w:rFonts w:ascii="Calibri" w:hAnsi="Calibri" w:cs="Calibri"/>
-              </w:rPr>
-            </w:pPr>
-            <w:r>
-              <w:rPr>
+            <w:tcW w:w="0" w:type="auto"/>
+            <w:hideMark/>
+          </w:tcPr>
+          <w:p>
+            <w:pPr>
+              <w:jc w:val="left"/>
+              <w:rPr>
+                <w:rFonts w:ascii="Calibri" w:hAnsi="Calibri" w:cs="Calibri"/>
+                <w:lang w:val="en-US"/>
+              </w:rPr>
+            </w:pPr>
+            <w:r>
+              <w:rPr>
+                <w:rFonts w:ascii="Calibri" w:hAnsi="Calibri" w:cs="Calibri"/>
                 <w:b/>
                 <w:bCs/>
-                <w:color w:val="1F1F1F"/>
-                <w:bdr w:val="none" w:sz="0" w:space="0" w:color="auto" w:frame="1"/>
-              </w:rPr>
-              <w:t>T5</w:t>
-            </w:r>
-          </w:p>
-        </w:tc>
-        <w:tc>
-          <w:tcPr>
-            <w:tcW w:w="1834" w:type="pct"/>
-            <w:tcBorders>
-              <w:left w:val="single" w:sz="4" w:space="0" w:color="E59EDC" w:themeColor="accent5" w:themeTint="66"/>
-            </w:tcBorders>
-            <w:vAlign w:val="center"/>
-          </w:tcPr>
-          <w:p>
-            <w:pPr>
-              <w:jc w:val="left"/>
-              <w:cnfStyle w:val="000000000000" w:firstRow="0" w:lastRow="0" w:firstColumn="0" w:lastColumn="0" w:oddVBand="0" w:evenVBand="0" w:oddHBand="0" w:evenHBand="0" w:firstRowFirstColumn="0" w:firstRowLastColumn="0" w:lastRowFirstColumn="0" w:lastRowLastColumn="0"/>
-              <w:rPr>
-                <w:rFonts w:ascii="Calibri" w:hAnsi="Calibri" w:cs="Calibri"/>
-              </w:rPr>
-            </w:pPr>
-            <w:r>
-              <w:rPr>
+                <w:lang w:val="en-US"/>
+              </w:rPr>
+              <w:t>T11</w:t>
+            </w:r>
+          </w:p>
+        </w:tc>
+        <w:tc>
+          <w:tcPr>
+            <w:tcW w:w="0" w:type="auto"/>
+            <w:hideMark/>
+          </w:tcPr>
+          <w:p>
+            <w:pPr>
+              <w:jc w:val="left"/>
+              <w:rPr>
+                <w:rFonts w:ascii="Calibri" w:hAnsi="Calibri" w:cs="Calibri"/>
+                <w:lang w:val="en-US"/>
+              </w:rPr>
+            </w:pPr>
+            <w:r>
+              <w:rPr>
+                <w:rFonts w:ascii="Calibri" w:hAnsi="Calibri" w:cs="Calibri"/>
                 <w:b/>
                 <w:bCs/>
-                <w:color w:val="1F1F1F"/>
-                <w:bdr w:val="none" w:sz="0" w:space="0" w:color="auto" w:frame="1"/>
-              </w:rPr>
-              <w:t>Implementation</w:t>
-            </w:r>
-            <w:r>
-              <w:rPr>
-                <w:color w:val="1F1F1F"/>
-                <w:bdr w:val="none" w:sz="0" w:space="0" w:color="auto" w:frame="1"/>
-              </w:rPr>
-              <w:t xml:space="preserve">: Populate </w:t>
+                <w:lang w:val="en-US"/>
+              </w:rPr>
+              <w:t>Security</w:t>
+            </w:r>
+            <w:r>
+              <w:rPr>
+                <w:rFonts w:ascii="Calibri" w:hAnsi="Calibri" w:cs="Calibri"/>
+                <w:lang w:val="en-US"/>
+              </w:rPr>
+              <w:t xml:space="preserve">: Implement </w:t>
             </w:r>
             <w:proofErr w:type="spellStart"/>
             <w:r>
               <w:rPr>
-                <w:rStyle w:val="HTMLCode"/>
-                <w:rFonts w:eastAsiaTheme="majorEastAsia" w:cs="Arial"/>
-                <w:color w:val="444746"/>
-                <w:bdr w:val="none" w:sz="0" w:space="0" w:color="auto" w:frame="1"/>
-              </w:rPr>
-              <w:t>mockData.ts</w:t>
+                <w:rFonts w:ascii="Calibri" w:hAnsi="Calibri" w:cs="Calibri"/>
+                <w:lang w:val="en-US"/>
+              </w:rPr>
+              <w:t>bcryptjs</w:t>
             </w:r>
             <w:proofErr w:type="spellEnd"/>
             <w:r>
               <w:rPr>
-                <w:color w:val="1F1F1F"/>
-                <w:bdr w:val="none" w:sz="0" w:space="0" w:color="auto" w:frame="1"/>
-              </w:rPr>
-              <w:t xml:space="preserve"> with 3NF entities.</w:t>
-            </w:r>
-          </w:p>
-        </w:tc>
-        <w:tc>
-          <w:tcPr>
-            <w:tcW w:w="824" w:type="pct"/>
-            <w:vAlign w:val="center"/>
-          </w:tcPr>
-          <w:p>
-            <w:pPr>
-              <w:jc w:val="center"/>
-              <w:cnfStyle w:val="000000000000" w:firstRow="0" w:lastRow="0" w:firstColumn="0" w:lastColumn="0" w:oddVBand="0" w:evenVBand="0" w:oddHBand="0" w:evenHBand="0" w:firstRowFirstColumn="0" w:firstRowLastColumn="0" w:lastRowFirstColumn="0" w:lastRowLastColumn="0"/>
-              <w:rPr>
-                <w:rFonts w:ascii="Calibri" w:hAnsi="Calibri" w:cs="Calibri"/>
-              </w:rPr>
-            </w:pPr>
-            <w:r>
-              <w:rPr>
-                <w:color w:val="1F1F1F"/>
-                <w:bdr w:val="none" w:sz="0" w:space="0" w:color="auto" w:frame="1"/>
-              </w:rPr>
-              <w:t>All</w:t>
-            </w:r>
-          </w:p>
-        </w:tc>
-        <w:tc>
-          <w:tcPr>
-            <w:tcW w:w="561" w:type="pct"/>
-            <w:vAlign w:val="center"/>
-          </w:tcPr>
-          <w:p>
-            <w:pPr>
-              <w:jc w:val="center"/>
-              <w:cnfStyle w:val="000000000000" w:firstRow="0" w:lastRow="0" w:firstColumn="0" w:lastColumn="0" w:oddVBand="0" w:evenVBand="0" w:oddHBand="0" w:evenHBand="0" w:firstRowFirstColumn="0" w:firstRowLastColumn="0" w:lastRowFirstColumn="0" w:lastRowLastColumn="0"/>
-              <w:rPr>
-                <w:rFonts w:ascii="Calibri" w:hAnsi="Calibri" w:cs="Calibri"/>
-              </w:rPr>
-            </w:pPr>
-            <w:r>
-              <w:rPr>
-                <w:color w:val="1F1F1F"/>
-                <w:bdr w:val="none" w:sz="0" w:space="0" w:color="auto" w:frame="1"/>
-              </w:rPr>
-              <w:t>2</w:t>
-            </w:r>
-          </w:p>
-        </w:tc>
-        <w:tc>
-          <w:tcPr>
-            <w:tcW w:w="593" w:type="pct"/>
-            <w:vAlign w:val="center"/>
-          </w:tcPr>
-          <w:p>
-            <w:pPr>
-              <w:jc w:val="center"/>
-              <w:cnfStyle w:val="000000000000" w:firstRow="0" w:lastRow="0" w:firstColumn="0" w:lastColumn="0" w:oddVBand="0" w:evenVBand="0" w:oddHBand="0" w:evenHBand="0" w:firstRowFirstColumn="0" w:firstRowLastColumn="0" w:lastRowFirstColumn="0" w:lastRowLastColumn="0"/>
-              <w:rPr>
-                <w:rFonts w:ascii="Calibri" w:hAnsi="Calibri" w:cs="Calibri"/>
-              </w:rPr>
-            </w:pPr>
-            <w:r>
-              <w:rPr>
+                <w:rFonts w:ascii="Calibri" w:hAnsi="Calibri" w:cs="Calibri"/>
+                <w:lang w:val="en-US"/>
+              </w:rPr>
+              <w:t xml:space="preserve"> hashing for </w:t>
+            </w:r>
+            <w:proofErr w:type="spellStart"/>
+            <w:r>
+              <w:rPr>
+                <w:rFonts w:ascii="Calibri" w:hAnsi="Calibri" w:cs="Calibri"/>
+                <w:lang w:val="en-US"/>
+              </w:rPr>
+              <w:t>password_hash</w:t>
+            </w:r>
+            <w:proofErr w:type="spellEnd"/>
+            <w:r>
+              <w:rPr>
+                <w:rFonts w:ascii="Calibri" w:hAnsi="Calibri" w:cs="Calibri"/>
+                <w:lang w:val="en-US"/>
+              </w:rPr>
+              <w:t>.</w:t>
+            </w:r>
+          </w:p>
+        </w:tc>
+        <w:tc>
+          <w:tcPr>
+            <w:tcW w:w="0" w:type="auto"/>
+            <w:hideMark/>
+          </w:tcPr>
+          <w:p>
+            <w:pPr>
+              <w:jc w:val="left"/>
+              <w:rPr>
+                <w:rFonts w:ascii="Calibri" w:hAnsi="Calibri" w:cs="Calibri"/>
+                <w:lang w:val="en-US"/>
+              </w:rPr>
+            </w:pPr>
+            <w:r>
+              <w:rPr>
+                <w:rFonts w:ascii="Calibri" w:hAnsi="Calibri" w:cs="Calibri"/>
+                <w:lang w:val="en-US"/>
+              </w:rPr>
+              <w:t>Story 01</w:t>
+            </w:r>
+          </w:p>
+        </w:tc>
+        <w:tc>
+          <w:tcPr>
+            <w:tcW w:w="0" w:type="auto"/>
+            <w:hideMark/>
+          </w:tcPr>
+          <w:p>
+            <w:pPr>
+              <w:jc w:val="left"/>
+              <w:rPr>
+                <w:rFonts w:ascii="Calibri" w:hAnsi="Calibri" w:cs="Calibri"/>
+                <w:lang w:val="en-US"/>
+              </w:rPr>
+            </w:pPr>
+            <w:r>
+              <w:rPr>
+                <w:rFonts w:ascii="Calibri" w:hAnsi="Calibri" w:cs="Calibri"/>
+                <w:lang w:val="en-US"/>
+              </w:rPr>
+              <w:t>3</w:t>
+            </w:r>
+          </w:p>
+        </w:tc>
+        <w:tc>
+          <w:tcPr>
+            <w:tcW w:w="0" w:type="auto"/>
+            <w:hideMark/>
+          </w:tcPr>
+          <w:p>
+            <w:pPr>
+              <w:jc w:val="left"/>
+              <w:rPr>
+                <w:rFonts w:ascii="Calibri" w:hAnsi="Calibri" w:cs="Calibri"/>
+                <w:lang w:val="en-US"/>
+              </w:rPr>
+            </w:pPr>
+            <w:r>
+              <w:rPr>
+                <w:rFonts w:ascii="Calibri" w:hAnsi="Calibri" w:cs="Calibri"/>
                 <w:b/>
                 <w:bCs/>
-                <w:color w:val="1F1F1F"/>
-                <w:bdr w:val="none" w:sz="0" w:space="0" w:color="auto" w:frame="1"/>
+                <w:lang w:val="en-US"/>
               </w:rPr>
               <w:t>Complete</w:t>
             </w:r>
@@ -1437,204 +1495,194 @@
         </w:tc>
         <w:tc>
           <w:tcPr>
-            <w:tcW w:w="816" w:type="pct"/>
-            <w:vAlign w:val="center"/>
-          </w:tcPr>
-          <w:p>
-            <w:pPr>
-              <w:jc w:val="center"/>
-              <w:cnfStyle w:val="000000000000" w:firstRow="0" w:lastRow="0" w:firstColumn="0" w:lastColumn="0" w:oddVBand="0" w:evenVBand="0" w:oddHBand="0" w:evenHBand="0" w:firstRowFirstColumn="0" w:firstRowLastColumn="0" w:lastRowFirstColumn="0" w:lastRowLastColumn="0"/>
-              <w:rPr>
-                <w:rFonts w:ascii="Calibri" w:hAnsi="Calibri" w:cs="Calibri"/>
-                <w:lang w:val="en-US"/>
-              </w:rPr>
-            </w:pPr>
-            <w:r>
-              <w:rPr>
-                <w:rStyle w:val="citation-4984"/>
-                <w:color w:val="1F1F1F"/>
-                <w:bdr w:val="none" w:sz="0" w:space="0" w:color="auto" w:frame="1"/>
-              </w:rPr>
-              <w:t>Maps LDM to code</w:t>
-            </w:r>
-            <w:r>
-              <w:rPr>
-                <w:color w:val="1F1F1F"/>
-                <w:bdr w:val="none" w:sz="0" w:space="0" w:color="auto" w:frame="1"/>
-              </w:rPr>
-              <w:t>.</w:t>
+            <w:tcW w:w="0" w:type="auto"/>
+            <w:hideMark/>
+          </w:tcPr>
+          <w:p>
+            <w:pPr>
+              <w:jc w:val="left"/>
+              <w:rPr>
+                <w:rFonts w:ascii="Calibri" w:hAnsi="Calibri" w:cs="Calibri"/>
+                <w:lang w:val="en-US"/>
+              </w:rPr>
+            </w:pPr>
+            <w:r>
+              <w:rPr>
+                <w:rFonts w:ascii="Calibri" w:hAnsi="Calibri" w:cs="Calibri"/>
+                <w:lang w:val="en-US"/>
+              </w:rPr>
+              <w:t xml:space="preserve">Fulfills </w:t>
+            </w:r>
+            <w:r>
+              <w:rPr>
+                <w:rFonts w:ascii="Calibri" w:hAnsi="Calibri" w:cs="Calibri"/>
+                <w:b/>
+                <w:bCs/>
+                <w:lang w:val="en-US"/>
+              </w:rPr>
+              <w:t>NFR1 (Security)</w:t>
+            </w:r>
+            <w:r>
+              <w:rPr>
+                <w:rFonts w:ascii="Calibri" w:hAnsi="Calibri" w:cs="Calibri"/>
+                <w:lang w:val="en-US"/>
+              </w:rPr>
+              <w:t xml:space="preserve"> and </w:t>
+            </w:r>
+            <w:r>
+              <w:rPr>
+                <w:rFonts w:ascii="Calibri" w:hAnsi="Calibri" w:cs="Calibri"/>
+                <w:b/>
+                <w:bCs/>
+                <w:lang w:val="en-US"/>
+              </w:rPr>
+              <w:t>PSD</w:t>
+            </w:r>
+            <w:r>
+              <w:rPr>
+                <w:rFonts w:ascii="Calibri" w:hAnsi="Calibri" w:cs="Calibri"/>
+                <w:lang w:val="en-US"/>
+              </w:rPr>
+              <w:t xml:space="preserve"> commitments.</w:t>
             </w:r>
           </w:p>
         </w:tc>
       </w:tr>
       <w:tr>
-        <w:trPr>
-          <w:cnfStyle w:val="000000100000" w:firstRow="0" w:lastRow="0" w:firstColumn="0" w:lastColumn="0" w:oddVBand="0" w:evenVBand="0" w:oddHBand="1" w:evenHBand="0" w:firstRowFirstColumn="0" w:firstRowLastColumn="0" w:lastRowFirstColumn="0" w:lastRowLastColumn="0"/>
-        </w:trPr>
-        <w:tc>
-          <w:tcPr>
-            <w:cnfStyle w:val="001000000000" w:firstRow="0" w:lastRow="0" w:firstColumn="1" w:lastColumn="0" w:oddVBand="0" w:evenVBand="0" w:oddHBand="0" w:evenHBand="0" w:firstRowFirstColumn="0" w:firstRowLastColumn="0" w:lastRowFirstColumn="0" w:lastRowLastColumn="0"/>
-            <w:tcW w:w="371" w:type="pct"/>
-            <w:tcBorders>
-              <w:top w:val="single" w:sz="4" w:space="0" w:color="E59EDC" w:themeColor="accent5" w:themeTint="66"/>
-              <w:left w:val="single" w:sz="4" w:space="0" w:color="E59EDC" w:themeColor="accent5" w:themeTint="66"/>
-              <w:bottom w:val="single" w:sz="4" w:space="0" w:color="E59EDC" w:themeColor="accent5" w:themeTint="66"/>
-              <w:right w:val="single" w:sz="4" w:space="0" w:color="E59EDC" w:themeColor="accent5" w:themeTint="66"/>
-            </w:tcBorders>
-            <w:shd w:val="clear" w:color="auto" w:fill="F2CEED" w:themeFill="accent5" w:themeFillTint="33"/>
-            <w:vAlign w:val="center"/>
-          </w:tcPr>
-          <w:p>
-            <w:pPr>
-              <w:jc w:val="center"/>
-              <w:rPr>
-                <w:rFonts w:ascii="Calibri" w:hAnsi="Calibri" w:cs="Calibri"/>
-              </w:rPr>
-            </w:pPr>
-            <w:r>
-              <w:rPr>
+        <w:tc>
+          <w:tcPr>
+            <w:tcW w:w="0" w:type="auto"/>
+            <w:hideMark/>
+          </w:tcPr>
+          <w:p>
+            <w:pPr>
+              <w:jc w:val="left"/>
+              <w:rPr>
+                <w:rFonts w:ascii="Calibri" w:hAnsi="Calibri" w:cs="Calibri"/>
+                <w:lang w:val="en-US"/>
+              </w:rPr>
+            </w:pPr>
+            <w:r>
+              <w:rPr>
+                <w:rFonts w:ascii="Calibri" w:hAnsi="Calibri" w:cs="Calibri"/>
                 <w:b/>
                 <w:bCs/>
-                <w:color w:val="1F1F1F"/>
-                <w:bdr w:val="none" w:sz="0" w:space="0" w:color="auto" w:frame="1"/>
-              </w:rPr>
-              <w:t>T11</w:t>
-            </w:r>
-          </w:p>
-        </w:tc>
-        <w:tc>
-          <w:tcPr>
-            <w:tcW w:w="1834" w:type="pct"/>
-            <w:tcBorders>
-              <w:left w:val="single" w:sz="4" w:space="0" w:color="E59EDC" w:themeColor="accent5" w:themeTint="66"/>
-            </w:tcBorders>
-            <w:vAlign w:val="center"/>
-          </w:tcPr>
-          <w:p>
-            <w:pPr>
-              <w:jc w:val="left"/>
-              <w:cnfStyle w:val="000000100000" w:firstRow="0" w:lastRow="0" w:firstColumn="0" w:lastColumn="0" w:oddVBand="0" w:evenVBand="0" w:oddHBand="1" w:evenHBand="0" w:firstRowFirstColumn="0" w:firstRowLastColumn="0" w:lastRowFirstColumn="0" w:lastRowLastColumn="0"/>
-              <w:rPr>
-                <w:rFonts w:ascii="Calibri" w:hAnsi="Calibri" w:cs="Calibri"/>
-              </w:rPr>
-            </w:pPr>
-            <w:r>
-              <w:rPr>
+                <w:lang w:val="en-US"/>
+              </w:rPr>
+              <w:t>T8</w:t>
+            </w:r>
+          </w:p>
+        </w:tc>
+        <w:tc>
+          <w:tcPr>
+            <w:tcW w:w="0" w:type="auto"/>
+            <w:hideMark/>
+          </w:tcPr>
+          <w:p>
+            <w:pPr>
+              <w:jc w:val="left"/>
+              <w:rPr>
+                <w:rFonts w:ascii="Calibri" w:hAnsi="Calibri" w:cs="Calibri"/>
+                <w:lang w:val="en-US"/>
+              </w:rPr>
+            </w:pPr>
+            <w:r>
+              <w:rPr>
+                <w:rFonts w:ascii="Calibri" w:hAnsi="Calibri" w:cs="Calibri"/>
                 <w:b/>
                 <w:bCs/>
-                <w:color w:val="1F1F1F"/>
-                <w:bdr w:val="none" w:sz="0" w:space="0" w:color="auto" w:frame="1"/>
-              </w:rPr>
-              <w:t>Security</w:t>
-            </w:r>
-            <w:r>
-              <w:rPr>
-                <w:color w:val="1F1F1F"/>
-                <w:bdr w:val="none" w:sz="0" w:space="0" w:color="auto" w:frame="1"/>
-              </w:rPr>
-              <w:t xml:space="preserve">: Implement </w:t>
-            </w:r>
-            <w:proofErr w:type="spellStart"/>
-            <w:r>
-              <w:rPr>
-                <w:rStyle w:val="HTMLCode"/>
-                <w:rFonts w:eastAsiaTheme="majorEastAsia" w:cs="Arial"/>
-                <w:color w:val="444746"/>
-                <w:bdr w:val="none" w:sz="0" w:space="0" w:color="auto" w:frame="1"/>
-              </w:rPr>
-              <w:t>bcryptjs</w:t>
-            </w:r>
-            <w:proofErr w:type="spellEnd"/>
-            <w:r>
-              <w:rPr>
-                <w:color w:val="1F1F1F"/>
-                <w:bdr w:val="none" w:sz="0" w:space="0" w:color="auto" w:frame="1"/>
-              </w:rPr>
-              <w:t xml:space="preserve"> hashing for </w:t>
-            </w:r>
-            <w:proofErr w:type="spellStart"/>
-            <w:r>
-              <w:rPr>
-                <w:rStyle w:val="HTMLCode"/>
-                <w:rFonts w:eastAsiaTheme="majorEastAsia" w:cs="Arial"/>
-                <w:color w:val="444746"/>
-                <w:bdr w:val="none" w:sz="0" w:space="0" w:color="auto" w:frame="1"/>
-              </w:rPr>
-              <w:t>password_hash</w:t>
-            </w:r>
-            <w:proofErr w:type="spellEnd"/>
-            <w:r>
-              <w:rPr>
-                <w:color w:val="1F1F1F"/>
-                <w:bdr w:val="none" w:sz="0" w:space="0" w:color="auto" w:frame="1"/>
-              </w:rPr>
-              <w:t>.</w:t>
-            </w:r>
-          </w:p>
-        </w:tc>
-        <w:tc>
-          <w:tcPr>
-            <w:tcW w:w="824" w:type="pct"/>
-            <w:vAlign w:val="center"/>
-          </w:tcPr>
-          <w:p>
-            <w:pPr>
-              <w:jc w:val="center"/>
-              <w:cnfStyle w:val="000000100000" w:firstRow="0" w:lastRow="0" w:firstColumn="0" w:lastColumn="0" w:oddVBand="0" w:evenVBand="0" w:oddHBand="1" w:evenHBand="0" w:firstRowFirstColumn="0" w:firstRowLastColumn="0" w:lastRowFirstColumn="0" w:lastRowLastColumn="0"/>
-              <w:rPr>
-                <w:rFonts w:ascii="Calibri" w:hAnsi="Calibri" w:cs="Calibri"/>
-              </w:rPr>
-            </w:pPr>
-            <w:r>
-              <w:rPr>
-                <w:color w:val="1F1F1F"/>
-                <w:bdr w:val="none" w:sz="0" w:space="0" w:color="auto" w:frame="1"/>
-              </w:rPr>
-              <w:t>Story 01</w:t>
-            </w:r>
-          </w:p>
-        </w:tc>
-        <w:tc>
-          <w:tcPr>
-            <w:tcW w:w="561" w:type="pct"/>
-            <w:vAlign w:val="center"/>
-          </w:tcPr>
-          <w:p>
-            <w:pPr>
-              <w:jc w:val="center"/>
-              <w:cnfStyle w:val="000000100000" w:firstRow="0" w:lastRow="0" w:firstColumn="0" w:lastColumn="0" w:oddVBand="0" w:evenVBand="0" w:oddHBand="1" w:evenHBand="0" w:firstRowFirstColumn="0" w:firstRowLastColumn="0" w:lastRowFirstColumn="0" w:lastRowLastColumn="0"/>
-              <w:rPr>
-                <w:rFonts w:ascii="Calibri" w:hAnsi="Calibri" w:cs="Calibri"/>
-              </w:rPr>
-            </w:pPr>
-            <w:r>
-              <w:rPr>
-                <w:color w:val="1F1F1F"/>
-                <w:bdr w:val="none" w:sz="0" w:space="0" w:color="auto" w:frame="1"/>
-              </w:rPr>
-              <w:t>3</w:t>
-            </w:r>
-          </w:p>
-        </w:tc>
-        <w:tc>
-          <w:tcPr>
-            <w:tcW w:w="593" w:type="pct"/>
-            <w:vAlign w:val="center"/>
-          </w:tcPr>
-          <w:p>
-            <w:pPr>
-              <w:jc w:val="center"/>
-              <w:cnfStyle w:val="000000100000" w:firstRow="0" w:lastRow="0" w:firstColumn="0" w:lastColumn="0" w:oddVBand="0" w:evenVBand="0" w:oddHBand="1" w:evenHBand="0" w:firstRowFirstColumn="0" w:firstRowLastColumn="0" w:lastRowFirstColumn="0" w:lastRowLastColumn="0"/>
-              <w:rPr>
-                <w:rFonts w:ascii="Calibri" w:hAnsi="Calibri" w:cs="Calibri"/>
-              </w:rPr>
-            </w:pPr>
-            <w:r>
-              <w:rPr>
+                <w:lang w:val="en-US"/>
+              </w:rPr>
+              <w:t>TDD</w:t>
+            </w:r>
+            <w:r>
+              <w:rPr>
+                <w:rFonts w:ascii="Calibri" w:hAnsi="Calibri" w:cs="Calibri"/>
+                <w:lang w:val="en-US"/>
+              </w:rPr>
+              <w:t xml:space="preserve">: Write Unit Tests for Login logic using the </w:t>
+            </w:r>
+            <w:r>
+              <w:rPr>
+                <w:rFonts w:ascii="Calibri" w:hAnsi="Calibri" w:cs="Calibri"/>
                 <w:b/>
                 <w:bCs/>
-                <w:color w:val="1F1F1F"/>
-                <w:bdr w:val="none" w:sz="0" w:space="0" w:color="auto" w:frame="1"/>
+                <w:lang w:val="en-US"/>
+              </w:rPr>
+              <w:t>AAA pattern</w:t>
+            </w:r>
+            <w:r>
+              <w:rPr>
+                <w:rFonts w:ascii="Calibri" w:hAnsi="Calibri" w:cs="Calibri"/>
+                <w:lang w:val="en-US"/>
+              </w:rPr>
+              <w:t>.</w:t>
+            </w:r>
+          </w:p>
+        </w:tc>
+        <w:tc>
+          <w:tcPr>
+            <w:tcW w:w="0" w:type="auto"/>
+            <w:hideMark/>
+          </w:tcPr>
+          <w:p>
+            <w:pPr>
+              <w:jc w:val="left"/>
+              <w:rPr>
+                <w:rFonts w:ascii="Calibri" w:hAnsi="Calibri" w:cs="Calibri"/>
+                <w:lang w:val="en-US"/>
+              </w:rPr>
+            </w:pPr>
+            <w:r>
+              <w:rPr>
+                <w:rFonts w:ascii="Calibri" w:hAnsi="Calibri" w:cs="Calibri"/>
+                <w:lang w:val="en-US"/>
+              </w:rPr>
+              <w:t>Story 01</w:t>
+            </w:r>
+          </w:p>
+        </w:tc>
+        <w:tc>
+          <w:tcPr>
+            <w:tcW w:w="0" w:type="auto"/>
+            <w:hideMark/>
+          </w:tcPr>
+          <w:p>
+            <w:pPr>
+              <w:jc w:val="left"/>
+              <w:rPr>
+                <w:rFonts w:ascii="Calibri" w:hAnsi="Calibri" w:cs="Calibri"/>
+                <w:lang w:val="en-US"/>
+              </w:rPr>
+            </w:pPr>
+            <w:r>
+              <w:rPr>
+                <w:rFonts w:ascii="Calibri" w:hAnsi="Calibri" w:cs="Calibri"/>
+                <w:lang w:val="en-US"/>
+              </w:rPr>
+              <w:t>3</w:t>
+            </w:r>
+          </w:p>
+        </w:tc>
+        <w:tc>
+          <w:tcPr>
+            <w:tcW w:w="0" w:type="auto"/>
+            <w:hideMark/>
+          </w:tcPr>
+          <w:p>
+            <w:pPr>
+              <w:jc w:val="left"/>
+              <w:rPr>
+                <w:rFonts w:ascii="Calibri" w:hAnsi="Calibri" w:cs="Calibri"/>
+                <w:lang w:val="en-US"/>
+              </w:rPr>
+            </w:pPr>
+            <w:r>
+              <w:rPr>
+                <w:rFonts w:ascii="Calibri" w:hAnsi="Calibri" w:cs="Calibri"/>
+                <w:b/>
+                <w:bCs/>
+                <w:lang w:val="en-US"/>
               </w:rPr>
               <w:t>Complete</w:t>
             </w:r>
@@ -1642,42 +1690,23 @@
         </w:tc>
         <w:tc>
           <w:tcPr>
-            <w:tcW w:w="816" w:type="pct"/>
-            <w:vAlign w:val="center"/>
-          </w:tcPr>
-          <w:p>
-            <w:pPr>
-              <w:jc w:val="center"/>
-              <w:cnfStyle w:val="000000100000" w:firstRow="0" w:lastRow="0" w:firstColumn="0" w:lastColumn="0" w:oddVBand="0" w:evenVBand="0" w:oddHBand="1" w:evenHBand="0" w:firstRowFirstColumn="0" w:firstRowLastColumn="0" w:lastRowFirstColumn="0" w:lastRowLastColumn="0"/>
-              <w:rPr>
-                <w:rFonts w:ascii="Calibri" w:hAnsi="Calibri" w:cs="Calibri"/>
-                <w:lang w:val="en-US"/>
-              </w:rPr>
-            </w:pPr>
-            <w:proofErr w:type="spellStart"/>
-            <w:r>
-              <w:rPr>
-                <w:rStyle w:val="citation-4983"/>
-                <w:color w:val="1F1F1F"/>
-                <w:bdr w:val="none" w:sz="0" w:space="0" w:color="auto" w:frame="1"/>
-              </w:rPr>
-              <w:t>Fulfills</w:t>
-            </w:r>
-            <w:proofErr w:type="spellEnd"/>
-            <w:r>
-              <w:rPr>
-                <w:rStyle w:val="citation-4983"/>
-                <w:color w:val="1F1F1F"/>
-                <w:bdr w:val="none" w:sz="0" w:space="0" w:color="auto" w:frame="1"/>
-              </w:rPr>
-              <w:t xml:space="preserve"> NFR1 &amp; LDM</w:t>
-            </w:r>
-            <w:r>
-              <w:rPr>
-                <w:color w:val="1F1F1F"/>
-                <w:bdr w:val="none" w:sz="0" w:space="0" w:color="auto" w:frame="1"/>
-              </w:rPr>
-              <w:t>.</w:t>
+            <w:tcW w:w="0" w:type="auto"/>
+            <w:hideMark/>
+          </w:tcPr>
+          <w:p>
+            <w:pPr>
+              <w:jc w:val="left"/>
+              <w:rPr>
+                <w:rFonts w:ascii="Calibri" w:hAnsi="Calibri" w:cs="Calibri"/>
+                <w:lang w:val="en-US"/>
+              </w:rPr>
+            </w:pPr>
+            <w:r>
+              <w:rPr>
+                <w:rFonts w:ascii="Calibri" w:hAnsi="Calibri" w:cs="Calibri"/>
+                <w:lang w:val="en-US"/>
+              </w:rPr>
+              <w:t>Proves 100% pass rate on core functional tests.</w:t>
             </w:r>
           </w:p>
         </w:tc>
@@ -1685,361 +1714,357 @@
       <w:tr>
         <w:tc>
           <w:tcPr>
-            <w:cnfStyle w:val="001000000000" w:firstRow="0" w:lastRow="0" w:firstColumn="1" w:lastColumn="0" w:oddVBand="0" w:evenVBand="0" w:oddHBand="0" w:evenHBand="0" w:firstRowFirstColumn="0" w:firstRowLastColumn="0" w:lastRowFirstColumn="0" w:lastRowLastColumn="0"/>
-            <w:tcW w:w="371" w:type="pct"/>
-            <w:tcBorders>
-              <w:top w:val="single" w:sz="4" w:space="0" w:color="E59EDC" w:themeColor="accent5" w:themeTint="66"/>
-              <w:left w:val="single" w:sz="4" w:space="0" w:color="E59EDC" w:themeColor="accent5" w:themeTint="66"/>
-              <w:bottom w:val="single" w:sz="4" w:space="0" w:color="E59EDC" w:themeColor="accent5" w:themeTint="66"/>
-              <w:right w:val="single" w:sz="4" w:space="0" w:color="E59EDC" w:themeColor="accent5" w:themeTint="66"/>
-            </w:tcBorders>
-            <w:vAlign w:val="center"/>
-          </w:tcPr>
-          <w:p>
-            <w:pPr>
-              <w:jc w:val="center"/>
-              <w:rPr>
-                <w:rFonts w:ascii="Calibri" w:hAnsi="Calibri" w:cs="Calibri"/>
-              </w:rPr>
-            </w:pPr>
-            <w:r>
-              <w:rPr>
+            <w:tcW w:w="0" w:type="auto"/>
+            <w:hideMark/>
+          </w:tcPr>
+          <w:p>
+            <w:pPr>
+              <w:jc w:val="left"/>
+              <w:rPr>
+                <w:rFonts w:ascii="Calibri" w:hAnsi="Calibri" w:cs="Calibri"/>
+                <w:lang w:val="en-US"/>
+              </w:rPr>
+            </w:pPr>
+            <w:r>
+              <w:rPr>
+                <w:rFonts w:ascii="Calibri" w:hAnsi="Calibri" w:cs="Calibri"/>
                 <w:b/>
                 <w:bCs/>
-                <w:color w:val="1F1F1F"/>
-                <w:bdr w:val="none" w:sz="0" w:space="0" w:color="auto" w:frame="1"/>
-              </w:rPr>
-              <w:t>T8</w:t>
-            </w:r>
-          </w:p>
-        </w:tc>
-        <w:tc>
-          <w:tcPr>
-            <w:tcW w:w="1834" w:type="pct"/>
-            <w:tcBorders>
-              <w:left w:val="single" w:sz="4" w:space="0" w:color="E59EDC" w:themeColor="accent5" w:themeTint="66"/>
-            </w:tcBorders>
-            <w:vAlign w:val="center"/>
-          </w:tcPr>
-          <w:p>
-            <w:pPr>
-              <w:jc w:val="left"/>
-              <w:cnfStyle w:val="000000000000" w:firstRow="0" w:lastRow="0" w:firstColumn="0" w:lastColumn="0" w:oddVBand="0" w:evenVBand="0" w:oddHBand="0" w:evenHBand="0" w:firstRowFirstColumn="0" w:firstRowLastColumn="0" w:lastRowFirstColumn="0" w:lastRowLastColumn="0"/>
-              <w:rPr>
-                <w:rFonts w:ascii="Calibri" w:hAnsi="Calibri" w:cs="Calibri"/>
-              </w:rPr>
-            </w:pPr>
-            <w:r>
-              <w:rPr>
+                <w:lang w:val="en-US"/>
+              </w:rPr>
+              <w:t>T6</w:t>
+            </w:r>
+          </w:p>
+        </w:tc>
+        <w:tc>
+          <w:tcPr>
+            <w:tcW w:w="0" w:type="auto"/>
+            <w:hideMark/>
+          </w:tcPr>
+          <w:p>
+            <w:pPr>
+              <w:jc w:val="left"/>
+              <w:rPr>
+                <w:rFonts w:ascii="Calibri" w:hAnsi="Calibri" w:cs="Calibri"/>
+                <w:lang w:val="en-US"/>
+              </w:rPr>
+            </w:pPr>
+            <w:r>
+              <w:rPr>
+                <w:rFonts w:ascii="Calibri" w:hAnsi="Calibri" w:cs="Calibri"/>
                 <w:b/>
                 <w:bCs/>
-                <w:color w:val="1F1F1F"/>
-                <w:bdr w:val="none" w:sz="0" w:space="0" w:color="auto" w:frame="1"/>
-              </w:rPr>
-              <w:t>TDD</w:t>
-            </w:r>
-            <w:r>
-              <w:rPr>
-                <w:color w:val="1F1F1F"/>
-                <w:bdr w:val="none" w:sz="0" w:space="0" w:color="auto" w:frame="1"/>
-              </w:rPr>
-              <w:t xml:space="preserve">: Write Unit Tests using the </w:t>
-            </w:r>
-            <w:r>
-              <w:rPr>
+                <w:lang w:val="en-US"/>
+              </w:rPr>
+              <w:t>Security</w:t>
+            </w:r>
+            <w:r>
+              <w:rPr>
+                <w:rFonts w:ascii="Calibri" w:hAnsi="Calibri" w:cs="Calibri"/>
+                <w:lang w:val="en-US"/>
+              </w:rPr>
+              <w:t xml:space="preserve">: Build </w:t>
+            </w:r>
+            <w:proofErr w:type="spellStart"/>
+            <w:r>
+              <w:rPr>
+                <w:rFonts w:ascii="Calibri" w:hAnsi="Calibri" w:cs="Calibri"/>
+                <w:lang w:val="en-US"/>
+              </w:rPr>
+              <w:t>hooks.server.ts</w:t>
+            </w:r>
+            <w:proofErr w:type="spellEnd"/>
+            <w:r>
+              <w:rPr>
+                <w:rFonts w:ascii="Calibri" w:hAnsi="Calibri" w:cs="Calibri"/>
+                <w:lang w:val="en-US"/>
+              </w:rPr>
+              <w:t xml:space="preserve"> and +</w:t>
+            </w:r>
+            <w:proofErr w:type="spellStart"/>
+            <w:r>
+              <w:rPr>
+                <w:rFonts w:ascii="Calibri" w:hAnsi="Calibri" w:cs="Calibri"/>
+                <w:lang w:val="en-US"/>
+              </w:rPr>
+              <w:t>page.server.ts</w:t>
+            </w:r>
+            <w:proofErr w:type="spellEnd"/>
+            <w:r>
+              <w:rPr>
+                <w:rFonts w:ascii="Calibri" w:hAnsi="Calibri" w:cs="Calibri"/>
+                <w:lang w:val="en-US"/>
+              </w:rPr>
+              <w:t xml:space="preserve"> for auth.</w:t>
+            </w:r>
+          </w:p>
+        </w:tc>
+        <w:tc>
+          <w:tcPr>
+            <w:tcW w:w="0" w:type="auto"/>
+            <w:hideMark/>
+          </w:tcPr>
+          <w:p>
+            <w:pPr>
+              <w:jc w:val="left"/>
+              <w:rPr>
+                <w:rFonts w:ascii="Calibri" w:hAnsi="Calibri" w:cs="Calibri"/>
+                <w:lang w:val="en-US"/>
+              </w:rPr>
+            </w:pPr>
+            <w:r>
+              <w:rPr>
+                <w:rFonts w:ascii="Calibri" w:hAnsi="Calibri" w:cs="Calibri"/>
+                <w:lang w:val="en-US"/>
+              </w:rPr>
+              <w:t>Story 01</w:t>
+            </w:r>
+          </w:p>
+        </w:tc>
+        <w:tc>
+          <w:tcPr>
+            <w:tcW w:w="0" w:type="auto"/>
+            <w:hideMark/>
+          </w:tcPr>
+          <w:p>
+            <w:pPr>
+              <w:jc w:val="left"/>
+              <w:rPr>
+                <w:rFonts w:ascii="Calibri" w:hAnsi="Calibri" w:cs="Calibri"/>
+                <w:lang w:val="en-US"/>
+              </w:rPr>
+            </w:pPr>
+            <w:r>
+              <w:rPr>
+                <w:rFonts w:ascii="Calibri" w:hAnsi="Calibri" w:cs="Calibri"/>
+                <w:lang w:val="en-US"/>
+              </w:rPr>
+              <w:t>3</w:t>
+            </w:r>
+          </w:p>
+        </w:tc>
+        <w:tc>
+          <w:tcPr>
+            <w:tcW w:w="0" w:type="auto"/>
+            <w:hideMark/>
+          </w:tcPr>
+          <w:p>
+            <w:pPr>
+              <w:jc w:val="left"/>
+              <w:rPr>
+                <w:rFonts w:ascii="Calibri" w:hAnsi="Calibri" w:cs="Calibri"/>
+                <w:lang w:val="en-US"/>
+              </w:rPr>
+            </w:pPr>
+            <w:r>
+              <w:rPr>
+                <w:rFonts w:ascii="Calibri" w:hAnsi="Calibri" w:cs="Calibri"/>
                 <w:b/>
                 <w:bCs/>
-                <w:color w:val="1F1F1F"/>
-                <w:bdr w:val="none" w:sz="0" w:space="0" w:color="auto" w:frame="1"/>
-              </w:rPr>
-              <w:t>AAA pattern</w:t>
-            </w:r>
-            <w:r>
-              <w:rPr>
-                <w:color w:val="1F1F1F"/>
-                <w:bdr w:val="none" w:sz="0" w:space="0" w:color="auto" w:frame="1"/>
-              </w:rPr>
-              <w:t>.</w:t>
-            </w:r>
-          </w:p>
-        </w:tc>
-        <w:tc>
-          <w:tcPr>
-            <w:tcW w:w="824" w:type="pct"/>
-            <w:vAlign w:val="center"/>
-          </w:tcPr>
-          <w:p>
-            <w:pPr>
-              <w:jc w:val="center"/>
-              <w:cnfStyle w:val="000000000000" w:firstRow="0" w:lastRow="0" w:firstColumn="0" w:lastColumn="0" w:oddVBand="0" w:evenVBand="0" w:oddHBand="0" w:evenHBand="0" w:firstRowFirstColumn="0" w:firstRowLastColumn="0" w:lastRowFirstColumn="0" w:lastRowLastColumn="0"/>
-              <w:rPr>
-                <w:rFonts w:ascii="Calibri" w:hAnsi="Calibri" w:cs="Calibri"/>
-              </w:rPr>
-            </w:pPr>
-            <w:r>
-              <w:rPr>
-                <w:color w:val="1F1F1F"/>
-                <w:bdr w:val="none" w:sz="0" w:space="0" w:color="auto" w:frame="1"/>
-              </w:rPr>
-              <w:t>Story 01</w:t>
-            </w:r>
-          </w:p>
-        </w:tc>
-        <w:tc>
-          <w:tcPr>
-            <w:tcW w:w="561" w:type="pct"/>
-            <w:vAlign w:val="center"/>
-          </w:tcPr>
-          <w:p>
-            <w:pPr>
-              <w:jc w:val="center"/>
-              <w:cnfStyle w:val="000000000000" w:firstRow="0" w:lastRow="0" w:firstColumn="0" w:lastColumn="0" w:oddVBand="0" w:evenVBand="0" w:oddHBand="0" w:evenHBand="0" w:firstRowFirstColumn="0" w:firstRowLastColumn="0" w:lastRowFirstColumn="0" w:lastRowLastColumn="0"/>
-              <w:rPr>
-                <w:rFonts w:ascii="Calibri" w:hAnsi="Calibri" w:cs="Calibri"/>
-              </w:rPr>
-            </w:pPr>
-            <w:r>
-              <w:rPr>
-                <w:color w:val="1F1F1F"/>
-                <w:bdr w:val="none" w:sz="0" w:space="0" w:color="auto" w:frame="1"/>
-              </w:rPr>
-              <w:t>3</w:t>
-            </w:r>
-          </w:p>
-        </w:tc>
-        <w:tc>
-          <w:tcPr>
-            <w:tcW w:w="593" w:type="pct"/>
-            <w:vAlign w:val="center"/>
-          </w:tcPr>
-          <w:p>
-            <w:pPr>
-              <w:jc w:val="center"/>
-              <w:cnfStyle w:val="000000000000" w:firstRow="0" w:lastRow="0" w:firstColumn="0" w:lastColumn="0" w:oddVBand="0" w:evenVBand="0" w:oddHBand="0" w:evenHBand="0" w:firstRowFirstColumn="0" w:firstRowLastColumn="0" w:lastRowFirstColumn="0" w:lastRowLastColumn="0"/>
-              <w:rPr>
-                <w:rFonts w:ascii="Calibri" w:hAnsi="Calibri" w:cs="Calibri"/>
-              </w:rPr>
-            </w:pPr>
-            <w:r>
-              <w:rPr>
+                <w:lang w:val="en-US"/>
+              </w:rPr>
+              <w:t>Complete</w:t>
+            </w:r>
+          </w:p>
+        </w:tc>
+        <w:tc>
+          <w:tcPr>
+            <w:tcW w:w="0" w:type="auto"/>
+            <w:hideMark/>
+          </w:tcPr>
+          <w:p>
+            <w:pPr>
+              <w:jc w:val="left"/>
+              <w:rPr>
+                <w:rFonts w:ascii="Calibri" w:hAnsi="Calibri" w:cs="Calibri"/>
+                <w:lang w:val="en-US"/>
+              </w:rPr>
+            </w:pPr>
+            <w:r>
+              <w:rPr>
+                <w:rFonts w:ascii="Calibri" w:hAnsi="Calibri" w:cs="Calibri"/>
+                <w:lang w:val="en-US"/>
+              </w:rPr>
+              <w:t xml:space="preserve">Implements </w:t>
+            </w:r>
+            <w:r>
+              <w:rPr>
+                <w:rFonts w:ascii="Calibri" w:hAnsi="Calibri" w:cs="Calibri"/>
                 <w:b/>
                 <w:bCs/>
-                <w:color w:val="1F1F1F"/>
-                <w:bdr w:val="none" w:sz="0" w:space="0" w:color="auto" w:frame="1"/>
-              </w:rPr>
-              <w:t>Complete</w:t>
-            </w:r>
-          </w:p>
-        </w:tc>
-        <w:tc>
-          <w:tcPr>
-            <w:tcW w:w="816" w:type="pct"/>
-            <w:vAlign w:val="center"/>
-          </w:tcPr>
-          <w:p>
-            <w:pPr>
-              <w:jc w:val="center"/>
-              <w:cnfStyle w:val="000000000000" w:firstRow="0" w:lastRow="0" w:firstColumn="0" w:lastColumn="0" w:oddVBand="0" w:evenVBand="0" w:oddHBand="0" w:evenHBand="0" w:firstRowFirstColumn="0" w:firstRowLastColumn="0" w:lastRowFirstColumn="0" w:lastRowLastColumn="0"/>
-              <w:rPr>
-                <w:rFonts w:ascii="Calibri" w:hAnsi="Calibri" w:cs="Calibri"/>
-                <w:lang w:val="en-US"/>
-              </w:rPr>
-            </w:pPr>
-            <w:r>
-              <w:rPr>
-                <w:rStyle w:val="citation-4982"/>
-                <w:color w:val="1F1F1F"/>
-                <w:bdr w:val="none" w:sz="0" w:space="0" w:color="auto" w:frame="1"/>
-              </w:rPr>
-              <w:t>Proves PSD testing plan</w:t>
-            </w:r>
-            <w:r>
-              <w:rPr>
-                <w:color w:val="1F1F1F"/>
-                <w:bdr w:val="none" w:sz="0" w:space="0" w:color="auto" w:frame="1"/>
-              </w:rPr>
-              <w:t>.</w:t>
+                <w:lang w:val="en-US"/>
+              </w:rPr>
+              <w:t>FR1</w:t>
+            </w:r>
+            <w:r>
+              <w:rPr>
+                <w:rFonts w:ascii="Calibri" w:hAnsi="Calibri" w:cs="Calibri"/>
+                <w:lang w:val="en-US"/>
+              </w:rPr>
+              <w:t xml:space="preserve"> server-side session protection.</w:t>
             </w:r>
           </w:p>
         </w:tc>
       </w:tr>
       <w:tr>
-        <w:trPr>
-          <w:cnfStyle w:val="000000100000" w:firstRow="0" w:lastRow="0" w:firstColumn="0" w:lastColumn="0" w:oddVBand="0" w:evenVBand="0" w:oddHBand="1" w:evenHBand="0" w:firstRowFirstColumn="0" w:firstRowLastColumn="0" w:lastRowFirstColumn="0" w:lastRowLastColumn="0"/>
-        </w:trPr>
-        <w:tc>
-          <w:tcPr>
-            <w:cnfStyle w:val="001000000000" w:firstRow="0" w:lastRow="0" w:firstColumn="1" w:lastColumn="0" w:oddVBand="0" w:evenVBand="0" w:oddHBand="0" w:evenHBand="0" w:firstRowFirstColumn="0" w:firstRowLastColumn="0" w:lastRowFirstColumn="0" w:lastRowLastColumn="0"/>
-            <w:tcW w:w="371" w:type="pct"/>
-            <w:tcBorders>
-              <w:top w:val="single" w:sz="4" w:space="0" w:color="E59EDC" w:themeColor="accent5" w:themeTint="66"/>
-              <w:left w:val="single" w:sz="4" w:space="0" w:color="E59EDC" w:themeColor="accent5" w:themeTint="66"/>
-              <w:bottom w:val="single" w:sz="4" w:space="0" w:color="E59EDC" w:themeColor="accent5" w:themeTint="66"/>
-              <w:right w:val="single" w:sz="4" w:space="0" w:color="E59EDC" w:themeColor="accent5" w:themeTint="66"/>
-            </w:tcBorders>
-            <w:vAlign w:val="center"/>
-          </w:tcPr>
-          <w:p>
-            <w:pPr>
-              <w:jc w:val="center"/>
-              <w:rPr>
-                <w:rFonts w:ascii="Calibri" w:hAnsi="Calibri" w:cs="Calibri"/>
-              </w:rPr>
-            </w:pPr>
-            <w:r>
-              <w:rPr>
+        <w:tc>
+          <w:tcPr>
+            <w:tcW w:w="0" w:type="auto"/>
+            <w:hideMark/>
+          </w:tcPr>
+          <w:p>
+            <w:pPr>
+              <w:jc w:val="left"/>
+              <w:rPr>
+                <w:rFonts w:ascii="Calibri" w:hAnsi="Calibri" w:cs="Calibri"/>
+                <w:lang w:val="en-US"/>
+              </w:rPr>
+            </w:pPr>
+            <w:r>
+              <w:rPr>
+                <w:rFonts w:ascii="Calibri" w:hAnsi="Calibri" w:cs="Calibri"/>
                 <w:b/>
                 <w:bCs/>
-                <w:color w:val="1F1F1F"/>
-                <w:bdr w:val="none" w:sz="0" w:space="0" w:color="auto" w:frame="1"/>
-              </w:rPr>
-              <w:t>T6</w:t>
-            </w:r>
-          </w:p>
-        </w:tc>
-        <w:tc>
-          <w:tcPr>
-            <w:tcW w:w="1834" w:type="pct"/>
-            <w:tcBorders>
-              <w:left w:val="single" w:sz="4" w:space="0" w:color="E59EDC" w:themeColor="accent5" w:themeTint="66"/>
-            </w:tcBorders>
-            <w:vAlign w:val="center"/>
-          </w:tcPr>
-          <w:p>
-            <w:pPr>
-              <w:jc w:val="left"/>
-              <w:cnfStyle w:val="000000100000" w:firstRow="0" w:lastRow="0" w:firstColumn="0" w:lastColumn="0" w:oddVBand="0" w:evenVBand="0" w:oddHBand="1" w:evenHBand="0" w:firstRowFirstColumn="0" w:firstRowLastColumn="0" w:lastRowFirstColumn="0" w:lastRowLastColumn="0"/>
+                <w:lang w:val="en-US"/>
+              </w:rPr>
+              <w:t>T7</w:t>
+            </w:r>
+          </w:p>
+        </w:tc>
+        <w:tc>
+          <w:tcPr>
+            <w:tcW w:w="0" w:type="auto"/>
+            <w:hideMark/>
+          </w:tcPr>
+          <w:p>
+            <w:pPr>
+              <w:jc w:val="left"/>
+              <w:rPr>
+                <w:rFonts w:ascii="Calibri" w:hAnsi="Calibri" w:cs="Calibri"/>
+                <w:lang w:val="en-US"/>
+              </w:rPr>
+            </w:pPr>
+            <w:r>
               <w:rPr>
                 <w:rFonts w:ascii="Calibri" w:hAnsi="Calibri" w:cs="Calibri"/>
                 <w:b/>
                 <w:bCs/>
                 <w:lang w:val="en-US"/>
               </w:rPr>
-            </w:pPr>
-            <w:r>
-              <w:rPr>
+              <w:t>Frontend</w:t>
+            </w:r>
+            <w:r>
+              <w:rPr>
+                <w:rFonts w:ascii="Calibri" w:hAnsi="Calibri" w:cs="Calibri"/>
+                <w:lang w:val="en-US"/>
+              </w:rPr>
+              <w:t>: Build Login UI and Dashboard navigation.</w:t>
+            </w:r>
+          </w:p>
+        </w:tc>
+        <w:tc>
+          <w:tcPr>
+            <w:tcW w:w="0" w:type="auto"/>
+            <w:hideMark/>
+          </w:tcPr>
+          <w:p>
+            <w:pPr>
+              <w:jc w:val="left"/>
+              <w:rPr>
+                <w:rFonts w:ascii="Calibri" w:hAnsi="Calibri" w:cs="Calibri"/>
+                <w:lang w:val="en-US"/>
+              </w:rPr>
+            </w:pPr>
+            <w:r>
+              <w:rPr>
+                <w:rFonts w:ascii="Calibri" w:hAnsi="Calibri" w:cs="Calibri"/>
+                <w:lang w:val="en-US"/>
+              </w:rPr>
+              <w:t>Story 01</w:t>
+            </w:r>
+          </w:p>
+        </w:tc>
+        <w:tc>
+          <w:tcPr>
+            <w:tcW w:w="0" w:type="auto"/>
+            <w:hideMark/>
+          </w:tcPr>
+          <w:p>
+            <w:pPr>
+              <w:jc w:val="left"/>
+              <w:rPr>
+                <w:rFonts w:ascii="Calibri" w:hAnsi="Calibri" w:cs="Calibri"/>
+                <w:lang w:val="en-US"/>
+              </w:rPr>
+            </w:pPr>
+            <w:r>
+              <w:rPr>
+                <w:rFonts w:ascii="Calibri" w:hAnsi="Calibri" w:cs="Calibri"/>
+                <w:lang w:val="en-US"/>
+              </w:rPr>
+              <w:t>3</w:t>
+            </w:r>
+          </w:p>
+        </w:tc>
+        <w:tc>
+          <w:tcPr>
+            <w:tcW w:w="0" w:type="auto"/>
+            <w:hideMark/>
+          </w:tcPr>
+          <w:p>
+            <w:pPr>
+              <w:jc w:val="left"/>
+              <w:rPr>
+                <w:rFonts w:ascii="Calibri" w:hAnsi="Calibri" w:cs="Calibri"/>
+                <w:lang w:val="en-US"/>
+              </w:rPr>
+            </w:pPr>
+            <w:r>
+              <w:rPr>
+                <w:rFonts w:ascii="Calibri" w:hAnsi="Calibri" w:cs="Calibri"/>
                 <w:b/>
                 <w:bCs/>
-                <w:color w:val="1F1F1F"/>
-                <w:bdr w:val="none" w:sz="0" w:space="0" w:color="auto" w:frame="1"/>
-              </w:rPr>
-              <w:t>Security</w:t>
-            </w:r>
-            <w:r>
-              <w:rPr>
-                <w:color w:val="1F1F1F"/>
-                <w:bdr w:val="none" w:sz="0" w:space="0" w:color="auto" w:frame="1"/>
-              </w:rPr>
-              <w:t xml:space="preserve">: Build </w:t>
-            </w:r>
-            <w:proofErr w:type="spellStart"/>
-            <w:r>
-              <w:rPr>
-                <w:rStyle w:val="HTMLCode"/>
-                <w:rFonts w:eastAsiaTheme="majorEastAsia" w:cs="Arial"/>
-                <w:color w:val="444746"/>
-                <w:bdr w:val="none" w:sz="0" w:space="0" w:color="auto" w:frame="1"/>
-              </w:rPr>
-              <w:t>hooks.server.ts</w:t>
-            </w:r>
-            <w:proofErr w:type="spellEnd"/>
-            <w:r>
-              <w:rPr>
-                <w:color w:val="1F1F1F"/>
-                <w:bdr w:val="none" w:sz="0" w:space="0" w:color="auto" w:frame="1"/>
-              </w:rPr>
-              <w:t xml:space="preserve"> session validation.</w:t>
-            </w:r>
-          </w:p>
-        </w:tc>
-        <w:tc>
-          <w:tcPr>
-            <w:tcW w:w="824" w:type="pct"/>
-            <w:vAlign w:val="center"/>
-          </w:tcPr>
-          <w:p>
-            <w:pPr>
-              <w:jc w:val="center"/>
-              <w:cnfStyle w:val="000000100000" w:firstRow="0" w:lastRow="0" w:firstColumn="0" w:lastColumn="0" w:oddVBand="0" w:evenVBand="0" w:oddHBand="1" w:evenHBand="0" w:firstRowFirstColumn="0" w:firstRowLastColumn="0" w:lastRowFirstColumn="0" w:lastRowLastColumn="0"/>
-              <w:rPr>
-                <w:rFonts w:ascii="Calibri" w:hAnsi="Calibri" w:cs="Calibri"/>
-              </w:rPr>
-            </w:pPr>
-            <w:r>
-              <w:rPr>
-                <w:color w:val="1F1F1F"/>
-                <w:bdr w:val="none" w:sz="0" w:space="0" w:color="auto" w:frame="1"/>
-              </w:rPr>
-              <w:t>Story 01</w:t>
-            </w:r>
-          </w:p>
-        </w:tc>
-        <w:tc>
-          <w:tcPr>
-            <w:tcW w:w="561" w:type="pct"/>
-            <w:vAlign w:val="center"/>
-          </w:tcPr>
-          <w:p>
-            <w:pPr>
-              <w:jc w:val="center"/>
-              <w:cnfStyle w:val="000000100000" w:firstRow="0" w:lastRow="0" w:firstColumn="0" w:lastColumn="0" w:oddVBand="0" w:evenVBand="0" w:oddHBand="1" w:evenHBand="0" w:firstRowFirstColumn="0" w:firstRowLastColumn="0" w:lastRowFirstColumn="0" w:lastRowLastColumn="0"/>
-              <w:rPr>
-                <w:rFonts w:ascii="Calibri" w:hAnsi="Calibri" w:cs="Calibri"/>
-              </w:rPr>
-            </w:pPr>
-            <w:r>
-              <w:rPr>
-                <w:color w:val="1F1F1F"/>
-                <w:bdr w:val="none" w:sz="0" w:space="0" w:color="auto" w:frame="1"/>
-              </w:rPr>
-              <w:t>3</w:t>
-            </w:r>
-          </w:p>
-        </w:tc>
-        <w:tc>
-          <w:tcPr>
-            <w:tcW w:w="593" w:type="pct"/>
-            <w:vAlign w:val="center"/>
-          </w:tcPr>
-          <w:p>
-            <w:pPr>
-              <w:jc w:val="center"/>
-              <w:cnfStyle w:val="000000100000" w:firstRow="0" w:lastRow="0" w:firstColumn="0" w:lastColumn="0" w:oddVBand="0" w:evenVBand="0" w:oddHBand="1" w:evenHBand="0" w:firstRowFirstColumn="0" w:firstRowLastColumn="0" w:lastRowFirstColumn="0" w:lastRowLastColumn="0"/>
-              <w:rPr>
-                <w:rFonts w:ascii="Calibri" w:hAnsi="Calibri" w:cs="Calibri"/>
-              </w:rPr>
-            </w:pPr>
-            <w:r>
-              <w:rPr>
+                <w:lang w:val="en-US"/>
+              </w:rPr>
+              <w:t>Complete</w:t>
+            </w:r>
+          </w:p>
+        </w:tc>
+        <w:tc>
+          <w:tcPr>
+            <w:tcW w:w="0" w:type="auto"/>
+            <w:hideMark/>
+          </w:tcPr>
+          <w:p>
+            <w:pPr>
+              <w:jc w:val="left"/>
+              <w:rPr>
+                <w:rFonts w:ascii="Calibri" w:hAnsi="Calibri" w:cs="Calibri"/>
+                <w:lang w:val="en-US"/>
+              </w:rPr>
+            </w:pPr>
+            <w:r>
+              <w:rPr>
+                <w:rFonts w:ascii="Calibri" w:hAnsi="Calibri" w:cs="Calibri"/>
+                <w:lang w:val="en-US"/>
+              </w:rPr>
+              <w:t xml:space="preserve">Fulfills </w:t>
+            </w:r>
+            <w:r>
+              <w:rPr>
+                <w:rFonts w:ascii="Calibri" w:hAnsi="Calibri" w:cs="Calibri"/>
                 <w:b/>
                 <w:bCs/>
-                <w:color w:val="1F1F1F"/>
-                <w:bdr w:val="none" w:sz="0" w:space="0" w:color="auto" w:frame="1"/>
-              </w:rPr>
-              <w:t>Complete</w:t>
-            </w:r>
-          </w:p>
-        </w:tc>
-        <w:tc>
-          <w:tcPr>
-            <w:tcW w:w="816" w:type="pct"/>
-            <w:vAlign w:val="center"/>
-          </w:tcPr>
-          <w:p>
-            <w:pPr>
-              <w:jc w:val="center"/>
-              <w:cnfStyle w:val="000000100000" w:firstRow="0" w:lastRow="0" w:firstColumn="0" w:lastColumn="0" w:oddVBand="0" w:evenVBand="0" w:oddHBand="1" w:evenHBand="0" w:firstRowFirstColumn="0" w:firstRowLastColumn="0" w:lastRowFirstColumn="0" w:lastRowLastColumn="0"/>
-              <w:rPr>
-                <w:rFonts w:ascii="Calibri" w:hAnsi="Calibri" w:cs="Calibri"/>
-                <w:lang w:val="en-US"/>
-              </w:rPr>
-            </w:pPr>
-            <w:r>
-              <w:rPr>
-                <w:color w:val="1F1F1F"/>
-                <w:bdr w:val="none" w:sz="0" w:space="0" w:color="auto" w:frame="1"/>
-              </w:rPr>
-              <w:t>Implements server-side protection.</w:t>
+                <w:lang w:val="en-US"/>
+              </w:rPr>
+              <w:t>Story 01</w:t>
+            </w:r>
+            <w:r>
+              <w:rPr>
+                <w:rFonts w:ascii="Calibri" w:hAnsi="Calibri" w:cs="Calibri"/>
+                <w:lang w:val="en-US"/>
+              </w:rPr>
+              <w:t xml:space="preserve"> and wireframe Screen 1.</w:t>
             </w:r>
           </w:p>
         </w:tc>
@@ -2047,174 +2072,176 @@
       <w:tr>
         <w:tc>
           <w:tcPr>
-            <w:cnfStyle w:val="001000000000" w:firstRow="0" w:lastRow="0" w:firstColumn="1" w:lastColumn="0" w:oddVBand="0" w:evenVBand="0" w:oddHBand="0" w:evenHBand="0" w:firstRowFirstColumn="0" w:firstRowLastColumn="0" w:lastRowFirstColumn="0" w:lastRowLastColumn="0"/>
-            <w:tcW w:w="371" w:type="pct"/>
-            <w:tcBorders>
-              <w:top w:val="single" w:sz="4" w:space="0" w:color="E59EDC" w:themeColor="accent5" w:themeTint="66"/>
-              <w:left w:val="single" w:sz="4" w:space="0" w:color="E59EDC" w:themeColor="accent5" w:themeTint="66"/>
-              <w:bottom w:val="single" w:sz="4" w:space="0" w:color="E59EDC" w:themeColor="accent5" w:themeTint="66"/>
-              <w:right w:val="single" w:sz="4" w:space="0" w:color="E59EDC" w:themeColor="accent5" w:themeTint="66"/>
-            </w:tcBorders>
-            <w:vAlign w:val="center"/>
-          </w:tcPr>
-          <w:p>
-            <w:pPr>
-              <w:jc w:val="center"/>
-              <w:rPr>
-                <w:rFonts w:ascii="Calibri" w:hAnsi="Calibri" w:cs="Calibri"/>
-              </w:rPr>
-            </w:pPr>
-            <w:r>
-              <w:rPr>
+            <w:tcW w:w="0" w:type="auto"/>
+            <w:hideMark/>
+          </w:tcPr>
+          <w:p>
+            <w:pPr>
+              <w:jc w:val="left"/>
+              <w:rPr>
+                <w:rFonts w:ascii="Calibri" w:hAnsi="Calibri" w:cs="Calibri"/>
+                <w:lang w:val="en-US"/>
+              </w:rPr>
+            </w:pPr>
+            <w:r>
+              <w:rPr>
+                <w:rFonts w:ascii="Calibri" w:hAnsi="Calibri" w:cs="Calibri"/>
                 <w:b/>
                 <w:bCs/>
-                <w:color w:val="1F1F1F"/>
-                <w:bdr w:val="none" w:sz="0" w:space="0" w:color="auto" w:frame="1"/>
-              </w:rPr>
-              <w:t>T7</w:t>
-            </w:r>
-          </w:p>
-        </w:tc>
-        <w:tc>
-          <w:tcPr>
-            <w:tcW w:w="1834" w:type="pct"/>
-            <w:tcBorders>
-              <w:left w:val="single" w:sz="4" w:space="0" w:color="E59EDC" w:themeColor="accent5" w:themeTint="66"/>
-            </w:tcBorders>
-            <w:vAlign w:val="center"/>
-          </w:tcPr>
-          <w:p>
-            <w:pPr>
-              <w:jc w:val="left"/>
-              <w:cnfStyle w:val="000000000000" w:firstRow="0" w:lastRow="0" w:firstColumn="0" w:lastColumn="0" w:oddVBand="0" w:evenVBand="0" w:oddHBand="0" w:evenHBand="0" w:firstRowFirstColumn="0" w:firstRowLastColumn="0" w:lastRowFirstColumn="0" w:lastRowLastColumn="0"/>
+                <w:lang w:val="en-US"/>
+              </w:rPr>
+              <w:t>T9</w:t>
+            </w:r>
+          </w:p>
+        </w:tc>
+        <w:tc>
+          <w:tcPr>
+            <w:tcW w:w="0" w:type="auto"/>
+            <w:hideMark/>
+          </w:tcPr>
+          <w:p>
+            <w:pPr>
+              <w:jc w:val="left"/>
+              <w:rPr>
+                <w:rFonts w:ascii="Calibri" w:hAnsi="Calibri" w:cs="Calibri"/>
+                <w:lang w:val="en-US"/>
+              </w:rPr>
+            </w:pPr>
+            <w:r>
               <w:rPr>
                 <w:rFonts w:ascii="Calibri" w:hAnsi="Calibri" w:cs="Calibri"/>
                 <w:b/>
                 <w:bCs/>
-              </w:rPr>
-            </w:pPr>
-            <w:r>
-              <w:rPr>
+                <w:lang w:val="en-US"/>
+              </w:rPr>
+              <w:t>Logic</w:t>
+            </w:r>
+            <w:r>
+              <w:rPr>
+                <w:rFonts w:ascii="Calibri" w:hAnsi="Calibri" w:cs="Calibri"/>
+                <w:lang w:val="en-US"/>
+              </w:rPr>
+              <w:t>: Build reactive ACT_SCHEDULING_ENGINE ticker.</w:t>
+            </w:r>
+          </w:p>
+        </w:tc>
+        <w:tc>
+          <w:tcPr>
+            <w:tcW w:w="0" w:type="auto"/>
+            <w:hideMark/>
+          </w:tcPr>
+          <w:p>
+            <w:pPr>
+              <w:jc w:val="left"/>
+              <w:rPr>
+                <w:rFonts w:ascii="Calibri" w:hAnsi="Calibri" w:cs="Calibri"/>
+                <w:lang w:val="en-US"/>
+              </w:rPr>
+            </w:pPr>
+            <w:r>
+              <w:rPr>
+                <w:rFonts w:ascii="Calibri" w:hAnsi="Calibri" w:cs="Calibri"/>
+                <w:lang w:val="en-US"/>
+              </w:rPr>
+              <w:t>Story 02</w:t>
+            </w:r>
+          </w:p>
+        </w:tc>
+        <w:tc>
+          <w:tcPr>
+            <w:tcW w:w="0" w:type="auto"/>
+            <w:hideMark/>
+          </w:tcPr>
+          <w:p>
+            <w:pPr>
+              <w:jc w:val="left"/>
+              <w:rPr>
+                <w:rFonts w:ascii="Calibri" w:hAnsi="Calibri" w:cs="Calibri"/>
+                <w:lang w:val="en-US"/>
+              </w:rPr>
+            </w:pPr>
+            <w:r>
+              <w:rPr>
+                <w:rFonts w:ascii="Calibri" w:hAnsi="Calibri" w:cs="Calibri"/>
+                <w:lang w:val="en-US"/>
+              </w:rPr>
+              <w:t>5</w:t>
+            </w:r>
+          </w:p>
+        </w:tc>
+        <w:tc>
+          <w:tcPr>
+            <w:tcW w:w="0" w:type="auto"/>
+            <w:hideMark/>
+          </w:tcPr>
+          <w:p>
+            <w:pPr>
+              <w:jc w:val="left"/>
+              <w:rPr>
+                <w:rFonts w:ascii="Calibri" w:hAnsi="Calibri" w:cs="Calibri"/>
+                <w:lang w:val="en-US"/>
+              </w:rPr>
+            </w:pPr>
+            <w:r>
+              <w:rPr>
+                <w:rFonts w:ascii="Calibri" w:hAnsi="Calibri" w:cs="Calibri"/>
                 <w:b/>
                 <w:bCs/>
-                <w:color w:val="1F1F1F"/>
-                <w:bdr w:val="none" w:sz="0" w:space="0" w:color="auto" w:frame="1"/>
-              </w:rPr>
-              <w:t>Frontend</w:t>
-            </w:r>
-            <w:r>
-              <w:rPr>
-                <w:color w:val="1F1F1F"/>
-                <w:bdr w:val="none" w:sz="0" w:space="0" w:color="auto" w:frame="1"/>
-              </w:rPr>
-              <w:t>: Build Login UI and Dashboard navigation.</w:t>
-            </w:r>
-          </w:p>
-        </w:tc>
-        <w:tc>
-          <w:tcPr>
-            <w:tcW w:w="824" w:type="pct"/>
-            <w:vAlign w:val="center"/>
-          </w:tcPr>
-          <w:p>
-            <w:pPr>
-              <w:jc w:val="center"/>
-              <w:cnfStyle w:val="000000000000" w:firstRow="0" w:lastRow="0" w:firstColumn="0" w:lastColumn="0" w:oddVBand="0" w:evenVBand="0" w:oddHBand="0" w:evenHBand="0" w:firstRowFirstColumn="0" w:firstRowLastColumn="0" w:lastRowFirstColumn="0" w:lastRowLastColumn="0"/>
-              <w:rPr>
-                <w:rFonts w:ascii="Calibri" w:hAnsi="Calibri" w:cs="Calibri"/>
-              </w:rPr>
-            </w:pPr>
-            <w:r>
-              <w:rPr>
-                <w:color w:val="1F1F1F"/>
-                <w:bdr w:val="none" w:sz="0" w:space="0" w:color="auto" w:frame="1"/>
-              </w:rPr>
-              <w:t>Story 01</w:t>
-            </w:r>
-          </w:p>
-        </w:tc>
-        <w:tc>
-          <w:tcPr>
-            <w:tcW w:w="561" w:type="pct"/>
-            <w:vAlign w:val="center"/>
-          </w:tcPr>
-          <w:p>
-            <w:pPr>
-              <w:jc w:val="center"/>
-              <w:cnfStyle w:val="000000000000" w:firstRow="0" w:lastRow="0" w:firstColumn="0" w:lastColumn="0" w:oddVBand="0" w:evenVBand="0" w:oddHBand="0" w:evenHBand="0" w:firstRowFirstColumn="0" w:firstRowLastColumn="0" w:lastRowFirstColumn="0" w:lastRowLastColumn="0"/>
-              <w:rPr>
-                <w:rFonts w:ascii="Calibri" w:hAnsi="Calibri" w:cs="Calibri"/>
-              </w:rPr>
-            </w:pPr>
-            <w:r>
-              <w:rPr>
-                <w:color w:val="1F1F1F"/>
-                <w:bdr w:val="none" w:sz="0" w:space="0" w:color="auto" w:frame="1"/>
-              </w:rPr>
-              <w:t>3</w:t>
-            </w:r>
-          </w:p>
-        </w:tc>
-        <w:tc>
-          <w:tcPr>
-            <w:tcW w:w="593" w:type="pct"/>
-            <w:vAlign w:val="center"/>
-          </w:tcPr>
-          <w:p>
-            <w:pPr>
-              <w:jc w:val="center"/>
-              <w:cnfStyle w:val="000000000000" w:firstRow="0" w:lastRow="0" w:firstColumn="0" w:lastColumn="0" w:oddVBand="0" w:evenVBand="0" w:oddHBand="0" w:evenHBand="0" w:firstRowFirstColumn="0" w:firstRowLastColumn="0" w:lastRowFirstColumn="0" w:lastRowLastColumn="0"/>
-              <w:rPr>
-                <w:rFonts w:ascii="Calibri" w:hAnsi="Calibri" w:cs="Calibri"/>
-              </w:rPr>
-            </w:pPr>
-            <w:r>
-              <w:rPr>
+                <w:lang w:val="en-US"/>
+              </w:rPr>
+              <w:t>Complete</w:t>
+            </w:r>
+          </w:p>
+        </w:tc>
+        <w:tc>
+          <w:tcPr>
+            <w:tcW w:w="0" w:type="auto"/>
+            <w:hideMark/>
+          </w:tcPr>
+          <w:p>
+            <w:pPr>
+              <w:jc w:val="left"/>
+              <w:rPr>
+                <w:rFonts w:ascii="Calibri" w:hAnsi="Calibri" w:cs="Calibri"/>
+                <w:lang w:val="en-US"/>
+              </w:rPr>
+            </w:pPr>
+            <w:r>
+              <w:rPr>
+                <w:rFonts w:ascii="Calibri" w:hAnsi="Calibri" w:cs="Calibri"/>
+                <w:lang w:val="en-US"/>
+              </w:rPr>
+              <w:t xml:space="preserve">Fulfills </w:t>
+            </w:r>
+            <w:r>
+              <w:rPr>
+                <w:rFonts w:ascii="Calibri" w:hAnsi="Calibri" w:cs="Calibri"/>
                 <w:b/>
                 <w:bCs/>
-                <w:color w:val="1F1F1F"/>
-                <w:bdr w:val="none" w:sz="0" w:space="0" w:color="auto" w:frame="1"/>
-              </w:rPr>
-              <w:t>Complete</w:t>
-            </w:r>
-          </w:p>
-        </w:tc>
-        <w:tc>
-          <w:tcPr>
-            <w:tcW w:w="816" w:type="pct"/>
-            <w:vAlign w:val="center"/>
-          </w:tcPr>
-          <w:p>
-            <w:pPr>
-              <w:jc w:val="center"/>
-              <w:cnfStyle w:val="000000000000" w:firstRow="0" w:lastRow="0" w:firstColumn="0" w:lastColumn="0" w:oddVBand="0" w:evenVBand="0" w:oddHBand="0" w:evenHBand="0" w:firstRowFirstColumn="0" w:firstRowLastColumn="0" w:lastRowFirstColumn="0" w:lastRowLastColumn="0"/>
-              <w:rPr>
-                <w:rFonts w:ascii="Calibri" w:hAnsi="Calibri" w:cs="Calibri"/>
-                <w:lang w:val="en-US"/>
-              </w:rPr>
-            </w:pPr>
-            <w:proofErr w:type="spellStart"/>
-            <w:r>
-              <w:rPr>
-                <w:rStyle w:val="citation-4981"/>
-                <w:color w:val="1F1F1F"/>
-                <w:bdr w:val="none" w:sz="0" w:space="0" w:color="auto" w:frame="1"/>
-              </w:rPr>
-              <w:t>Fulfills</w:t>
-            </w:r>
-            <w:proofErr w:type="spellEnd"/>
-            <w:r>
-              <w:rPr>
-                <w:rStyle w:val="citation-4981"/>
-                <w:color w:val="1F1F1F"/>
-                <w:bdr w:val="none" w:sz="0" w:space="0" w:color="auto" w:frame="1"/>
-              </w:rPr>
-              <w:t xml:space="preserve"> FR1 &amp; Story 01</w:t>
-            </w:r>
-            <w:r>
-              <w:rPr>
-                <w:color w:val="1F1F1F"/>
-                <w:bdr w:val="none" w:sz="0" w:space="0" w:color="auto" w:frame="1"/>
+                <w:lang w:val="en-US"/>
+              </w:rPr>
+              <w:t>FR2</w:t>
+            </w:r>
+            <w:r>
+              <w:rPr>
+                <w:rFonts w:ascii="Calibri" w:hAnsi="Calibri" w:cs="Calibri"/>
+                <w:lang w:val="en-US"/>
+              </w:rPr>
+              <w:t xml:space="preserve"> and </w:t>
+            </w:r>
+            <w:r>
+              <w:rPr>
+                <w:rFonts w:ascii="Calibri" w:hAnsi="Calibri" w:cs="Calibri"/>
+                <w:b/>
+                <w:bCs/>
+                <w:lang w:val="en-US"/>
+              </w:rPr>
+              <w:t>NFR2 (Availability)</w:t>
+            </w:r>
+            <w:r>
+              <w:rPr>
+                <w:rFonts w:ascii="Calibri" w:hAnsi="Calibri" w:cs="Calibri"/>
+                <w:lang w:val="en-US"/>
               </w:rPr>
               <w:t>.</w:t>
             </w:r>
@@ -2222,194 +2249,178 @@
         </w:tc>
       </w:tr>
       <w:tr>
-        <w:trPr>
-          <w:cnfStyle w:val="000000100000" w:firstRow="0" w:lastRow="0" w:firstColumn="0" w:lastColumn="0" w:oddVBand="0" w:evenVBand="0" w:oddHBand="1" w:evenHBand="0" w:firstRowFirstColumn="0" w:firstRowLastColumn="0" w:lastRowFirstColumn="0" w:lastRowLastColumn="0"/>
-        </w:trPr>
-        <w:tc>
-          <w:tcPr>
-            <w:cnfStyle w:val="001000000000" w:firstRow="0" w:lastRow="0" w:firstColumn="1" w:lastColumn="0" w:oddVBand="0" w:evenVBand="0" w:oddHBand="0" w:evenHBand="0" w:firstRowFirstColumn="0" w:firstRowLastColumn="0" w:lastRowFirstColumn="0" w:lastRowLastColumn="0"/>
-            <w:tcW w:w="371" w:type="pct"/>
-            <w:tcBorders>
-              <w:top w:val="single" w:sz="4" w:space="0" w:color="E59EDC" w:themeColor="accent5" w:themeTint="66"/>
-              <w:left w:val="single" w:sz="4" w:space="0" w:color="E59EDC" w:themeColor="accent5" w:themeTint="66"/>
-              <w:bottom w:val="single" w:sz="4" w:space="0" w:color="E59EDC" w:themeColor="accent5" w:themeTint="66"/>
-              <w:right w:val="single" w:sz="4" w:space="0" w:color="E59EDC" w:themeColor="accent5" w:themeTint="66"/>
-            </w:tcBorders>
-            <w:vAlign w:val="center"/>
-          </w:tcPr>
-          <w:p>
-            <w:pPr>
-              <w:jc w:val="center"/>
-              <w:rPr>
-                <w:rFonts w:ascii="Calibri" w:hAnsi="Calibri" w:cs="Calibri"/>
-              </w:rPr>
-            </w:pPr>
-            <w:r>
-              <w:rPr>
+        <w:tc>
+          <w:tcPr>
+            <w:tcW w:w="0" w:type="auto"/>
+            <w:hideMark/>
+          </w:tcPr>
+          <w:p>
+            <w:pPr>
+              <w:jc w:val="left"/>
+              <w:rPr>
+                <w:rFonts w:ascii="Calibri" w:hAnsi="Calibri" w:cs="Calibri"/>
+                <w:lang w:val="en-US"/>
+              </w:rPr>
+            </w:pPr>
+            <w:r>
+              <w:rPr>
+                <w:rFonts w:ascii="Calibri" w:hAnsi="Calibri" w:cs="Calibri"/>
                 <w:b/>
                 <w:bCs/>
-                <w:color w:val="1F1F1F"/>
-                <w:bdr w:val="none" w:sz="0" w:space="0" w:color="auto" w:frame="1"/>
-              </w:rPr>
-              <w:t>T9</w:t>
-            </w:r>
-          </w:p>
-        </w:tc>
-        <w:tc>
-          <w:tcPr>
-            <w:tcW w:w="1834" w:type="pct"/>
-            <w:tcBorders>
-              <w:left w:val="single" w:sz="4" w:space="0" w:color="E59EDC" w:themeColor="accent5" w:themeTint="66"/>
-            </w:tcBorders>
-            <w:vAlign w:val="center"/>
-          </w:tcPr>
-          <w:p>
-            <w:pPr>
-              <w:jc w:val="left"/>
-              <w:cnfStyle w:val="000000100000" w:firstRow="0" w:lastRow="0" w:firstColumn="0" w:lastColumn="0" w:oddVBand="0" w:evenVBand="0" w:oddHBand="1" w:evenHBand="0" w:firstRowFirstColumn="0" w:firstRowLastColumn="0" w:lastRowFirstColumn="0" w:lastRowLastColumn="0"/>
+                <w:lang w:val="en-US"/>
+              </w:rPr>
+              <w:t>T12</w:t>
+            </w:r>
+          </w:p>
+        </w:tc>
+        <w:tc>
+          <w:tcPr>
+            <w:tcW w:w="0" w:type="auto"/>
+            <w:hideMark/>
+          </w:tcPr>
+          <w:p>
+            <w:pPr>
+              <w:jc w:val="left"/>
+              <w:rPr>
+                <w:rFonts w:ascii="Calibri" w:hAnsi="Calibri" w:cs="Calibri"/>
+                <w:lang w:val="en-US"/>
+              </w:rPr>
+            </w:pPr>
+            <w:r>
               <w:rPr>
                 <w:rFonts w:ascii="Calibri" w:hAnsi="Calibri" w:cs="Calibri"/>
                 <w:b/>
                 <w:bCs/>
-              </w:rPr>
-            </w:pPr>
-            <w:r>
-              <w:rPr>
+                <w:lang w:val="en-US"/>
+              </w:rPr>
+              <w:t>Implementation</w:t>
+            </w:r>
+            <w:r>
+              <w:rPr>
+                <w:rFonts w:ascii="Calibri" w:hAnsi="Calibri" w:cs="Calibri"/>
+                <w:lang w:val="en-US"/>
+              </w:rPr>
+              <w:t>: Build ACT_RECORD_FETCHER portal logic.</w:t>
+            </w:r>
+          </w:p>
+        </w:tc>
+        <w:tc>
+          <w:tcPr>
+            <w:tcW w:w="0" w:type="auto"/>
+            <w:hideMark/>
+          </w:tcPr>
+          <w:p>
+            <w:pPr>
+              <w:jc w:val="left"/>
+              <w:rPr>
+                <w:rFonts w:ascii="Calibri" w:hAnsi="Calibri" w:cs="Calibri"/>
+                <w:lang w:val="en-US"/>
+              </w:rPr>
+            </w:pPr>
+            <w:r>
+              <w:rPr>
+                <w:rFonts w:ascii="Calibri" w:hAnsi="Calibri" w:cs="Calibri"/>
+                <w:lang w:val="en-US"/>
+              </w:rPr>
+              <w:t>Story 04</w:t>
+            </w:r>
+          </w:p>
+        </w:tc>
+        <w:tc>
+          <w:tcPr>
+            <w:tcW w:w="0" w:type="auto"/>
+            <w:hideMark/>
+          </w:tcPr>
+          <w:p>
+            <w:pPr>
+              <w:jc w:val="left"/>
+              <w:rPr>
+                <w:rFonts w:ascii="Calibri" w:hAnsi="Calibri" w:cs="Calibri"/>
+                <w:lang w:val="en-US"/>
+              </w:rPr>
+            </w:pPr>
+            <w:r>
+              <w:rPr>
+                <w:rFonts w:ascii="Calibri" w:hAnsi="Calibri" w:cs="Calibri"/>
+                <w:lang w:val="en-US"/>
+              </w:rPr>
+              <w:t>5</w:t>
+            </w:r>
+          </w:p>
+        </w:tc>
+        <w:tc>
+          <w:tcPr>
+            <w:tcW w:w="0" w:type="auto"/>
+            <w:hideMark/>
+          </w:tcPr>
+          <w:p>
+            <w:pPr>
+              <w:jc w:val="left"/>
+              <w:rPr>
+                <w:rFonts w:ascii="Calibri" w:hAnsi="Calibri" w:cs="Calibri"/>
+                <w:lang w:val="en-US"/>
+              </w:rPr>
+            </w:pPr>
+            <w:r>
+              <w:rPr>
+                <w:rFonts w:ascii="Calibri" w:hAnsi="Calibri" w:cs="Calibri"/>
                 <w:b/>
                 <w:bCs/>
-                <w:color w:val="1F1F1F"/>
-                <w:bdr w:val="none" w:sz="0" w:space="0" w:color="auto" w:frame="1"/>
-              </w:rPr>
-              <w:t>Logic</w:t>
-            </w:r>
-            <w:r>
-              <w:rPr>
-                <w:color w:val="1F1F1F"/>
-                <w:bdr w:val="none" w:sz="0" w:space="0" w:color="auto" w:frame="1"/>
-              </w:rPr>
-              <w:t xml:space="preserve">: Build reactive </w:t>
-            </w:r>
-            <w:r>
-              <w:rPr>
-                <w:rStyle w:val="HTMLCode"/>
-                <w:rFonts w:eastAsiaTheme="majorEastAsia" w:cs="Arial"/>
-                <w:color w:val="444746"/>
-                <w:bdr w:val="none" w:sz="0" w:space="0" w:color="auto" w:frame="1"/>
-              </w:rPr>
-              <w:t>ACT_SCHEDULING_ENGINE</w:t>
-            </w:r>
-            <w:r>
-              <w:rPr>
-                <w:color w:val="1F1F1F"/>
-                <w:bdr w:val="none" w:sz="0" w:space="0" w:color="auto" w:frame="1"/>
-              </w:rPr>
-              <w:t xml:space="preserve"> ticker.</w:t>
-            </w:r>
-          </w:p>
-        </w:tc>
-        <w:tc>
-          <w:tcPr>
-            <w:tcW w:w="824" w:type="pct"/>
-            <w:vAlign w:val="center"/>
-          </w:tcPr>
-          <w:p>
-            <w:pPr>
-              <w:jc w:val="center"/>
-              <w:cnfStyle w:val="000000100000" w:firstRow="0" w:lastRow="0" w:firstColumn="0" w:lastColumn="0" w:oddVBand="0" w:evenVBand="0" w:oddHBand="1" w:evenHBand="0" w:firstRowFirstColumn="0" w:firstRowLastColumn="0" w:lastRowFirstColumn="0" w:lastRowLastColumn="0"/>
-              <w:rPr>
-                <w:rFonts w:ascii="Calibri" w:hAnsi="Calibri" w:cs="Calibri"/>
-              </w:rPr>
-            </w:pPr>
-            <w:r>
-              <w:rPr>
-                <w:color w:val="1F1F1F"/>
-                <w:bdr w:val="none" w:sz="0" w:space="0" w:color="auto" w:frame="1"/>
-              </w:rPr>
-              <w:t>Story 02</w:t>
-            </w:r>
-          </w:p>
-        </w:tc>
-        <w:tc>
-          <w:tcPr>
-            <w:tcW w:w="561" w:type="pct"/>
-            <w:vAlign w:val="center"/>
-          </w:tcPr>
-          <w:p>
-            <w:pPr>
-              <w:jc w:val="center"/>
-              <w:cnfStyle w:val="000000100000" w:firstRow="0" w:lastRow="0" w:firstColumn="0" w:lastColumn="0" w:oddVBand="0" w:evenVBand="0" w:oddHBand="1" w:evenHBand="0" w:firstRowFirstColumn="0" w:firstRowLastColumn="0" w:lastRowFirstColumn="0" w:lastRowLastColumn="0"/>
-              <w:rPr>
-                <w:rFonts w:ascii="Calibri" w:hAnsi="Calibri" w:cs="Calibri"/>
-              </w:rPr>
-            </w:pPr>
-            <w:r>
-              <w:rPr>
-                <w:color w:val="1F1F1F"/>
-                <w:bdr w:val="none" w:sz="0" w:space="0" w:color="auto" w:frame="1"/>
-              </w:rPr>
-              <w:t>5</w:t>
-            </w:r>
-          </w:p>
-        </w:tc>
-        <w:tc>
-          <w:tcPr>
-            <w:tcW w:w="593" w:type="pct"/>
-            <w:vAlign w:val="center"/>
-          </w:tcPr>
-          <w:p>
-            <w:pPr>
-              <w:jc w:val="center"/>
-              <w:cnfStyle w:val="000000100000" w:firstRow="0" w:lastRow="0" w:firstColumn="0" w:lastColumn="0" w:oddVBand="0" w:evenVBand="0" w:oddHBand="1" w:evenHBand="0" w:firstRowFirstColumn="0" w:firstRowLastColumn="0" w:lastRowFirstColumn="0" w:lastRowLastColumn="0"/>
-              <w:rPr>
-                <w:rFonts w:ascii="Calibri" w:hAnsi="Calibri" w:cs="Calibri"/>
-              </w:rPr>
-            </w:pPr>
-            <w:r>
-              <w:rPr>
+                <w:lang w:val="en-US"/>
+              </w:rPr>
+              <w:t>Complete</w:t>
+            </w:r>
+          </w:p>
+        </w:tc>
+        <w:tc>
+          <w:tcPr>
+            <w:tcW w:w="0" w:type="auto"/>
+            <w:hideMark/>
+          </w:tcPr>
+          <w:p>
+            <w:pPr>
+              <w:jc w:val="left"/>
+              <w:rPr>
+                <w:rFonts w:ascii="Calibri" w:hAnsi="Calibri" w:cs="Calibri"/>
+                <w:lang w:val="en-US"/>
+              </w:rPr>
+            </w:pPr>
+            <w:r>
+              <w:rPr>
+                <w:rFonts w:ascii="Calibri" w:hAnsi="Calibri" w:cs="Calibri"/>
+                <w:lang w:val="en-US"/>
+              </w:rPr>
+              <w:t xml:space="preserve">Fulfills </w:t>
+            </w:r>
+            <w:r>
+              <w:rPr>
+                <w:rFonts w:ascii="Calibri" w:hAnsi="Calibri" w:cs="Calibri"/>
                 <w:b/>
                 <w:bCs/>
-                <w:color w:val="1F1F1F"/>
-                <w:bdr w:val="none" w:sz="0" w:space="0" w:color="auto" w:frame="1"/>
-              </w:rPr>
-              <w:t>Complete</w:t>
-            </w:r>
-          </w:p>
-        </w:tc>
-        <w:tc>
-          <w:tcPr>
-            <w:tcW w:w="816" w:type="pct"/>
-            <w:vAlign w:val="center"/>
-          </w:tcPr>
-          <w:p>
-            <w:pPr>
-              <w:jc w:val="center"/>
-              <w:cnfStyle w:val="000000100000" w:firstRow="0" w:lastRow="0" w:firstColumn="0" w:lastColumn="0" w:oddVBand="0" w:evenVBand="0" w:oddHBand="1" w:evenHBand="0" w:firstRowFirstColumn="0" w:firstRowLastColumn="0" w:lastRowFirstColumn="0" w:lastRowLastColumn="0"/>
-              <w:rPr>
-                <w:rFonts w:ascii="Calibri" w:hAnsi="Calibri" w:cs="Calibri"/>
-              </w:rPr>
-            </w:pPr>
-            <w:proofErr w:type="spellStart"/>
-            <w:r>
-              <w:rPr>
-                <w:rStyle w:val="citation-4980"/>
-                <w:color w:val="1F1F1F"/>
-                <w:bdr w:val="none" w:sz="0" w:space="0" w:color="auto" w:frame="1"/>
-              </w:rPr>
-              <w:t>Fulfills</w:t>
-            </w:r>
-            <w:proofErr w:type="spellEnd"/>
-            <w:r>
-              <w:rPr>
-                <w:rStyle w:val="citation-4980"/>
-                <w:color w:val="1F1F1F"/>
-                <w:bdr w:val="none" w:sz="0" w:space="0" w:color="auto" w:frame="1"/>
-              </w:rPr>
-              <w:t xml:space="preserve"> FR2 &amp; NFR2</w:t>
-            </w:r>
-            <w:r>
-              <w:rPr>
-                <w:color w:val="1F1F1F"/>
-                <w:bdr w:val="none" w:sz="0" w:space="0" w:color="auto" w:frame="1"/>
+                <w:lang w:val="en-US"/>
+              </w:rPr>
+              <w:t>FR4</w:t>
+            </w:r>
+            <w:r>
+              <w:rPr>
+                <w:rFonts w:ascii="Calibri" w:hAnsi="Calibri" w:cs="Calibri"/>
+                <w:lang w:val="en-US"/>
+              </w:rPr>
+              <w:t xml:space="preserve"> and </w:t>
+            </w:r>
+            <w:r>
+              <w:rPr>
+                <w:rFonts w:ascii="Calibri" w:hAnsi="Calibri" w:cs="Calibri"/>
+                <w:b/>
+                <w:bCs/>
+                <w:lang w:val="en-US"/>
+              </w:rPr>
+              <w:t>Story 04</w:t>
+            </w:r>
+            <w:r>
+              <w:rPr>
+                <w:rFonts w:ascii="Calibri" w:hAnsi="Calibri" w:cs="Calibri"/>
+                <w:lang w:val="en-US"/>
               </w:rPr>
               <w:t>.</w:t>
             </w:r>
@@ -2419,192 +2430,178 @@
       <w:tr>
         <w:tc>
           <w:tcPr>
-            <w:cnfStyle w:val="001000000000" w:firstRow="0" w:lastRow="0" w:firstColumn="1" w:lastColumn="0" w:oddVBand="0" w:evenVBand="0" w:oddHBand="0" w:evenHBand="0" w:firstRowFirstColumn="0" w:firstRowLastColumn="0" w:lastRowFirstColumn="0" w:lastRowLastColumn="0"/>
-            <w:tcW w:w="371" w:type="pct"/>
-            <w:tcBorders>
-              <w:top w:val="single" w:sz="4" w:space="0" w:color="E59EDC" w:themeColor="accent5" w:themeTint="66"/>
-              <w:left w:val="single" w:sz="4" w:space="0" w:color="E59EDC" w:themeColor="accent5" w:themeTint="66"/>
-              <w:bottom w:val="single" w:sz="4" w:space="0" w:color="E59EDC" w:themeColor="accent5" w:themeTint="66"/>
-              <w:right w:val="single" w:sz="4" w:space="0" w:color="E59EDC" w:themeColor="accent5" w:themeTint="66"/>
-            </w:tcBorders>
-            <w:vAlign w:val="center"/>
-          </w:tcPr>
-          <w:p>
-            <w:pPr>
-              <w:jc w:val="center"/>
-              <w:rPr>
-                <w:rFonts w:ascii="Calibri" w:hAnsi="Calibri" w:cs="Calibri"/>
-              </w:rPr>
-            </w:pPr>
-            <w:r>
-              <w:rPr>
+            <w:tcW w:w="0" w:type="auto"/>
+            <w:hideMark/>
+          </w:tcPr>
+          <w:p>
+            <w:pPr>
+              <w:jc w:val="left"/>
+              <w:rPr>
+                <w:rFonts w:ascii="Calibri" w:hAnsi="Calibri" w:cs="Calibri"/>
+                <w:lang w:val="en-US"/>
+              </w:rPr>
+            </w:pPr>
+            <w:r>
+              <w:rPr>
+                <w:rFonts w:ascii="Calibri" w:hAnsi="Calibri" w:cs="Calibri"/>
                 <w:b/>
                 <w:bCs/>
-                <w:color w:val="1F1F1F"/>
-                <w:bdr w:val="none" w:sz="0" w:space="0" w:color="auto" w:frame="1"/>
-              </w:rPr>
-              <w:t>T12</w:t>
-            </w:r>
-          </w:p>
-        </w:tc>
-        <w:tc>
-          <w:tcPr>
-            <w:tcW w:w="1834" w:type="pct"/>
-            <w:tcBorders>
-              <w:left w:val="single" w:sz="4" w:space="0" w:color="E59EDC" w:themeColor="accent5" w:themeTint="66"/>
-            </w:tcBorders>
-            <w:vAlign w:val="center"/>
-          </w:tcPr>
-          <w:p>
-            <w:pPr>
-              <w:jc w:val="left"/>
-              <w:cnfStyle w:val="000000000000" w:firstRow="0" w:lastRow="0" w:firstColumn="0" w:lastColumn="0" w:oddVBand="0" w:evenVBand="0" w:oddHBand="0" w:evenHBand="0" w:firstRowFirstColumn="0" w:firstRowLastColumn="0" w:lastRowFirstColumn="0" w:lastRowLastColumn="0"/>
+                <w:lang w:val="en-US"/>
+              </w:rPr>
+              <w:t>T10</w:t>
+            </w:r>
+          </w:p>
+        </w:tc>
+        <w:tc>
+          <w:tcPr>
+            <w:tcW w:w="0" w:type="auto"/>
+            <w:hideMark/>
+          </w:tcPr>
+          <w:p>
+            <w:pPr>
+              <w:jc w:val="left"/>
+              <w:rPr>
+                <w:rFonts w:ascii="Calibri" w:hAnsi="Calibri" w:cs="Calibri"/>
+                <w:lang w:val="en-US"/>
+              </w:rPr>
+            </w:pPr>
+            <w:r>
               <w:rPr>
                 <w:rFonts w:ascii="Calibri" w:hAnsi="Calibri" w:cs="Calibri"/>
                 <w:b/>
                 <w:bCs/>
-              </w:rPr>
-            </w:pPr>
-            <w:r>
-              <w:rPr>
+                <w:lang w:val="en-US"/>
+              </w:rPr>
+              <w:t>Implementation</w:t>
+            </w:r>
+            <w:r>
+              <w:rPr>
+                <w:rFonts w:ascii="Calibri" w:hAnsi="Calibri" w:cs="Calibri"/>
+                <w:lang w:val="en-US"/>
+              </w:rPr>
+              <w:t>: Create dedicated /booking transaction form.</w:t>
+            </w:r>
+          </w:p>
+        </w:tc>
+        <w:tc>
+          <w:tcPr>
+            <w:tcW w:w="0" w:type="auto"/>
+            <w:hideMark/>
+          </w:tcPr>
+          <w:p>
+            <w:pPr>
+              <w:jc w:val="left"/>
+              <w:rPr>
+                <w:rFonts w:ascii="Calibri" w:hAnsi="Calibri" w:cs="Calibri"/>
+                <w:lang w:val="en-US"/>
+              </w:rPr>
+            </w:pPr>
+            <w:r>
+              <w:rPr>
+                <w:rFonts w:ascii="Calibri" w:hAnsi="Calibri" w:cs="Calibri"/>
+                <w:lang w:val="en-US"/>
+              </w:rPr>
+              <w:t>Story 03</w:t>
+            </w:r>
+          </w:p>
+        </w:tc>
+        <w:tc>
+          <w:tcPr>
+            <w:tcW w:w="0" w:type="auto"/>
+            <w:hideMark/>
+          </w:tcPr>
+          <w:p>
+            <w:pPr>
+              <w:jc w:val="left"/>
+              <w:rPr>
+                <w:rFonts w:ascii="Calibri" w:hAnsi="Calibri" w:cs="Calibri"/>
+                <w:lang w:val="en-US"/>
+              </w:rPr>
+            </w:pPr>
+            <w:r>
+              <w:rPr>
+                <w:rFonts w:ascii="Calibri" w:hAnsi="Calibri" w:cs="Calibri"/>
+                <w:lang w:val="en-US"/>
+              </w:rPr>
+              <w:t>8</w:t>
+            </w:r>
+          </w:p>
+        </w:tc>
+        <w:tc>
+          <w:tcPr>
+            <w:tcW w:w="0" w:type="auto"/>
+            <w:hideMark/>
+          </w:tcPr>
+          <w:p>
+            <w:pPr>
+              <w:jc w:val="left"/>
+              <w:rPr>
+                <w:rFonts w:ascii="Calibri" w:hAnsi="Calibri" w:cs="Calibri"/>
+                <w:lang w:val="en-US"/>
+              </w:rPr>
+            </w:pPr>
+            <w:r>
+              <w:rPr>
+                <w:rFonts w:ascii="Calibri" w:hAnsi="Calibri" w:cs="Calibri"/>
                 <w:b/>
                 <w:bCs/>
-                <w:color w:val="1F1F1F"/>
-                <w:bdr w:val="none" w:sz="0" w:space="0" w:color="auto" w:frame="1"/>
-              </w:rPr>
-              <w:t>Implementation</w:t>
-            </w:r>
-            <w:r>
-              <w:rPr>
-                <w:color w:val="1F1F1F"/>
-                <w:bdr w:val="none" w:sz="0" w:space="0" w:color="auto" w:frame="1"/>
-              </w:rPr>
-              <w:t xml:space="preserve">: Build </w:t>
-            </w:r>
-            <w:r>
-              <w:rPr>
-                <w:rStyle w:val="HTMLCode"/>
-                <w:rFonts w:eastAsiaTheme="majorEastAsia" w:cs="Arial"/>
-                <w:color w:val="444746"/>
-                <w:bdr w:val="none" w:sz="0" w:space="0" w:color="auto" w:frame="1"/>
-              </w:rPr>
-              <w:t>ACT_RECORD_FETCHER</w:t>
-            </w:r>
-            <w:r>
-              <w:rPr>
-                <w:color w:val="1F1F1F"/>
-                <w:bdr w:val="none" w:sz="0" w:space="0" w:color="auto" w:frame="1"/>
-              </w:rPr>
-              <w:t xml:space="preserve"> portal logic.</w:t>
-            </w:r>
-          </w:p>
-        </w:tc>
-        <w:tc>
-          <w:tcPr>
-            <w:tcW w:w="824" w:type="pct"/>
-            <w:vAlign w:val="center"/>
-          </w:tcPr>
-          <w:p>
-            <w:pPr>
-              <w:jc w:val="center"/>
-              <w:cnfStyle w:val="000000000000" w:firstRow="0" w:lastRow="0" w:firstColumn="0" w:lastColumn="0" w:oddVBand="0" w:evenVBand="0" w:oddHBand="0" w:evenHBand="0" w:firstRowFirstColumn="0" w:firstRowLastColumn="0" w:lastRowFirstColumn="0" w:lastRowLastColumn="0"/>
-              <w:rPr>
-                <w:rFonts w:ascii="Calibri" w:hAnsi="Calibri" w:cs="Calibri"/>
-              </w:rPr>
-            </w:pPr>
-            <w:r>
-              <w:rPr>
-                <w:color w:val="1F1F1F"/>
-                <w:bdr w:val="none" w:sz="0" w:space="0" w:color="auto" w:frame="1"/>
-              </w:rPr>
-              <w:t>Story 04</w:t>
-            </w:r>
-          </w:p>
-        </w:tc>
-        <w:tc>
-          <w:tcPr>
-            <w:tcW w:w="561" w:type="pct"/>
-            <w:vAlign w:val="center"/>
-          </w:tcPr>
-          <w:p>
-            <w:pPr>
-              <w:jc w:val="center"/>
-              <w:cnfStyle w:val="000000000000" w:firstRow="0" w:lastRow="0" w:firstColumn="0" w:lastColumn="0" w:oddVBand="0" w:evenVBand="0" w:oddHBand="0" w:evenHBand="0" w:firstRowFirstColumn="0" w:firstRowLastColumn="0" w:lastRowFirstColumn="0" w:lastRowLastColumn="0"/>
-              <w:rPr>
-                <w:rFonts w:ascii="Calibri" w:hAnsi="Calibri" w:cs="Calibri"/>
-              </w:rPr>
-            </w:pPr>
-            <w:r>
-              <w:rPr>
-                <w:color w:val="1F1F1F"/>
-                <w:bdr w:val="none" w:sz="0" w:space="0" w:color="auto" w:frame="1"/>
-              </w:rPr>
-              <w:t>5</w:t>
-            </w:r>
-          </w:p>
-        </w:tc>
-        <w:tc>
-          <w:tcPr>
-            <w:tcW w:w="593" w:type="pct"/>
-            <w:vAlign w:val="center"/>
-          </w:tcPr>
-          <w:p>
-            <w:pPr>
-              <w:jc w:val="center"/>
-              <w:cnfStyle w:val="000000000000" w:firstRow="0" w:lastRow="0" w:firstColumn="0" w:lastColumn="0" w:oddVBand="0" w:evenVBand="0" w:oddHBand="0" w:evenHBand="0" w:firstRowFirstColumn="0" w:firstRowLastColumn="0" w:lastRowFirstColumn="0" w:lastRowLastColumn="0"/>
-              <w:rPr>
-                <w:rFonts w:ascii="Calibri" w:hAnsi="Calibri" w:cs="Calibri"/>
-              </w:rPr>
-            </w:pPr>
-            <w:r>
-              <w:rPr>
+                <w:lang w:val="en-US"/>
+              </w:rPr>
+              <w:t>In Progress</w:t>
+            </w:r>
+          </w:p>
+        </w:tc>
+        <w:tc>
+          <w:tcPr>
+            <w:tcW w:w="0" w:type="auto"/>
+            <w:hideMark/>
+          </w:tcPr>
+          <w:p>
+            <w:pPr>
+              <w:jc w:val="left"/>
+              <w:rPr>
+                <w:rFonts w:ascii="Calibri" w:hAnsi="Calibri" w:cs="Calibri"/>
+                <w:lang w:val="en-US"/>
+              </w:rPr>
+            </w:pPr>
+            <w:r>
+              <w:rPr>
+                <w:rFonts w:ascii="Calibri" w:hAnsi="Calibri" w:cs="Calibri"/>
+                <w:lang w:val="en-US"/>
+              </w:rPr>
+              <w:t xml:space="preserve">Required for </w:t>
+            </w:r>
+            <w:r>
+              <w:rPr>
+                <w:rFonts w:ascii="Calibri" w:hAnsi="Calibri" w:cs="Calibri"/>
                 <w:b/>
                 <w:bCs/>
-                <w:color w:val="1F1F1F"/>
-                <w:bdr w:val="none" w:sz="0" w:space="0" w:color="auto" w:frame="1"/>
-              </w:rPr>
-              <w:t>Complete</w:t>
-            </w:r>
-          </w:p>
-        </w:tc>
-        <w:tc>
-          <w:tcPr>
-            <w:tcW w:w="816" w:type="pct"/>
-            <w:vAlign w:val="center"/>
-          </w:tcPr>
-          <w:p>
-            <w:pPr>
-              <w:jc w:val="center"/>
-              <w:cnfStyle w:val="000000000000" w:firstRow="0" w:lastRow="0" w:firstColumn="0" w:lastColumn="0" w:oddVBand="0" w:evenVBand="0" w:oddHBand="0" w:evenHBand="0" w:firstRowFirstColumn="0" w:firstRowLastColumn="0" w:lastRowFirstColumn="0" w:lastRowLastColumn="0"/>
-              <w:rPr>
-                <w:rFonts w:ascii="Calibri" w:hAnsi="Calibri" w:cs="Calibri"/>
-                <w:lang w:val="en-US"/>
-              </w:rPr>
-            </w:pPr>
-            <w:proofErr w:type="spellStart"/>
-            <w:r>
-              <w:rPr>
-                <w:rStyle w:val="citation-4979"/>
-                <w:color w:val="1F1F1F"/>
-                <w:bdr w:val="none" w:sz="0" w:space="0" w:color="auto" w:frame="1"/>
-              </w:rPr>
-              <w:t>Fulfills</w:t>
-            </w:r>
-            <w:proofErr w:type="spellEnd"/>
-            <w:r>
-              <w:rPr>
-                <w:rStyle w:val="citation-4979"/>
-                <w:color w:val="1F1F1F"/>
-                <w:bdr w:val="none" w:sz="0" w:space="0" w:color="auto" w:frame="1"/>
-              </w:rPr>
-              <w:t xml:space="preserve"> FR4 &amp; Story 04</w:t>
-            </w:r>
-            <w:r>
-              <w:rPr>
-                <w:color w:val="1F1F1F"/>
-                <w:bdr w:val="none" w:sz="0" w:space="0" w:color="auto" w:frame="1"/>
-              </w:rPr>
-              <w:t>.</w:t>
+                <w:lang w:val="en-US"/>
+              </w:rPr>
+              <w:t>FR3 (Self-Service)</w:t>
+            </w:r>
+            <w:r>
+              <w:rPr>
+                <w:rFonts w:ascii="Calibri" w:hAnsi="Calibri" w:cs="Calibri"/>
+                <w:lang w:val="en-US"/>
+              </w:rPr>
+              <w:t xml:space="preserve"> and </w:t>
+            </w:r>
+            <w:r>
+              <w:rPr>
+                <w:rFonts w:ascii="Calibri" w:hAnsi="Calibri" w:cs="Calibri"/>
+                <w:b/>
+                <w:bCs/>
+                <w:lang w:val="en-US"/>
+              </w:rPr>
+              <w:t>MVP</w:t>
+            </w:r>
+            <w:r>
+              <w:rPr>
+                <w:rFonts w:ascii="Calibri" w:hAnsi="Calibri" w:cs="Calibri"/>
+                <w:lang w:val="en-US"/>
+              </w:rPr>
+              <w:t xml:space="preserve"> completion.</w:t>
             </w:r>
           </w:p>
         </w:tc>
@@ -3362,8 +3359,16 @@
         <w:rPr>
           <w:rFonts w:ascii="Calibri" w:hAnsi="Calibri" w:cs="Calibri"/>
         </w:rPr>
-        <w:t xml:space="preserve"> compliance .</w:t>
-      </w:r>
+        <w:t xml:space="preserve"> </w:t>
+      </w:r>
+      <w:proofErr w:type="gramStart"/>
+      <w:r>
+        <w:rPr>
+          <w:rFonts w:ascii="Calibri" w:hAnsi="Calibri" w:cs="Calibri"/>
+        </w:rPr>
+        <w:t>compliance .</w:t>
+      </w:r>
+      <w:proofErr w:type="gramEnd"/>
     </w:p>
     <w:p>
       <w:pPr>
@@ -3455,8 +3460,30 @@
         <w:rPr>
           <w:rFonts w:ascii="Calibri" w:hAnsi="Calibri" w:cs="Calibri"/>
         </w:rPr>
-        <w:t>The current 'BOOK WITH DR. MEHTA' button on the dashboard is a UI placeholder. The next development goal is to implement the dedicated '/booking' route to handle the transaction logic and data-binding for Story 03 .</w:t>
-      </w:r>
+        <w:t xml:space="preserve">The current 'BOOK WITH DR. MEHTA' button on the dashboard is a UI placeholder. The next development goal is to implement the dedicated '/booking' route to handle the transaction logic and </w:t>
+      </w:r>
+      <w:proofErr w:type="gramStart"/>
+      <w:r>
+        <w:rPr>
+          <w:rFonts w:ascii="Calibri" w:hAnsi="Calibri" w:cs="Calibri"/>
+        </w:rPr>
+        <w:t>data-binding</w:t>
+      </w:r>
+      <w:proofErr w:type="gramEnd"/>
+      <w:r>
+        <w:rPr>
+          <w:rFonts w:ascii="Calibri" w:hAnsi="Calibri" w:cs="Calibri"/>
+        </w:rPr>
+        <w:t xml:space="preserve"> for Story </w:t>
+      </w:r>
+      <w:proofErr w:type="gramStart"/>
+      <w:r>
+        <w:rPr>
+          <w:rFonts w:ascii="Calibri" w:hAnsi="Calibri" w:cs="Calibri"/>
+        </w:rPr>
+        <w:t>03 .</w:t>
+      </w:r>
+      <w:proofErr w:type="gramEnd"/>
     </w:p>
     <w:p>
       <w:pPr>
@@ -3496,11 +3523,19 @@
         <w:t>While the current MVP uses plain-string comparison for mock data validation, a production-ready version must implement Argon2 or Bcrypt hashing within the +</w:t>
       </w:r>
       <w:proofErr w:type="spellStart"/>
-      <w:r>
-        <w:rPr>
-          <w:rFonts w:ascii="Calibri" w:hAnsi="Calibri" w:cs="Calibri"/>
-        </w:rPr>
-        <w:t>page.server.ts</w:t>
+      <w:proofErr w:type="gramStart"/>
+      <w:r>
+        <w:rPr>
+          <w:rFonts w:ascii="Calibri" w:hAnsi="Calibri" w:cs="Calibri"/>
+        </w:rPr>
+        <w:t>page.server</w:t>
+      </w:r>
+      <w:proofErr w:type="gramEnd"/>
+      <w:r>
+        <w:rPr>
+          <w:rFonts w:ascii="Calibri" w:hAnsi="Calibri" w:cs="Calibri"/>
+        </w:rPr>
+        <w:t>.ts</w:t>
       </w:r>
       <w:proofErr w:type="spellEnd"/>
       <w:r>
@@ -4734,6 +4769,25 @@
     <w:basedOn w:val="DefaultParagraphFont"/>
     <w:rsid w:val="00F97C4F"/>
   </w:style>
+  <w:style w:type="table" w:styleId="TableGrid">
+    <w:name w:val="Table Grid"/>
+    <w:basedOn w:val="TableNormal"/>
+    <w:uiPriority w:val="39"/>
+    <w:rsid w:val="00425C1F"/>
+    <w:pPr>
+      <w:spacing w:after="0" w:line="240" w:lineRule="auto"/>
+    </w:pPr>
+    <w:tblPr>
+      <w:tblBorders>
+        <w:top w:val="single" w:sz="4" w:space="0" w:color="auto"/>
+        <w:left w:val="single" w:sz="4" w:space="0" w:color="auto"/>
+        <w:bottom w:val="single" w:sz="4" w:space="0" w:color="auto"/>
+        <w:right w:val="single" w:sz="4" w:space="0" w:color="auto"/>
+        <w:insideH w:val="single" w:sz="4" w:space="0" w:color="auto"/>
+        <w:insideV w:val="single" w:sz="4" w:space="0" w:color="auto"/>
+      </w:tblBorders>
+    </w:tblPr>
+  </w:style>
 </w:styles>
 </file>
 

</xml_diff>

<commit_message>
feat: implement booking functionality with appointment creation and success message display
</commit_message>
<xml_diff>
--- a/docs/Sprint 2.docx
+++ b/docs/Sprint 2.docx
@@ -337,21 +337,7 @@
               <w:rPr>
                 <w:rFonts w:ascii="Calibri" w:hAnsi="Calibri" w:cs="Calibri"/>
               </w:rPr>
-              <w:t xml:space="preserve">As a Patient, I want to book an appointment </w:t>
-            </w:r>
-            <w:proofErr w:type="gramStart"/>
-            <w:r>
-              <w:rPr>
-                <w:rFonts w:ascii="Calibri" w:hAnsi="Calibri" w:cs="Calibri"/>
-              </w:rPr>
-              <w:t>online</w:t>
-            </w:r>
-            <w:proofErr w:type="gramEnd"/>
-            <w:r>
-              <w:rPr>
-                <w:rFonts w:ascii="Calibri" w:hAnsi="Calibri" w:cs="Calibri"/>
-              </w:rPr>
-              <w:t xml:space="preserve"> so I don't have to call the clinic.</w:t>
+              <w:t>As a Patient, I want to book an appointment online so I don't have to call the clinic.</w:t>
             </w:r>
           </w:p>
         </w:tc>
@@ -568,21 +554,7 @@
               <w:rPr>
                 <w:rFonts w:ascii="Calibri" w:hAnsi="Calibri" w:cs="Calibri"/>
               </w:rPr>
-              <w:t xml:space="preserve">As a Patient, I want to receive an appointment </w:t>
-            </w:r>
-            <w:proofErr w:type="gramStart"/>
-            <w:r>
-              <w:rPr>
-                <w:rFonts w:ascii="Calibri" w:hAnsi="Calibri" w:cs="Calibri"/>
-              </w:rPr>
-              <w:t>confirmation</w:t>
-            </w:r>
-            <w:proofErr w:type="gramEnd"/>
-            <w:r>
-              <w:rPr>
-                <w:rFonts w:ascii="Calibri" w:hAnsi="Calibri" w:cs="Calibri"/>
-              </w:rPr>
-              <w:t xml:space="preserve"> so I know my booking was successful.</w:t>
+              <w:t>As a Patient, I want to receive an appointment confirmation so I know my booking was successful.</w:t>
             </w:r>
           </w:p>
         </w:tc>
@@ -657,21 +629,7 @@
               <w:rPr>
                 <w:rFonts w:ascii="Calibri" w:hAnsi="Calibri" w:cs="Calibri"/>
               </w:rPr>
-              <w:t xml:space="preserve">As an Admin, I want to register a new patient with their name and </w:t>
-            </w:r>
-            <w:proofErr w:type="gramStart"/>
-            <w:r>
-              <w:rPr>
-                <w:rFonts w:ascii="Calibri" w:hAnsi="Calibri" w:cs="Calibri"/>
-              </w:rPr>
-              <w:t>DOB</w:t>
-            </w:r>
-            <w:proofErr w:type="gramEnd"/>
-            <w:r>
-              <w:rPr>
-                <w:rFonts w:ascii="Calibri" w:hAnsi="Calibri" w:cs="Calibri"/>
-              </w:rPr>
-              <w:t xml:space="preserve"> so their record is created.</w:t>
+              <w:t>As an Admin, I want to register a new patient with their name and DOB so their record is created.</w:t>
             </w:r>
           </w:p>
         </w:tc>
@@ -944,21 +902,7 @@
         <w:rPr>
           <w:rFonts w:ascii="Calibri" w:hAnsi="Calibri" w:cs="Calibri"/>
         </w:rPr>
-        <w:t xml:space="preserve"> by building the secure authentication gateway and the reactive scheduling engine. These features are </w:t>
-      </w:r>
-      <w:proofErr w:type="gramStart"/>
-      <w:r>
-        <w:rPr>
-          <w:rFonts w:ascii="Calibri" w:hAnsi="Calibri" w:cs="Calibri"/>
-        </w:rPr>
-        <w:t>high-value</w:t>
-      </w:r>
-      <w:proofErr w:type="gramEnd"/>
-      <w:r>
-        <w:rPr>
-          <w:rFonts w:ascii="Calibri" w:hAnsi="Calibri" w:cs="Calibri"/>
-        </w:rPr>
-        <w:t xml:space="preserve"> because they directly address the primary user frustration identified in discovery: the lack of self-service visibility for bookings and medical records. By prioritizing the </w:t>
+        <w:t xml:space="preserve"> by building the secure authentication gateway and the reactive scheduling engine. These features are high-value because they directly address the primary user frustration identified in discovery: the lack of self-service visibility for bookings and medical records. By prioritizing the </w:t>
       </w:r>
       <w:r>
         <w:rPr>
@@ -1004,17 +948,18 @@
         <w:tblLook w:val="04A0" w:firstRow="1" w:lastRow="0" w:firstColumn="1" w:lastColumn="0" w:noHBand="0" w:noVBand="1"/>
       </w:tblPr>
       <w:tblGrid>
-        <w:gridCol w:w="748"/>
-        <w:gridCol w:w="3484"/>
-        <w:gridCol w:w="875"/>
-        <w:gridCol w:w="618"/>
-        <w:gridCol w:w="1155"/>
-        <w:gridCol w:w="2470"/>
+        <w:gridCol w:w="822"/>
+        <w:gridCol w:w="3680"/>
+        <w:gridCol w:w="952"/>
+        <w:gridCol w:w="687"/>
+        <w:gridCol w:w="1232"/>
+        <w:gridCol w:w="1977"/>
       </w:tblGrid>
       <w:tr>
         <w:tc>
           <w:tcPr>
             <w:tcW w:w="0" w:type="auto"/>
+            <w:vAlign w:val="center"/>
             <w:hideMark/>
           </w:tcPr>
           <w:p>
@@ -1027,10 +972,9 @@
             </w:pPr>
             <w:r>
               <w:rPr>
-                <w:rFonts w:ascii="Calibri" w:hAnsi="Calibri" w:cs="Calibri"/>
-                <w:b/>
-                <w:bCs/>
-                <w:lang w:val="en-US"/>
+                <w:rStyle w:val="Strong"/>
+                <w:color w:val="1F1F1F"/>
+                <w:bdr w:val="none" w:sz="0" w:space="0" w:color="auto" w:frame="1"/>
               </w:rPr>
               <w:t>Task ID</w:t>
             </w:r>
@@ -1039,6 +983,7 @@
         <w:tc>
           <w:tcPr>
             <w:tcW w:w="0" w:type="auto"/>
+            <w:vAlign w:val="center"/>
             <w:hideMark/>
           </w:tcPr>
           <w:p>
@@ -1051,10 +996,9 @@
             </w:pPr>
             <w:r>
               <w:rPr>
-                <w:rFonts w:ascii="Calibri" w:hAnsi="Calibri" w:cs="Calibri"/>
-                <w:b/>
-                <w:bCs/>
-                <w:lang w:val="en-US"/>
+                <w:rStyle w:val="Strong"/>
+                <w:color w:val="1F1F1F"/>
+                <w:bdr w:val="none" w:sz="0" w:space="0" w:color="auto" w:frame="1"/>
               </w:rPr>
               <w:t>Technical Task</w:t>
             </w:r>
@@ -1063,6 +1007,7 @@
         <w:tc>
           <w:tcPr>
             <w:tcW w:w="0" w:type="auto"/>
+            <w:vAlign w:val="center"/>
             <w:hideMark/>
           </w:tcPr>
           <w:p>
@@ -1075,10 +1020,9 @@
             </w:pPr>
             <w:r>
               <w:rPr>
-                <w:rFonts w:ascii="Calibri" w:hAnsi="Calibri" w:cs="Calibri"/>
-                <w:b/>
-                <w:bCs/>
-                <w:lang w:val="en-US"/>
+                <w:rStyle w:val="Strong"/>
+                <w:color w:val="1F1F1F"/>
+                <w:bdr w:val="none" w:sz="0" w:space="0" w:color="auto" w:frame="1"/>
               </w:rPr>
               <w:t>Story Link</w:t>
             </w:r>
@@ -1087,6 +1031,7 @@
         <w:tc>
           <w:tcPr>
             <w:tcW w:w="0" w:type="auto"/>
+            <w:vAlign w:val="center"/>
             <w:hideMark/>
           </w:tcPr>
           <w:p>
@@ -1099,10 +1044,9 @@
             </w:pPr>
             <w:r>
               <w:rPr>
-                <w:rFonts w:ascii="Calibri" w:hAnsi="Calibri" w:cs="Calibri"/>
-                <w:b/>
-                <w:bCs/>
-                <w:lang w:val="en-US"/>
+                <w:rStyle w:val="Strong"/>
+                <w:color w:val="1F1F1F"/>
+                <w:bdr w:val="none" w:sz="0" w:space="0" w:color="auto" w:frame="1"/>
               </w:rPr>
               <w:t>Est.</w:t>
             </w:r>
@@ -1111,6 +1055,7 @@
         <w:tc>
           <w:tcPr>
             <w:tcW w:w="0" w:type="auto"/>
+            <w:vAlign w:val="center"/>
             <w:hideMark/>
           </w:tcPr>
           <w:p>
@@ -1123,10 +1068,9 @@
             </w:pPr>
             <w:r>
               <w:rPr>
-                <w:rFonts w:ascii="Calibri" w:hAnsi="Calibri" w:cs="Calibri"/>
-                <w:b/>
-                <w:bCs/>
-                <w:lang w:val="en-US"/>
+                <w:rStyle w:val="Strong"/>
+                <w:color w:val="1F1F1F"/>
+                <w:bdr w:val="none" w:sz="0" w:space="0" w:color="auto" w:frame="1"/>
               </w:rPr>
               <w:t>Status</w:t>
             </w:r>
@@ -1135,6 +1079,7 @@
         <w:tc>
           <w:tcPr>
             <w:tcW w:w="0" w:type="auto"/>
+            <w:vAlign w:val="center"/>
             <w:hideMark/>
           </w:tcPr>
           <w:p>
@@ -1147,10 +1092,9 @@
             </w:pPr>
             <w:r>
               <w:rPr>
-                <w:rFonts w:ascii="Calibri" w:hAnsi="Calibri" w:cs="Calibri"/>
-                <w:b/>
-                <w:bCs/>
-                <w:lang w:val="en-US"/>
+                <w:rStyle w:val="Strong"/>
+                <w:color w:val="1F1F1F"/>
+                <w:bdr w:val="none" w:sz="0" w:space="0" w:color="auto" w:frame="1"/>
               </w:rPr>
               <w:t>Traceability</w:t>
             </w:r>
@@ -1161,6 +1105,7 @@
         <w:tc>
           <w:tcPr>
             <w:tcW w:w="0" w:type="auto"/>
+            <w:vAlign w:val="center"/>
             <w:hideMark/>
           </w:tcPr>
           <w:p>
@@ -1173,10 +1118,10 @@
             </w:pPr>
             <w:r>
               <w:rPr>
-                <w:rFonts w:ascii="Calibri" w:hAnsi="Calibri" w:cs="Calibri"/>
-                <w:b/>
-                <w:bCs/>
-                <w:lang w:val="en-US"/>
+                <w:b/>
+                <w:bCs/>
+                <w:color w:val="1F1F1F"/>
+                <w:bdr w:val="none" w:sz="0" w:space="0" w:color="auto" w:frame="1"/>
               </w:rPr>
               <w:lastRenderedPageBreak/>
               <w:t>T5</w:t>
@@ -1186,6 +1131,7 @@
         <w:tc>
           <w:tcPr>
             <w:tcW w:w="0" w:type="auto"/>
+            <w:vAlign w:val="center"/>
             <w:hideMark/>
           </w:tcPr>
           <w:p>
@@ -1198,33 +1144,33 @@
             </w:pPr>
             <w:r>
               <w:rPr>
-                <w:rFonts w:ascii="Calibri" w:hAnsi="Calibri" w:cs="Calibri"/>
-                <w:b/>
-                <w:bCs/>
-                <w:lang w:val="en-US"/>
+                <w:b/>
+                <w:bCs/>
+                <w:color w:val="1F1F1F"/>
+                <w:bdr w:val="none" w:sz="0" w:space="0" w:color="auto" w:frame="1"/>
               </w:rPr>
               <w:t>Implementation</w:t>
             </w:r>
             <w:r>
               <w:rPr>
-                <w:rFonts w:ascii="Calibri" w:hAnsi="Calibri" w:cs="Calibri"/>
-                <w:lang w:val="en-US"/>
+                <w:color w:val="1F1F1F"/>
+                <w:bdr w:val="none" w:sz="0" w:space="0" w:color="auto" w:frame="1"/>
               </w:rPr>
               <w:t xml:space="preserve">: Populate </w:t>
             </w:r>
-            <w:proofErr w:type="spellStart"/>
-            <w:r>
-              <w:rPr>
-                <w:rFonts w:ascii="Calibri" w:hAnsi="Calibri" w:cs="Calibri"/>
-                <w:lang w:val="en-US"/>
+            <w:r>
+              <w:rPr>
+                <w:rStyle w:val="HTMLCode"/>
+                <w:rFonts w:eastAsiaTheme="majorEastAsia" w:cs="Arial"/>
+                <w:color w:val="444746"/>
+                <w:bdr w:val="none" w:sz="0" w:space="0" w:color="auto" w:frame="1"/>
               </w:rPr>
               <w:t>mockData.ts</w:t>
             </w:r>
-            <w:proofErr w:type="spellEnd"/>
-            <w:r>
-              <w:rPr>
-                <w:rFonts w:ascii="Calibri" w:hAnsi="Calibri" w:cs="Calibri"/>
-                <w:lang w:val="en-US"/>
+            <w:r>
+              <w:rPr>
+                <w:color w:val="1F1F1F"/>
+                <w:bdr w:val="none" w:sz="0" w:space="0" w:color="auto" w:frame="1"/>
               </w:rPr>
               <w:t xml:space="preserve"> with 3NF clinical entities.</w:t>
             </w:r>
@@ -1233,6 +1179,7 @@
         <w:tc>
           <w:tcPr>
             <w:tcW w:w="0" w:type="auto"/>
+            <w:vAlign w:val="center"/>
             <w:hideMark/>
           </w:tcPr>
           <w:p>
@@ -1245,8 +1192,8 @@
             </w:pPr>
             <w:r>
               <w:rPr>
-                <w:rFonts w:ascii="Calibri" w:hAnsi="Calibri" w:cs="Calibri"/>
-                <w:lang w:val="en-US"/>
+                <w:color w:val="1F1F1F"/>
+                <w:bdr w:val="none" w:sz="0" w:space="0" w:color="auto" w:frame="1"/>
               </w:rPr>
               <w:t>All</w:t>
             </w:r>
@@ -1255,6 +1202,7 @@
         <w:tc>
           <w:tcPr>
             <w:tcW w:w="0" w:type="auto"/>
+            <w:vAlign w:val="center"/>
             <w:hideMark/>
           </w:tcPr>
           <w:p>
@@ -1267,8 +1215,8 @@
             </w:pPr>
             <w:r>
               <w:rPr>
-                <w:rFonts w:ascii="Calibri" w:hAnsi="Calibri" w:cs="Calibri"/>
-                <w:lang w:val="en-US"/>
+                <w:color w:val="1F1F1F"/>
+                <w:bdr w:val="none" w:sz="0" w:space="0" w:color="auto" w:frame="1"/>
               </w:rPr>
               <w:t>2</w:t>
             </w:r>
@@ -1277,6 +1225,7 @@
         <w:tc>
           <w:tcPr>
             <w:tcW w:w="0" w:type="auto"/>
+            <w:vAlign w:val="center"/>
             <w:hideMark/>
           </w:tcPr>
           <w:p>
@@ -1289,10 +1238,10 @@
             </w:pPr>
             <w:r>
               <w:rPr>
-                <w:rFonts w:ascii="Calibri" w:hAnsi="Calibri" w:cs="Calibri"/>
-                <w:b/>
-                <w:bCs/>
-                <w:lang w:val="en-US"/>
+                <w:b/>
+                <w:bCs/>
+                <w:color w:val="1F1F1F"/>
+                <w:bdr w:val="none" w:sz="0" w:space="0" w:color="auto" w:frame="1"/>
               </w:rPr>
               <w:t>Complete</w:t>
             </w:r>
@@ -1301,6 +1250,7 @@
         <w:tc>
           <w:tcPr>
             <w:tcW w:w="0" w:type="auto"/>
+            <w:vAlign w:val="center"/>
             <w:hideMark/>
           </w:tcPr>
           <w:p>
@@ -1313,26 +1263,36 @@
             </w:pPr>
             <w:r>
               <w:rPr>
-                <w:rFonts w:ascii="Calibri" w:hAnsi="Calibri" w:cs="Calibri"/>
-                <w:lang w:val="en-US"/>
+                <w:rStyle w:val="citation-5126"/>
+                <w:color w:val="1F1F1F"/>
+                <w:bdr w:val="none" w:sz="0" w:space="0" w:color="auto" w:frame="1"/>
               </w:rPr>
               <w:t xml:space="preserve">Maps </w:t>
             </w:r>
             <w:r>
               <w:rPr>
-                <w:rFonts w:ascii="Calibri" w:hAnsi="Calibri" w:cs="Calibri"/>
-                <w:b/>
-                <w:bCs/>
-                <w:lang w:val="en-US"/>
+                <w:rStyle w:val="citation-5126"/>
+                <w:b/>
+                <w:bCs/>
+                <w:color w:val="1F1F1F"/>
+                <w:bdr w:val="none" w:sz="0" w:space="0" w:color="auto" w:frame="1"/>
               </w:rPr>
               <w:t>LDM</w:t>
             </w:r>
             <w:r>
               <w:rPr>
-                <w:rFonts w:ascii="Calibri" w:hAnsi="Calibri" w:cs="Calibri"/>
-                <w:lang w:val="en-US"/>
-              </w:rPr>
-              <w:t xml:space="preserve"> attributes to code.</w:t>
+                <w:rStyle w:val="citation-5126"/>
+                <w:color w:val="1F1F1F"/>
+                <w:bdr w:val="none" w:sz="0" w:space="0" w:color="auto" w:frame="1"/>
+              </w:rPr>
+              <w:t xml:space="preserve"> attributes to code</w:t>
+            </w:r>
+            <w:r>
+              <w:rPr>
+                <w:color w:val="1F1F1F"/>
+                <w:bdr w:val="none" w:sz="0" w:space="0" w:color="auto" w:frame="1"/>
+              </w:rPr>
+              <w:t>.</w:t>
             </w:r>
           </w:p>
         </w:tc>
@@ -1341,6 +1301,7 @@
         <w:tc>
           <w:tcPr>
             <w:tcW w:w="0" w:type="auto"/>
+            <w:vAlign w:val="center"/>
             <w:hideMark/>
           </w:tcPr>
           <w:p>
@@ -1353,10 +1314,10 @@
             </w:pPr>
             <w:r>
               <w:rPr>
-                <w:rFonts w:ascii="Calibri" w:hAnsi="Calibri" w:cs="Calibri"/>
-                <w:b/>
-                <w:bCs/>
-                <w:lang w:val="en-US"/>
+                <w:b/>
+                <w:bCs/>
+                <w:color w:val="1F1F1F"/>
+                <w:bdr w:val="none" w:sz="0" w:space="0" w:color="auto" w:frame="1"/>
               </w:rPr>
               <w:t>T11</w:t>
             </w:r>
@@ -1365,6 +1326,7 @@
         <w:tc>
           <w:tcPr>
             <w:tcW w:w="0" w:type="auto"/>
+            <w:vAlign w:val="center"/>
             <w:hideMark/>
           </w:tcPr>
           <w:p>
@@ -1377,49 +1339,49 @@
             </w:pPr>
             <w:r>
               <w:rPr>
-                <w:rFonts w:ascii="Calibri" w:hAnsi="Calibri" w:cs="Calibri"/>
-                <w:b/>
-                <w:bCs/>
-                <w:lang w:val="en-US"/>
+                <w:b/>
+                <w:bCs/>
+                <w:color w:val="1F1F1F"/>
+                <w:bdr w:val="none" w:sz="0" w:space="0" w:color="auto" w:frame="1"/>
               </w:rPr>
               <w:t>Security</w:t>
             </w:r>
             <w:r>
               <w:rPr>
-                <w:rFonts w:ascii="Calibri" w:hAnsi="Calibri" w:cs="Calibri"/>
-                <w:lang w:val="en-US"/>
+                <w:color w:val="1F1F1F"/>
+                <w:bdr w:val="none" w:sz="0" w:space="0" w:color="auto" w:frame="1"/>
               </w:rPr>
               <w:t xml:space="preserve">: Implement </w:t>
             </w:r>
-            <w:proofErr w:type="spellStart"/>
-            <w:r>
-              <w:rPr>
-                <w:rFonts w:ascii="Calibri" w:hAnsi="Calibri" w:cs="Calibri"/>
-                <w:lang w:val="en-US"/>
+            <w:r>
+              <w:rPr>
+                <w:rStyle w:val="HTMLCode"/>
+                <w:rFonts w:eastAsiaTheme="majorEastAsia" w:cs="Arial"/>
+                <w:color w:val="444746"/>
+                <w:bdr w:val="none" w:sz="0" w:space="0" w:color="auto" w:frame="1"/>
               </w:rPr>
               <w:t>bcryptjs</w:t>
             </w:r>
-            <w:proofErr w:type="spellEnd"/>
-            <w:r>
-              <w:rPr>
-                <w:rFonts w:ascii="Calibri" w:hAnsi="Calibri" w:cs="Calibri"/>
-                <w:lang w:val="en-US"/>
+            <w:r>
+              <w:rPr>
+                <w:color w:val="1F1F1F"/>
+                <w:bdr w:val="none" w:sz="0" w:space="0" w:color="auto" w:frame="1"/>
               </w:rPr>
               <w:t xml:space="preserve"> hashing for </w:t>
             </w:r>
-            <w:proofErr w:type="spellStart"/>
-            <w:r>
-              <w:rPr>
-                <w:rFonts w:ascii="Calibri" w:hAnsi="Calibri" w:cs="Calibri"/>
-                <w:lang w:val="en-US"/>
+            <w:r>
+              <w:rPr>
+                <w:rStyle w:val="HTMLCode"/>
+                <w:rFonts w:eastAsiaTheme="majorEastAsia" w:cs="Arial"/>
+                <w:color w:val="444746"/>
+                <w:bdr w:val="none" w:sz="0" w:space="0" w:color="auto" w:frame="1"/>
               </w:rPr>
               <w:t>password_hash</w:t>
             </w:r>
-            <w:proofErr w:type="spellEnd"/>
-            <w:r>
-              <w:rPr>
-                <w:rFonts w:ascii="Calibri" w:hAnsi="Calibri" w:cs="Calibri"/>
-                <w:lang w:val="en-US"/>
+            <w:r>
+              <w:rPr>
+                <w:color w:val="1F1F1F"/>
+                <w:bdr w:val="none" w:sz="0" w:space="0" w:color="auto" w:frame="1"/>
               </w:rPr>
               <w:t>.</w:t>
             </w:r>
@@ -1428,6 +1390,7 @@
         <w:tc>
           <w:tcPr>
             <w:tcW w:w="0" w:type="auto"/>
+            <w:vAlign w:val="center"/>
             <w:hideMark/>
           </w:tcPr>
           <w:p>
@@ -1440,8 +1403,8 @@
             </w:pPr>
             <w:r>
               <w:rPr>
-                <w:rFonts w:ascii="Calibri" w:hAnsi="Calibri" w:cs="Calibri"/>
-                <w:lang w:val="en-US"/>
+                <w:color w:val="1F1F1F"/>
+                <w:bdr w:val="none" w:sz="0" w:space="0" w:color="auto" w:frame="1"/>
               </w:rPr>
               <w:t>Story 01</w:t>
             </w:r>
@@ -1450,6 +1413,7 @@
         <w:tc>
           <w:tcPr>
             <w:tcW w:w="0" w:type="auto"/>
+            <w:vAlign w:val="center"/>
             <w:hideMark/>
           </w:tcPr>
           <w:p>
@@ -1462,8 +1426,8 @@
             </w:pPr>
             <w:r>
               <w:rPr>
-                <w:rFonts w:ascii="Calibri" w:hAnsi="Calibri" w:cs="Calibri"/>
-                <w:lang w:val="en-US"/>
+                <w:color w:val="1F1F1F"/>
+                <w:bdr w:val="none" w:sz="0" w:space="0" w:color="auto" w:frame="1"/>
               </w:rPr>
               <w:t>3</w:t>
             </w:r>
@@ -1472,6 +1436,7 @@
         <w:tc>
           <w:tcPr>
             <w:tcW w:w="0" w:type="auto"/>
+            <w:vAlign w:val="center"/>
             <w:hideMark/>
           </w:tcPr>
           <w:p>
@@ -1484,10 +1449,10 @@
             </w:pPr>
             <w:r>
               <w:rPr>
-                <w:rFonts w:ascii="Calibri" w:hAnsi="Calibri" w:cs="Calibri"/>
-                <w:b/>
-                <w:bCs/>
-                <w:lang w:val="en-US"/>
+                <w:b/>
+                <w:bCs/>
+                <w:color w:val="1F1F1F"/>
+                <w:bdr w:val="none" w:sz="0" w:space="0" w:color="auto" w:frame="1"/>
               </w:rPr>
               <w:t>Complete</w:t>
             </w:r>
@@ -1496,6 +1461,7 @@
         <w:tc>
           <w:tcPr>
             <w:tcW w:w="0" w:type="auto"/>
+            <w:vAlign w:val="center"/>
             <w:hideMark/>
           </w:tcPr>
           <w:p>
@@ -1508,42 +1474,54 @@
             </w:pPr>
             <w:r>
               <w:rPr>
-                <w:rFonts w:ascii="Calibri" w:hAnsi="Calibri" w:cs="Calibri"/>
-                <w:lang w:val="en-US"/>
+                <w:rStyle w:val="citation-5125"/>
+                <w:color w:val="1F1F1F"/>
+                <w:bdr w:val="none" w:sz="0" w:space="0" w:color="auto" w:frame="1"/>
               </w:rPr>
               <w:t xml:space="preserve">Fulfills </w:t>
             </w:r>
             <w:r>
               <w:rPr>
-                <w:rFonts w:ascii="Calibri" w:hAnsi="Calibri" w:cs="Calibri"/>
-                <w:b/>
-                <w:bCs/>
-                <w:lang w:val="en-US"/>
-              </w:rPr>
-              <w:t>NFR1 (Security)</w:t>
-            </w:r>
-            <w:r>
-              <w:rPr>
-                <w:rFonts w:ascii="Calibri" w:hAnsi="Calibri" w:cs="Calibri"/>
-                <w:lang w:val="en-US"/>
+                <w:rStyle w:val="citation-5125"/>
+                <w:b/>
+                <w:bCs/>
+                <w:color w:val="1F1F1F"/>
+                <w:bdr w:val="none" w:sz="0" w:space="0" w:color="auto" w:frame="1"/>
+              </w:rPr>
+              <w:t>NFR1</w:t>
+            </w:r>
+            <w:r>
+              <w:rPr>
+                <w:rStyle w:val="citation-5125"/>
+                <w:color w:val="1F1F1F"/>
+                <w:bdr w:val="none" w:sz="0" w:space="0" w:color="auto" w:frame="1"/>
               </w:rPr>
               <w:t xml:space="preserve"> and </w:t>
             </w:r>
             <w:r>
               <w:rPr>
-                <w:rFonts w:ascii="Calibri" w:hAnsi="Calibri" w:cs="Calibri"/>
-                <w:b/>
-                <w:bCs/>
-                <w:lang w:val="en-US"/>
-              </w:rPr>
-              <w:t>PSD</w:t>
-            </w:r>
-            <w:r>
-              <w:rPr>
-                <w:rFonts w:ascii="Calibri" w:hAnsi="Calibri" w:cs="Calibri"/>
-                <w:lang w:val="en-US"/>
-              </w:rPr>
-              <w:t xml:space="preserve"> commitments.</w:t>
+                <w:rStyle w:val="citation-5125"/>
+                <w:b/>
+                <w:bCs/>
+                <w:color w:val="1F1F1F"/>
+                <w:bdr w:val="none" w:sz="0" w:space="0" w:color="auto" w:frame="1"/>
+              </w:rPr>
+              <w:t>LDM</w:t>
+            </w:r>
+            <w:r>
+              <w:rPr>
+                <w:rStyle w:val="citation-5125"/>
+                <w:color w:val="1F1F1F"/>
+                <w:bdr w:val="none" w:sz="0" w:space="0" w:color="auto" w:frame="1"/>
+              </w:rPr>
+              <w:t xml:space="preserve"> constraints</w:t>
+            </w:r>
+            <w:r>
+              <w:rPr>
+                <w:color w:val="1F1F1F"/>
+                <w:bdr w:val="none" w:sz="0" w:space="0" w:color="auto" w:frame="1"/>
+              </w:rPr>
+              <w:t>.</w:t>
             </w:r>
           </w:p>
         </w:tc>
@@ -1552,6 +1530,7 @@
         <w:tc>
           <w:tcPr>
             <w:tcW w:w="0" w:type="auto"/>
+            <w:vAlign w:val="center"/>
             <w:hideMark/>
           </w:tcPr>
           <w:p>
@@ -1564,10 +1543,10 @@
             </w:pPr>
             <w:r>
               <w:rPr>
-                <w:rFonts w:ascii="Calibri" w:hAnsi="Calibri" w:cs="Calibri"/>
-                <w:b/>
-                <w:bCs/>
-                <w:lang w:val="en-US"/>
+                <w:b/>
+                <w:bCs/>
+                <w:color w:val="1F1F1F"/>
+                <w:bdr w:val="none" w:sz="0" w:space="0" w:color="auto" w:frame="1"/>
               </w:rPr>
               <w:t>T8</w:t>
             </w:r>
@@ -1576,6 +1555,7 @@
         <w:tc>
           <w:tcPr>
             <w:tcW w:w="0" w:type="auto"/>
+            <w:vAlign w:val="center"/>
             <w:hideMark/>
           </w:tcPr>
           <w:p>
@@ -1588,33 +1568,33 @@
             </w:pPr>
             <w:r>
               <w:rPr>
-                <w:rFonts w:ascii="Calibri" w:hAnsi="Calibri" w:cs="Calibri"/>
-                <w:b/>
-                <w:bCs/>
-                <w:lang w:val="en-US"/>
+                <w:b/>
+                <w:bCs/>
+                <w:color w:val="1F1F1F"/>
+                <w:bdr w:val="none" w:sz="0" w:space="0" w:color="auto" w:frame="1"/>
               </w:rPr>
               <w:t>TDD</w:t>
             </w:r>
             <w:r>
               <w:rPr>
-                <w:rFonts w:ascii="Calibri" w:hAnsi="Calibri" w:cs="Calibri"/>
-                <w:lang w:val="en-US"/>
+                <w:color w:val="1F1F1F"/>
+                <w:bdr w:val="none" w:sz="0" w:space="0" w:color="auto" w:frame="1"/>
               </w:rPr>
               <w:t xml:space="preserve">: Write Unit Tests for Login logic using the </w:t>
             </w:r>
             <w:r>
               <w:rPr>
-                <w:rFonts w:ascii="Calibri" w:hAnsi="Calibri" w:cs="Calibri"/>
-                <w:b/>
-                <w:bCs/>
-                <w:lang w:val="en-US"/>
+                <w:b/>
+                <w:bCs/>
+                <w:color w:val="1F1F1F"/>
+                <w:bdr w:val="none" w:sz="0" w:space="0" w:color="auto" w:frame="1"/>
               </w:rPr>
               <w:t>AAA pattern</w:t>
             </w:r>
             <w:r>
               <w:rPr>
-                <w:rFonts w:ascii="Calibri" w:hAnsi="Calibri" w:cs="Calibri"/>
-                <w:lang w:val="en-US"/>
+                <w:color w:val="1F1F1F"/>
+                <w:bdr w:val="none" w:sz="0" w:space="0" w:color="auto" w:frame="1"/>
               </w:rPr>
               <w:t>.</w:t>
             </w:r>
@@ -1623,6 +1603,7 @@
         <w:tc>
           <w:tcPr>
             <w:tcW w:w="0" w:type="auto"/>
+            <w:vAlign w:val="center"/>
             <w:hideMark/>
           </w:tcPr>
           <w:p>
@@ -1635,8 +1616,8 @@
             </w:pPr>
             <w:r>
               <w:rPr>
-                <w:rFonts w:ascii="Calibri" w:hAnsi="Calibri" w:cs="Calibri"/>
-                <w:lang w:val="en-US"/>
+                <w:color w:val="1F1F1F"/>
+                <w:bdr w:val="none" w:sz="0" w:space="0" w:color="auto" w:frame="1"/>
               </w:rPr>
               <w:t>Story 01</w:t>
             </w:r>
@@ -1645,6 +1626,7 @@
         <w:tc>
           <w:tcPr>
             <w:tcW w:w="0" w:type="auto"/>
+            <w:vAlign w:val="center"/>
             <w:hideMark/>
           </w:tcPr>
           <w:p>
@@ -1657,8 +1639,8 @@
             </w:pPr>
             <w:r>
               <w:rPr>
-                <w:rFonts w:ascii="Calibri" w:hAnsi="Calibri" w:cs="Calibri"/>
-                <w:lang w:val="en-US"/>
+                <w:color w:val="1F1F1F"/>
+                <w:bdr w:val="none" w:sz="0" w:space="0" w:color="auto" w:frame="1"/>
               </w:rPr>
               <w:t>3</w:t>
             </w:r>
@@ -1667,6 +1649,7 @@
         <w:tc>
           <w:tcPr>
             <w:tcW w:w="0" w:type="auto"/>
+            <w:vAlign w:val="center"/>
             <w:hideMark/>
           </w:tcPr>
           <w:p>
@@ -1679,10 +1662,10 @@
             </w:pPr>
             <w:r>
               <w:rPr>
-                <w:rFonts w:ascii="Calibri" w:hAnsi="Calibri" w:cs="Calibri"/>
-                <w:b/>
-                <w:bCs/>
-                <w:lang w:val="en-US"/>
+                <w:b/>
+                <w:bCs/>
+                <w:color w:val="1F1F1F"/>
+                <w:bdr w:val="none" w:sz="0" w:space="0" w:color="auto" w:frame="1"/>
               </w:rPr>
               <w:t>Complete</w:t>
             </w:r>
@@ -1691,6 +1674,7 @@
         <w:tc>
           <w:tcPr>
             <w:tcW w:w="0" w:type="auto"/>
+            <w:vAlign w:val="center"/>
             <w:hideMark/>
           </w:tcPr>
           <w:p>
@@ -1703,10 +1687,18 @@
             </w:pPr>
             <w:r>
               <w:rPr>
-                <w:rFonts w:ascii="Calibri" w:hAnsi="Calibri" w:cs="Calibri"/>
-                <w:lang w:val="en-US"/>
-              </w:rPr>
-              <w:t>Proves 100% pass rate on core functional tests.</w:t>
+                <w:rStyle w:val="citation-5124"/>
+                <w:color w:val="1F1F1F"/>
+                <w:bdr w:val="none" w:sz="0" w:space="0" w:color="auto" w:frame="1"/>
+              </w:rPr>
+              <w:t>Proves 100% pass rate on core tests</w:t>
+            </w:r>
+            <w:r>
+              <w:rPr>
+                <w:color w:val="1F1F1F"/>
+                <w:bdr w:val="none" w:sz="0" w:space="0" w:color="auto" w:frame="1"/>
+              </w:rPr>
+              <w:t>.</w:t>
             </w:r>
           </w:p>
         </w:tc>
@@ -1715,6 +1707,7 @@
         <w:tc>
           <w:tcPr>
             <w:tcW w:w="0" w:type="auto"/>
+            <w:vAlign w:val="center"/>
             <w:hideMark/>
           </w:tcPr>
           <w:p>
@@ -1727,10 +1720,10 @@
             </w:pPr>
             <w:r>
               <w:rPr>
-                <w:rFonts w:ascii="Calibri" w:hAnsi="Calibri" w:cs="Calibri"/>
-                <w:b/>
-                <w:bCs/>
-                <w:lang w:val="en-US"/>
+                <w:b/>
+                <w:bCs/>
+                <w:color w:val="1F1F1F"/>
+                <w:bdr w:val="none" w:sz="0" w:space="0" w:color="auto" w:frame="1"/>
               </w:rPr>
               <w:t>T6</w:t>
             </w:r>
@@ -1739,6 +1732,7 @@
         <w:tc>
           <w:tcPr>
             <w:tcW w:w="0" w:type="auto"/>
+            <w:vAlign w:val="center"/>
             <w:hideMark/>
           </w:tcPr>
           <w:p>
@@ -1751,57 +1745,42 @@
             </w:pPr>
             <w:r>
               <w:rPr>
-                <w:rFonts w:ascii="Calibri" w:hAnsi="Calibri" w:cs="Calibri"/>
-                <w:b/>
-                <w:bCs/>
-                <w:lang w:val="en-US"/>
+                <w:b/>
+                <w:bCs/>
+                <w:color w:val="1F1F1F"/>
+                <w:bdr w:val="none" w:sz="0" w:space="0" w:color="auto" w:frame="1"/>
               </w:rPr>
               <w:t>Security</w:t>
             </w:r>
             <w:r>
               <w:rPr>
-                <w:rFonts w:ascii="Calibri" w:hAnsi="Calibri" w:cs="Calibri"/>
-                <w:lang w:val="en-US"/>
+                <w:color w:val="1F1F1F"/>
+                <w:bdr w:val="none" w:sz="0" w:space="0" w:color="auto" w:frame="1"/>
               </w:rPr>
               <w:t xml:space="preserve">: Build </w:t>
             </w:r>
-            <w:proofErr w:type="spellStart"/>
-            <w:r>
-              <w:rPr>
-                <w:rFonts w:ascii="Calibri" w:hAnsi="Calibri" w:cs="Calibri"/>
-                <w:lang w:val="en-US"/>
+            <w:r>
+              <w:rPr>
+                <w:rStyle w:val="HTMLCode"/>
+                <w:rFonts w:eastAsiaTheme="majorEastAsia" w:cs="Arial"/>
+                <w:color w:val="444746"/>
+                <w:bdr w:val="none" w:sz="0" w:space="0" w:color="auto" w:frame="1"/>
               </w:rPr>
               <w:t>hooks.server.ts</w:t>
             </w:r>
-            <w:proofErr w:type="spellEnd"/>
-            <w:r>
-              <w:rPr>
-                <w:rFonts w:ascii="Calibri" w:hAnsi="Calibri" w:cs="Calibri"/>
-                <w:lang w:val="en-US"/>
-              </w:rPr>
-              <w:t xml:space="preserve"> and +</w:t>
-            </w:r>
-            <w:proofErr w:type="spellStart"/>
-            <w:r>
-              <w:rPr>
-                <w:rFonts w:ascii="Calibri" w:hAnsi="Calibri" w:cs="Calibri"/>
-                <w:lang w:val="en-US"/>
-              </w:rPr>
-              <w:t>page.server.ts</w:t>
-            </w:r>
-            <w:proofErr w:type="spellEnd"/>
-            <w:r>
-              <w:rPr>
-                <w:rFonts w:ascii="Calibri" w:hAnsi="Calibri" w:cs="Calibri"/>
-                <w:lang w:val="en-US"/>
-              </w:rPr>
-              <w:t xml:space="preserve"> for auth.</w:t>
-            </w:r>
-          </w:p>
-        </w:tc>
-        <w:tc>
-          <w:tcPr>
-            <w:tcW w:w="0" w:type="auto"/>
+            <w:r>
+              <w:rPr>
+                <w:color w:val="1F1F1F"/>
+                <w:bdr w:val="none" w:sz="0" w:space="0" w:color="auto" w:frame="1"/>
+              </w:rPr>
+              <w:t xml:space="preserve"> session validation.</w:t>
+            </w:r>
+          </w:p>
+        </w:tc>
+        <w:tc>
+          <w:tcPr>
+            <w:tcW w:w="0" w:type="auto"/>
+            <w:vAlign w:val="center"/>
             <w:hideMark/>
           </w:tcPr>
           <w:p>
@@ -1814,8 +1793,8 @@
             </w:pPr>
             <w:r>
               <w:rPr>
-                <w:rFonts w:ascii="Calibri" w:hAnsi="Calibri" w:cs="Calibri"/>
-                <w:lang w:val="en-US"/>
+                <w:color w:val="1F1F1F"/>
+                <w:bdr w:val="none" w:sz="0" w:space="0" w:color="auto" w:frame="1"/>
               </w:rPr>
               <w:t>Story 01</w:t>
             </w:r>
@@ -1824,6 +1803,7 @@
         <w:tc>
           <w:tcPr>
             <w:tcW w:w="0" w:type="auto"/>
+            <w:vAlign w:val="center"/>
             <w:hideMark/>
           </w:tcPr>
           <w:p>
@@ -1836,8 +1816,8 @@
             </w:pPr>
             <w:r>
               <w:rPr>
-                <w:rFonts w:ascii="Calibri" w:hAnsi="Calibri" w:cs="Calibri"/>
-                <w:lang w:val="en-US"/>
+                <w:color w:val="1F1F1F"/>
+                <w:bdr w:val="none" w:sz="0" w:space="0" w:color="auto" w:frame="1"/>
               </w:rPr>
               <w:t>3</w:t>
             </w:r>
@@ -1846,6 +1826,7 @@
         <w:tc>
           <w:tcPr>
             <w:tcW w:w="0" w:type="auto"/>
+            <w:vAlign w:val="center"/>
             <w:hideMark/>
           </w:tcPr>
           <w:p>
@@ -1858,10 +1839,10 @@
             </w:pPr>
             <w:r>
               <w:rPr>
-                <w:rFonts w:ascii="Calibri" w:hAnsi="Calibri" w:cs="Calibri"/>
-                <w:b/>
-                <w:bCs/>
-                <w:lang w:val="en-US"/>
+                <w:b/>
+                <w:bCs/>
+                <w:color w:val="1F1F1F"/>
+                <w:bdr w:val="none" w:sz="0" w:space="0" w:color="auto" w:frame="1"/>
               </w:rPr>
               <w:t>Complete</w:t>
             </w:r>
@@ -1870,6 +1851,7 @@
         <w:tc>
           <w:tcPr>
             <w:tcW w:w="0" w:type="auto"/>
+            <w:vAlign w:val="center"/>
             <w:hideMark/>
           </w:tcPr>
           <w:p>
@@ -1882,26 +1864,18 @@
             </w:pPr>
             <w:r>
               <w:rPr>
-                <w:rFonts w:ascii="Calibri" w:hAnsi="Calibri" w:cs="Calibri"/>
-                <w:lang w:val="en-US"/>
-              </w:rPr>
-              <w:t xml:space="preserve">Implements </w:t>
-            </w:r>
-            <w:r>
-              <w:rPr>
-                <w:rFonts w:ascii="Calibri" w:hAnsi="Calibri" w:cs="Calibri"/>
-                <w:b/>
-                <w:bCs/>
-                <w:lang w:val="en-US"/>
-              </w:rPr>
-              <w:t>FR1</w:t>
-            </w:r>
-            <w:r>
-              <w:rPr>
-                <w:rFonts w:ascii="Calibri" w:hAnsi="Calibri" w:cs="Calibri"/>
-                <w:lang w:val="en-US"/>
-              </w:rPr>
-              <w:t xml:space="preserve"> server-side session protection.</w:t>
+                <w:rStyle w:val="citation-5123"/>
+                <w:color w:val="1F1F1F"/>
+                <w:bdr w:val="none" w:sz="0" w:space="0" w:color="auto" w:frame="1"/>
+              </w:rPr>
+              <w:t>Implements server-side protection</w:t>
+            </w:r>
+            <w:r>
+              <w:rPr>
+                <w:color w:val="1F1F1F"/>
+                <w:bdr w:val="none" w:sz="0" w:space="0" w:color="auto" w:frame="1"/>
+              </w:rPr>
+              <w:t>.</w:t>
             </w:r>
           </w:p>
         </w:tc>
@@ -1910,6 +1884,7 @@
         <w:tc>
           <w:tcPr>
             <w:tcW w:w="0" w:type="auto"/>
+            <w:vAlign w:val="center"/>
             <w:hideMark/>
           </w:tcPr>
           <w:p>
@@ -1922,10 +1897,10 @@
             </w:pPr>
             <w:r>
               <w:rPr>
-                <w:rFonts w:ascii="Calibri" w:hAnsi="Calibri" w:cs="Calibri"/>
-                <w:b/>
-                <w:bCs/>
-                <w:lang w:val="en-US"/>
+                <w:b/>
+                <w:bCs/>
+                <w:color w:val="1F1F1F"/>
+                <w:bdr w:val="none" w:sz="0" w:space="0" w:color="auto" w:frame="1"/>
               </w:rPr>
               <w:t>T7</w:t>
             </w:r>
@@ -1934,6 +1909,7 @@
         <w:tc>
           <w:tcPr>
             <w:tcW w:w="0" w:type="auto"/>
+            <w:vAlign w:val="center"/>
             <w:hideMark/>
           </w:tcPr>
           <w:p>
@@ -1946,17 +1922,17 @@
             </w:pPr>
             <w:r>
               <w:rPr>
-                <w:rFonts w:ascii="Calibri" w:hAnsi="Calibri" w:cs="Calibri"/>
-                <w:b/>
-                <w:bCs/>
-                <w:lang w:val="en-US"/>
+                <w:b/>
+                <w:bCs/>
+                <w:color w:val="1F1F1F"/>
+                <w:bdr w:val="none" w:sz="0" w:space="0" w:color="auto" w:frame="1"/>
               </w:rPr>
               <w:t>Frontend</w:t>
             </w:r>
             <w:r>
               <w:rPr>
-                <w:rFonts w:ascii="Calibri" w:hAnsi="Calibri" w:cs="Calibri"/>
-                <w:lang w:val="en-US"/>
+                <w:color w:val="1F1F1F"/>
+                <w:bdr w:val="none" w:sz="0" w:space="0" w:color="auto" w:frame="1"/>
               </w:rPr>
               <w:t>: Build Login UI and Dashboard navigation.</w:t>
             </w:r>
@@ -1965,6 +1941,7 @@
         <w:tc>
           <w:tcPr>
             <w:tcW w:w="0" w:type="auto"/>
+            <w:vAlign w:val="center"/>
             <w:hideMark/>
           </w:tcPr>
           <w:p>
@@ -1977,8 +1954,8 @@
             </w:pPr>
             <w:r>
               <w:rPr>
-                <w:rFonts w:ascii="Calibri" w:hAnsi="Calibri" w:cs="Calibri"/>
-                <w:lang w:val="en-US"/>
+                <w:color w:val="1F1F1F"/>
+                <w:bdr w:val="none" w:sz="0" w:space="0" w:color="auto" w:frame="1"/>
               </w:rPr>
               <w:t>Story 01</w:t>
             </w:r>
@@ -1987,6 +1964,7 @@
         <w:tc>
           <w:tcPr>
             <w:tcW w:w="0" w:type="auto"/>
+            <w:vAlign w:val="center"/>
             <w:hideMark/>
           </w:tcPr>
           <w:p>
@@ -1999,8 +1977,8 @@
             </w:pPr>
             <w:r>
               <w:rPr>
-                <w:rFonts w:ascii="Calibri" w:hAnsi="Calibri" w:cs="Calibri"/>
-                <w:lang w:val="en-US"/>
+                <w:color w:val="1F1F1F"/>
+                <w:bdr w:val="none" w:sz="0" w:space="0" w:color="auto" w:frame="1"/>
               </w:rPr>
               <w:t>3</w:t>
             </w:r>
@@ -2009,6 +1987,7 @@
         <w:tc>
           <w:tcPr>
             <w:tcW w:w="0" w:type="auto"/>
+            <w:vAlign w:val="center"/>
             <w:hideMark/>
           </w:tcPr>
           <w:p>
@@ -2021,10 +2000,10 @@
             </w:pPr>
             <w:r>
               <w:rPr>
-                <w:rFonts w:ascii="Calibri" w:hAnsi="Calibri" w:cs="Calibri"/>
-                <w:b/>
-                <w:bCs/>
-                <w:lang w:val="en-US"/>
+                <w:b/>
+                <w:bCs/>
+                <w:color w:val="1F1F1F"/>
+                <w:bdr w:val="none" w:sz="0" w:space="0" w:color="auto" w:frame="1"/>
               </w:rPr>
               <w:t>Complete</w:t>
             </w:r>
@@ -2033,6 +2012,7 @@
         <w:tc>
           <w:tcPr>
             <w:tcW w:w="0" w:type="auto"/>
+            <w:vAlign w:val="center"/>
             <w:hideMark/>
           </w:tcPr>
           <w:p>
@@ -2045,26 +2025,46 @@
             </w:pPr>
             <w:r>
               <w:rPr>
-                <w:rFonts w:ascii="Calibri" w:hAnsi="Calibri" w:cs="Calibri"/>
-                <w:lang w:val="en-US"/>
+                <w:rStyle w:val="citation-5122"/>
+                <w:color w:val="1F1F1F"/>
+                <w:bdr w:val="none" w:sz="0" w:space="0" w:color="auto" w:frame="1"/>
               </w:rPr>
               <w:t xml:space="preserve">Fulfills </w:t>
             </w:r>
             <w:r>
               <w:rPr>
-                <w:rFonts w:ascii="Calibri" w:hAnsi="Calibri" w:cs="Calibri"/>
-                <w:b/>
-                <w:bCs/>
-                <w:lang w:val="en-US"/>
+                <w:rStyle w:val="citation-5122"/>
+                <w:b/>
+                <w:bCs/>
+                <w:color w:val="1F1F1F"/>
+                <w:bdr w:val="none" w:sz="0" w:space="0" w:color="auto" w:frame="1"/>
+              </w:rPr>
+              <w:t>FR1</w:t>
+            </w:r>
+            <w:r>
+              <w:rPr>
+                <w:rStyle w:val="citation-5122"/>
+                <w:color w:val="1F1F1F"/>
+                <w:bdr w:val="none" w:sz="0" w:space="0" w:color="auto" w:frame="1"/>
+              </w:rPr>
+              <w:t xml:space="preserve"> and </w:t>
+            </w:r>
+            <w:r>
+              <w:rPr>
+                <w:rStyle w:val="citation-5122"/>
+                <w:b/>
+                <w:bCs/>
+                <w:color w:val="1F1F1F"/>
+                <w:bdr w:val="none" w:sz="0" w:space="0" w:color="auto" w:frame="1"/>
               </w:rPr>
               <w:t>Story 01</w:t>
             </w:r>
             <w:r>
               <w:rPr>
-                <w:rFonts w:ascii="Calibri" w:hAnsi="Calibri" w:cs="Calibri"/>
-                <w:lang w:val="en-US"/>
-              </w:rPr>
-              <w:t xml:space="preserve"> and wireframe Screen 1.</w:t>
+                <w:color w:val="1F1F1F"/>
+                <w:bdr w:val="none" w:sz="0" w:space="0" w:color="auto" w:frame="1"/>
+              </w:rPr>
+              <w:t>.</w:t>
             </w:r>
           </w:p>
         </w:tc>
@@ -2073,6 +2073,7 @@
         <w:tc>
           <w:tcPr>
             <w:tcW w:w="0" w:type="auto"/>
+            <w:vAlign w:val="center"/>
             <w:hideMark/>
           </w:tcPr>
           <w:p>
@@ -2085,10 +2086,10 @@
             </w:pPr>
             <w:r>
               <w:rPr>
-                <w:rFonts w:ascii="Calibri" w:hAnsi="Calibri" w:cs="Calibri"/>
-                <w:b/>
-                <w:bCs/>
-                <w:lang w:val="en-US"/>
+                <w:b/>
+                <w:bCs/>
+                <w:color w:val="1F1F1F"/>
+                <w:bdr w:val="none" w:sz="0" w:space="0" w:color="auto" w:frame="1"/>
               </w:rPr>
               <w:t>T9</w:t>
             </w:r>
@@ -2097,6 +2098,7 @@
         <w:tc>
           <w:tcPr>
             <w:tcW w:w="0" w:type="auto"/>
+            <w:vAlign w:val="center"/>
             <w:hideMark/>
           </w:tcPr>
           <w:p>
@@ -2109,25 +2111,42 @@
             </w:pPr>
             <w:r>
               <w:rPr>
-                <w:rFonts w:ascii="Calibri" w:hAnsi="Calibri" w:cs="Calibri"/>
-                <w:b/>
-                <w:bCs/>
-                <w:lang w:val="en-US"/>
+                <w:b/>
+                <w:bCs/>
+                <w:color w:val="1F1F1F"/>
+                <w:bdr w:val="none" w:sz="0" w:space="0" w:color="auto" w:frame="1"/>
               </w:rPr>
               <w:t>Logic</w:t>
             </w:r>
             <w:r>
               <w:rPr>
-                <w:rFonts w:ascii="Calibri" w:hAnsi="Calibri" w:cs="Calibri"/>
-                <w:lang w:val="en-US"/>
-              </w:rPr>
-              <w:t>: Build reactive ACT_SCHEDULING_ENGINE ticker.</w:t>
-            </w:r>
-          </w:p>
-        </w:tc>
-        <w:tc>
-          <w:tcPr>
-            <w:tcW w:w="0" w:type="auto"/>
+                <w:color w:val="1F1F1F"/>
+                <w:bdr w:val="none" w:sz="0" w:space="0" w:color="auto" w:frame="1"/>
+              </w:rPr>
+              <w:t xml:space="preserve">: Build reactive </w:t>
+            </w:r>
+            <w:r>
+              <w:rPr>
+                <w:rStyle w:val="HTMLCode"/>
+                <w:rFonts w:eastAsiaTheme="majorEastAsia" w:cs="Arial"/>
+                <w:color w:val="444746"/>
+                <w:bdr w:val="none" w:sz="0" w:space="0" w:color="auto" w:frame="1"/>
+              </w:rPr>
+              <w:t>ACT_SCHEDULING_ENGINE</w:t>
+            </w:r>
+            <w:r>
+              <w:rPr>
+                <w:color w:val="1F1F1F"/>
+                <w:bdr w:val="none" w:sz="0" w:space="0" w:color="auto" w:frame="1"/>
+              </w:rPr>
+              <w:t xml:space="preserve"> ticker.</w:t>
+            </w:r>
+          </w:p>
+        </w:tc>
+        <w:tc>
+          <w:tcPr>
+            <w:tcW w:w="0" w:type="auto"/>
+            <w:vAlign w:val="center"/>
             <w:hideMark/>
           </w:tcPr>
           <w:p>
@@ -2140,8 +2159,8 @@
             </w:pPr>
             <w:r>
               <w:rPr>
-                <w:rFonts w:ascii="Calibri" w:hAnsi="Calibri" w:cs="Calibri"/>
-                <w:lang w:val="en-US"/>
+                <w:color w:val="1F1F1F"/>
+                <w:bdr w:val="none" w:sz="0" w:space="0" w:color="auto" w:frame="1"/>
               </w:rPr>
               <w:t>Story 02</w:t>
             </w:r>
@@ -2150,6 +2169,7 @@
         <w:tc>
           <w:tcPr>
             <w:tcW w:w="0" w:type="auto"/>
+            <w:vAlign w:val="center"/>
             <w:hideMark/>
           </w:tcPr>
           <w:p>
@@ -2162,8 +2182,8 @@
             </w:pPr>
             <w:r>
               <w:rPr>
-                <w:rFonts w:ascii="Calibri" w:hAnsi="Calibri" w:cs="Calibri"/>
-                <w:lang w:val="en-US"/>
+                <w:color w:val="1F1F1F"/>
+                <w:bdr w:val="none" w:sz="0" w:space="0" w:color="auto" w:frame="1"/>
               </w:rPr>
               <w:t>5</w:t>
             </w:r>
@@ -2172,6 +2192,7 @@
         <w:tc>
           <w:tcPr>
             <w:tcW w:w="0" w:type="auto"/>
+            <w:vAlign w:val="center"/>
             <w:hideMark/>
           </w:tcPr>
           <w:p>
@@ -2184,10 +2205,10 @@
             </w:pPr>
             <w:r>
               <w:rPr>
-                <w:rFonts w:ascii="Calibri" w:hAnsi="Calibri" w:cs="Calibri"/>
-                <w:b/>
-                <w:bCs/>
-                <w:lang w:val="en-US"/>
+                <w:b/>
+                <w:bCs/>
+                <w:color w:val="1F1F1F"/>
+                <w:bdr w:val="none" w:sz="0" w:space="0" w:color="auto" w:frame="1"/>
               </w:rPr>
               <w:t>Complete</w:t>
             </w:r>
@@ -2196,6 +2217,7 @@
         <w:tc>
           <w:tcPr>
             <w:tcW w:w="0" w:type="auto"/>
+            <w:vAlign w:val="center"/>
             <w:hideMark/>
           </w:tcPr>
           <w:p>
@@ -2208,40 +2230,44 @@
             </w:pPr>
             <w:r>
               <w:rPr>
-                <w:rFonts w:ascii="Calibri" w:hAnsi="Calibri" w:cs="Calibri"/>
-                <w:lang w:val="en-US"/>
+                <w:rStyle w:val="citation-5121"/>
+                <w:color w:val="1F1F1F"/>
+                <w:bdr w:val="none" w:sz="0" w:space="0" w:color="auto" w:frame="1"/>
               </w:rPr>
               <w:t xml:space="preserve">Fulfills </w:t>
             </w:r>
             <w:r>
               <w:rPr>
-                <w:rFonts w:ascii="Calibri" w:hAnsi="Calibri" w:cs="Calibri"/>
-                <w:b/>
-                <w:bCs/>
-                <w:lang w:val="en-US"/>
+                <w:rStyle w:val="citation-5121"/>
+                <w:b/>
+                <w:bCs/>
+                <w:color w:val="1F1F1F"/>
+                <w:bdr w:val="none" w:sz="0" w:space="0" w:color="auto" w:frame="1"/>
               </w:rPr>
               <w:t>FR2</w:t>
             </w:r>
             <w:r>
               <w:rPr>
-                <w:rFonts w:ascii="Calibri" w:hAnsi="Calibri" w:cs="Calibri"/>
-                <w:lang w:val="en-US"/>
+                <w:rStyle w:val="citation-5121"/>
+                <w:color w:val="1F1F1F"/>
+                <w:bdr w:val="none" w:sz="0" w:space="0" w:color="auto" w:frame="1"/>
               </w:rPr>
               <w:t xml:space="preserve"> and </w:t>
             </w:r>
             <w:r>
               <w:rPr>
-                <w:rFonts w:ascii="Calibri" w:hAnsi="Calibri" w:cs="Calibri"/>
-                <w:b/>
-                <w:bCs/>
-                <w:lang w:val="en-US"/>
-              </w:rPr>
-              <w:t>NFR2 (Availability)</w:t>
-            </w:r>
-            <w:r>
-              <w:rPr>
-                <w:rFonts w:ascii="Calibri" w:hAnsi="Calibri" w:cs="Calibri"/>
-                <w:lang w:val="en-US"/>
+                <w:rStyle w:val="citation-5121"/>
+                <w:b/>
+                <w:bCs/>
+                <w:color w:val="1F1F1F"/>
+                <w:bdr w:val="none" w:sz="0" w:space="0" w:color="auto" w:frame="1"/>
+              </w:rPr>
+              <w:t>NFR2</w:t>
+            </w:r>
+            <w:r>
+              <w:rPr>
+                <w:color w:val="1F1F1F"/>
+                <w:bdr w:val="none" w:sz="0" w:space="0" w:color="auto" w:frame="1"/>
               </w:rPr>
               <w:t>.</w:t>
             </w:r>
@@ -2252,6 +2278,7 @@
         <w:tc>
           <w:tcPr>
             <w:tcW w:w="0" w:type="auto"/>
+            <w:vAlign w:val="center"/>
             <w:hideMark/>
           </w:tcPr>
           <w:p>
@@ -2264,10 +2291,10 @@
             </w:pPr>
             <w:r>
               <w:rPr>
-                <w:rFonts w:ascii="Calibri" w:hAnsi="Calibri" w:cs="Calibri"/>
-                <w:b/>
-                <w:bCs/>
-                <w:lang w:val="en-US"/>
+                <w:b/>
+                <w:bCs/>
+                <w:color w:val="1F1F1F"/>
+                <w:bdr w:val="none" w:sz="0" w:space="0" w:color="auto" w:frame="1"/>
               </w:rPr>
               <w:t>T12</w:t>
             </w:r>
@@ -2276,6 +2303,7 @@
         <w:tc>
           <w:tcPr>
             <w:tcW w:w="0" w:type="auto"/>
+            <w:vAlign w:val="center"/>
             <w:hideMark/>
           </w:tcPr>
           <w:p>
@@ -2288,25 +2316,42 @@
             </w:pPr>
             <w:r>
               <w:rPr>
-                <w:rFonts w:ascii="Calibri" w:hAnsi="Calibri" w:cs="Calibri"/>
-                <w:b/>
-                <w:bCs/>
-                <w:lang w:val="en-US"/>
+                <w:b/>
+                <w:bCs/>
+                <w:color w:val="1F1F1F"/>
+                <w:bdr w:val="none" w:sz="0" w:space="0" w:color="auto" w:frame="1"/>
               </w:rPr>
               <w:t>Implementation</w:t>
             </w:r>
             <w:r>
               <w:rPr>
-                <w:rFonts w:ascii="Calibri" w:hAnsi="Calibri" w:cs="Calibri"/>
-                <w:lang w:val="en-US"/>
-              </w:rPr>
-              <w:t>: Build ACT_RECORD_FETCHER portal logic.</w:t>
-            </w:r>
-          </w:p>
-        </w:tc>
-        <w:tc>
-          <w:tcPr>
-            <w:tcW w:w="0" w:type="auto"/>
+                <w:color w:val="1F1F1F"/>
+                <w:bdr w:val="none" w:sz="0" w:space="0" w:color="auto" w:frame="1"/>
+              </w:rPr>
+              <w:t xml:space="preserve">: Build </w:t>
+            </w:r>
+            <w:r>
+              <w:rPr>
+                <w:rStyle w:val="HTMLCode"/>
+                <w:rFonts w:eastAsiaTheme="majorEastAsia" w:cs="Arial"/>
+                <w:color w:val="444746"/>
+                <w:bdr w:val="none" w:sz="0" w:space="0" w:color="auto" w:frame="1"/>
+              </w:rPr>
+              <w:t>ACT_RECORD_FETCHER</w:t>
+            </w:r>
+            <w:r>
+              <w:rPr>
+                <w:color w:val="1F1F1F"/>
+                <w:bdr w:val="none" w:sz="0" w:space="0" w:color="auto" w:frame="1"/>
+              </w:rPr>
+              <w:t xml:space="preserve"> portal logic.</w:t>
+            </w:r>
+          </w:p>
+        </w:tc>
+        <w:tc>
+          <w:tcPr>
+            <w:tcW w:w="0" w:type="auto"/>
+            <w:vAlign w:val="center"/>
             <w:hideMark/>
           </w:tcPr>
           <w:p>
@@ -2319,8 +2364,8 @@
             </w:pPr>
             <w:r>
               <w:rPr>
-                <w:rFonts w:ascii="Calibri" w:hAnsi="Calibri" w:cs="Calibri"/>
-                <w:lang w:val="en-US"/>
+                <w:color w:val="1F1F1F"/>
+                <w:bdr w:val="none" w:sz="0" w:space="0" w:color="auto" w:frame="1"/>
               </w:rPr>
               <w:t>Story 04</w:t>
             </w:r>
@@ -2329,6 +2374,7 @@
         <w:tc>
           <w:tcPr>
             <w:tcW w:w="0" w:type="auto"/>
+            <w:vAlign w:val="center"/>
             <w:hideMark/>
           </w:tcPr>
           <w:p>
@@ -2341,8 +2387,8 @@
             </w:pPr>
             <w:r>
               <w:rPr>
-                <w:rFonts w:ascii="Calibri" w:hAnsi="Calibri" w:cs="Calibri"/>
-                <w:lang w:val="en-US"/>
+                <w:color w:val="1F1F1F"/>
+                <w:bdr w:val="none" w:sz="0" w:space="0" w:color="auto" w:frame="1"/>
               </w:rPr>
               <w:t>5</w:t>
             </w:r>
@@ -2351,6 +2397,7 @@
         <w:tc>
           <w:tcPr>
             <w:tcW w:w="0" w:type="auto"/>
+            <w:vAlign w:val="center"/>
             <w:hideMark/>
           </w:tcPr>
           <w:p>
@@ -2363,10 +2410,10 @@
             </w:pPr>
             <w:r>
               <w:rPr>
-                <w:rFonts w:ascii="Calibri" w:hAnsi="Calibri" w:cs="Calibri"/>
-                <w:b/>
-                <w:bCs/>
-                <w:lang w:val="en-US"/>
+                <w:b/>
+                <w:bCs/>
+                <w:color w:val="1F1F1F"/>
+                <w:bdr w:val="none" w:sz="0" w:space="0" w:color="auto" w:frame="1"/>
               </w:rPr>
               <w:t>Complete</w:t>
             </w:r>
@@ -2375,6 +2422,7 @@
         <w:tc>
           <w:tcPr>
             <w:tcW w:w="0" w:type="auto"/>
+            <w:vAlign w:val="center"/>
             <w:hideMark/>
           </w:tcPr>
           <w:p>
@@ -2387,40 +2435,44 @@
             </w:pPr>
             <w:r>
               <w:rPr>
-                <w:rFonts w:ascii="Calibri" w:hAnsi="Calibri" w:cs="Calibri"/>
-                <w:lang w:val="en-US"/>
+                <w:rStyle w:val="citation-5120"/>
+                <w:color w:val="1F1F1F"/>
+                <w:bdr w:val="none" w:sz="0" w:space="0" w:color="auto" w:frame="1"/>
               </w:rPr>
               <w:t xml:space="preserve">Fulfills </w:t>
             </w:r>
             <w:r>
               <w:rPr>
-                <w:rFonts w:ascii="Calibri" w:hAnsi="Calibri" w:cs="Calibri"/>
-                <w:b/>
-                <w:bCs/>
-                <w:lang w:val="en-US"/>
+                <w:rStyle w:val="citation-5120"/>
+                <w:b/>
+                <w:bCs/>
+                <w:color w:val="1F1F1F"/>
+                <w:bdr w:val="none" w:sz="0" w:space="0" w:color="auto" w:frame="1"/>
               </w:rPr>
               <w:t>FR4</w:t>
             </w:r>
             <w:r>
               <w:rPr>
-                <w:rFonts w:ascii="Calibri" w:hAnsi="Calibri" w:cs="Calibri"/>
-                <w:lang w:val="en-US"/>
+                <w:rStyle w:val="citation-5120"/>
+                <w:color w:val="1F1F1F"/>
+                <w:bdr w:val="none" w:sz="0" w:space="0" w:color="auto" w:frame="1"/>
               </w:rPr>
               <w:t xml:space="preserve"> and </w:t>
             </w:r>
             <w:r>
               <w:rPr>
-                <w:rFonts w:ascii="Calibri" w:hAnsi="Calibri" w:cs="Calibri"/>
-                <w:b/>
-                <w:bCs/>
-                <w:lang w:val="en-US"/>
+                <w:rStyle w:val="citation-5120"/>
+                <w:b/>
+                <w:bCs/>
+                <w:color w:val="1F1F1F"/>
+                <w:bdr w:val="none" w:sz="0" w:space="0" w:color="auto" w:frame="1"/>
               </w:rPr>
               <w:t>Story 04</w:t>
             </w:r>
             <w:r>
               <w:rPr>
-                <w:rFonts w:ascii="Calibri" w:hAnsi="Calibri" w:cs="Calibri"/>
-                <w:lang w:val="en-US"/>
+                <w:color w:val="1F1F1F"/>
+                <w:bdr w:val="none" w:sz="0" w:space="0" w:color="auto" w:frame="1"/>
               </w:rPr>
               <w:t>.</w:t>
             </w:r>
@@ -2431,6 +2483,7 @@
         <w:tc>
           <w:tcPr>
             <w:tcW w:w="0" w:type="auto"/>
+            <w:vAlign w:val="center"/>
             <w:hideMark/>
           </w:tcPr>
           <w:p>
@@ -2443,10 +2496,10 @@
             </w:pPr>
             <w:r>
               <w:rPr>
-                <w:rFonts w:ascii="Calibri" w:hAnsi="Calibri" w:cs="Calibri"/>
-                <w:b/>
-                <w:bCs/>
-                <w:lang w:val="en-US"/>
+                <w:b/>
+                <w:bCs/>
+                <w:color w:val="1F1F1F"/>
+                <w:bdr w:val="none" w:sz="0" w:space="0" w:color="auto" w:frame="1"/>
               </w:rPr>
               <w:t>T10</w:t>
             </w:r>
@@ -2455,6 +2508,7 @@
         <w:tc>
           <w:tcPr>
             <w:tcW w:w="0" w:type="auto"/>
+            <w:vAlign w:val="center"/>
             <w:hideMark/>
           </w:tcPr>
           <w:p>
@@ -2467,25 +2521,42 @@
             </w:pPr>
             <w:r>
               <w:rPr>
-                <w:rFonts w:ascii="Calibri" w:hAnsi="Calibri" w:cs="Calibri"/>
-                <w:b/>
-                <w:bCs/>
-                <w:lang w:val="en-US"/>
+                <w:b/>
+                <w:bCs/>
+                <w:color w:val="1F1F1F"/>
+                <w:bdr w:val="none" w:sz="0" w:space="0" w:color="auto" w:frame="1"/>
               </w:rPr>
               <w:t>Implementation</w:t>
             </w:r>
             <w:r>
               <w:rPr>
-                <w:rFonts w:ascii="Calibri" w:hAnsi="Calibri" w:cs="Calibri"/>
-                <w:lang w:val="en-US"/>
-              </w:rPr>
-              <w:t>: Create dedicated /booking transaction form.</w:t>
-            </w:r>
-          </w:p>
-        </w:tc>
-        <w:tc>
-          <w:tcPr>
-            <w:tcW w:w="0" w:type="auto"/>
+                <w:color w:val="1F1F1F"/>
+                <w:bdr w:val="none" w:sz="0" w:space="0" w:color="auto" w:frame="1"/>
+              </w:rPr>
+              <w:t xml:space="preserve">: Create dedicated </w:t>
+            </w:r>
+            <w:r>
+              <w:rPr>
+                <w:rStyle w:val="HTMLCode"/>
+                <w:rFonts w:eastAsiaTheme="majorEastAsia" w:cs="Arial"/>
+                <w:color w:val="444746"/>
+                <w:bdr w:val="none" w:sz="0" w:space="0" w:color="auto" w:frame="1"/>
+              </w:rPr>
+              <w:t>/booking</w:t>
+            </w:r>
+            <w:r>
+              <w:rPr>
+                <w:color w:val="1F1F1F"/>
+                <w:bdr w:val="none" w:sz="0" w:space="0" w:color="auto" w:frame="1"/>
+              </w:rPr>
+              <w:t xml:space="preserve"> transaction form.</w:t>
+            </w:r>
+          </w:p>
+        </w:tc>
+        <w:tc>
+          <w:tcPr>
+            <w:tcW w:w="0" w:type="auto"/>
+            <w:vAlign w:val="center"/>
             <w:hideMark/>
           </w:tcPr>
           <w:p>
@@ -2498,8 +2569,8 @@
             </w:pPr>
             <w:r>
               <w:rPr>
-                <w:rFonts w:ascii="Calibri" w:hAnsi="Calibri" w:cs="Calibri"/>
-                <w:lang w:val="en-US"/>
+                <w:color w:val="1F1F1F"/>
+                <w:bdr w:val="none" w:sz="0" w:space="0" w:color="auto" w:frame="1"/>
               </w:rPr>
               <w:t>Story 03</w:t>
             </w:r>
@@ -2508,6 +2579,7 @@
         <w:tc>
           <w:tcPr>
             <w:tcW w:w="0" w:type="auto"/>
+            <w:vAlign w:val="center"/>
             <w:hideMark/>
           </w:tcPr>
           <w:p>
@@ -2520,8 +2592,8 @@
             </w:pPr>
             <w:r>
               <w:rPr>
-                <w:rFonts w:ascii="Calibri" w:hAnsi="Calibri" w:cs="Calibri"/>
-                <w:lang w:val="en-US"/>
+                <w:color w:val="1F1F1F"/>
+                <w:bdr w:val="none" w:sz="0" w:space="0" w:color="auto" w:frame="1"/>
               </w:rPr>
               <w:t>8</w:t>
             </w:r>
@@ -2530,6 +2602,7 @@
         <w:tc>
           <w:tcPr>
             <w:tcW w:w="0" w:type="auto"/>
+            <w:vAlign w:val="center"/>
             <w:hideMark/>
           </w:tcPr>
           <w:p>
@@ -2542,18 +2615,19 @@
             </w:pPr>
             <w:r>
               <w:rPr>
-                <w:rFonts w:ascii="Calibri" w:hAnsi="Calibri" w:cs="Calibri"/>
-                <w:b/>
-                <w:bCs/>
-                <w:lang w:val="en-US"/>
-              </w:rPr>
-              <w:t>In Progress</w:t>
-            </w:r>
-          </w:p>
-        </w:tc>
-        <w:tc>
-          <w:tcPr>
-            <w:tcW w:w="0" w:type="auto"/>
+                <w:b/>
+                <w:bCs/>
+                <w:color w:val="1F1F1F"/>
+                <w:bdr w:val="none" w:sz="0" w:space="0" w:color="auto" w:frame="1"/>
+              </w:rPr>
+              <w:t>Complete</w:t>
+            </w:r>
+          </w:p>
+        </w:tc>
+        <w:tc>
+          <w:tcPr>
+            <w:tcW w:w="0" w:type="auto"/>
+            <w:vAlign w:val="center"/>
             <w:hideMark/>
           </w:tcPr>
           <w:p>
@@ -2566,42 +2640,694 @@
             </w:pPr>
             <w:r>
               <w:rPr>
-                <w:rFonts w:ascii="Calibri" w:hAnsi="Calibri" w:cs="Calibri"/>
-                <w:lang w:val="en-US"/>
+                <w:rStyle w:val="citation-5119"/>
+                <w:color w:val="1F1F1F"/>
+                <w:bdr w:val="none" w:sz="0" w:space="0" w:color="auto" w:frame="1"/>
               </w:rPr>
               <w:t xml:space="preserve">Required for </w:t>
             </w:r>
             <w:r>
               <w:rPr>
-                <w:rFonts w:ascii="Calibri" w:hAnsi="Calibri" w:cs="Calibri"/>
-                <w:b/>
-                <w:bCs/>
-                <w:lang w:val="en-US"/>
-              </w:rPr>
-              <w:t>FR3 (Self-Service)</w:t>
-            </w:r>
-            <w:r>
-              <w:rPr>
-                <w:rFonts w:ascii="Calibri" w:hAnsi="Calibri" w:cs="Calibri"/>
-                <w:lang w:val="en-US"/>
+                <w:rStyle w:val="citation-5119"/>
+                <w:b/>
+                <w:bCs/>
+                <w:color w:val="1F1F1F"/>
+                <w:bdr w:val="none" w:sz="0" w:space="0" w:color="auto" w:frame="1"/>
+              </w:rPr>
+              <w:t>FR3</w:t>
+            </w:r>
+            <w:r>
+              <w:rPr>
+                <w:rStyle w:val="citation-5119"/>
+                <w:color w:val="1F1F1F"/>
+                <w:bdr w:val="none" w:sz="0" w:space="0" w:color="auto" w:frame="1"/>
               </w:rPr>
               <w:t xml:space="preserve"> and </w:t>
             </w:r>
             <w:r>
               <w:rPr>
-                <w:rFonts w:ascii="Calibri" w:hAnsi="Calibri" w:cs="Calibri"/>
-                <w:b/>
-                <w:bCs/>
-                <w:lang w:val="en-US"/>
-              </w:rPr>
-              <w:t>MVP</w:t>
-            </w:r>
-            <w:r>
-              <w:rPr>
-                <w:rFonts w:ascii="Calibri" w:hAnsi="Calibri" w:cs="Calibri"/>
-                <w:lang w:val="en-US"/>
-              </w:rPr>
-              <w:t xml:space="preserve"> completion.</w:t>
+                <w:rStyle w:val="citation-5119"/>
+                <w:b/>
+                <w:bCs/>
+                <w:color w:val="1F1F1F"/>
+                <w:bdr w:val="none" w:sz="0" w:space="0" w:color="auto" w:frame="1"/>
+              </w:rPr>
+              <w:t>UT03</w:t>
+            </w:r>
+            <w:r>
+              <w:rPr>
+                <w:color w:val="1F1F1F"/>
+                <w:bdr w:val="none" w:sz="0" w:space="0" w:color="auto" w:frame="1"/>
+              </w:rPr>
+              <w:t>.</w:t>
+            </w:r>
+          </w:p>
+        </w:tc>
+      </w:tr>
+      <w:tr>
+        <w:tc>
+          <w:tcPr>
+            <w:tcW w:w="0" w:type="auto"/>
+            <w:vAlign w:val="center"/>
+          </w:tcPr>
+          <w:p>
+            <w:pPr>
+              <w:jc w:val="left"/>
+              <w:rPr>
+                <w:b/>
+                <w:bCs/>
+                <w:color w:val="1F1F1F"/>
+                <w:bdr w:val="none" w:sz="0" w:space="0" w:color="auto" w:frame="1"/>
+              </w:rPr>
+            </w:pPr>
+            <w:r>
+              <w:rPr>
+                <w:b/>
+                <w:bCs/>
+                <w:color w:val="1F1F1F"/>
+                <w:bdr w:val="none" w:sz="0" w:space="0" w:color="auto" w:frame="1"/>
+              </w:rPr>
+              <w:t>T13</w:t>
+            </w:r>
+          </w:p>
+        </w:tc>
+        <w:tc>
+          <w:tcPr>
+            <w:tcW w:w="0" w:type="auto"/>
+            <w:vAlign w:val="center"/>
+          </w:tcPr>
+          <w:p>
+            <w:pPr>
+              <w:jc w:val="left"/>
+              <w:rPr>
+                <w:b/>
+                <w:bCs/>
+                <w:color w:val="1F1F1F"/>
+                <w:bdr w:val="none" w:sz="0" w:space="0" w:color="auto" w:frame="1"/>
+              </w:rPr>
+            </w:pPr>
+            <w:r>
+              <w:rPr>
+                <w:b/>
+                <w:bCs/>
+                <w:color w:val="1F1F1F"/>
+                <w:bdr w:val="none" w:sz="0" w:space="0" w:color="auto" w:frame="1"/>
+              </w:rPr>
+              <w:t>Logic</w:t>
+            </w:r>
+            <w:r>
+              <w:rPr>
+                <w:color w:val="1F1F1F"/>
+                <w:bdr w:val="none" w:sz="0" w:space="0" w:color="auto" w:frame="1"/>
+              </w:rPr>
+              <w:t>: Implement double-booking prevention (UT04).</w:t>
+            </w:r>
+          </w:p>
+        </w:tc>
+        <w:tc>
+          <w:tcPr>
+            <w:tcW w:w="0" w:type="auto"/>
+            <w:vAlign w:val="center"/>
+          </w:tcPr>
+          <w:p>
+            <w:pPr>
+              <w:jc w:val="left"/>
+              <w:rPr>
+                <w:color w:val="1F1F1F"/>
+                <w:bdr w:val="none" w:sz="0" w:space="0" w:color="auto" w:frame="1"/>
+              </w:rPr>
+            </w:pPr>
+            <w:r>
+              <w:rPr>
+                <w:color w:val="1F1F1F"/>
+                <w:bdr w:val="none" w:sz="0" w:space="0" w:color="auto" w:frame="1"/>
+              </w:rPr>
+              <w:t>Story 03</w:t>
+            </w:r>
+          </w:p>
+        </w:tc>
+        <w:tc>
+          <w:tcPr>
+            <w:tcW w:w="0" w:type="auto"/>
+            <w:vAlign w:val="center"/>
+          </w:tcPr>
+          <w:p>
+            <w:pPr>
+              <w:jc w:val="left"/>
+              <w:rPr>
+                <w:color w:val="1F1F1F"/>
+                <w:bdr w:val="none" w:sz="0" w:space="0" w:color="auto" w:frame="1"/>
+              </w:rPr>
+            </w:pPr>
+            <w:r>
+              <w:rPr>
+                <w:color w:val="1F1F1F"/>
+                <w:bdr w:val="none" w:sz="0" w:space="0" w:color="auto" w:frame="1"/>
+              </w:rPr>
+              <w:t>3</w:t>
+            </w:r>
+          </w:p>
+        </w:tc>
+        <w:tc>
+          <w:tcPr>
+            <w:tcW w:w="0" w:type="auto"/>
+            <w:vAlign w:val="center"/>
+          </w:tcPr>
+          <w:p>
+            <w:pPr>
+              <w:jc w:val="left"/>
+              <w:rPr>
+                <w:b/>
+                <w:bCs/>
+                <w:color w:val="1F1F1F"/>
+                <w:bdr w:val="none" w:sz="0" w:space="0" w:color="auto" w:frame="1"/>
+              </w:rPr>
+            </w:pPr>
+            <w:r>
+              <w:rPr>
+                <w:b/>
+                <w:bCs/>
+                <w:color w:val="1F1F1F"/>
+                <w:bdr w:val="none" w:sz="0" w:space="0" w:color="auto" w:frame="1"/>
+              </w:rPr>
+              <w:t>New</w:t>
+            </w:r>
+          </w:p>
+        </w:tc>
+        <w:tc>
+          <w:tcPr>
+            <w:tcW w:w="0" w:type="auto"/>
+            <w:vAlign w:val="center"/>
+          </w:tcPr>
+          <w:p>
+            <w:pPr>
+              <w:jc w:val="left"/>
+              <w:rPr>
+                <w:rStyle w:val="citation-5119"/>
+                <w:color w:val="1F1F1F"/>
+                <w:bdr w:val="none" w:sz="0" w:space="0" w:color="auto" w:frame="1"/>
+              </w:rPr>
+            </w:pPr>
+            <w:r>
+              <w:rPr>
+                <w:rStyle w:val="citation-5183"/>
+                <w:color w:val="1F1F1F"/>
+                <w:bdr w:val="none" w:sz="0" w:space="0" w:color="auto" w:frame="1"/>
+              </w:rPr>
+              <w:t>Fulfills PSD Success Metric</w:t>
+            </w:r>
+            <w:r>
+              <w:rPr>
+                <w:color w:val="1F1F1F"/>
+                <w:bdr w:val="none" w:sz="0" w:space="0" w:color="auto" w:frame="1"/>
+              </w:rPr>
+              <w:t>.</w:t>
+            </w:r>
+          </w:p>
+        </w:tc>
+      </w:tr>
+      <w:tr>
+        <w:tc>
+          <w:tcPr>
+            <w:tcW w:w="0" w:type="auto"/>
+            <w:vAlign w:val="center"/>
+          </w:tcPr>
+          <w:p>
+            <w:pPr>
+              <w:jc w:val="left"/>
+              <w:rPr>
+                <w:b/>
+                <w:bCs/>
+                <w:color w:val="1F1F1F"/>
+                <w:bdr w:val="none" w:sz="0" w:space="0" w:color="auto" w:frame="1"/>
+              </w:rPr>
+            </w:pPr>
+            <w:r>
+              <w:rPr>
+                <w:b/>
+                <w:bCs/>
+                <w:color w:val="1F1F1F"/>
+                <w:bdr w:val="none" w:sz="0" w:space="0" w:color="auto" w:frame="1"/>
+              </w:rPr>
+              <w:t>T14</w:t>
+            </w:r>
+          </w:p>
+        </w:tc>
+        <w:tc>
+          <w:tcPr>
+            <w:tcW w:w="0" w:type="auto"/>
+            <w:vAlign w:val="center"/>
+          </w:tcPr>
+          <w:p>
+            <w:pPr>
+              <w:jc w:val="left"/>
+              <w:rPr>
+                <w:b/>
+                <w:bCs/>
+                <w:color w:val="1F1F1F"/>
+                <w:bdr w:val="none" w:sz="0" w:space="0" w:color="auto" w:frame="1"/>
+              </w:rPr>
+            </w:pPr>
+            <w:r>
+              <w:rPr>
+                <w:b/>
+                <w:bCs/>
+                <w:color w:val="1F1F1F"/>
+                <w:bdr w:val="none" w:sz="0" w:space="0" w:color="auto" w:frame="1"/>
+              </w:rPr>
+              <w:t>Security</w:t>
+            </w:r>
+            <w:r>
+              <w:rPr>
+                <w:color w:val="1F1F1F"/>
+                <w:bdr w:val="none" w:sz="0" w:space="0" w:color="auto" w:frame="1"/>
+              </w:rPr>
+              <w:t>: Implement server-side Audit Logging for records.</w:t>
+            </w:r>
+          </w:p>
+        </w:tc>
+        <w:tc>
+          <w:tcPr>
+            <w:tcW w:w="0" w:type="auto"/>
+            <w:vAlign w:val="center"/>
+          </w:tcPr>
+          <w:p>
+            <w:pPr>
+              <w:jc w:val="left"/>
+              <w:rPr>
+                <w:color w:val="1F1F1F"/>
+                <w:bdr w:val="none" w:sz="0" w:space="0" w:color="auto" w:frame="1"/>
+              </w:rPr>
+            </w:pPr>
+            <w:r>
+              <w:rPr>
+                <w:color w:val="1F1F1F"/>
+                <w:bdr w:val="none" w:sz="0" w:space="0" w:color="auto" w:frame="1"/>
+              </w:rPr>
+              <w:t>NFR1</w:t>
+            </w:r>
+          </w:p>
+        </w:tc>
+        <w:tc>
+          <w:tcPr>
+            <w:tcW w:w="0" w:type="auto"/>
+            <w:vAlign w:val="center"/>
+          </w:tcPr>
+          <w:p>
+            <w:pPr>
+              <w:jc w:val="left"/>
+              <w:rPr>
+                <w:color w:val="1F1F1F"/>
+                <w:bdr w:val="none" w:sz="0" w:space="0" w:color="auto" w:frame="1"/>
+              </w:rPr>
+            </w:pPr>
+            <w:r>
+              <w:rPr>
+                <w:color w:val="1F1F1F"/>
+                <w:bdr w:val="none" w:sz="0" w:space="0" w:color="auto" w:frame="1"/>
+              </w:rPr>
+              <w:t>2</w:t>
+            </w:r>
+          </w:p>
+        </w:tc>
+        <w:tc>
+          <w:tcPr>
+            <w:tcW w:w="0" w:type="auto"/>
+            <w:vAlign w:val="center"/>
+          </w:tcPr>
+          <w:p>
+            <w:pPr>
+              <w:jc w:val="left"/>
+              <w:rPr>
+                <w:b/>
+                <w:bCs/>
+                <w:color w:val="1F1F1F"/>
+                <w:bdr w:val="none" w:sz="0" w:space="0" w:color="auto" w:frame="1"/>
+              </w:rPr>
+            </w:pPr>
+            <w:r>
+              <w:rPr>
+                <w:b/>
+                <w:bCs/>
+                <w:color w:val="1F1F1F"/>
+                <w:bdr w:val="none" w:sz="0" w:space="0" w:color="auto" w:frame="1"/>
+              </w:rPr>
+              <w:t>New</w:t>
+            </w:r>
+          </w:p>
+        </w:tc>
+        <w:tc>
+          <w:tcPr>
+            <w:tcW w:w="0" w:type="auto"/>
+            <w:vAlign w:val="center"/>
+          </w:tcPr>
+          <w:p>
+            <w:pPr>
+              <w:jc w:val="left"/>
+              <w:rPr>
+                <w:rStyle w:val="citation-5119"/>
+                <w:color w:val="1F1F1F"/>
+                <w:bdr w:val="none" w:sz="0" w:space="0" w:color="auto" w:frame="1"/>
+              </w:rPr>
+            </w:pPr>
+            <w:r>
+              <w:rPr>
+                <w:rStyle w:val="citation-5182"/>
+                <w:color w:val="1F1F1F"/>
+                <w:bdr w:val="none" w:sz="0" w:space="0" w:color="auto" w:frame="1"/>
+              </w:rPr>
+              <w:t>Fulfills GDPR/UML requirement</w:t>
+            </w:r>
+            <w:r>
+              <w:rPr>
+                <w:color w:val="1F1F1F"/>
+                <w:bdr w:val="none" w:sz="0" w:space="0" w:color="auto" w:frame="1"/>
+              </w:rPr>
+              <w:t>.</w:t>
+            </w:r>
+          </w:p>
+        </w:tc>
+      </w:tr>
+      <w:tr>
+        <w:tc>
+          <w:tcPr>
+            <w:tcW w:w="0" w:type="auto"/>
+            <w:vAlign w:val="center"/>
+          </w:tcPr>
+          <w:p>
+            <w:pPr>
+              <w:jc w:val="left"/>
+              <w:rPr>
+                <w:b/>
+                <w:bCs/>
+                <w:color w:val="1F1F1F"/>
+                <w:bdr w:val="none" w:sz="0" w:space="0" w:color="auto" w:frame="1"/>
+              </w:rPr>
+            </w:pPr>
+            <w:r>
+              <w:rPr>
+                <w:b/>
+                <w:bCs/>
+                <w:color w:val="1F1F1F"/>
+                <w:bdr w:val="none" w:sz="0" w:space="0" w:color="auto" w:frame="1"/>
+              </w:rPr>
+              <w:t>T15</w:t>
+            </w:r>
+          </w:p>
+        </w:tc>
+        <w:tc>
+          <w:tcPr>
+            <w:tcW w:w="0" w:type="auto"/>
+            <w:vAlign w:val="center"/>
+          </w:tcPr>
+          <w:p>
+            <w:pPr>
+              <w:jc w:val="left"/>
+              <w:rPr>
+                <w:b/>
+                <w:bCs/>
+                <w:color w:val="1F1F1F"/>
+                <w:bdr w:val="none" w:sz="0" w:space="0" w:color="auto" w:frame="1"/>
+              </w:rPr>
+            </w:pPr>
+            <w:r>
+              <w:rPr>
+                <w:b/>
+                <w:bCs/>
+                <w:color w:val="1F1F1F"/>
+                <w:bdr w:val="none" w:sz="0" w:space="0" w:color="auto" w:frame="1"/>
+              </w:rPr>
+              <w:t>Frontend</w:t>
+            </w:r>
+            <w:r>
+              <w:rPr>
+                <w:color w:val="1F1F1F"/>
+                <w:bdr w:val="none" w:sz="0" w:space="0" w:color="auto" w:frame="1"/>
+              </w:rPr>
+              <w:t>: Add Story 06 Confirmation Banner.</w:t>
+            </w:r>
+          </w:p>
+        </w:tc>
+        <w:tc>
+          <w:tcPr>
+            <w:tcW w:w="0" w:type="auto"/>
+            <w:vAlign w:val="center"/>
+          </w:tcPr>
+          <w:p>
+            <w:pPr>
+              <w:jc w:val="left"/>
+              <w:rPr>
+                <w:color w:val="1F1F1F"/>
+                <w:bdr w:val="none" w:sz="0" w:space="0" w:color="auto" w:frame="1"/>
+              </w:rPr>
+            </w:pPr>
+            <w:r>
+              <w:rPr>
+                <w:color w:val="1F1F1F"/>
+                <w:bdr w:val="none" w:sz="0" w:space="0" w:color="auto" w:frame="1"/>
+              </w:rPr>
+              <w:t>Story 06</w:t>
+            </w:r>
+          </w:p>
+        </w:tc>
+        <w:tc>
+          <w:tcPr>
+            <w:tcW w:w="0" w:type="auto"/>
+            <w:vAlign w:val="center"/>
+          </w:tcPr>
+          <w:p>
+            <w:pPr>
+              <w:jc w:val="left"/>
+              <w:rPr>
+                <w:color w:val="1F1F1F"/>
+                <w:bdr w:val="none" w:sz="0" w:space="0" w:color="auto" w:frame="1"/>
+              </w:rPr>
+            </w:pPr>
+            <w:r>
+              <w:rPr>
+                <w:color w:val="1F1F1F"/>
+                <w:bdr w:val="none" w:sz="0" w:space="0" w:color="auto" w:frame="1"/>
+              </w:rPr>
+              <w:t>2</w:t>
+            </w:r>
+          </w:p>
+        </w:tc>
+        <w:tc>
+          <w:tcPr>
+            <w:tcW w:w="0" w:type="auto"/>
+            <w:vAlign w:val="center"/>
+          </w:tcPr>
+          <w:p>
+            <w:pPr>
+              <w:jc w:val="left"/>
+              <w:rPr>
+                <w:b/>
+                <w:bCs/>
+                <w:color w:val="1F1F1F"/>
+                <w:bdr w:val="none" w:sz="0" w:space="0" w:color="auto" w:frame="1"/>
+              </w:rPr>
+            </w:pPr>
+            <w:r>
+              <w:rPr>
+                <w:b/>
+                <w:bCs/>
+                <w:color w:val="1F1F1F"/>
+                <w:bdr w:val="none" w:sz="0" w:space="0" w:color="auto" w:frame="1"/>
+              </w:rPr>
+              <w:t>New</w:t>
+            </w:r>
+          </w:p>
+        </w:tc>
+        <w:tc>
+          <w:tcPr>
+            <w:tcW w:w="0" w:type="auto"/>
+            <w:vAlign w:val="center"/>
+          </w:tcPr>
+          <w:p>
+            <w:pPr>
+              <w:jc w:val="left"/>
+              <w:rPr>
+                <w:rStyle w:val="citation-5119"/>
+                <w:color w:val="1F1F1F"/>
+                <w:bdr w:val="none" w:sz="0" w:space="0" w:color="auto" w:frame="1"/>
+              </w:rPr>
+            </w:pPr>
+            <w:r>
+              <w:rPr>
+                <w:rStyle w:val="citation-5181"/>
+                <w:color w:val="1F1F1F"/>
+                <w:bdr w:val="none" w:sz="0" w:space="0" w:color="auto" w:frame="1"/>
+              </w:rPr>
+              <w:t>Fulfills "Should-Have" trust goal</w:t>
+            </w:r>
+            <w:r>
+              <w:rPr>
+                <w:color w:val="1F1F1F"/>
+                <w:bdr w:val="none" w:sz="0" w:space="0" w:color="auto" w:frame="1"/>
+              </w:rPr>
+              <w:t>.</w:t>
+            </w:r>
+          </w:p>
+        </w:tc>
+      </w:tr>
+      <w:tr>
+        <w:tc>
+          <w:tcPr>
+            <w:tcW w:w="0" w:type="auto"/>
+            <w:vAlign w:val="center"/>
+          </w:tcPr>
+          <w:p>
+            <w:pPr>
+              <w:jc w:val="left"/>
+              <w:rPr>
+                <w:b/>
+                <w:bCs/>
+                <w:color w:val="1F1F1F"/>
+                <w:bdr w:val="none" w:sz="0" w:space="0" w:color="auto" w:frame="1"/>
+              </w:rPr>
+            </w:pPr>
+            <w:r>
+              <w:rPr>
+                <w:b/>
+                <w:bCs/>
+                <w:color w:val="1F1F1F"/>
+                <w:bdr w:val="none" w:sz="0" w:space="0" w:color="auto" w:frame="1"/>
+              </w:rPr>
+              <w:t>T16</w:t>
+            </w:r>
+          </w:p>
+        </w:tc>
+        <w:tc>
+          <w:tcPr>
+            <w:tcW w:w="0" w:type="auto"/>
+            <w:vAlign w:val="center"/>
+          </w:tcPr>
+          <w:p>
+            <w:pPr>
+              <w:jc w:val="left"/>
+              <w:rPr>
+                <w:b/>
+                <w:bCs/>
+                <w:color w:val="1F1F1F"/>
+                <w:bdr w:val="none" w:sz="0" w:space="0" w:color="auto" w:frame="1"/>
+              </w:rPr>
+            </w:pPr>
+            <w:r>
+              <w:rPr>
+                <w:b/>
+                <w:bCs/>
+                <w:color w:val="1F1F1F"/>
+                <w:bdr w:val="none" w:sz="0" w:space="0" w:color="auto" w:frame="1"/>
+              </w:rPr>
+              <w:t>Implementation</w:t>
+            </w:r>
+            <w:r>
+              <w:rPr>
+                <w:color w:val="1F1F1F"/>
+                <w:bdr w:val="none" w:sz="0" w:space="0" w:color="auto" w:frame="1"/>
+              </w:rPr>
+              <w:t>: Basic Admin "Cancel" functionality.</w:t>
+            </w:r>
+          </w:p>
+        </w:tc>
+        <w:tc>
+          <w:tcPr>
+            <w:tcW w:w="0" w:type="auto"/>
+            <w:vAlign w:val="center"/>
+          </w:tcPr>
+          <w:p>
+            <w:pPr>
+              <w:jc w:val="left"/>
+              <w:rPr>
+                <w:color w:val="1F1F1F"/>
+                <w:bdr w:val="none" w:sz="0" w:space="0" w:color="auto" w:frame="1"/>
+              </w:rPr>
+            </w:pPr>
+            <w:r>
+              <w:rPr>
+                <w:color w:val="1F1F1F"/>
+                <w:bdr w:val="none" w:sz="0" w:space="0" w:color="auto" w:frame="1"/>
+              </w:rPr>
+              <w:t>Story 10</w:t>
+            </w:r>
+          </w:p>
+        </w:tc>
+        <w:tc>
+          <w:tcPr>
+            <w:tcW w:w="0" w:type="auto"/>
+            <w:vAlign w:val="center"/>
+          </w:tcPr>
+          <w:p>
+            <w:pPr>
+              <w:jc w:val="left"/>
+              <w:rPr>
+                <w:color w:val="1F1F1F"/>
+                <w:bdr w:val="none" w:sz="0" w:space="0" w:color="auto" w:frame="1"/>
+              </w:rPr>
+            </w:pPr>
+            <w:r>
+              <w:rPr>
+                <w:color w:val="1F1F1F"/>
+                <w:bdr w:val="none" w:sz="0" w:space="0" w:color="auto" w:frame="1"/>
+              </w:rPr>
+              <w:t>5</w:t>
+            </w:r>
+          </w:p>
+        </w:tc>
+        <w:tc>
+          <w:tcPr>
+            <w:tcW w:w="0" w:type="auto"/>
+            <w:vAlign w:val="center"/>
+          </w:tcPr>
+          <w:p>
+            <w:pPr>
+              <w:jc w:val="left"/>
+              <w:rPr>
+                <w:b/>
+                <w:bCs/>
+                <w:color w:val="1F1F1F"/>
+                <w:bdr w:val="none" w:sz="0" w:space="0" w:color="auto" w:frame="1"/>
+              </w:rPr>
+            </w:pPr>
+            <w:r>
+              <w:rPr>
+                <w:b/>
+                <w:bCs/>
+                <w:color w:val="1F1F1F"/>
+                <w:bdr w:val="none" w:sz="0" w:space="0" w:color="auto" w:frame="1"/>
+              </w:rPr>
+              <w:t>New</w:t>
+            </w:r>
+          </w:p>
+        </w:tc>
+        <w:tc>
+          <w:tcPr>
+            <w:tcW w:w="0" w:type="auto"/>
+            <w:vAlign w:val="center"/>
+          </w:tcPr>
+          <w:p>
+            <w:pPr>
+              <w:jc w:val="left"/>
+              <w:rPr>
+                <w:rStyle w:val="citation-5119"/>
+                <w:color w:val="1F1F1F"/>
+                <w:bdr w:val="none" w:sz="0" w:space="0" w:color="auto" w:frame="1"/>
+              </w:rPr>
+            </w:pPr>
+            <w:r>
+              <w:rPr>
+                <w:rStyle w:val="citation-5180"/>
+                <w:color w:val="1F1F1F"/>
+                <w:bdr w:val="none" w:sz="0" w:space="0" w:color="auto" w:frame="1"/>
+              </w:rPr>
+              <w:t>Fulfills "Must-Have" Admin needs</w:t>
+            </w:r>
+            <w:r>
+              <w:rPr>
+                <w:color w:val="1F1F1F"/>
+                <w:bdr w:val="none" w:sz="0" w:space="0" w:color="auto" w:frame="1"/>
+              </w:rPr>
+              <w:t>.</w:t>
             </w:r>
           </w:p>
         </w:tc>
@@ -3359,16 +4085,8 @@
         <w:rPr>
           <w:rFonts w:ascii="Calibri" w:hAnsi="Calibri" w:cs="Calibri"/>
         </w:rPr>
-        <w:t xml:space="preserve"> </w:t>
+        <w:t xml:space="preserve"> compliance .</w:t>
       </w:r>
-      <w:proofErr w:type="gramStart"/>
-      <w:r>
-        <w:rPr>
-          <w:rFonts w:ascii="Calibri" w:hAnsi="Calibri" w:cs="Calibri"/>
-        </w:rPr>
-        <w:t>compliance .</w:t>
-      </w:r>
-      <w:proofErr w:type="gramEnd"/>
     </w:p>
     <w:p>
       <w:pPr>
@@ -3460,30 +4178,8 @@
         <w:rPr>
           <w:rFonts w:ascii="Calibri" w:hAnsi="Calibri" w:cs="Calibri"/>
         </w:rPr>
-        <w:t xml:space="preserve">The current 'BOOK WITH DR. MEHTA' button on the dashboard is a UI placeholder. The next development goal is to implement the dedicated '/booking' route to handle the transaction logic and </w:t>
+        <w:t>The current 'BOOK WITH DR. MEHTA' button on the dashboard is a UI placeholder. The next development goal is to implement the dedicated '/booking' route to handle the transaction logic and data-binding for Story 03 .</w:t>
       </w:r>
-      <w:proofErr w:type="gramStart"/>
-      <w:r>
-        <w:rPr>
-          <w:rFonts w:ascii="Calibri" w:hAnsi="Calibri" w:cs="Calibri"/>
-        </w:rPr>
-        <w:t>data-binding</w:t>
-      </w:r>
-      <w:proofErr w:type="gramEnd"/>
-      <w:r>
-        <w:rPr>
-          <w:rFonts w:ascii="Calibri" w:hAnsi="Calibri" w:cs="Calibri"/>
-        </w:rPr>
-        <w:t xml:space="preserve"> for Story </w:t>
-      </w:r>
-      <w:proofErr w:type="gramStart"/>
-      <w:r>
-        <w:rPr>
-          <w:rFonts w:ascii="Calibri" w:hAnsi="Calibri" w:cs="Calibri"/>
-        </w:rPr>
-        <w:t>03 .</w:t>
-      </w:r>
-      <w:proofErr w:type="gramEnd"/>
     </w:p>
     <w:p>
       <w:pPr>
@@ -3520,29 +4216,7 @@
         <w:rPr>
           <w:rFonts w:ascii="Calibri" w:hAnsi="Calibri" w:cs="Calibri"/>
         </w:rPr>
-        <w:t>While the current MVP uses plain-string comparison for mock data validation, a production-ready version must implement Argon2 or Bcrypt hashing within the +</w:t>
-      </w:r>
-      <w:proofErr w:type="spellStart"/>
-      <w:proofErr w:type="gramStart"/>
-      <w:r>
-        <w:rPr>
-          <w:rFonts w:ascii="Calibri" w:hAnsi="Calibri" w:cs="Calibri"/>
-        </w:rPr>
-        <w:t>page.server</w:t>
-      </w:r>
-      <w:proofErr w:type="gramEnd"/>
-      <w:r>
-        <w:rPr>
-          <w:rFonts w:ascii="Calibri" w:hAnsi="Calibri" w:cs="Calibri"/>
-        </w:rPr>
-        <w:t>.ts</w:t>
-      </w:r>
-      <w:proofErr w:type="spellEnd"/>
-      <w:r>
-        <w:rPr>
-          <w:rFonts w:ascii="Calibri" w:hAnsi="Calibri" w:cs="Calibri"/>
-        </w:rPr>
-        <w:t xml:space="preserve"> logic to fully satisfy NFR1 (Security).</w:t>
+        <w:t>While the current MVP uses plain-string comparison for mock data validation, a production-ready version must implement Argon2 or Bcrypt hashing within the +page.server.ts logic to fully satisfy NFR1 (Security).</w:t>
       </w:r>
       <w:r>
         <w:rPr>
@@ -4221,6 +4895,7 @@
   <w:style w:type="character" w:default="1" w:styleId="DefaultParagraphFont">
     <w:name w:val="Default Paragraph Font"/>
     <w:uiPriority w:val="1"/>
+    <w:semiHidden/>
     <w:unhideWhenUsed/>
   </w:style>
   <w:style w:type="table" w:default="1" w:styleId="TableNormal">
@@ -4788,6 +5463,66 @@
       </w:tblBorders>
     </w:tblPr>
   </w:style>
+  <w:style w:type="character" w:customStyle="1" w:styleId="citation-5126">
+    <w:name w:val="citation-5126"/>
+    <w:basedOn w:val="DefaultParagraphFont"/>
+    <w:rsid w:val="00892810"/>
+  </w:style>
+  <w:style w:type="character" w:customStyle="1" w:styleId="citation-5125">
+    <w:name w:val="citation-5125"/>
+    <w:basedOn w:val="DefaultParagraphFont"/>
+    <w:rsid w:val="00892810"/>
+  </w:style>
+  <w:style w:type="character" w:customStyle="1" w:styleId="citation-5124">
+    <w:name w:val="citation-5124"/>
+    <w:basedOn w:val="DefaultParagraphFont"/>
+    <w:rsid w:val="00892810"/>
+  </w:style>
+  <w:style w:type="character" w:customStyle="1" w:styleId="citation-5123">
+    <w:name w:val="citation-5123"/>
+    <w:basedOn w:val="DefaultParagraphFont"/>
+    <w:rsid w:val="00892810"/>
+  </w:style>
+  <w:style w:type="character" w:customStyle="1" w:styleId="citation-5122">
+    <w:name w:val="citation-5122"/>
+    <w:basedOn w:val="DefaultParagraphFont"/>
+    <w:rsid w:val="00892810"/>
+  </w:style>
+  <w:style w:type="character" w:customStyle="1" w:styleId="citation-5121">
+    <w:name w:val="citation-5121"/>
+    <w:basedOn w:val="DefaultParagraphFont"/>
+    <w:rsid w:val="00892810"/>
+  </w:style>
+  <w:style w:type="character" w:customStyle="1" w:styleId="citation-5120">
+    <w:name w:val="citation-5120"/>
+    <w:basedOn w:val="DefaultParagraphFont"/>
+    <w:rsid w:val="00892810"/>
+  </w:style>
+  <w:style w:type="character" w:customStyle="1" w:styleId="citation-5119">
+    <w:name w:val="citation-5119"/>
+    <w:basedOn w:val="DefaultParagraphFont"/>
+    <w:rsid w:val="00892810"/>
+  </w:style>
+  <w:style w:type="character" w:customStyle="1" w:styleId="citation-5183">
+    <w:name w:val="citation-5183"/>
+    <w:basedOn w:val="DefaultParagraphFont"/>
+    <w:rsid w:val="00F41A96"/>
+  </w:style>
+  <w:style w:type="character" w:customStyle="1" w:styleId="citation-5182">
+    <w:name w:val="citation-5182"/>
+    <w:basedOn w:val="DefaultParagraphFont"/>
+    <w:rsid w:val="00F41A96"/>
+  </w:style>
+  <w:style w:type="character" w:customStyle="1" w:styleId="citation-5181">
+    <w:name w:val="citation-5181"/>
+    <w:basedOn w:val="DefaultParagraphFont"/>
+    <w:rsid w:val="00F41A96"/>
+  </w:style>
+  <w:style w:type="character" w:customStyle="1" w:styleId="citation-5180">
+    <w:name w:val="citation-5180"/>
+    <w:basedOn w:val="DefaultParagraphFont"/>
+    <w:rsid w:val="00F41A96"/>
+  </w:style>
 </w:styles>
 </file>
 

</xml_diff>